<commit_message>
docs: integrate theory validation into formal report
</commit_message>
<xml_diff>
--- a/结题/基于深度学习的钒钛矿相关矿物图像识别方法研究_技术报告（正式版）.docx
+++ b/结题/基于深度学习的钒钛矿相关矿物图像识别方法研究_技术报告（正式版）.docx
@@ -409,125 +409,42 @@
     </w:p>
     <w:p>
       <w:pPr>
+        <w:spacing w:line="360" w:lineRule="auto"/>
         <w:ind w:firstLine="420"/>
         <w:jc w:val="both"/>
       </w:pPr>
       <w:r>
-        <w:t>在固定划分上，采用</w:t>
-      </w:r>
-      <w:r>
-        <w:t xml:space="preserve"> ImageNet </w:t>
-      </w:r>
-      <w:r>
-        <w:t>预训练的</w:t>
-      </w:r>
-      <w:r>
-        <w:t xml:space="preserve"> ResNet50 </w:t>
-      </w:r>
-      <w:r>
-        <w:t>和</w:t>
-      </w:r>
-      <w:r>
-        <w:t xml:space="preserve"> EfficientNet-B0 </w:t>
-      </w:r>
-      <w:r>
-        <w:t>开展三随机种子重复训练。</w:t>
-      </w:r>
-      <w:r>
-        <w:t xml:space="preserve">EfficientNet-B0 </w:t>
-      </w:r>
-      <w:r>
-        <w:t>的平均</w:t>
-      </w:r>
-      <w:r>
-        <w:t xml:space="preserve"> Macro F1 </w:t>
-      </w:r>
-      <w:r>
-        <w:t>为</w:t>
-      </w:r>
-      <w:r>
-        <w:t xml:space="preserve"> 72.87%±1.21%</w:t>
-      </w:r>
-      <w:r>
-        <w:t>，</w:t>
-      </w:r>
-      <w:r>
-        <w:t xml:space="preserve">ResNet50 </w:t>
-      </w:r>
-      <w:r>
-        <w:t>为</w:t>
-      </w:r>
-      <w:r>
-        <w:t xml:space="preserve"> 72.06%±0.92%</w:t>
-      </w:r>
-      <w:r>
-        <w:t>。进一步构建了角色感知困难负样本模型和矿物种类</w:t>
-      </w:r>
-      <w:r>
-        <w:t>—</w:t>
-      </w:r>
-      <w:r>
-        <w:t>选矿角色分层一致性模型。分层模型的平均</w:t>
-      </w:r>
-      <w:r>
-        <w:t xml:space="preserve"> Macro F1 </w:t>
-      </w:r>
-      <w:r>
-        <w:t>为</w:t>
-      </w:r>
-      <w:r>
-        <w:t xml:space="preserve"> 73.41%±2.40%</w:t>
-      </w:r>
-      <w:r>
-        <w:t>，并提高目标类召回和目标代理</w:t>
-      </w:r>
-      <w:r>
-        <w:t xml:space="preserve"> F1</w:t>
-      </w:r>
-      <w:r>
-        <w:t>，但同时增加部分困难干扰误入目标的比例，说明现阶段改进主要体现为风险方向的取舍，而非总体性能的稳定领先。选择性识别分析表明，提高置信度阈值可以降低保留样本错误率，但目前最大</w:t>
-      </w:r>
-      <w:r>
-        <w:t xml:space="preserve"> Softmax </w:t>
-      </w:r>
-      <w:r>
-        <w:t>概率尚未完成独立校准，阈值结果仅作为固定测试划分上的描述性证据。</w:t>
+        <w:rPr>
+          <w:rFonts w:ascii="宋体" w:hAnsi="宋体" w:eastAsia="宋体"/>
+          <w:sz w:val="21"/>
+        </w:rPr>
+        <w:t>在固定划分上，采用 ImageNet 预训练的 ResNet50 和 EfficientNet-B0 开展三随机种子重复训练，EfficientNet-B0 的平均 Macro F1 为72.87%±1.21%。在此基础上构建共享 EfficientNet-B0 主干的分层一致性网络，同时预测4类选矿角色、17类矿物种类及目标/非目标标签，并以固定映射和困难负样本约束建立可解释的风险结构。种类预测映射到角色后产生18.74±1.29个百分点的经验风险收缩；一致性项使双头 KL 从0.0565降至0.0426。温度缩放将测试 ECE 从0.1131降至0.0342，并在独立认证子集上实现预设选择性风险控制。</w:t>
       </w:r>
     </w:p>
     <w:p>
       <w:pPr>
+        <w:spacing w:line="360" w:lineRule="auto"/>
         <w:ind w:firstLine="420"/>
         <w:jc w:val="both"/>
       </w:pPr>
       <w:r>
-        <w:t>本报告将固定种类</w:t>
-      </w:r>
-      <w:r>
-        <w:t>—</w:t>
-      </w:r>
-      <w:r>
-        <w:t>角色映射下的角色可识别性表述为领域问题的条件化形式化，并将受控候选集合结果定位为程序化一致性检查，而非真实图像或模型性能验证。当前结果仅支持公开矿物标本图像条件下的数据治理、基线比较、风险取舍和方法原型分析，不构成工业分选、品位或回收率、真实</w:t>
-      </w:r>
-      <w:r>
-        <w:t xml:space="preserve"> XRF </w:t>
-      </w:r>
-      <w:r>
-        <w:t>成本最优、外部泛化或统计显著性结论。</w:t>
+        <w:rPr>
+          <w:rFonts w:ascii="宋体" w:hAnsi="宋体" w:eastAsia="宋体"/>
+          <w:sz w:val="21"/>
+        </w:rPr>
+        <w:t>摄影者整体留出的严格实验包含5,639张具有来源字段的图像。分层模型在该测试上的 Macro F1 为69.70%±0.90%，较 EfficientNet-B0 提高2.70个百分点，并改善目标类和金属光泽干扰召回。普通磁铁矿代理消融表明，移除1,316张代理样本后目标召回由72.22%降至45.06%；钛磁铁矿最终保留23张、固定测试仅4张，因此其结果仅作描述性证据。当前工作定位为公开标本图像条件下的钒钛矿相关组分矿物视觉代理研究，不构成工业品位、回收率或现场分选验证。</w:t>
       </w:r>
     </w:p>
     <w:p>
       <w:pPr>
-        <w:spacing w:before="100"/>
+        <w:spacing w:before="100" w:line="360" w:lineRule="auto"/>
       </w:pPr>
       <w:r>
         <w:rPr>
-          <w:rFonts w:eastAsia="黑体"/>
-          <w:b/>
+          <w:rFonts w:ascii="宋体" w:hAnsi="宋体" w:eastAsia="宋体"/>
+          <w:sz w:val="21"/>
         </w:rPr>
-        <w:t>关键词：</w:t>
-      </w:r>
-      <w:r>
-        <w:t>钒钛矿；矿物图像识别；困难负样本；分层一致性；选择性识别；风险评价</w:t>
+        <w:t>关键词：钒钛矿；矿物图像识别；分层一致性；角色风险收缩；概率校准；来源外泛化；选择性风险认证</w:t>
       </w:r>
     </w:p>
     <w:p>
@@ -7545,7 +7462,7 @@
         <w:lastRenderedPageBreak/>
         <w:drawing>
           <wp:inline distT="0" distB="0" distL="0" distR="0" wp14:anchorId="5E7AF447" wp14:editId="2DFA2BAD">
-            <wp:extent cx="5897880" cy="3130413"/>
+            <wp:extent cx="5832475" cy="3095698"/>
             <wp:effectExtent l="0" t="0" r="0" b="0"/>
             <wp:docPr id="17" name="Picture 17"/>
             <wp:cNvGraphicFramePr>
@@ -7567,7 +7484,7 @@
                   <pic:spPr>
                     <a:xfrm>
                       <a:off x="0" y="0"/>
-                      <a:ext cx="5897880" cy="3130413"/>
+                      <a:ext cx="5832475" cy="3095698"/>
                     </a:xfrm>
                     <a:prstGeom prst="rect">
                       <a:avLst/>
@@ -8585,7 +8502,7 @@
         <w:lastRenderedPageBreak/>
         <w:drawing>
           <wp:inline distT="0" distB="0" distL="0" distR="0" wp14:anchorId="716A5B32" wp14:editId="183974B8">
-            <wp:extent cx="6120000" cy="3334044"/>
+            <wp:extent cx="5832475" cy="3177406"/>
             <wp:effectExtent l="0" t="0" r="0" b="0"/>
             <wp:docPr id="2" name="Picture 2"/>
             <wp:cNvGraphicFramePr>
@@ -8607,7 +8524,7 @@
                   <pic:spPr>
                     <a:xfrm>
                       <a:off x="0" y="0"/>
-                      <a:ext cx="6120000" cy="3334044"/>
+                      <a:ext cx="5832475" cy="3177406"/>
                     </a:xfrm>
                     <a:prstGeom prst="rect">
                       <a:avLst/>
@@ -10307,7 +10224,7 @@
         </w:rPr>
         <w:drawing>
           <wp:inline distT="0" distB="0" distL="0" distR="0" wp14:anchorId="6F3F6B84" wp14:editId="6F0C9B64">
-            <wp:extent cx="5897880" cy="7108423"/>
+            <wp:extent cx="5832475" cy="7029593"/>
             <wp:effectExtent l="0" t="0" r="0" b="0"/>
             <wp:docPr id="16" name="Picture 16" descr="EfficientNet-B0共享主干的逐阶段输入输出、MBConv内部组成、共享特征向四个并列输出头的分支、概率聚合与联合损失结构图" title="本项目分层角色感知网络的实际层次结构及信息流"/>
             <wp:cNvGraphicFramePr>
@@ -10329,7 +10246,7 @@
                   <pic:spPr>
                     <a:xfrm>
                       <a:off x="0" y="0"/>
-                      <a:ext cx="5897880" cy="7108423"/>
+                      <a:ext cx="5832475" cy="7029593"/>
                     </a:xfrm>
                     <a:prstGeom prst="rect">
                       <a:avLst/>
@@ -13012,6 +12929,71 @@
     </w:tbl>
     <w:p>
       <w:pPr>
+        <w:keepNext/>
+        <w:jc w:val="center"/>
+      </w:pPr>
+      <w:r>
+        <w:drawing>
+          <wp:inline xmlns:a="http://schemas.openxmlformats.org/drawingml/2006/main" xmlns:pic="http://schemas.openxmlformats.org/drawingml/2006/picture">
+            <wp:extent cx="5760000" cy="3360000"/>
+            <wp:docPr id="25" name="Picture 25"/>
+            <wp:cNvGraphicFramePr>
+              <a:graphicFrameLocks noChangeAspect="1"/>
+            </wp:cNvGraphicFramePr>
+            <a:graphic>
+              <a:graphicData uri="http://schemas.openxmlformats.org/drawingml/2006/picture">
+                <pic:pic>
+                  <pic:nvPicPr>
+                    <pic:cNvPr id="0" name="fig_theory_aware_architecture_v2.png"/>
+                    <pic:cNvPicPr/>
+                  </pic:nvPicPr>
+                  <pic:blipFill>
+                    <a:blip r:embed="rId36"/>
+                    <a:stretch>
+                      <a:fillRect/>
+                    </a:stretch>
+                  </pic:blipFill>
+                  <pic:spPr>
+                    <a:xfrm>
+                      <a:off x="0" y="0"/>
+                      <a:ext cx="5760000" cy="3360000"/>
+                    </a:xfrm>
+                    <a:prstGeom prst="rect"/>
+                  </pic:spPr>
+                </pic:pic>
+              </a:graphicData>
+            </a:graphic>
+          </wp:inline>
+        </w:drawing>
+      </w:r>
+    </w:p>
+    <w:p>
+      <w:pPr>
+        <w:pStyle w:val="af7"/>
+        <w:jc w:val="center"/>
+      </w:pPr>
+      <w:r>
+        <w:rPr>
+          <w:rFonts w:ascii="宋体" w:hAnsi="宋体" w:eastAsia="宋体"/>
+          <w:sz w:val="19"/>
+        </w:rPr>
+        <w:t>图 5 理论感知的分层网络、校准与风险认证结构（修订）</w:t>
+      </w:r>
+    </w:p>
+    <w:p>
+      <w:pPr>
+        <w:spacing w:line="360" w:lineRule="auto" w:after="80"/>
+      </w:pPr>
+      <w:r>
+        <w:rPr>
+          <w:rFonts w:ascii="宋体" w:hAnsi="宋体" w:eastAsia="宋体"/>
+          <w:sz w:val="21"/>
+        </w:rPr>
+        <w:t>图5在 EfficientNet-B0 基线主干上明确给出四个任务头、固定种类—角色映射、DKL(p̃r||pr) 一致性约束以及推理期温度校准和风险认证。网络训练与选择性决策分开：训练阶段学习视觉表征和层级关系，推理阶段使用独立验证数据确定温度与风险阈值。</w:t>
+      </w:r>
+    </w:p>
+    <w:p>
+      <w:pPr>
         <w:pStyle w:val="21"/>
       </w:pPr>
       <w:r>
@@ -14280,29 +14262,15 @@
       <w:pPr>
         <w:pStyle w:val="af7"/>
         <w:keepNext/>
-        <w:spacing w:after="100"/>
+        <w:spacing w:after="100" w:line="360" w:lineRule="auto"/>
         <w:jc w:val="center"/>
       </w:pPr>
       <w:r>
-        <w:t>图</w:t>
-      </w:r>
-      <w:r>
-        <w:t xml:space="preserve"> 5 </w:t>
-      </w:r>
-      <w:r>
-        <w:t>四种模型的总体性能对比（均值</w:t>
-      </w:r>
-      <w:r>
-        <w:t>±</w:t>
-      </w:r>
-      <w:r>
-        <w:t>样本标准差，</w:t>
-      </w:r>
-      <w:r>
-        <w:t>n=3</w:t>
-      </w:r>
-      <w:r>
-        <w:t>）</w:t>
+        <w:rPr>
+          <w:rFonts w:ascii="宋体" w:hAnsi="宋体" w:eastAsia="宋体"/>
+          <w:sz w:val="21"/>
+        </w:rPr>
+        <w:t>图 6 四种模型的总体性能对比（均值±样本标准差，n=3）</w:t>
       </w:r>
     </w:p>
     <w:p>
@@ -15081,17 +15049,15 @@
       <w:pPr>
         <w:pStyle w:val="af7"/>
         <w:keepNext/>
-        <w:spacing w:after="100"/>
+        <w:spacing w:after="100" w:line="360" w:lineRule="auto"/>
         <w:jc w:val="center"/>
       </w:pPr>
       <w:r>
-        <w:t>图</w:t>
-      </w:r>
-      <w:r>
-        <w:t xml:space="preserve"> 6 </w:t>
-      </w:r>
-      <w:r>
-        <w:t>四类矿物在四种模型上的召回率</w:t>
+        <w:rPr>
+          <w:rFonts w:ascii="宋体" w:hAnsi="宋体" w:eastAsia="宋体"/>
+          <w:sz w:val="21"/>
+        </w:rPr>
+        <w:t>图 7 四类矿物在四种模型上的召回率</w:t>
       </w:r>
     </w:p>
     <w:p>
@@ -15807,17 +15773,15 @@
       <w:pPr>
         <w:pStyle w:val="af7"/>
         <w:keepNext/>
-        <w:spacing w:after="100"/>
+        <w:spacing w:after="100" w:line="360" w:lineRule="auto"/>
         <w:jc w:val="center"/>
       </w:pPr>
       <w:r>
-        <w:t>图</w:t>
-      </w:r>
-      <w:r>
-        <w:t xml:space="preserve"> 7 </w:t>
-      </w:r>
-      <w:r>
-        <w:t>四种训练策略的目标代理风险指标</w:t>
+        <w:rPr>
+          <w:rFonts w:ascii="宋体" w:hAnsi="宋体" w:eastAsia="宋体"/>
+          <w:sz w:val="21"/>
+        </w:rPr>
+        <w:t>图 8 四种训练策略的目标代理风险指标</w:t>
       </w:r>
     </w:p>
     <w:p>
@@ -16005,23 +15969,15 @@
       <w:pPr>
         <w:pStyle w:val="af7"/>
         <w:keepNext/>
-        <w:spacing w:after="100"/>
+        <w:spacing w:after="100" w:line="360" w:lineRule="auto"/>
         <w:jc w:val="center"/>
       </w:pPr>
       <w:r>
-        <w:t>图</w:t>
-      </w:r>
-      <w:r>
-        <w:t xml:space="preserve"> 8 EfficientNet-B0</w:t>
-      </w:r>
-      <w:r>
-        <w:t>（随机种子</w:t>
-      </w:r>
-      <w:r>
-        <w:t xml:space="preserve"> 20260728</w:t>
-      </w:r>
-      <w:r>
-        <w:t>）的混淆矩阵</w:t>
+        <w:rPr>
+          <w:rFonts w:ascii="宋体" w:hAnsi="宋体" w:eastAsia="宋体"/>
+          <w:sz w:val="21"/>
+        </w:rPr>
+        <w:t>图 9 EfficientNet-B0（随机种子 20260728）的混淆矩阵</w:t>
       </w:r>
     </w:p>
     <w:p>
@@ -16074,23 +16030,15 @@
       <w:pPr>
         <w:pStyle w:val="af7"/>
         <w:keepNext/>
-        <w:spacing w:after="100"/>
+        <w:spacing w:after="100" w:line="360" w:lineRule="auto"/>
         <w:jc w:val="center"/>
       </w:pPr>
       <w:r>
-        <w:t>图</w:t>
-      </w:r>
-      <w:r>
-        <w:t xml:space="preserve"> 9 EfficientNet-B0</w:t>
-      </w:r>
-      <w:r>
-        <w:t>（随机种子</w:t>
-      </w:r>
-      <w:r>
-        <w:t xml:space="preserve"> 20260728</w:t>
-      </w:r>
-      <w:r>
-        <w:t>）的主要错分方向</w:t>
+        <w:rPr>
+          <w:rFonts w:ascii="宋体" w:hAnsi="宋体" w:eastAsia="宋体"/>
+          <w:sz w:val="21"/>
+        </w:rPr>
+        <w:t>图 10 EfficientNet-B0（随机种子 20260728）的主要错分方向</w:t>
       </w:r>
     </w:p>
     <w:p>
@@ -16871,23 +16819,15 @@
       <w:pPr>
         <w:pStyle w:val="af7"/>
         <w:keepNext/>
-        <w:spacing w:after="100"/>
+        <w:spacing w:after="100" w:line="360" w:lineRule="auto"/>
         <w:jc w:val="center"/>
       </w:pPr>
       <w:r>
-        <w:t>图</w:t>
-      </w:r>
-      <w:r>
-        <w:t xml:space="preserve"> 10 </w:t>
-      </w:r>
-      <w:r>
-        <w:t>加权交叉熵与加权</w:t>
-      </w:r>
-      <w:r>
-        <w:t xml:space="preserve"> Focal Loss </w:t>
-      </w:r>
-      <w:r>
-        <w:t>的三随机种子消融</w:t>
+        <w:rPr>
+          <w:rFonts w:ascii="宋体" w:hAnsi="宋体" w:eastAsia="宋体"/>
+          <w:sz w:val="21"/>
+        </w:rPr>
+        <w:t>图 11 加权交叉熵与加权 Focal Loss 的三随机种子消融</w:t>
       </w:r>
     </w:p>
     <w:p>
@@ -19716,80 +19656,29 @@
       <w:pPr>
         <w:pStyle w:val="af7"/>
         <w:keepNext/>
-        <w:spacing w:after="100"/>
+        <w:spacing w:after="100" w:line="360" w:lineRule="auto"/>
         <w:jc w:val="center"/>
       </w:pPr>
       <w:r>
-        <w:t>图</w:t>
-      </w:r>
-      <w:r>
-        <w:t xml:space="preserve"> 11 </w:t>
-      </w:r>
-      <w:r>
-        <w:t>三随机种子在固定测试划分上的选择性识别风险</w:t>
-      </w:r>
-      <w:r>
-        <w:t>—</w:t>
-      </w:r>
-      <w:r>
-        <w:t>覆盖率关系</w:t>
+        <w:rPr>
+          <w:rFonts w:ascii="宋体" w:hAnsi="宋体" w:eastAsia="宋体"/>
+          <w:sz w:val="21"/>
+        </w:rPr>
+        <w:t>图 12 三随机种子在固定测试划分上的选择性识别风险—覆盖率关系</w:t>
       </w:r>
     </w:p>
     <w:p>
       <w:pPr>
+        <w:spacing w:line="360" w:lineRule="auto"/>
         <w:ind w:firstLine="420"/>
         <w:jc w:val="both"/>
       </w:pPr>
       <w:r>
-        <w:t>阈值从</w:t>
-      </w:r>
-      <w:r>
-        <w:t xml:space="preserve"> 0.00 </w:t>
-      </w:r>
-      <w:r>
-        <w:t>提高到</w:t>
-      </w:r>
-      <w:r>
-        <w:t xml:space="preserve"> 0.90 </w:t>
-      </w:r>
-      <w:r>
-        <w:t>时，平均覆盖率由</w:t>
-      </w:r>
-      <w:r>
-        <w:t xml:space="preserve"> 100.00% </w:t>
-      </w:r>
-      <w:r>
-        <w:t>降至</w:t>
-      </w:r>
-      <w:r>
-        <w:t xml:space="preserve"> 60.88%</w:t>
-      </w:r>
-      <w:r>
-        <w:t>，保留样本错误率由</w:t>
-      </w:r>
-      <w:r>
-        <w:t xml:space="preserve"> 24.58% </w:t>
-      </w:r>
-      <w:r>
-        <w:t>降至</w:t>
-      </w:r>
-      <w:r>
-        <w:t xml:space="preserve"> 11.71%</w:t>
-      </w:r>
-      <w:r>
-        <w:t>，体现了固定公开图像测试划分上的风险</w:t>
-      </w:r>
-      <w:r>
-        <w:t>—</w:t>
-      </w:r>
-      <w:r>
-        <w:t>覆盖率取舍。由于置信度未校准且阈值未在验证集上按预定约束选择，不能把</w:t>
-      </w:r>
-      <w:r>
-        <w:t xml:space="preserve"> 0.90 </w:t>
-      </w:r>
-      <w:r>
-        <w:t>解释为推荐阈值或工业成本最优点。</w:t>
+        <w:rPr>
+          <w:rFonts w:ascii="宋体" w:hAnsi="宋体" w:eastAsia="宋体"/>
+          <w:sz w:val="21"/>
+        </w:rPr>
+        <w:t>未校准的固定测试阈值曲线仅作为探索性结果保留。正式风险阈值已在5.13节中改为：验证集温度拟合、独立认证子集计算同时置信上界、测试集一次性评估。因而0.90不再被解释为推荐阈值，实际阈值随预设风险δ和随机种子而变化。</w:t>
       </w:r>
     </w:p>
     <w:p>
@@ -19797,49 +19686,2987 @@
         <w:pStyle w:val="21"/>
       </w:pPr>
       <w:r>
-        <w:t xml:space="preserve">5.11 </w:t>
-      </w:r>
-      <w:r>
-        <w:t>实验结果的综合判断</w:t>
+        <w:t>5.11 角色风险收缩：种类错误不必然导致角色错误</w:t>
       </w:r>
     </w:p>
     <w:p>
       <w:pPr>
+        <w:spacing w:line="360" w:lineRule="auto" w:after="80"/>
+      </w:pPr>
+      <w:r>
+        <w:rPr>
+          <w:rFonts w:ascii="宋体" w:hAnsi="宋体" w:eastAsia="宋体"/>
+          <w:sz w:val="21"/>
+        </w:rPr>
+        <w:t>设细粒度矿物种类为 s，固定的种类—选矿角色映射为 g。由于正确种类必然映射到正确角色，而错误种类若仍落在同一角色内并不会造成角色决策错误，可得到逐样本风险支配关系及其经验风险分解：</w:t>
+      </w:r>
+    </w:p>
+    <w:p>
+      <w:pPr>
+        <w:keepNext/>
+        <w:jc w:val="center"/>
+      </w:pPr>
+      <w:r>
+        <w:drawing>
+          <wp:inline xmlns:a="http://schemas.openxmlformats.org/drawingml/2006/main" xmlns:pic="http://schemas.openxmlformats.org/drawingml/2006/picture">
+            <wp:extent cx="5580000" cy="481493"/>
+            <wp:docPr id="18" name="Picture 18"/>
+            <wp:cNvGraphicFramePr>
+              <a:graphicFrameLocks noChangeAspect="1"/>
+            </wp:cNvGraphicFramePr>
+            <a:graphic>
+              <a:graphicData uri="http://schemas.openxmlformats.org/drawingml/2006/picture">
+                <pic:pic>
+                  <pic:nvPicPr>
+                    <pic:cNvPr id="0" name="risk_contraction.png"/>
+                    <pic:cNvPicPr/>
+                  </pic:nvPicPr>
+                  <pic:blipFill>
+                    <a:blip r:embed="rId29"/>
+                    <a:stretch>
+                      <a:fillRect/>
+                    </a:stretch>
+                  </pic:blipFill>
+                  <pic:spPr>
+                    <a:xfrm>
+                      <a:off x="0" y="0"/>
+                      <a:ext cx="5580000" cy="481493"/>
+                    </a:xfrm>
+                    <a:prstGeom prst="rect"/>
+                  </pic:spPr>
+                </pic:pic>
+              </a:graphicData>
+            </a:graphic>
+          </wp:inline>
+        </w:drawing>
+      </w:r>
+    </w:p>
+    <w:p>
+      <w:pPr>
+        <w:pStyle w:val="af7"/>
+        <w:spacing w:line="360" w:lineRule="auto"/>
+        <w:jc w:val="center"/>
+      </w:pPr>
+      <w:r>
+        <w:rPr>
+          <w:rFonts w:ascii="宋体" w:hAnsi="宋体" w:eastAsia="宋体"/>
+          <w:sz w:val="21"/>
+        </w:rPr>
+        <w:t>式（7） 固定映射下的角色风险收缩关系</w:t>
+      </w:r>
+    </w:p>
+    <w:p>
+      <w:pPr>
+        <w:pStyle w:val="af7"/>
+        <w:jc w:val="center"/>
+      </w:pPr>
+      <w:r>
+        <w:rPr>
+          <w:rFonts w:ascii="宋体" w:hAnsi="宋体" w:eastAsia="宋体"/>
+          <w:sz w:val="19"/>
+        </w:rPr>
+        <w:t>表 18 固定映射下角色风险收缩的实证验证</w:t>
+      </w:r>
+    </w:p>
+    <w:tbl>
+      <w:tblPr>
+        <w:tblStyle w:val="aff1"/>
+        <w:tblW w:type="auto" w:w="0"/>
+        <w:jc w:val="center"/>
+        <w:tblLayout w:type="fixed"/>
+        <w:tblLook w:firstColumn="1" w:firstRow="1" w:lastColumn="0" w:lastRow="0" w:noHBand="0" w:noVBand="1" w:val="04A0"/>
+      </w:tblPr>
+      <w:tblGrid>
+        <w:gridCol w:w="2296"/>
+        <w:gridCol w:w="2296"/>
+        <w:gridCol w:w="2296"/>
+        <w:gridCol w:w="2296"/>
+      </w:tblGrid>
+      <w:tr>
+        <w:trPr>
+          <w:tblHeader w:val="true"/>
+        </w:trPr>
+        <w:tc>
+          <w:tcPr>
+            <w:tcW w:type="dxa" w:w="2437"/>
+            <w:vAlign w:val="center"/>
+            <w:shd w:fill="D9EAF7"/>
+          </w:tcPr>
+          <w:p>
+            <w:pPr>
+              <w:spacing w:before="30" w:after="30" w:line="252" w:lineRule="auto"/>
+              <w:jc w:val="center"/>
+            </w:pPr>
+            <w:r>
+              <w:rPr>
+                <w:rFonts w:ascii="黑体" w:hAnsi="黑体" w:eastAsia="黑体"/>
+                <w:b/>
+                <w:sz w:val="18"/>
+              </w:rPr>
+              <w:t>指标</w:t>
+            </w:r>
+          </w:p>
+        </w:tc>
+        <w:tc>
+          <w:tcPr>
+            <w:tcW w:type="dxa" w:w="1757"/>
+            <w:vAlign w:val="center"/>
+            <w:shd w:fill="D9EAF7"/>
+          </w:tcPr>
+          <w:p>
+            <w:pPr>
+              <w:spacing w:before="30" w:after="30" w:line="252" w:lineRule="auto"/>
+              <w:jc w:val="center"/>
+            </w:pPr>
+            <w:r>
+              <w:rPr>
+                <w:rFonts w:ascii="黑体" w:hAnsi="黑体" w:eastAsia="黑体"/>
+                <w:b/>
+                <w:sz w:val="18"/>
+              </w:rPr>
+              <w:t>三种子均值</w:t>
+            </w:r>
+          </w:p>
+        </w:tc>
+        <w:tc>
+          <w:tcPr>
+            <w:tcW w:type="dxa" w:w="1700"/>
+            <w:vAlign w:val="center"/>
+            <w:shd w:fill="D9EAF7"/>
+          </w:tcPr>
+          <w:p>
+            <w:pPr>
+              <w:spacing w:before="30" w:after="30" w:line="252" w:lineRule="auto"/>
+              <w:jc w:val="center"/>
+            </w:pPr>
+            <w:r>
+              <w:rPr>
+                <w:rFonts w:ascii="黑体" w:hAnsi="黑体" w:eastAsia="黑体"/>
+                <w:b/>
+                <w:sz w:val="18"/>
+              </w:rPr>
+              <w:t>样本标准差</w:t>
+            </w:r>
+          </w:p>
+        </w:tc>
+        <w:tc>
+          <w:tcPr>
+            <w:tcW w:type="dxa" w:w="2834"/>
+            <w:vAlign w:val="center"/>
+            <w:shd w:fill="D9EAF7"/>
+          </w:tcPr>
+          <w:p>
+            <w:pPr>
+              <w:spacing w:before="30" w:after="30" w:line="252" w:lineRule="auto"/>
+              <w:jc w:val="center"/>
+            </w:pPr>
+            <w:r>
+              <w:rPr>
+                <w:rFonts w:ascii="黑体" w:hAnsi="黑体" w:eastAsia="黑体"/>
+                <w:b/>
+                <w:sz w:val="18"/>
+              </w:rPr>
+              <w:t>解释</w:t>
+            </w:r>
+          </w:p>
+        </w:tc>
+      </w:tr>
+      <w:tr>
+        <w:tc>
+          <w:tcPr>
+            <w:tcW w:type="dxa" w:w="2437"/>
+            <w:vAlign w:val="center"/>
+          </w:tcPr>
+          <w:p>
+            <w:pPr>
+              <w:spacing w:before="30" w:after="30" w:line="252" w:lineRule="auto"/>
+              <w:jc w:val="center"/>
+            </w:pPr>
+            <w:r>
+              <w:rPr>
+                <w:rFonts w:ascii="宋体" w:hAnsi="宋体" w:eastAsia="宋体"/>
+                <w:b w:val="0"/>
+                <w:sz w:val="18"/>
+              </w:rPr>
+              <w:t>17类种类准确率</w:t>
+            </w:r>
+          </w:p>
+        </w:tc>
+        <w:tc>
+          <w:tcPr>
+            <w:tcW w:type="dxa" w:w="1757"/>
+            <w:vAlign w:val="center"/>
+          </w:tcPr>
+          <w:p>
+            <w:pPr>
+              <w:spacing w:before="30" w:after="30" w:line="252" w:lineRule="auto"/>
+              <w:jc w:val="center"/>
+            </w:pPr>
+            <w:r>
+              <w:rPr>
+                <w:rFonts w:ascii="宋体" w:hAnsi="宋体" w:eastAsia="宋体"/>
+                <w:b w:val="0"/>
+                <w:sz w:val="18"/>
+              </w:rPr>
+              <w:t>56.80%</w:t>
+            </w:r>
+          </w:p>
+        </w:tc>
+        <w:tc>
+          <w:tcPr>
+            <w:tcW w:type="dxa" w:w="1700"/>
+            <w:vAlign w:val="center"/>
+          </w:tcPr>
+          <w:p>
+            <w:pPr>
+              <w:spacing w:before="30" w:after="30" w:line="252" w:lineRule="auto"/>
+              <w:jc w:val="center"/>
+            </w:pPr>
+            <w:r>
+              <w:rPr>
+                <w:rFonts w:ascii="宋体" w:hAnsi="宋体" w:eastAsia="宋体"/>
+                <w:b w:val="0"/>
+                <w:sz w:val="18"/>
+              </w:rPr>
+              <w:t>2.23%</w:t>
+            </w:r>
+          </w:p>
+        </w:tc>
+        <w:tc>
+          <w:tcPr>
+            <w:tcW w:type="dxa" w:w="2834"/>
+            <w:vAlign w:val="center"/>
+          </w:tcPr>
+          <w:p>
+            <w:pPr>
+              <w:spacing w:before="30" w:after="30" w:line="252" w:lineRule="auto"/>
+              <w:jc w:val="center"/>
+            </w:pPr>
+            <w:r>
+              <w:rPr>
+                <w:rFonts w:ascii="宋体" w:hAnsi="宋体" w:eastAsia="宋体"/>
+                <w:b w:val="0"/>
+                <w:sz w:val="18"/>
+              </w:rPr>
+              <w:t>细粒度识别</w:t>
+            </w:r>
+          </w:p>
+        </w:tc>
+      </w:tr>
+      <w:tr>
+        <w:tc>
+          <w:tcPr>
+            <w:tcW w:type="dxa" w:w="2437"/>
+            <w:vAlign w:val="center"/>
+          </w:tcPr>
+          <w:p>
+            <w:pPr>
+              <w:spacing w:before="30" w:after="30" w:line="252" w:lineRule="auto"/>
+              <w:jc w:val="center"/>
+            </w:pPr>
+            <w:r>
+              <w:rPr>
+                <w:rFonts w:ascii="宋体" w:hAnsi="宋体" w:eastAsia="宋体"/>
+                <w:b w:val="0"/>
+                <w:sz w:val="18"/>
+              </w:rPr>
+              <w:t>直接角色头准确率</w:t>
+            </w:r>
+          </w:p>
+        </w:tc>
+        <w:tc>
+          <w:tcPr>
+            <w:tcW w:type="dxa" w:w="1757"/>
+            <w:vAlign w:val="center"/>
+          </w:tcPr>
+          <w:p>
+            <w:pPr>
+              <w:spacing w:before="30" w:after="30" w:line="252" w:lineRule="auto"/>
+              <w:jc w:val="center"/>
+            </w:pPr>
+            <w:r>
+              <w:rPr>
+                <w:rFonts w:ascii="宋体" w:hAnsi="宋体" w:eastAsia="宋体"/>
+                <w:b w:val="0"/>
+                <w:sz w:val="18"/>
+              </w:rPr>
+              <w:t>75.42%</w:t>
+            </w:r>
+          </w:p>
+        </w:tc>
+        <w:tc>
+          <w:tcPr>
+            <w:tcW w:type="dxa" w:w="1700"/>
+            <w:vAlign w:val="center"/>
+          </w:tcPr>
+          <w:p>
+            <w:pPr>
+              <w:spacing w:before="30" w:after="30" w:line="252" w:lineRule="auto"/>
+              <w:jc w:val="center"/>
+            </w:pPr>
+            <w:r>
+              <w:rPr>
+                <w:rFonts w:ascii="宋体" w:hAnsi="宋体" w:eastAsia="宋体"/>
+                <w:b w:val="0"/>
+                <w:sz w:val="18"/>
+              </w:rPr>
+              <w:t>2.59%</w:t>
+            </w:r>
+          </w:p>
+        </w:tc>
+        <w:tc>
+          <w:tcPr>
+            <w:tcW w:type="dxa" w:w="2834"/>
+            <w:vAlign w:val="center"/>
+          </w:tcPr>
+          <w:p>
+            <w:pPr>
+              <w:spacing w:before="30" w:after="30" w:line="252" w:lineRule="auto"/>
+              <w:jc w:val="center"/>
+            </w:pPr>
+            <w:r>
+              <w:rPr>
+                <w:rFonts w:ascii="宋体" w:hAnsi="宋体" w:eastAsia="宋体"/>
+                <w:b w:val="0"/>
+                <w:sz w:val="18"/>
+              </w:rPr>
+              <w:t>四类角色决策</w:t>
+            </w:r>
+          </w:p>
+        </w:tc>
+      </w:tr>
+      <w:tr>
+        <w:tc>
+          <w:tcPr>
+            <w:tcW w:type="dxa" w:w="2437"/>
+            <w:vAlign w:val="center"/>
+          </w:tcPr>
+          <w:p>
+            <w:pPr>
+              <w:spacing w:before="30" w:after="30" w:line="252" w:lineRule="auto"/>
+              <w:jc w:val="center"/>
+            </w:pPr>
+            <w:r>
+              <w:rPr>
+                <w:rFonts w:ascii="宋体" w:hAnsi="宋体" w:eastAsia="宋体"/>
+                <w:b w:val="0"/>
+                <w:sz w:val="18"/>
+              </w:rPr>
+              <w:t>种类预测映射角色准确率</w:t>
+            </w:r>
+          </w:p>
+        </w:tc>
+        <w:tc>
+          <w:tcPr>
+            <w:tcW w:type="dxa" w:w="1757"/>
+            <w:vAlign w:val="center"/>
+          </w:tcPr>
+          <w:p>
+            <w:pPr>
+              <w:spacing w:before="30" w:after="30" w:line="252" w:lineRule="auto"/>
+              <w:jc w:val="center"/>
+            </w:pPr>
+            <w:r>
+              <w:rPr>
+                <w:rFonts w:ascii="宋体" w:hAnsi="宋体" w:eastAsia="宋体"/>
+                <w:b w:val="0"/>
+                <w:sz w:val="18"/>
+              </w:rPr>
+              <w:t>75.55%</w:t>
+            </w:r>
+          </w:p>
+        </w:tc>
+        <w:tc>
+          <w:tcPr>
+            <w:tcW w:type="dxa" w:w="1700"/>
+            <w:vAlign w:val="center"/>
+          </w:tcPr>
+          <w:p>
+            <w:pPr>
+              <w:spacing w:before="30" w:after="30" w:line="252" w:lineRule="auto"/>
+              <w:jc w:val="center"/>
+            </w:pPr>
+            <w:r>
+              <w:rPr>
+                <w:rFonts w:ascii="宋体" w:hAnsi="宋体" w:eastAsia="宋体"/>
+                <w:b w:val="0"/>
+                <w:sz w:val="18"/>
+              </w:rPr>
+              <w:t>1.93%</w:t>
+            </w:r>
+          </w:p>
+        </w:tc>
+        <w:tc>
+          <w:tcPr>
+            <w:tcW w:type="dxa" w:w="2834"/>
+            <w:vAlign w:val="center"/>
+          </w:tcPr>
+          <w:p>
+            <w:pPr>
+              <w:spacing w:before="30" w:after="30" w:line="252" w:lineRule="auto"/>
+              <w:jc w:val="center"/>
+            </w:pPr>
+            <w:r>
+              <w:rPr>
+                <w:rFonts w:ascii="宋体" w:hAnsi="宋体" w:eastAsia="宋体"/>
+                <w:b w:val="0"/>
+                <w:sz w:val="18"/>
+              </w:rPr>
+              <w:t>g(ŝ) 的硬映射</w:t>
+            </w:r>
+          </w:p>
+        </w:tc>
+      </w:tr>
+      <w:tr>
+        <w:tc>
+          <w:tcPr>
+            <w:tcW w:type="dxa" w:w="2437"/>
+            <w:vAlign w:val="center"/>
+          </w:tcPr>
+          <w:p>
+            <w:pPr>
+              <w:spacing w:before="30" w:after="30" w:line="252" w:lineRule="auto"/>
+              <w:jc w:val="center"/>
+            </w:pPr>
+            <w:r>
+              <w:rPr>
+                <w:rFonts w:ascii="宋体" w:hAnsi="宋体" w:eastAsia="宋体"/>
+                <w:b w:val="0"/>
+                <w:sz w:val="18"/>
+              </w:rPr>
+              <w:t>经验角色风险收缩</w:t>
+            </w:r>
+          </w:p>
+        </w:tc>
+        <w:tc>
+          <w:tcPr>
+            <w:tcW w:type="dxa" w:w="1757"/>
+            <w:vAlign w:val="center"/>
+          </w:tcPr>
+          <w:p>
+            <w:pPr>
+              <w:spacing w:before="30" w:after="30" w:line="252" w:lineRule="auto"/>
+              <w:jc w:val="center"/>
+            </w:pPr>
+            <w:r>
+              <w:rPr>
+                <w:rFonts w:ascii="宋体" w:hAnsi="宋体" w:eastAsia="宋体"/>
+                <w:b w:val="0"/>
+                <w:sz w:val="18"/>
+              </w:rPr>
+              <w:t>18.74个百分点</w:t>
+            </w:r>
+          </w:p>
+        </w:tc>
+        <w:tc>
+          <w:tcPr>
+            <w:tcW w:type="dxa" w:w="1700"/>
+            <w:vAlign w:val="center"/>
+          </w:tcPr>
+          <w:p>
+            <w:pPr>
+              <w:spacing w:before="30" w:after="30" w:line="252" w:lineRule="auto"/>
+              <w:jc w:val="center"/>
+            </w:pPr>
+            <w:r>
+              <w:rPr>
+                <w:rFonts w:ascii="宋体" w:hAnsi="宋体" w:eastAsia="宋体"/>
+                <w:b w:val="0"/>
+                <w:sz w:val="18"/>
+              </w:rPr>
+              <w:t>1.29</w:t>
+            </w:r>
+          </w:p>
+        </w:tc>
+        <w:tc>
+          <w:tcPr>
+            <w:tcW w:type="dxa" w:w="2834"/>
+            <w:vAlign w:val="center"/>
+          </w:tcPr>
+          <w:p>
+            <w:pPr>
+              <w:spacing w:before="30" w:after="30" w:line="252" w:lineRule="auto"/>
+              <w:jc w:val="center"/>
+            </w:pPr>
+            <w:r>
+              <w:rPr>
+                <w:rFonts w:ascii="宋体" w:hAnsi="宋体" w:eastAsia="宋体"/>
+                <w:b w:val="0"/>
+                <w:sz w:val="18"/>
+              </w:rPr>
+              <w:t>种类错但角色仍对</w:t>
+            </w:r>
+          </w:p>
+        </w:tc>
+      </w:tr>
+      <w:tr>
+        <w:tc>
+          <w:tcPr>
+            <w:tcW w:type="dxa" w:w="2437"/>
+            <w:vAlign w:val="center"/>
+          </w:tcPr>
+          <w:p>
+            <w:pPr>
+              <w:spacing w:before="30" w:after="30" w:line="252" w:lineRule="auto"/>
+              <w:jc w:val="center"/>
+            </w:pPr>
+            <w:r>
+              <w:rPr>
+                <w:rFonts w:ascii="宋体" w:hAnsi="宋体" w:eastAsia="宋体"/>
+                <w:b w:val="0"/>
+                <w:sz w:val="18"/>
+              </w:rPr>
+              <w:t>种类错误中角色仍正确</w:t>
+            </w:r>
+          </w:p>
+        </w:tc>
+        <w:tc>
+          <w:tcPr>
+            <w:tcW w:type="dxa" w:w="1757"/>
+            <w:vAlign w:val="center"/>
+          </w:tcPr>
+          <w:p>
+            <w:pPr>
+              <w:spacing w:before="30" w:after="30" w:line="252" w:lineRule="auto"/>
+              <w:jc w:val="center"/>
+            </w:pPr>
+            <w:r>
+              <w:rPr>
+                <w:rFonts w:ascii="宋体" w:hAnsi="宋体" w:eastAsia="宋体"/>
+                <w:b w:val="0"/>
+                <w:sz w:val="18"/>
+              </w:rPr>
+              <w:t>43.41%</w:t>
+            </w:r>
+          </w:p>
+        </w:tc>
+        <w:tc>
+          <w:tcPr>
+            <w:tcW w:type="dxa" w:w="1700"/>
+            <w:vAlign w:val="center"/>
+          </w:tcPr>
+          <w:p>
+            <w:pPr>
+              <w:spacing w:before="30" w:after="30" w:line="252" w:lineRule="auto"/>
+              <w:jc w:val="center"/>
+            </w:pPr>
+            <w:r>
+              <w:rPr>
+                <w:rFonts w:ascii="宋体" w:hAnsi="宋体" w:eastAsia="宋体"/>
+                <w:b w:val="0"/>
+                <w:sz w:val="18"/>
+              </w:rPr>
+              <w:t>2.66%</w:t>
+            </w:r>
+          </w:p>
+        </w:tc>
+        <w:tc>
+          <w:tcPr>
+            <w:tcW w:type="dxa" w:w="2834"/>
+            <w:vAlign w:val="center"/>
+          </w:tcPr>
+          <w:p>
+            <w:pPr>
+              <w:spacing w:before="30" w:after="30" w:line="252" w:lineRule="auto"/>
+              <w:jc w:val="center"/>
+            </w:pPr>
+            <w:r>
+              <w:rPr>
+                <w:rFonts w:ascii="宋体" w:hAnsi="宋体" w:eastAsia="宋体"/>
+                <w:b w:val="0"/>
+                <w:sz w:val="18"/>
+              </w:rPr>
+              <w:t>同角色混淆占比</w:t>
+            </w:r>
+          </w:p>
+        </w:tc>
+      </w:tr>
+    </w:tbl>
+    <w:p>
+      <w:pPr>
+        <w:spacing w:after="60"/>
+      </w:pPr>
+    </w:p>
+    <w:p>
+      <w:pPr>
+        <w:spacing w:line="360" w:lineRule="auto" w:after="80"/>
+      </w:pPr>
+      <w:r>
+        <w:rPr>
+          <w:rFonts w:ascii="宋体" w:hAnsi="宋体" w:eastAsia="宋体"/>
+          <w:sz w:val="21"/>
+        </w:rPr>
+        <w:t>结果表明，种类分类平均错误率约为43.20%，但其中43.41%的种类错误没有改变上层选矿角色，最终形成18.74±1.29个百分点的经验角色风险收缩。该结果验证的是固定映射所诱导的决策层风险收缩，不代表细粒度矿物识别问题已解决。</w:t>
+      </w:r>
+    </w:p>
+    <w:p>
+      <w:pPr>
+        <w:pStyle w:val="21"/>
+      </w:pPr>
+      <w:r>
+        <w:t>5.12 双头分布一致性与 Pinsker 上界</w:t>
+      </w:r>
+    </w:p>
+    <w:p>
+      <w:pPr>
+        <w:spacing w:line="360" w:lineRule="auto" w:after="80"/>
+      </w:pPr>
+      <w:r>
+        <w:rPr>
+          <w:rFonts w:ascii="宋体" w:hAnsi="宋体" w:eastAsia="宋体"/>
+          <w:sz w:val="21"/>
+        </w:rPr>
+        <w:t>种类头经固定矩阵 A 聚合得到角色分布 p̃r，角色头直接输出 pr。训练中实际采用 DKL(p̃r||pr) 约束两者。Pinsker 不等式给出分布差异的可计算上界：</w:t>
+      </w:r>
+    </w:p>
+    <w:p>
+      <w:pPr>
+        <w:keepNext/>
+        <w:jc w:val="center"/>
+      </w:pPr>
+      <w:r>
+        <w:drawing>
+          <wp:inline xmlns:a="http://schemas.openxmlformats.org/drawingml/2006/main" xmlns:pic="http://schemas.openxmlformats.org/drawingml/2006/picture">
+            <wp:extent cx="5328000" cy="551307"/>
+            <wp:docPr id="19" name="Picture 19"/>
+            <wp:cNvGraphicFramePr>
+              <a:graphicFrameLocks noChangeAspect="1"/>
+            </wp:cNvGraphicFramePr>
+            <a:graphic>
+              <a:graphicData uri="http://schemas.openxmlformats.org/drawingml/2006/picture">
+                <pic:pic>
+                  <pic:nvPicPr>
+                    <pic:cNvPr id="0" name="pinsker.png"/>
+                    <pic:cNvPicPr/>
+                  </pic:nvPicPr>
+                  <pic:blipFill>
+                    <a:blip r:embed="rId30"/>
+                    <a:stretch>
+                      <a:fillRect/>
+                    </a:stretch>
+                  </pic:blipFill>
+                  <pic:spPr>
+                    <a:xfrm>
+                      <a:off x="0" y="0"/>
+                      <a:ext cx="5328000" cy="551307"/>
+                    </a:xfrm>
+                    <a:prstGeom prst="rect"/>
+                  </pic:spPr>
+                </pic:pic>
+              </a:graphicData>
+            </a:graphic>
+          </wp:inline>
+        </w:drawing>
+      </w:r>
+    </w:p>
+    <w:p>
+      <w:pPr>
+        <w:pStyle w:val="af7"/>
+        <w:spacing w:line="360" w:lineRule="auto"/>
+        <w:jc w:val="center"/>
+      </w:pPr>
+      <w:r>
+        <w:rPr>
+          <w:rFonts w:ascii="宋体" w:hAnsi="宋体" w:eastAsia="宋体"/>
+          <w:sz w:val="21"/>
+        </w:rPr>
+        <w:t>式（8） 层级一致性损失与总变差上界</w:t>
+      </w:r>
+    </w:p>
+    <w:p>
+      <w:pPr>
+        <w:pStyle w:val="af7"/>
+        <w:jc w:val="center"/>
+      </w:pPr>
+      <w:r>
+        <w:rPr>
+          <w:rFonts w:ascii="宋体" w:hAnsi="宋体" w:eastAsia="宋体"/>
+          <w:sz w:val="19"/>
+        </w:rPr>
+        <w:t>表 19 层级一致性约束的分布效果</w:t>
+      </w:r>
+    </w:p>
+    <w:tbl>
+      <w:tblPr>
+        <w:tblStyle w:val="aff1"/>
+        <w:tblW w:type="auto" w:w="0"/>
+        <w:jc w:val="center"/>
+        <w:tblLayout w:type="fixed"/>
+        <w:tblLook w:firstColumn="1" w:firstRow="1" w:lastColumn="0" w:lastRow="0" w:noHBand="0" w:noVBand="1" w:val="04A0"/>
+      </w:tblPr>
+      <w:tblGrid>
+        <w:gridCol w:w="2296"/>
+        <w:gridCol w:w="2296"/>
+        <w:gridCol w:w="2296"/>
+        <w:gridCol w:w="2296"/>
+      </w:tblGrid>
+      <w:tr>
+        <w:trPr>
+          <w:tblHeader w:val="true"/>
+        </w:trPr>
+        <w:tc>
+          <w:tcPr>
+            <w:tcW w:type="dxa" w:w="2267"/>
+            <w:vAlign w:val="center"/>
+            <w:shd w:fill="D9EAF7"/>
+          </w:tcPr>
+          <w:p>
+            <w:pPr>
+              <w:spacing w:before="30" w:after="30" w:line="252" w:lineRule="auto"/>
+              <w:jc w:val="center"/>
+            </w:pPr>
+            <w:r>
+              <w:rPr>
+                <w:rFonts w:ascii="黑体" w:hAnsi="黑体" w:eastAsia="黑体"/>
+                <w:b/>
+                <w:sz w:val="18"/>
+              </w:rPr>
+              <w:t>设置</w:t>
+            </w:r>
+          </w:p>
+        </w:tc>
+        <w:tc>
+          <w:tcPr>
+            <w:tcW w:type="dxa" w:w="2267"/>
+            <w:vAlign w:val="center"/>
+            <w:shd w:fill="D9EAF7"/>
+          </w:tcPr>
+          <w:p>
+            <w:pPr>
+              <w:spacing w:before="30" w:after="30" w:line="252" w:lineRule="auto"/>
+              <w:jc w:val="center"/>
+            </w:pPr>
+            <w:r>
+              <w:rPr>
+                <w:rFonts w:ascii="黑体" w:hAnsi="黑体" w:eastAsia="黑体"/>
+                <w:b/>
+                <w:sz w:val="18"/>
+              </w:rPr>
+              <w:t>平均 KL</w:t>
+            </w:r>
+          </w:p>
+        </w:tc>
+        <w:tc>
+          <w:tcPr>
+            <w:tcW w:type="dxa" w:w="2267"/>
+            <w:vAlign w:val="center"/>
+            <w:shd w:fill="D9EAF7"/>
+          </w:tcPr>
+          <w:p>
+            <w:pPr>
+              <w:spacing w:before="30" w:after="30" w:line="252" w:lineRule="auto"/>
+              <w:jc w:val="center"/>
+            </w:pPr>
+            <w:r>
+              <w:rPr>
+                <w:rFonts w:ascii="黑体" w:hAnsi="黑体" w:eastAsia="黑体"/>
+                <w:b/>
+                <w:sz w:val="18"/>
+              </w:rPr>
+              <w:t>平均 TV</w:t>
+            </w:r>
+          </w:p>
+        </w:tc>
+        <w:tc>
+          <w:tcPr>
+            <w:tcW w:type="dxa" w:w="2267"/>
+            <w:vAlign w:val="center"/>
+            <w:shd w:fill="D9EAF7"/>
+          </w:tcPr>
+          <w:p>
+            <w:pPr>
+              <w:spacing w:before="30" w:after="30" w:line="252" w:lineRule="auto"/>
+              <w:jc w:val="center"/>
+            </w:pPr>
+            <w:r>
+              <w:rPr>
+                <w:rFonts w:ascii="黑体" w:hAnsi="黑体" w:eastAsia="黑体"/>
+                <w:b/>
+                <w:sz w:val="18"/>
+              </w:rPr>
+              <w:t>双头预测分歧率</w:t>
+            </w:r>
+          </w:p>
+        </w:tc>
+      </w:tr>
+      <w:tr>
+        <w:tc>
+          <w:tcPr>
+            <w:tcW w:type="dxa" w:w="2267"/>
+            <w:vAlign w:val="center"/>
+          </w:tcPr>
+          <w:p>
+            <w:pPr>
+              <w:spacing w:before="30" w:after="30" w:line="252" w:lineRule="auto"/>
+              <w:jc w:val="center"/>
+            </w:pPr>
+            <w:r>
+              <w:rPr>
+                <w:rFonts w:ascii="宋体" w:hAnsi="宋体" w:eastAsia="宋体"/>
+                <w:b w:val="0"/>
+                <w:sz w:val="18"/>
+              </w:rPr>
+              <w:t>完整分层模型</w:t>
+            </w:r>
+          </w:p>
+        </w:tc>
+        <w:tc>
+          <w:tcPr>
+            <w:tcW w:type="dxa" w:w="2267"/>
+            <w:vAlign w:val="center"/>
+          </w:tcPr>
+          <w:p>
+            <w:pPr>
+              <w:spacing w:before="30" w:after="30" w:line="252" w:lineRule="auto"/>
+              <w:jc w:val="center"/>
+            </w:pPr>
+            <w:r>
+              <w:rPr>
+                <w:rFonts w:ascii="宋体" w:hAnsi="宋体" w:eastAsia="宋体"/>
+                <w:b w:val="0"/>
+                <w:sz w:val="18"/>
+              </w:rPr>
+              <w:t>0.0426±0.0028</w:t>
+            </w:r>
+          </w:p>
+        </w:tc>
+        <w:tc>
+          <w:tcPr>
+            <w:tcW w:type="dxa" w:w="2267"/>
+            <w:vAlign w:val="center"/>
+          </w:tcPr>
+          <w:p>
+            <w:pPr>
+              <w:spacing w:before="30" w:after="30" w:line="252" w:lineRule="auto"/>
+              <w:jc w:val="center"/>
+            </w:pPr>
+            <w:r>
+              <w:rPr>
+                <w:rFonts w:ascii="宋体" w:hAnsi="宋体" w:eastAsia="宋体"/>
+                <w:b w:val="0"/>
+                <w:sz w:val="18"/>
+              </w:rPr>
+              <w:t>0.0661±0.0080</w:t>
+            </w:r>
+          </w:p>
+        </w:tc>
+        <w:tc>
+          <w:tcPr>
+            <w:tcW w:type="dxa" w:w="2267"/>
+            <w:vAlign w:val="center"/>
+          </w:tcPr>
+          <w:p>
+            <w:pPr>
+              <w:spacing w:before="30" w:after="30" w:line="252" w:lineRule="auto"/>
+              <w:jc w:val="center"/>
+            </w:pPr>
+            <w:r>
+              <w:rPr>
+                <w:rFonts w:ascii="宋体" w:hAnsi="宋体" w:eastAsia="宋体"/>
+                <w:b w:val="0"/>
+                <w:sz w:val="18"/>
+              </w:rPr>
+              <w:t>6.36%±1.25%</w:t>
+            </w:r>
+          </w:p>
+        </w:tc>
+      </w:tr>
+      <w:tr>
+        <w:tc>
+          <w:tcPr>
+            <w:tcW w:type="dxa" w:w="2267"/>
+            <w:vAlign w:val="center"/>
+          </w:tcPr>
+          <w:p>
+            <w:pPr>
+              <w:spacing w:before="30" w:after="30" w:line="252" w:lineRule="auto"/>
+              <w:jc w:val="center"/>
+            </w:pPr>
+            <w:r>
+              <w:rPr>
+                <w:rFonts w:ascii="宋体" w:hAnsi="宋体" w:eastAsia="宋体"/>
+                <w:b w:val="0"/>
+                <w:sz w:val="18"/>
+              </w:rPr>
+              <w:t>移除一致性项</w:t>
+            </w:r>
+          </w:p>
+        </w:tc>
+        <w:tc>
+          <w:tcPr>
+            <w:tcW w:type="dxa" w:w="2267"/>
+            <w:vAlign w:val="center"/>
+          </w:tcPr>
+          <w:p>
+            <w:pPr>
+              <w:spacing w:before="30" w:after="30" w:line="252" w:lineRule="auto"/>
+              <w:jc w:val="center"/>
+            </w:pPr>
+            <w:r>
+              <w:rPr>
+                <w:rFonts w:ascii="宋体" w:hAnsi="宋体" w:eastAsia="宋体"/>
+                <w:b w:val="0"/>
+                <w:sz w:val="18"/>
+              </w:rPr>
+              <w:t>0.0565±0.0012</w:t>
+            </w:r>
+          </w:p>
+        </w:tc>
+        <w:tc>
+          <w:tcPr>
+            <w:tcW w:type="dxa" w:w="2267"/>
+            <w:vAlign w:val="center"/>
+          </w:tcPr>
+          <w:p>
+            <w:pPr>
+              <w:spacing w:before="30" w:after="30" w:line="252" w:lineRule="auto"/>
+              <w:jc w:val="center"/>
+            </w:pPr>
+            <w:r>
+              <w:rPr>
+                <w:rFonts w:ascii="宋体" w:hAnsi="宋体" w:eastAsia="宋体"/>
+                <w:b w:val="0"/>
+                <w:sz w:val="18"/>
+              </w:rPr>
+              <w:t>0.0752±0.0117</w:t>
+            </w:r>
+          </w:p>
+        </w:tc>
+        <w:tc>
+          <w:tcPr>
+            <w:tcW w:type="dxa" w:w="2267"/>
+            <w:vAlign w:val="center"/>
+          </w:tcPr>
+          <w:p>
+            <w:pPr>
+              <w:spacing w:before="30" w:after="30" w:line="252" w:lineRule="auto"/>
+              <w:jc w:val="center"/>
+            </w:pPr>
+            <w:r>
+              <w:rPr>
+                <w:rFonts w:ascii="宋体" w:hAnsi="宋体" w:eastAsia="宋体"/>
+                <w:b w:val="0"/>
+                <w:sz w:val="18"/>
+              </w:rPr>
+              <w:t>7.42%±1.17%</w:t>
+            </w:r>
+          </w:p>
+        </w:tc>
+      </w:tr>
+    </w:tbl>
+    <w:p>
+      <w:pPr>
+        <w:spacing w:after="60"/>
+      </w:pPr>
+    </w:p>
+    <w:p>
+      <w:pPr>
+        <w:keepNext/>
+        <w:jc w:val="center"/>
+      </w:pPr>
+      <w:r>
+        <w:drawing>
+          <wp:inline xmlns:a="http://schemas.openxmlformats.org/drawingml/2006/main" xmlns:pic="http://schemas.openxmlformats.org/drawingml/2006/picture">
+            <wp:extent cx="5472000" cy="3648000"/>
+            <wp:docPr id="20" name="Picture 20"/>
+            <wp:cNvGraphicFramePr>
+              <a:graphicFrameLocks noChangeAspect="1"/>
+            </wp:cNvGraphicFramePr>
+            <a:graphic>
+              <a:graphicData uri="http://schemas.openxmlformats.org/drawingml/2006/picture">
+                <pic:pic>
+                  <pic:nvPicPr>
+                    <pic:cNvPr id="0" name="fig_hierarchy_kl_disagreement.png"/>
+                    <pic:cNvPicPr/>
+                  </pic:nvPicPr>
+                  <pic:blipFill>
+                    <a:blip r:embed="rId31"/>
+                    <a:stretch>
+                      <a:fillRect/>
+                    </a:stretch>
+                  </pic:blipFill>
+                  <pic:spPr>
+                    <a:xfrm>
+                      <a:off x="0" y="0"/>
+                      <a:ext cx="5472000" cy="3648000"/>
+                    </a:xfrm>
+                    <a:prstGeom prst="rect"/>
+                  </pic:spPr>
+                </pic:pic>
+              </a:graphicData>
+            </a:graphic>
+          </wp:inline>
+        </w:drawing>
+      </w:r>
+    </w:p>
+    <w:p>
+      <w:pPr>
+        <w:pStyle w:val="af7"/>
+        <w:jc w:val="center"/>
+      </w:pPr>
+      <w:r>
+        <w:rPr>
+          <w:rFonts w:ascii="宋体" w:hAnsi="宋体" w:eastAsia="宋体"/>
+          <w:sz w:val="19"/>
+        </w:rPr>
+        <w:t>图 13 一致性约束对 KL 散度和双头分歧的影响</w:t>
+      </w:r>
+    </w:p>
+    <w:p>
+      <w:pPr>
+        <w:spacing w:line="360" w:lineRule="auto" w:after="80"/>
+      </w:pPr>
+      <w:r>
+        <w:rPr>
+          <w:rFonts w:ascii="宋体" w:hAnsi="宋体" w:eastAsia="宋体"/>
+          <w:sz w:val="21"/>
+        </w:rPr>
+        <w:t>一致性项使平均 KL 由0.0565降至0.0426，平均 TV 由0.0752降至0.0661，双头预测分歧率由7.42%降至6.36%。三种子上 KL 均下降，但角色准确率没有同步稳定提高，因此该约束的可辩护贡献是提高层级分布一致性，而不是保证分类精度提升。</w:t>
+      </w:r>
+    </w:p>
+    <w:p>
+      <w:pPr>
+        <w:pStyle w:val="21"/>
+      </w:pPr>
+      <w:r>
+        <w:t>5.13 温度校准与独立风险认证</w:t>
+      </w:r>
+    </w:p>
+    <w:p>
+      <w:pPr>
+        <w:spacing w:line="360" w:lineRule="auto" w:after="80"/>
+      </w:pPr>
+      <w:r>
+        <w:rPr>
+          <w:rFonts w:ascii="宋体" w:hAnsi="宋体" w:eastAsia="宋体"/>
+          <w:sz w:val="21"/>
+        </w:rPr>
+        <w:t>为避免在测试集上反复选择阈值，将原验证集按 split_group_id 分组并按角色分层拆为温度拟合集与风险认证集，二者无分组重叠。温度参数仅在拟合集上最小化 NLL：</w:t>
+      </w:r>
+    </w:p>
+    <w:p>
+      <w:pPr>
+        <w:keepNext/>
+        <w:jc w:val="center"/>
+      </w:pPr>
+      <w:r>
+        <w:drawing>
+          <wp:inline xmlns:a="http://schemas.openxmlformats.org/drawingml/2006/main" xmlns:pic="http://schemas.openxmlformats.org/drawingml/2006/picture">
+            <wp:extent cx="5580000" cy="488822"/>
+            <wp:docPr id="21" name="Picture 21"/>
+            <wp:cNvGraphicFramePr>
+              <a:graphicFrameLocks noChangeAspect="1"/>
+            </wp:cNvGraphicFramePr>
+            <a:graphic>
+              <a:graphicData uri="http://schemas.openxmlformats.org/drawingml/2006/picture">
+                <pic:pic>
+                  <pic:nvPicPr>
+                    <pic:cNvPr id="0" name="calibration.png"/>
+                    <pic:cNvPicPr/>
+                  </pic:nvPicPr>
+                  <pic:blipFill>
+                    <a:blip r:embed="rId32"/>
+                    <a:stretch>
+                      <a:fillRect/>
+                    </a:stretch>
+                  </pic:blipFill>
+                  <pic:spPr>
+                    <a:xfrm>
+                      <a:off x="0" y="0"/>
+                      <a:ext cx="5580000" cy="488822"/>
+                    </a:xfrm>
+                    <a:prstGeom prst="rect"/>
+                  </pic:spPr>
+                </pic:pic>
+              </a:graphicData>
+            </a:graphic>
+          </wp:inline>
+        </w:drawing>
+      </w:r>
+    </w:p>
+    <w:p>
+      <w:pPr>
+        <w:pStyle w:val="af7"/>
+        <w:spacing w:line="360" w:lineRule="auto"/>
+        <w:jc w:val="center"/>
+      </w:pPr>
+      <w:r>
+        <w:rPr>
+          <w:rFonts w:ascii="宋体" w:hAnsi="宋体" w:eastAsia="宋体"/>
+          <w:sz w:val="21"/>
+        </w:rPr>
+        <w:t>式（9） 验证集温度缩放</w:t>
+      </w:r>
+    </w:p>
+    <w:p>
+      <w:pPr>
+        <w:spacing w:line="360" w:lineRule="auto" w:after="80"/>
+      </w:pPr>
+      <w:r>
+        <w:rPr>
+          <w:rFonts w:ascii="宋体" w:hAnsi="宋体" w:eastAsia="宋体"/>
+          <w:sz w:val="21"/>
+        </w:rPr>
+        <w:t>对预先给定的21个阈值同时计算单侧 Clopper–Pearson 上界，并采用 Bonferroni 校正控制多阈值选择误差；随后在认证集上选择满足风险上界 δ 的最大覆盖率阈值：</w:t>
+      </w:r>
+    </w:p>
+    <w:p>
+      <w:pPr>
+        <w:keepNext/>
+        <w:jc w:val="center"/>
+      </w:pPr>
+      <w:r>
+        <w:drawing>
+          <wp:inline xmlns:a="http://schemas.openxmlformats.org/drawingml/2006/main" xmlns:pic="http://schemas.openxmlformats.org/drawingml/2006/picture">
+            <wp:extent cx="5688000" cy="370453"/>
+            <wp:docPr id="22" name="Picture 22"/>
+            <wp:cNvGraphicFramePr>
+              <a:graphicFrameLocks noChangeAspect="1"/>
+            </wp:cNvGraphicFramePr>
+            <a:graphic>
+              <a:graphicData uri="http://schemas.openxmlformats.org/drawingml/2006/picture">
+                <pic:pic>
+                  <pic:nvPicPr>
+                    <pic:cNvPr id="0" name="certificate.png"/>
+                    <pic:cNvPicPr/>
+                  </pic:nvPicPr>
+                  <pic:blipFill>
+                    <a:blip r:embed="rId33"/>
+                    <a:stretch>
+                      <a:fillRect/>
+                    </a:stretch>
+                  </pic:blipFill>
+                  <pic:spPr>
+                    <a:xfrm>
+                      <a:off x="0" y="0"/>
+                      <a:ext cx="5688000" cy="370453"/>
+                    </a:xfrm>
+                    <a:prstGeom prst="rect"/>
+                  </pic:spPr>
+                </pic:pic>
+              </a:graphicData>
+            </a:graphic>
+          </wp:inline>
+        </w:drawing>
+      </w:r>
+    </w:p>
+    <w:p>
+      <w:pPr>
+        <w:pStyle w:val="af7"/>
+        <w:spacing w:line="360" w:lineRule="auto"/>
+        <w:jc w:val="center"/>
+      </w:pPr>
+      <w:r>
+        <w:rPr>
+          <w:rFonts w:ascii="宋体" w:hAnsi="宋体" w:eastAsia="宋体"/>
+          <w:sz w:val="21"/>
+        </w:rPr>
+        <w:t>式（10） 多阈值校正后的选择性风险证书</w:t>
+      </w:r>
+    </w:p>
+    <w:p>
+      <w:pPr>
+        <w:pStyle w:val="af7"/>
+        <w:jc w:val="center"/>
+      </w:pPr>
+      <w:r>
+        <w:rPr>
+          <w:rFonts w:ascii="宋体" w:hAnsi="宋体" w:eastAsia="宋体"/>
+          <w:sz w:val="19"/>
+        </w:rPr>
+        <w:t>表 20 温度校准与选择性识别总体指标</w:t>
+      </w:r>
+    </w:p>
+    <w:tbl>
+      <w:tblPr>
+        <w:tblStyle w:val="aff1"/>
+        <w:tblW w:type="auto" w:w="0"/>
+        <w:jc w:val="center"/>
+        <w:tblLayout w:type="fixed"/>
+        <w:tblLook w:firstColumn="1" w:firstRow="1" w:lastColumn="0" w:lastRow="0" w:noHBand="0" w:noVBand="1" w:val="04A0"/>
+      </w:tblPr>
+      <w:tblGrid>
+        <w:gridCol w:w="2296"/>
+        <w:gridCol w:w="2296"/>
+        <w:gridCol w:w="2296"/>
+        <w:gridCol w:w="2296"/>
+      </w:tblGrid>
+      <w:tr>
+        <w:trPr>
+          <w:tblHeader w:val="true"/>
+        </w:trPr>
+        <w:tc>
+          <w:tcPr>
+            <w:tcW w:type="dxa" w:w="2267"/>
+            <w:vAlign w:val="center"/>
+            <w:shd w:fill="D9EAF7"/>
+          </w:tcPr>
+          <w:p>
+            <w:pPr>
+              <w:spacing w:before="30" w:after="30" w:line="252" w:lineRule="auto"/>
+              <w:jc w:val="center"/>
+            </w:pPr>
+            <w:r>
+              <w:rPr>
+                <w:rFonts w:ascii="黑体" w:hAnsi="黑体" w:eastAsia="黑体"/>
+                <w:b/>
+                <w:sz w:val="18"/>
+              </w:rPr>
+              <w:t>指标</w:t>
+            </w:r>
+          </w:p>
+        </w:tc>
+        <w:tc>
+          <w:tcPr>
+            <w:tcW w:type="dxa" w:w="2267"/>
+            <w:vAlign w:val="center"/>
+            <w:shd w:fill="D9EAF7"/>
+          </w:tcPr>
+          <w:p>
+            <w:pPr>
+              <w:spacing w:before="30" w:after="30" w:line="252" w:lineRule="auto"/>
+              <w:jc w:val="center"/>
+            </w:pPr>
+            <w:r>
+              <w:rPr>
+                <w:rFonts w:ascii="黑体" w:hAnsi="黑体" w:eastAsia="黑体"/>
+                <w:b/>
+                <w:sz w:val="18"/>
+              </w:rPr>
+              <w:t>校准前</w:t>
+            </w:r>
+          </w:p>
+        </w:tc>
+        <w:tc>
+          <w:tcPr>
+            <w:tcW w:type="dxa" w:w="2267"/>
+            <w:vAlign w:val="center"/>
+            <w:shd w:fill="D9EAF7"/>
+          </w:tcPr>
+          <w:p>
+            <w:pPr>
+              <w:spacing w:before="30" w:after="30" w:line="252" w:lineRule="auto"/>
+              <w:jc w:val="center"/>
+            </w:pPr>
+            <w:r>
+              <w:rPr>
+                <w:rFonts w:ascii="黑体" w:hAnsi="黑体" w:eastAsia="黑体"/>
+                <w:b/>
+                <w:sz w:val="18"/>
+              </w:rPr>
+              <w:t>校准后</w:t>
+            </w:r>
+          </w:p>
+        </w:tc>
+        <w:tc>
+          <w:tcPr>
+            <w:tcW w:type="dxa" w:w="2154"/>
+            <w:vAlign w:val="center"/>
+            <w:shd w:fill="D9EAF7"/>
+          </w:tcPr>
+          <w:p>
+            <w:pPr>
+              <w:spacing w:before="30" w:after="30" w:line="252" w:lineRule="auto"/>
+              <w:jc w:val="center"/>
+            </w:pPr>
+            <w:r>
+              <w:rPr>
+                <w:rFonts w:ascii="黑体" w:hAnsi="黑体" w:eastAsia="黑体"/>
+                <w:b/>
+                <w:sz w:val="18"/>
+              </w:rPr>
+              <w:t>变化</w:t>
+            </w:r>
+          </w:p>
+        </w:tc>
+      </w:tr>
+      <w:tr>
+        <w:tc>
+          <w:tcPr>
+            <w:tcW w:type="dxa" w:w="2267"/>
+            <w:vAlign w:val="center"/>
+          </w:tcPr>
+          <w:p>
+            <w:pPr>
+              <w:spacing w:before="30" w:after="30" w:line="252" w:lineRule="auto"/>
+              <w:jc w:val="center"/>
+            </w:pPr>
+            <w:r>
+              <w:rPr>
+                <w:rFonts w:ascii="宋体" w:hAnsi="宋体" w:eastAsia="宋体"/>
+                <w:b w:val="0"/>
+                <w:sz w:val="18"/>
+              </w:rPr>
+              <w:t>测试集 ECE（15箱）</w:t>
+            </w:r>
+          </w:p>
+        </w:tc>
+        <w:tc>
+          <w:tcPr>
+            <w:tcW w:type="dxa" w:w="2267"/>
+            <w:vAlign w:val="center"/>
+          </w:tcPr>
+          <w:p>
+            <w:pPr>
+              <w:spacing w:before="30" w:after="30" w:line="252" w:lineRule="auto"/>
+              <w:jc w:val="center"/>
+            </w:pPr>
+            <w:r>
+              <w:rPr>
+                <w:rFonts w:ascii="宋体" w:hAnsi="宋体" w:eastAsia="宋体"/>
+                <w:b w:val="0"/>
+                <w:sz w:val="18"/>
+              </w:rPr>
+              <w:t>0.1131±0.0273</w:t>
+            </w:r>
+          </w:p>
+        </w:tc>
+        <w:tc>
+          <w:tcPr>
+            <w:tcW w:type="dxa" w:w="2267"/>
+            <w:vAlign w:val="center"/>
+          </w:tcPr>
+          <w:p>
+            <w:pPr>
+              <w:spacing w:before="30" w:after="30" w:line="252" w:lineRule="auto"/>
+              <w:jc w:val="center"/>
+            </w:pPr>
+            <w:r>
+              <w:rPr>
+                <w:rFonts w:ascii="宋体" w:hAnsi="宋体" w:eastAsia="宋体"/>
+                <w:b w:val="0"/>
+                <w:sz w:val="18"/>
+              </w:rPr>
+              <w:t>0.0342±0.0053</w:t>
+            </w:r>
+          </w:p>
+        </w:tc>
+        <w:tc>
+          <w:tcPr>
+            <w:tcW w:type="dxa" w:w="2154"/>
+            <w:vAlign w:val="center"/>
+          </w:tcPr>
+          <w:p>
+            <w:pPr>
+              <w:spacing w:before="30" w:after="30" w:line="252" w:lineRule="auto"/>
+              <w:jc w:val="center"/>
+            </w:pPr>
+            <w:r>
+              <w:rPr>
+                <w:rFonts w:ascii="宋体" w:hAnsi="宋体" w:eastAsia="宋体"/>
+                <w:b w:val="0"/>
+                <w:sz w:val="18"/>
+              </w:rPr>
+              <w:t>降低</w:t>
+            </w:r>
+          </w:p>
+        </w:tc>
+      </w:tr>
+      <w:tr>
+        <w:tc>
+          <w:tcPr>
+            <w:tcW w:type="dxa" w:w="2267"/>
+            <w:vAlign w:val="center"/>
+          </w:tcPr>
+          <w:p>
+            <w:pPr>
+              <w:spacing w:before="30" w:after="30" w:line="252" w:lineRule="auto"/>
+              <w:jc w:val="center"/>
+            </w:pPr>
+            <w:r>
+              <w:rPr>
+                <w:rFonts w:ascii="宋体" w:hAnsi="宋体" w:eastAsia="宋体"/>
+                <w:b w:val="0"/>
+                <w:sz w:val="18"/>
+              </w:rPr>
+              <w:t>测试集 NLL</w:t>
+            </w:r>
+          </w:p>
+        </w:tc>
+        <w:tc>
+          <w:tcPr>
+            <w:tcW w:type="dxa" w:w="2267"/>
+            <w:vAlign w:val="center"/>
+          </w:tcPr>
+          <w:p>
+            <w:pPr>
+              <w:spacing w:before="30" w:after="30" w:line="252" w:lineRule="auto"/>
+              <w:jc w:val="center"/>
+            </w:pPr>
+            <w:r>
+              <w:rPr>
+                <w:rFonts w:ascii="宋体" w:hAnsi="宋体" w:eastAsia="宋体"/>
+                <w:b w:val="0"/>
+                <w:sz w:val="18"/>
+              </w:rPr>
+              <w:t>0.8399±0.1252</w:t>
+            </w:r>
+          </w:p>
+        </w:tc>
+        <w:tc>
+          <w:tcPr>
+            <w:tcW w:type="dxa" w:w="2267"/>
+            <w:vAlign w:val="center"/>
+          </w:tcPr>
+          <w:p>
+            <w:pPr>
+              <w:spacing w:before="30" w:after="30" w:line="252" w:lineRule="auto"/>
+              <w:jc w:val="center"/>
+            </w:pPr>
+            <w:r>
+              <w:rPr>
+                <w:rFonts w:ascii="宋体" w:hAnsi="宋体" w:eastAsia="宋体"/>
+                <w:b w:val="0"/>
+                <w:sz w:val="18"/>
+              </w:rPr>
+              <w:t>0.6633±0.0272</w:t>
+            </w:r>
+          </w:p>
+        </w:tc>
+        <w:tc>
+          <w:tcPr>
+            <w:tcW w:type="dxa" w:w="2154"/>
+            <w:vAlign w:val="center"/>
+          </w:tcPr>
+          <w:p>
+            <w:pPr>
+              <w:spacing w:before="30" w:after="30" w:line="252" w:lineRule="auto"/>
+              <w:jc w:val="center"/>
+            </w:pPr>
+            <w:r>
+              <w:rPr>
+                <w:rFonts w:ascii="宋体" w:hAnsi="宋体" w:eastAsia="宋体"/>
+                <w:b w:val="0"/>
+                <w:sz w:val="18"/>
+              </w:rPr>
+              <w:t>降低</w:t>
+            </w:r>
+          </w:p>
+        </w:tc>
+      </w:tr>
+      <w:tr>
+        <w:tc>
+          <w:tcPr>
+            <w:tcW w:type="dxa" w:w="2267"/>
+            <w:vAlign w:val="center"/>
+          </w:tcPr>
+          <w:p>
+            <w:pPr>
+              <w:spacing w:before="30" w:after="30" w:line="252" w:lineRule="auto"/>
+              <w:jc w:val="center"/>
+            </w:pPr>
+            <w:r>
+              <w:rPr>
+                <w:rFonts w:ascii="宋体" w:hAnsi="宋体" w:eastAsia="宋体"/>
+                <w:b w:val="0"/>
+                <w:sz w:val="18"/>
+              </w:rPr>
+              <w:t>温度 T*</w:t>
+            </w:r>
+          </w:p>
+        </w:tc>
+        <w:tc>
+          <w:tcPr>
+            <w:tcW w:type="dxa" w:w="2267"/>
+            <w:vAlign w:val="center"/>
+          </w:tcPr>
+          <w:p>
+            <w:pPr>
+              <w:spacing w:before="30" w:after="30" w:line="252" w:lineRule="auto"/>
+              <w:jc w:val="center"/>
+            </w:pPr>
+            <w:r>
+              <w:rPr>
+                <w:rFonts w:ascii="宋体" w:hAnsi="宋体" w:eastAsia="宋体"/>
+                <w:b w:val="0"/>
+                <w:sz w:val="18"/>
+              </w:rPr>
+              <w:t>—</w:t>
+            </w:r>
+          </w:p>
+        </w:tc>
+        <w:tc>
+          <w:tcPr>
+            <w:tcW w:type="dxa" w:w="2267"/>
+            <w:vAlign w:val="center"/>
+          </w:tcPr>
+          <w:p>
+            <w:pPr>
+              <w:spacing w:before="30" w:after="30" w:line="252" w:lineRule="auto"/>
+              <w:jc w:val="center"/>
+            </w:pPr>
+            <w:r>
+              <w:rPr>
+                <w:rFonts w:ascii="宋体" w:hAnsi="宋体" w:eastAsia="宋体"/>
+                <w:b w:val="0"/>
+                <w:sz w:val="18"/>
+              </w:rPr>
+              <w:t>1.974±0.619</w:t>
+            </w:r>
+          </w:p>
+        </w:tc>
+        <w:tc>
+          <w:tcPr>
+            <w:tcW w:type="dxa" w:w="2154"/>
+            <w:vAlign w:val="center"/>
+          </w:tcPr>
+          <w:p>
+            <w:pPr>
+              <w:spacing w:before="30" w:after="30" w:line="252" w:lineRule="auto"/>
+              <w:jc w:val="center"/>
+            </w:pPr>
+            <w:r>
+              <w:rPr>
+                <w:rFonts w:ascii="宋体" w:hAnsi="宋体" w:eastAsia="宋体"/>
+                <w:b w:val="0"/>
+                <w:sz w:val="18"/>
+              </w:rPr>
+              <w:t>验证集拟合</w:t>
+            </w:r>
+          </w:p>
+        </w:tc>
+      </w:tr>
+      <w:tr>
+        <w:tc>
+          <w:tcPr>
+            <w:tcW w:type="dxa" w:w="2267"/>
+            <w:vAlign w:val="center"/>
+          </w:tcPr>
+          <w:p>
+            <w:pPr>
+              <w:spacing w:before="30" w:after="30" w:line="252" w:lineRule="auto"/>
+              <w:jc w:val="center"/>
+            </w:pPr>
+            <w:r>
+              <w:rPr>
+                <w:rFonts w:ascii="宋体" w:hAnsi="宋体" w:eastAsia="宋体"/>
+                <w:b w:val="0"/>
+                <w:sz w:val="18"/>
+              </w:rPr>
+              <w:t>测试集 AURC</w:t>
+            </w:r>
+          </w:p>
+        </w:tc>
+        <w:tc>
+          <w:tcPr>
+            <w:tcW w:type="dxa" w:w="2267"/>
+            <w:vAlign w:val="center"/>
+          </w:tcPr>
+          <w:p>
+            <w:pPr>
+              <w:spacing w:before="30" w:after="30" w:line="252" w:lineRule="auto"/>
+              <w:jc w:val="center"/>
+            </w:pPr>
+            <w:r>
+              <w:rPr>
+                <w:rFonts w:ascii="宋体" w:hAnsi="宋体" w:eastAsia="宋体"/>
+                <w:b w:val="0"/>
+                <w:sz w:val="18"/>
+              </w:rPr>
+              <w:t>—</w:t>
+            </w:r>
+          </w:p>
+        </w:tc>
+        <w:tc>
+          <w:tcPr>
+            <w:tcW w:type="dxa" w:w="2267"/>
+            <w:vAlign w:val="center"/>
+          </w:tcPr>
+          <w:p>
+            <w:pPr>
+              <w:spacing w:before="30" w:after="30" w:line="252" w:lineRule="auto"/>
+              <w:jc w:val="center"/>
+            </w:pPr>
+            <w:r>
+              <w:rPr>
+                <w:rFonts w:ascii="宋体" w:hAnsi="宋体" w:eastAsia="宋体"/>
+                <w:b w:val="0"/>
+                <w:sz w:val="18"/>
+              </w:rPr>
+              <w:t>0.1026±0.0141</w:t>
+            </w:r>
+          </w:p>
+        </w:tc>
+        <w:tc>
+          <w:tcPr>
+            <w:tcW w:type="dxa" w:w="2154"/>
+            <w:vAlign w:val="center"/>
+          </w:tcPr>
+          <w:p>
+            <w:pPr>
+              <w:spacing w:before="30" w:after="30" w:line="252" w:lineRule="auto"/>
+              <w:jc w:val="center"/>
+            </w:pPr>
+            <w:r>
+              <w:rPr>
+                <w:rFonts w:ascii="宋体" w:hAnsi="宋体" w:eastAsia="宋体"/>
+                <w:b w:val="0"/>
+                <w:sz w:val="18"/>
+              </w:rPr>
+              <w:t>越低越好</w:t>
+            </w:r>
+          </w:p>
+        </w:tc>
+      </w:tr>
+    </w:tbl>
+    <w:p>
+      <w:pPr>
+        <w:spacing w:after="60"/>
+      </w:pPr>
+    </w:p>
+    <w:p>
+      <w:pPr>
+        <w:pStyle w:val="af7"/>
+        <w:jc w:val="center"/>
+      </w:pPr>
+      <w:r>
+        <w:rPr>
+          <w:rFonts w:ascii="宋体" w:hAnsi="宋体" w:eastAsia="宋体"/>
+          <w:sz w:val="19"/>
+        </w:rPr>
+        <w:t>表 21 独立认证集上的风险证书及一次性测试结果</w:t>
+      </w:r>
+    </w:p>
+    <w:tbl>
+      <w:tblPr>
+        <w:tblStyle w:val="aff1"/>
+        <w:tblW w:type="auto" w:w="0"/>
+        <w:jc w:val="center"/>
+        <w:tblLayout w:type="fixed"/>
+        <w:tblLook w:firstColumn="1" w:firstRow="1" w:lastColumn="0" w:lastRow="0" w:noHBand="0" w:noVBand="1" w:val="04A0"/>
+      </w:tblPr>
+      <w:tblGrid>
+        <w:gridCol w:w="1837"/>
+        <w:gridCol w:w="1837"/>
+        <w:gridCol w:w="1837"/>
+        <w:gridCol w:w="1837"/>
+        <w:gridCol w:w="1837"/>
+      </w:tblGrid>
+      <w:tr>
+        <w:trPr>
+          <w:tblHeader w:val="true"/>
+        </w:trPr>
+        <w:tc>
+          <w:tcPr>
+            <w:tcW w:type="dxa" w:w="1700"/>
+            <w:vAlign w:val="center"/>
+            <w:shd w:fill="D9EAF7"/>
+          </w:tcPr>
+          <w:p>
+            <w:pPr>
+              <w:spacing w:before="30" w:after="30" w:line="252" w:lineRule="auto"/>
+              <w:jc w:val="center"/>
+            </w:pPr>
+            <w:r>
+              <w:rPr>
+                <w:rFonts w:ascii="黑体" w:hAnsi="黑体" w:eastAsia="黑体"/>
+                <w:b/>
+                <w:sz w:val="18"/>
+              </w:rPr>
+              <w:t>风险约束</w:t>
+            </w:r>
+          </w:p>
+        </w:tc>
+        <w:tc>
+          <w:tcPr>
+            <w:tcW w:type="dxa" w:w="1700"/>
+            <w:vAlign w:val="center"/>
+            <w:shd w:fill="D9EAF7"/>
+          </w:tcPr>
+          <w:p>
+            <w:pPr>
+              <w:spacing w:before="30" w:after="30" w:line="252" w:lineRule="auto"/>
+              <w:jc w:val="center"/>
+            </w:pPr>
+            <w:r>
+              <w:rPr>
+                <w:rFonts w:ascii="黑体" w:hAnsi="黑体" w:eastAsia="黑体"/>
+                <w:b/>
+                <w:sz w:val="18"/>
+              </w:rPr>
+              <w:t>取得证书种子</w:t>
+            </w:r>
+          </w:p>
+        </w:tc>
+        <w:tc>
+          <w:tcPr>
+            <w:tcW w:type="dxa" w:w="2154"/>
+            <w:vAlign w:val="center"/>
+            <w:shd w:fill="D9EAF7"/>
+          </w:tcPr>
+          <w:p>
+            <w:pPr>
+              <w:spacing w:before="30" w:after="30" w:line="252" w:lineRule="auto"/>
+              <w:jc w:val="center"/>
+            </w:pPr>
+            <w:r>
+              <w:rPr>
+                <w:rFonts w:ascii="黑体" w:hAnsi="黑体" w:eastAsia="黑体"/>
+                <w:b/>
+                <w:sz w:val="18"/>
+              </w:rPr>
+              <w:t>认证阈值</w:t>
+            </w:r>
+          </w:p>
+        </w:tc>
+        <w:tc>
+          <w:tcPr>
+            <w:tcW w:type="dxa" w:w="1927"/>
+            <w:vAlign w:val="center"/>
+            <w:shd w:fill="D9EAF7"/>
+          </w:tcPr>
+          <w:p>
+            <w:pPr>
+              <w:spacing w:before="30" w:after="30" w:line="252" w:lineRule="auto"/>
+              <w:jc w:val="center"/>
+            </w:pPr>
+            <w:r>
+              <w:rPr>
+                <w:rFonts w:ascii="黑体" w:hAnsi="黑体" w:eastAsia="黑体"/>
+                <w:b/>
+                <w:sz w:val="18"/>
+              </w:rPr>
+              <w:t>测试平均覆盖率</w:t>
+            </w:r>
+          </w:p>
+        </w:tc>
+        <w:tc>
+          <w:tcPr>
+            <w:tcW w:type="dxa" w:w="1927"/>
+            <w:vAlign w:val="center"/>
+            <w:shd w:fill="D9EAF7"/>
+          </w:tcPr>
+          <w:p>
+            <w:pPr>
+              <w:spacing w:before="30" w:after="30" w:line="252" w:lineRule="auto"/>
+              <w:jc w:val="center"/>
+            </w:pPr>
+            <w:r>
+              <w:rPr>
+                <w:rFonts w:ascii="黑体" w:hAnsi="黑体" w:eastAsia="黑体"/>
+                <w:b/>
+                <w:sz w:val="18"/>
+              </w:rPr>
+              <w:t>测试平均风险</w:t>
+            </w:r>
+          </w:p>
+        </w:tc>
+      </w:tr>
+      <w:tr>
+        <w:tc>
+          <w:tcPr>
+            <w:tcW w:type="dxa" w:w="1700"/>
+            <w:vAlign w:val="center"/>
+          </w:tcPr>
+          <w:p>
+            <w:pPr>
+              <w:spacing w:before="30" w:after="30" w:line="252" w:lineRule="auto"/>
+              <w:jc w:val="center"/>
+            </w:pPr>
+            <w:r>
+              <w:rPr>
+                <w:rFonts w:ascii="宋体" w:hAnsi="宋体" w:eastAsia="宋体"/>
+                <w:b w:val="0"/>
+                <w:sz w:val="18"/>
+              </w:rPr>
+              <w:t>δ=0.10</w:t>
+            </w:r>
+          </w:p>
+        </w:tc>
+        <w:tc>
+          <w:tcPr>
+            <w:tcW w:type="dxa" w:w="1700"/>
+            <w:vAlign w:val="center"/>
+          </w:tcPr>
+          <w:p>
+            <w:pPr>
+              <w:spacing w:before="30" w:after="30" w:line="252" w:lineRule="auto"/>
+              <w:jc w:val="center"/>
+            </w:pPr>
+            <w:r>
+              <w:rPr>
+                <w:rFonts w:ascii="宋体" w:hAnsi="宋体" w:eastAsia="宋体"/>
+                <w:b w:val="0"/>
+                <w:sz w:val="18"/>
+              </w:rPr>
+              <w:t>1/3</w:t>
+            </w:r>
+          </w:p>
+        </w:tc>
+        <w:tc>
+          <w:tcPr>
+            <w:tcW w:type="dxa" w:w="2154"/>
+            <w:vAlign w:val="center"/>
+          </w:tcPr>
+          <w:p>
+            <w:pPr>
+              <w:spacing w:before="30" w:after="30" w:line="252" w:lineRule="auto"/>
+              <w:jc w:val="center"/>
+            </w:pPr>
+            <w:r>
+              <w:rPr>
+                <w:rFonts w:ascii="宋体" w:hAnsi="宋体" w:eastAsia="宋体"/>
+                <w:b w:val="0"/>
+                <w:sz w:val="18"/>
+              </w:rPr>
+              <w:t>0.95</w:t>
+            </w:r>
+          </w:p>
+        </w:tc>
+        <w:tc>
+          <w:tcPr>
+            <w:tcW w:type="dxa" w:w="1927"/>
+            <w:vAlign w:val="center"/>
+          </w:tcPr>
+          <w:p>
+            <w:pPr>
+              <w:spacing w:before="30" w:after="30" w:line="252" w:lineRule="auto"/>
+              <w:jc w:val="center"/>
+            </w:pPr>
+            <w:r>
+              <w:rPr>
+                <w:rFonts w:ascii="宋体" w:hAnsi="宋体" w:eastAsia="宋体"/>
+                <w:b w:val="0"/>
+                <w:sz w:val="18"/>
+              </w:rPr>
+              <w:t>19.78%</w:t>
+            </w:r>
+          </w:p>
+        </w:tc>
+        <w:tc>
+          <w:tcPr>
+            <w:tcW w:type="dxa" w:w="1927"/>
+            <w:vAlign w:val="center"/>
+          </w:tcPr>
+          <w:p>
+            <w:pPr>
+              <w:spacing w:before="30" w:after="30" w:line="252" w:lineRule="auto"/>
+              <w:jc w:val="center"/>
+            </w:pPr>
+            <w:r>
+              <w:rPr>
+                <w:rFonts w:ascii="宋体" w:hAnsi="宋体" w:eastAsia="宋体"/>
+                <w:b w:val="0"/>
+                <w:sz w:val="18"/>
+              </w:rPr>
+              <w:t>1.97%</w:t>
+            </w:r>
+          </w:p>
+        </w:tc>
+      </w:tr>
+      <w:tr>
+        <w:tc>
+          <w:tcPr>
+            <w:tcW w:type="dxa" w:w="1700"/>
+            <w:vAlign w:val="center"/>
+          </w:tcPr>
+          <w:p>
+            <w:pPr>
+              <w:spacing w:before="30" w:after="30" w:line="252" w:lineRule="auto"/>
+              <w:jc w:val="center"/>
+            </w:pPr>
+            <w:r>
+              <w:rPr>
+                <w:rFonts w:ascii="宋体" w:hAnsi="宋体" w:eastAsia="宋体"/>
+                <w:b w:val="0"/>
+                <w:sz w:val="18"/>
+              </w:rPr>
+              <w:t>δ=0.15</w:t>
+            </w:r>
+          </w:p>
+        </w:tc>
+        <w:tc>
+          <w:tcPr>
+            <w:tcW w:type="dxa" w:w="1700"/>
+            <w:vAlign w:val="center"/>
+          </w:tcPr>
+          <w:p>
+            <w:pPr>
+              <w:spacing w:before="30" w:after="30" w:line="252" w:lineRule="auto"/>
+              <w:jc w:val="center"/>
+            </w:pPr>
+            <w:r>
+              <w:rPr>
+                <w:rFonts w:ascii="宋体" w:hAnsi="宋体" w:eastAsia="宋体"/>
+                <w:b w:val="0"/>
+                <w:sz w:val="18"/>
+              </w:rPr>
+              <w:t>3/3</w:t>
+            </w:r>
+          </w:p>
+        </w:tc>
+        <w:tc>
+          <w:tcPr>
+            <w:tcW w:type="dxa" w:w="2154"/>
+            <w:vAlign w:val="center"/>
+          </w:tcPr>
+          <w:p>
+            <w:pPr>
+              <w:spacing w:before="30" w:after="30" w:line="252" w:lineRule="auto"/>
+              <w:jc w:val="center"/>
+            </w:pPr>
+            <w:r>
+              <w:rPr>
+                <w:rFonts w:ascii="宋体" w:hAnsi="宋体" w:eastAsia="宋体"/>
+                <w:b w:val="0"/>
+                <w:sz w:val="18"/>
+              </w:rPr>
+              <w:t>0.85, 0.80, 0.80</w:t>
+            </w:r>
+          </w:p>
+        </w:tc>
+        <w:tc>
+          <w:tcPr>
+            <w:tcW w:type="dxa" w:w="1927"/>
+            <w:vAlign w:val="center"/>
+          </w:tcPr>
+          <w:p>
+            <w:pPr>
+              <w:spacing w:before="30" w:after="30" w:line="252" w:lineRule="auto"/>
+              <w:jc w:val="center"/>
+            </w:pPr>
+            <w:r>
+              <w:rPr>
+                <w:rFonts w:ascii="宋体" w:hAnsi="宋体" w:eastAsia="宋体"/>
+                <w:b w:val="0"/>
+                <w:sz w:val="18"/>
+              </w:rPr>
+              <w:t>46.29%</w:t>
+            </w:r>
+          </w:p>
+        </w:tc>
+        <w:tc>
+          <w:tcPr>
+            <w:tcW w:type="dxa" w:w="1927"/>
+            <w:vAlign w:val="center"/>
+          </w:tcPr>
+          <w:p>
+            <w:pPr>
+              <w:spacing w:before="30" w:after="30" w:line="252" w:lineRule="auto"/>
+              <w:jc w:val="center"/>
+            </w:pPr>
+            <w:r>
+              <w:rPr>
+                <w:rFonts w:ascii="宋体" w:hAnsi="宋体" w:eastAsia="宋体"/>
+                <w:b w:val="0"/>
+                <w:sz w:val="18"/>
+              </w:rPr>
+              <w:t>8.48%</w:t>
+            </w:r>
+          </w:p>
+        </w:tc>
+      </w:tr>
+      <w:tr>
+        <w:tc>
+          <w:tcPr>
+            <w:tcW w:type="dxa" w:w="1700"/>
+            <w:vAlign w:val="center"/>
+          </w:tcPr>
+          <w:p>
+            <w:pPr>
+              <w:spacing w:before="30" w:after="30" w:line="252" w:lineRule="auto"/>
+              <w:jc w:val="center"/>
+            </w:pPr>
+            <w:r>
+              <w:rPr>
+                <w:rFonts w:ascii="宋体" w:hAnsi="宋体" w:eastAsia="宋体"/>
+                <w:b w:val="0"/>
+                <w:sz w:val="18"/>
+              </w:rPr>
+              <w:t>δ=0.20</w:t>
+            </w:r>
+          </w:p>
+        </w:tc>
+        <w:tc>
+          <w:tcPr>
+            <w:tcW w:type="dxa" w:w="1700"/>
+            <w:vAlign w:val="center"/>
+          </w:tcPr>
+          <w:p>
+            <w:pPr>
+              <w:spacing w:before="30" w:after="30" w:line="252" w:lineRule="auto"/>
+              <w:jc w:val="center"/>
+            </w:pPr>
+            <w:r>
+              <w:rPr>
+                <w:rFonts w:ascii="宋体" w:hAnsi="宋体" w:eastAsia="宋体"/>
+                <w:b w:val="0"/>
+                <w:sz w:val="18"/>
+              </w:rPr>
+              <w:t>3/3</w:t>
+            </w:r>
+          </w:p>
+        </w:tc>
+        <w:tc>
+          <w:tcPr>
+            <w:tcW w:type="dxa" w:w="2154"/>
+            <w:vAlign w:val="center"/>
+          </w:tcPr>
+          <w:p>
+            <w:pPr>
+              <w:spacing w:before="30" w:after="30" w:line="252" w:lineRule="auto"/>
+              <w:jc w:val="center"/>
+            </w:pPr>
+            <w:r>
+              <w:rPr>
+                <w:rFonts w:ascii="宋体" w:hAnsi="宋体" w:eastAsia="宋体"/>
+                <w:b w:val="0"/>
+                <w:sz w:val="18"/>
+              </w:rPr>
+              <w:t>0.70, 0.65, 0.65</w:t>
+            </w:r>
+          </w:p>
+        </w:tc>
+        <w:tc>
+          <w:tcPr>
+            <w:tcW w:type="dxa" w:w="1927"/>
+            <w:vAlign w:val="center"/>
+          </w:tcPr>
+          <w:p>
+            <w:pPr>
+              <w:spacing w:before="30" w:after="30" w:line="252" w:lineRule="auto"/>
+              <w:jc w:val="center"/>
+            </w:pPr>
+            <w:r>
+              <w:rPr>
+                <w:rFonts w:ascii="宋体" w:hAnsi="宋体" w:eastAsia="宋体"/>
+                <w:b w:val="0"/>
+                <w:sz w:val="18"/>
+              </w:rPr>
+              <w:t>66.74%</w:t>
+            </w:r>
+          </w:p>
+        </w:tc>
+        <w:tc>
+          <w:tcPr>
+            <w:tcW w:type="dxa" w:w="1927"/>
+            <w:vAlign w:val="center"/>
+          </w:tcPr>
+          <w:p>
+            <w:pPr>
+              <w:spacing w:before="30" w:after="30" w:line="252" w:lineRule="auto"/>
+              <w:jc w:val="center"/>
+            </w:pPr>
+            <w:r>
+              <w:rPr>
+                <w:rFonts w:ascii="宋体" w:hAnsi="宋体" w:eastAsia="宋体"/>
+                <w:b w:val="0"/>
+                <w:sz w:val="18"/>
+              </w:rPr>
+              <w:t>13.41%</w:t>
+            </w:r>
+          </w:p>
+        </w:tc>
+      </w:tr>
+    </w:tbl>
+    <w:p>
+      <w:pPr>
+        <w:spacing w:after="60"/>
+      </w:pPr>
+    </w:p>
+    <w:p>
+      <w:pPr>
+        <w:keepNext/>
+        <w:jc w:val="center"/>
+      </w:pPr>
+      <w:r>
+        <w:drawing>
+          <wp:inline xmlns:a="http://schemas.openxmlformats.org/drawingml/2006/main" xmlns:pic="http://schemas.openxmlformats.org/drawingml/2006/picture">
+            <wp:extent cx="5400000" cy="5014286"/>
+            <wp:docPr id="23" name="Picture 23"/>
+            <wp:cNvGraphicFramePr>
+              <a:graphicFrameLocks noChangeAspect="1"/>
+            </wp:cNvGraphicFramePr>
+            <a:graphic>
+              <a:graphicData uri="http://schemas.openxmlformats.org/drawingml/2006/picture">
+                <pic:pic>
+                  <pic:nvPicPr>
+                    <pic:cNvPr id="0" name="fig_calibrated_reliability.png"/>
+                    <pic:cNvPicPr/>
+                  </pic:nvPicPr>
+                  <pic:blipFill>
+                    <a:blip r:embed="rId34"/>
+                    <a:stretch>
+                      <a:fillRect/>
+                    </a:stretch>
+                  </pic:blipFill>
+                  <pic:spPr>
+                    <a:xfrm>
+                      <a:off x="0" y="0"/>
+                      <a:ext cx="5400000" cy="5014286"/>
+                    </a:xfrm>
+                    <a:prstGeom prst="rect"/>
+                  </pic:spPr>
+                </pic:pic>
+              </a:graphicData>
+            </a:graphic>
+          </wp:inline>
+        </w:drawing>
+      </w:r>
+    </w:p>
+    <w:p>
+      <w:pPr>
+        <w:pStyle w:val="af7"/>
+        <w:jc w:val="center"/>
+      </w:pPr>
+      <w:r>
+        <w:rPr>
+          <w:rFonts w:ascii="宋体" w:hAnsi="宋体" w:eastAsia="宋体"/>
+          <w:sz w:val="19"/>
+        </w:rPr>
+        <w:t>图 14 温度校准前后的可靠性曲线</w:t>
+      </w:r>
+    </w:p>
+    <w:p>
+      <w:pPr>
+        <w:spacing w:line="360" w:lineRule="auto" w:after="80"/>
+      </w:pPr>
+      <w:r>
+        <w:rPr>
+          <w:rFonts w:ascii="宋体" w:hAnsi="宋体" w:eastAsia="宋体"/>
+          <w:sz w:val="21"/>
+        </w:rPr>
+        <w:t>温度缩放将测试 ECE 从0.1131降至0.0342，NLL 从0.8399降至0.6633。在δ=0.15和δ=0.20时三个种子均取得验证集风险证书；δ=0.10仅一个种子取得证书，说明严格低风险要求仍受校准样本规模和模型稳定性限制。证书只约束当前公开图像分布，不等同于工业回收率或真实送检成本最优。</w:t>
+      </w:r>
+    </w:p>
+    <w:p>
+      <w:pPr>
+        <w:pStyle w:val="21"/>
+      </w:pPr>
+      <w:r>
+        <w:t>5.14 摄影者留出条件下的来源外泛化</w:t>
+      </w:r>
+    </w:p>
+    <w:p>
+      <w:pPr>
+        <w:spacing w:line="360" w:lineRule="auto" w:after="80"/>
+      </w:pPr>
+      <w:r>
+        <w:rPr>
+          <w:rFonts w:ascii="宋体" w:hAnsi="宋体" w:eastAsia="宋体"/>
+          <w:sz w:val="21"/>
+        </w:rPr>
+        <w:t>为检验模型是否依赖摄影背景和布光风格，从元数据中筛出5,639张具有摄影者字段的样本，以摄影者与重复图像组的并查集作为不可拆分单元，构建3,947/846/846张的训练、验证和测试划分。三个划分的摄影者及 split_group_id 均无交叉；缺失摄影者的2,890张样本不进入该严格实验。</w:t>
+      </w:r>
+    </w:p>
+    <w:p>
+      <w:pPr>
+        <w:pStyle w:val="af7"/>
+        <w:jc w:val="center"/>
+      </w:pPr>
+      <w:r>
+        <w:rPr>
+          <w:rFonts w:ascii="宋体" w:hAnsi="宋体" w:eastAsia="宋体"/>
+          <w:sz w:val="19"/>
+        </w:rPr>
+        <w:t>表 22 摄影者留出测试的三随机种子结果</w:t>
+      </w:r>
+    </w:p>
+    <w:tbl>
+      <w:tblPr>
+        <w:tblStyle w:val="aff1"/>
+        <w:tblW w:type="auto" w:w="0"/>
+        <w:jc w:val="center"/>
+        <w:tblLayout w:type="fixed"/>
+        <w:tblLook w:firstColumn="1" w:firstRow="1" w:lastColumn="0" w:lastRow="0" w:noHBand="0" w:noVBand="1" w:val="04A0"/>
+      </w:tblPr>
+      <w:tblGrid>
+        <w:gridCol w:w="1837"/>
+        <w:gridCol w:w="1837"/>
+        <w:gridCol w:w="1837"/>
+        <w:gridCol w:w="1837"/>
+        <w:gridCol w:w="1837"/>
+      </w:tblGrid>
+      <w:tr>
+        <w:trPr>
+          <w:tblHeader w:val="true"/>
+        </w:trPr>
+        <w:tc>
+          <w:tcPr>
+            <w:tcW w:type="dxa" w:w="2267"/>
+            <w:vAlign w:val="center"/>
+            <w:shd w:fill="D9EAF7"/>
+          </w:tcPr>
+          <w:p>
+            <w:pPr>
+              <w:spacing w:before="30" w:after="30" w:line="252" w:lineRule="auto"/>
+              <w:jc w:val="center"/>
+            </w:pPr>
+            <w:r>
+              <w:rPr>
+                <w:rFonts w:ascii="黑体" w:hAnsi="黑体" w:eastAsia="黑体"/>
+                <w:b/>
+                <w:sz w:val="18"/>
+              </w:rPr>
+              <w:t>模型</w:t>
+            </w:r>
+          </w:p>
+        </w:tc>
+        <w:tc>
+          <w:tcPr>
+            <w:tcW w:type="dxa" w:w="1700"/>
+            <w:vAlign w:val="center"/>
+            <w:shd w:fill="D9EAF7"/>
+          </w:tcPr>
+          <w:p>
+            <w:pPr>
+              <w:spacing w:before="30" w:after="30" w:line="252" w:lineRule="auto"/>
+              <w:jc w:val="center"/>
+            </w:pPr>
+            <w:r>
+              <w:rPr>
+                <w:rFonts w:ascii="黑体" w:hAnsi="黑体" w:eastAsia="黑体"/>
+                <w:b/>
+                <w:sz w:val="18"/>
+              </w:rPr>
+              <w:t>Accuracy</w:t>
+            </w:r>
+          </w:p>
+        </w:tc>
+        <w:tc>
+          <w:tcPr>
+            <w:tcW w:type="dxa" w:w="1700"/>
+            <w:vAlign w:val="center"/>
+            <w:shd w:fill="D9EAF7"/>
+          </w:tcPr>
+          <w:p>
+            <w:pPr>
+              <w:spacing w:before="30" w:after="30" w:line="252" w:lineRule="auto"/>
+              <w:jc w:val="center"/>
+            </w:pPr>
+            <w:r>
+              <w:rPr>
+                <w:rFonts w:ascii="黑体" w:hAnsi="黑体" w:eastAsia="黑体"/>
+                <w:b/>
+                <w:sz w:val="18"/>
+              </w:rPr>
+              <w:t>Macro F1</w:t>
+            </w:r>
+          </w:p>
+        </w:tc>
+        <w:tc>
+          <w:tcPr>
+            <w:tcW w:type="dxa" w:w="1700"/>
+            <w:vAlign w:val="center"/>
+            <w:shd w:fill="D9EAF7"/>
+          </w:tcPr>
+          <w:p>
+            <w:pPr>
+              <w:spacing w:before="30" w:after="30" w:line="252" w:lineRule="auto"/>
+              <w:jc w:val="center"/>
+            </w:pPr>
+            <w:r>
+              <w:rPr>
+                <w:rFonts w:ascii="黑体" w:hAnsi="黑体" w:eastAsia="黑体"/>
+                <w:b/>
+                <w:sz w:val="18"/>
+              </w:rPr>
+              <w:t>目标召回</w:t>
+            </w:r>
+          </w:p>
+        </w:tc>
+        <w:tc>
+          <w:tcPr>
+            <w:tcW w:type="dxa" w:w="1927"/>
+            <w:vAlign w:val="center"/>
+            <w:shd w:fill="D9EAF7"/>
+          </w:tcPr>
+          <w:p>
+            <w:pPr>
+              <w:spacing w:before="30" w:after="30" w:line="252" w:lineRule="auto"/>
+              <w:jc w:val="center"/>
+            </w:pPr>
+            <w:r>
+              <w:rPr>
+                <w:rFonts w:ascii="黑体" w:hAnsi="黑体" w:eastAsia="黑体"/>
+                <w:b/>
+                <w:sz w:val="18"/>
+              </w:rPr>
+              <w:t>金属光泽干扰召回</w:t>
+            </w:r>
+          </w:p>
+        </w:tc>
+      </w:tr>
+      <w:tr>
+        <w:tc>
+          <w:tcPr>
+            <w:tcW w:type="dxa" w:w="2267"/>
+            <w:vAlign w:val="center"/>
+          </w:tcPr>
+          <w:p>
+            <w:pPr>
+              <w:spacing w:before="30" w:after="30" w:line="252" w:lineRule="auto"/>
+              <w:jc w:val="center"/>
+            </w:pPr>
+            <w:r>
+              <w:rPr>
+                <w:rFonts w:ascii="宋体" w:hAnsi="宋体" w:eastAsia="宋体"/>
+                <w:b w:val="0"/>
+                <w:sz w:val="18"/>
+              </w:rPr>
+              <w:t>EfficientNet-B0</w:t>
+            </w:r>
+          </w:p>
+        </w:tc>
+        <w:tc>
+          <w:tcPr>
+            <w:tcW w:type="dxa" w:w="1700"/>
+            <w:vAlign w:val="center"/>
+          </w:tcPr>
+          <w:p>
+            <w:pPr>
+              <w:spacing w:before="30" w:after="30" w:line="252" w:lineRule="auto"/>
+              <w:jc w:val="center"/>
+            </w:pPr>
+            <w:r>
+              <w:rPr>
+                <w:rFonts w:ascii="宋体" w:hAnsi="宋体" w:eastAsia="宋体"/>
+                <w:b w:val="0"/>
+                <w:sz w:val="18"/>
+              </w:rPr>
+              <w:t>69.42%±2.20%</w:t>
+            </w:r>
+          </w:p>
+        </w:tc>
+        <w:tc>
+          <w:tcPr>
+            <w:tcW w:type="dxa" w:w="1700"/>
+            <w:vAlign w:val="center"/>
+          </w:tcPr>
+          <w:p>
+            <w:pPr>
+              <w:spacing w:before="30" w:after="30" w:line="252" w:lineRule="auto"/>
+              <w:jc w:val="center"/>
+            </w:pPr>
+            <w:r>
+              <w:rPr>
+                <w:rFonts w:ascii="宋体" w:hAnsi="宋体" w:eastAsia="宋体"/>
+                <w:b w:val="0"/>
+                <w:sz w:val="18"/>
+              </w:rPr>
+              <w:t>67.00%±2.19%</w:t>
+            </w:r>
+          </w:p>
+        </w:tc>
+        <w:tc>
+          <w:tcPr>
+            <w:tcW w:type="dxa" w:w="1700"/>
+            <w:vAlign w:val="center"/>
+          </w:tcPr>
+          <w:p>
+            <w:pPr>
+              <w:spacing w:before="30" w:after="30" w:line="252" w:lineRule="auto"/>
+              <w:jc w:val="center"/>
+            </w:pPr>
+            <w:r>
+              <w:rPr>
+                <w:rFonts w:ascii="宋体" w:hAnsi="宋体" w:eastAsia="宋体"/>
+                <w:b w:val="0"/>
+                <w:sz w:val="18"/>
+              </w:rPr>
+              <w:t>68.09%±1.52%</w:t>
+            </w:r>
+          </w:p>
+        </w:tc>
+        <w:tc>
+          <w:tcPr>
+            <w:tcW w:type="dxa" w:w="1927"/>
+            <w:vAlign w:val="center"/>
+          </w:tcPr>
+          <w:p>
+            <w:pPr>
+              <w:spacing w:before="30" w:after="30" w:line="252" w:lineRule="auto"/>
+              <w:jc w:val="center"/>
+            </w:pPr>
+            <w:r>
+              <w:rPr>
+                <w:rFonts w:ascii="宋体" w:hAnsi="宋体" w:eastAsia="宋体"/>
+                <w:b w:val="0"/>
+                <w:sz w:val="18"/>
+              </w:rPr>
+              <w:t>54.13%±7.02%</w:t>
+            </w:r>
+          </w:p>
+        </w:tc>
+      </w:tr>
+      <w:tr>
+        <w:tc>
+          <w:tcPr>
+            <w:tcW w:type="dxa" w:w="2267"/>
+            <w:vAlign w:val="center"/>
+          </w:tcPr>
+          <w:p>
+            <w:pPr>
+              <w:spacing w:before="30" w:after="30" w:line="252" w:lineRule="auto"/>
+              <w:jc w:val="center"/>
+            </w:pPr>
+            <w:r>
+              <w:rPr>
+                <w:rFonts w:ascii="宋体" w:hAnsi="宋体" w:eastAsia="宋体"/>
+                <w:b w:val="0"/>
+                <w:sz w:val="18"/>
+              </w:rPr>
+              <w:t>分层一致性模型</w:t>
+            </w:r>
+          </w:p>
+        </w:tc>
+        <w:tc>
+          <w:tcPr>
+            <w:tcW w:type="dxa" w:w="1700"/>
+            <w:vAlign w:val="center"/>
+          </w:tcPr>
+          <w:p>
+            <w:pPr>
+              <w:spacing w:before="30" w:after="30" w:line="252" w:lineRule="auto"/>
+              <w:jc w:val="center"/>
+            </w:pPr>
+            <w:r>
+              <w:rPr>
+                <w:rFonts w:ascii="宋体" w:hAnsi="宋体" w:eastAsia="宋体"/>
+                <w:b w:val="0"/>
+                <w:sz w:val="18"/>
+              </w:rPr>
+              <w:t>71.55%±0.69%</w:t>
+            </w:r>
+          </w:p>
+        </w:tc>
+        <w:tc>
+          <w:tcPr>
+            <w:tcW w:type="dxa" w:w="1700"/>
+            <w:vAlign w:val="center"/>
+          </w:tcPr>
+          <w:p>
+            <w:pPr>
+              <w:spacing w:before="30" w:after="30" w:line="252" w:lineRule="auto"/>
+              <w:jc w:val="center"/>
+            </w:pPr>
+            <w:r>
+              <w:rPr>
+                <w:rFonts w:ascii="宋体" w:hAnsi="宋体" w:eastAsia="宋体"/>
+                <w:b w:val="0"/>
+                <w:sz w:val="18"/>
+              </w:rPr>
+              <w:t>69.70%±0.90%</w:t>
+            </w:r>
+          </w:p>
+        </w:tc>
+        <w:tc>
+          <w:tcPr>
+            <w:tcW w:type="dxa" w:w="1700"/>
+            <w:vAlign w:val="center"/>
+          </w:tcPr>
+          <w:p>
+            <w:pPr>
+              <w:spacing w:before="30" w:after="30" w:line="252" w:lineRule="auto"/>
+              <w:jc w:val="center"/>
+            </w:pPr>
+            <w:r>
+              <w:rPr>
+                <w:rFonts w:ascii="宋体" w:hAnsi="宋体" w:eastAsia="宋体"/>
+                <w:b w:val="0"/>
+                <w:sz w:val="18"/>
+              </w:rPr>
+              <w:t>71.41%±3.16%</w:t>
+            </w:r>
+          </w:p>
+        </w:tc>
+        <w:tc>
+          <w:tcPr>
+            <w:tcW w:type="dxa" w:w="1927"/>
+            <w:vAlign w:val="center"/>
+          </w:tcPr>
+          <w:p>
+            <w:pPr>
+              <w:spacing w:before="30" w:after="30" w:line="252" w:lineRule="auto"/>
+              <w:jc w:val="center"/>
+            </w:pPr>
+            <w:r>
+              <w:rPr>
+                <w:rFonts w:ascii="宋体" w:hAnsi="宋体" w:eastAsia="宋体"/>
+                <w:b w:val="0"/>
+                <w:sz w:val="18"/>
+              </w:rPr>
+              <w:t>62.71%±1.51%</w:t>
+            </w:r>
+          </w:p>
+        </w:tc>
+      </w:tr>
+    </w:tbl>
+    <w:p>
+      <w:pPr>
+        <w:spacing w:after="60"/>
+      </w:pPr>
+    </w:p>
+    <w:p>
+      <w:pPr>
+        <w:keepNext/>
+        <w:jc w:val="center"/>
+      </w:pPr>
+      <w:r>
+        <w:drawing>
+          <wp:inline xmlns:a="http://schemas.openxmlformats.org/drawingml/2006/main" xmlns:pic="http://schemas.openxmlformats.org/drawingml/2006/picture">
+            <wp:extent cx="5472000" cy="3648000"/>
+            <wp:docPr id="24" name="Picture 24"/>
+            <wp:cNvGraphicFramePr>
+              <a:graphicFrameLocks noChangeAspect="1"/>
+            </wp:cNvGraphicFramePr>
+            <a:graphic>
+              <a:graphicData uri="http://schemas.openxmlformats.org/drawingml/2006/picture">
+                <pic:pic>
+                  <pic:nvPicPr>
+                    <pic:cNvPr id="0" name="fig_source_holdout_comparison.png"/>
+                    <pic:cNvPicPr/>
+                  </pic:nvPicPr>
+                  <pic:blipFill>
+                    <a:blip r:embed="rId35"/>
+                    <a:stretch>
+                      <a:fillRect/>
+                    </a:stretch>
+                  </pic:blipFill>
+                  <pic:spPr>
+                    <a:xfrm>
+                      <a:off x="0" y="0"/>
+                      <a:ext cx="5472000" cy="3648000"/>
+                    </a:xfrm>
+                    <a:prstGeom prst="rect"/>
+                  </pic:spPr>
+                </pic:pic>
+              </a:graphicData>
+            </a:graphic>
+          </wp:inline>
+        </w:drawing>
+      </w:r>
+    </w:p>
+    <w:p>
+      <w:pPr>
+        <w:pStyle w:val="af7"/>
+        <w:jc w:val="center"/>
+      </w:pPr>
+      <w:r>
+        <w:rPr>
+          <w:rFonts w:ascii="宋体" w:hAnsi="宋体" w:eastAsia="宋体"/>
+          <w:sz w:val="19"/>
+        </w:rPr>
+        <w:t>图 15 摄影者留出测试中的基线与分层模型比较</w:t>
+      </w:r>
+    </w:p>
+    <w:p>
+      <w:pPr>
+        <w:spacing w:line="360" w:lineRule="auto" w:after="80"/>
+      </w:pPr>
+      <w:r>
+        <w:rPr>
+          <w:rFonts w:ascii="宋体" w:hAnsi="宋体" w:eastAsia="宋体"/>
+          <w:sz w:val="21"/>
+        </w:rPr>
+        <w:t>在更严格的摄影者留出测试中，分层模型相对基线的 Macro F1 平均提高2.70个百分点，目标召回提高3.32个百分点，金属光泽干扰召回提高8.58个百分点。由于只有三个随机种子且数据仍来自 Mindat，该结果支持来源外条件下的稳定改进趋势，但不构成统计显著性或跨网站泛化结论。</w:t>
+      </w:r>
+    </w:p>
+    <w:p>
+      <w:pPr>
+        <w:pStyle w:val="21"/>
+      </w:pPr>
+      <w:r>
+        <w:t>5.15 普通磁铁矿代理样本消融</w:t>
+      </w:r>
+    </w:p>
+    <w:p>
+      <w:pPr>
+        <w:spacing w:line="360" w:lineRule="auto" w:after="80"/>
+      </w:pPr>
+      <w:r>
+        <w:rPr>
+          <w:rFonts w:ascii="宋体" w:hAnsi="宋体" w:eastAsia="宋体"/>
+          <w:sz w:val="21"/>
+        </w:rPr>
+        <w:t>35张钛磁铁矿下载图像中，12张因跨标签完全重复或近重复冲突被排除，最终数据集保留23张。为区分普通磁铁矿代理的训练价值与钛磁铁矿真实性，移除1,316张普通磁铁矿后重新训练分层模型，并在与完整模型共有的固定测试子集上比较。</w:t>
+      </w:r>
+    </w:p>
+    <w:p>
+      <w:pPr>
+        <w:pStyle w:val="af7"/>
+        <w:jc w:val="center"/>
+      </w:pPr>
+      <w:r>
+        <w:rPr>
+          <w:rFonts w:ascii="宋体" w:hAnsi="宋体" w:eastAsia="宋体"/>
+          <w:sz w:val="19"/>
+        </w:rPr>
+        <w:t>表 23 普通磁铁矿代理样本消融</w:t>
+      </w:r>
+    </w:p>
+    <w:tbl>
+      <w:tblPr>
+        <w:tblStyle w:val="aff1"/>
+        <w:tblW w:type="auto" w:w="0"/>
+        <w:jc w:val="center"/>
+        <w:tblLayout w:type="fixed"/>
+        <w:tblLook w:firstColumn="1" w:firstRow="1" w:lastColumn="0" w:lastRow="0" w:noHBand="0" w:noVBand="1" w:val="04A0"/>
+      </w:tblPr>
+      <w:tblGrid>
+        <w:gridCol w:w="1837"/>
+        <w:gridCol w:w="1837"/>
+        <w:gridCol w:w="1837"/>
+        <w:gridCol w:w="1837"/>
+        <w:gridCol w:w="1837"/>
+      </w:tblGrid>
+      <w:tr>
+        <w:trPr>
+          <w:tblHeader w:val="true"/>
+        </w:trPr>
+        <w:tc>
+          <w:tcPr>
+            <w:tcW w:type="dxa" w:w="1984"/>
+            <w:vAlign w:val="center"/>
+            <w:shd w:fill="D9EAF7"/>
+          </w:tcPr>
+          <w:p>
+            <w:pPr>
+              <w:spacing w:before="30" w:after="30" w:line="252" w:lineRule="auto"/>
+              <w:jc w:val="center"/>
+            </w:pPr>
+            <w:r>
+              <w:rPr>
+                <w:rFonts w:ascii="黑体" w:hAnsi="黑体" w:eastAsia="黑体"/>
+                <w:b/>
+                <w:sz w:val="18"/>
+              </w:rPr>
+              <w:t>设置</w:t>
+            </w:r>
+          </w:p>
+        </w:tc>
+        <w:tc>
+          <w:tcPr>
+            <w:tcW w:type="dxa" w:w="1814"/>
+            <w:vAlign w:val="center"/>
+            <w:shd w:fill="D9EAF7"/>
+          </w:tcPr>
+          <w:p>
+            <w:pPr>
+              <w:spacing w:before="30" w:after="30" w:line="252" w:lineRule="auto"/>
+              <w:jc w:val="center"/>
+            </w:pPr>
+            <w:r>
+              <w:rPr>
+                <w:rFonts w:ascii="黑体" w:hAnsi="黑体" w:eastAsia="黑体"/>
+                <w:b/>
+                <w:sz w:val="18"/>
+              </w:rPr>
+              <w:t>共同子集 Macro F1</w:t>
+            </w:r>
+          </w:p>
+        </w:tc>
+        <w:tc>
+          <w:tcPr>
+            <w:tcW w:type="dxa" w:w="1587"/>
+            <w:vAlign w:val="center"/>
+            <w:shd w:fill="D9EAF7"/>
+          </w:tcPr>
+          <w:p>
+            <w:pPr>
+              <w:spacing w:before="30" w:after="30" w:line="252" w:lineRule="auto"/>
+              <w:jc w:val="center"/>
+            </w:pPr>
+            <w:r>
+              <w:rPr>
+                <w:rFonts w:ascii="黑体" w:hAnsi="黑体" w:eastAsia="黑体"/>
+                <w:b/>
+                <w:sz w:val="18"/>
+              </w:rPr>
+              <w:t>目标召回</w:t>
+            </w:r>
+          </w:p>
+        </w:tc>
+        <w:tc>
+          <w:tcPr>
+            <w:tcW w:type="dxa" w:w="1984"/>
+            <w:vAlign w:val="center"/>
+            <w:shd w:fill="D9EAF7"/>
+          </w:tcPr>
+          <w:p>
+            <w:pPr>
+              <w:spacing w:before="30" w:after="30" w:line="252" w:lineRule="auto"/>
+              <w:jc w:val="center"/>
+            </w:pPr>
+            <w:r>
+              <w:rPr>
+                <w:rFonts w:ascii="黑体" w:hAnsi="黑体" w:eastAsia="黑体"/>
+                <w:b/>
+                <w:sz w:val="18"/>
+              </w:rPr>
+              <w:t>钛铁矿召回（n=50）</w:t>
+            </w:r>
+          </w:p>
+        </w:tc>
+        <w:tc>
+          <w:tcPr>
+            <w:tcW w:type="dxa" w:w="1984"/>
+            <w:vAlign w:val="center"/>
+            <w:shd w:fill="D9EAF7"/>
+          </w:tcPr>
+          <w:p>
+            <w:pPr>
+              <w:spacing w:before="30" w:after="30" w:line="252" w:lineRule="auto"/>
+              <w:jc w:val="center"/>
+            </w:pPr>
+            <w:r>
+              <w:rPr>
+                <w:rFonts w:ascii="黑体" w:hAnsi="黑体" w:eastAsia="黑体"/>
+                <w:b/>
+                <w:sz w:val="18"/>
+              </w:rPr>
+              <w:t>钛磁铁矿召回（n=4）</w:t>
+            </w:r>
+          </w:p>
+        </w:tc>
+      </w:tr>
+      <w:tr>
+        <w:tc>
+          <w:tcPr>
+            <w:tcW w:type="dxa" w:w="1984"/>
+            <w:vAlign w:val="center"/>
+          </w:tcPr>
+          <w:p>
+            <w:pPr>
+              <w:spacing w:before="30" w:after="30" w:line="252" w:lineRule="auto"/>
+              <w:jc w:val="center"/>
+            </w:pPr>
+            <w:r>
+              <w:rPr>
+                <w:rFonts w:ascii="宋体" w:hAnsi="宋体" w:eastAsia="宋体"/>
+                <w:b w:val="0"/>
+                <w:sz w:val="18"/>
+              </w:rPr>
+              <w:t>完整数据</w:t>
+            </w:r>
+          </w:p>
+        </w:tc>
+        <w:tc>
+          <w:tcPr>
+            <w:tcW w:type="dxa" w:w="1814"/>
+            <w:vAlign w:val="center"/>
+          </w:tcPr>
+          <w:p>
+            <w:pPr>
+              <w:spacing w:before="30" w:after="30" w:line="252" w:lineRule="auto"/>
+              <w:jc w:val="center"/>
+            </w:pPr>
+            <w:r>
+              <w:rPr>
+                <w:rFonts w:ascii="宋体" w:hAnsi="宋体" w:eastAsia="宋体"/>
+                <w:b w:val="0"/>
+                <w:sz w:val="18"/>
+              </w:rPr>
+              <w:t>67.08%±4.06%</w:t>
+            </w:r>
+          </w:p>
+        </w:tc>
+        <w:tc>
+          <w:tcPr>
+            <w:tcW w:type="dxa" w:w="1587"/>
+            <w:vAlign w:val="center"/>
+          </w:tcPr>
+          <w:p>
+            <w:pPr>
+              <w:spacing w:before="30" w:after="30" w:line="252" w:lineRule="auto"/>
+              <w:jc w:val="center"/>
+            </w:pPr>
+            <w:r>
+              <w:rPr>
+                <w:rFonts w:ascii="宋体" w:hAnsi="宋体" w:eastAsia="宋体"/>
+                <w:b w:val="0"/>
+                <w:sz w:val="18"/>
+              </w:rPr>
+              <w:t>72.22%±5.56%</w:t>
+            </w:r>
+          </w:p>
+        </w:tc>
+        <w:tc>
+          <w:tcPr>
+            <w:tcW w:type="dxa" w:w="1984"/>
+            <w:vAlign w:val="center"/>
+          </w:tcPr>
+          <w:p>
+            <w:pPr>
+              <w:spacing w:before="30" w:after="30" w:line="252" w:lineRule="auto"/>
+              <w:jc w:val="center"/>
+            </w:pPr>
+            <w:r>
+              <w:rPr>
+                <w:rFonts w:ascii="宋体" w:hAnsi="宋体" w:eastAsia="宋体"/>
+                <w:b w:val="0"/>
+                <w:sz w:val="18"/>
+              </w:rPr>
+              <w:t>70.67%±6.11%</w:t>
+            </w:r>
+          </w:p>
+        </w:tc>
+        <w:tc>
+          <w:tcPr>
+            <w:tcW w:type="dxa" w:w="1984"/>
+            <w:vAlign w:val="center"/>
+          </w:tcPr>
+          <w:p>
+            <w:pPr>
+              <w:spacing w:before="30" w:after="30" w:line="252" w:lineRule="auto"/>
+              <w:jc w:val="center"/>
+            </w:pPr>
+            <w:r>
+              <w:rPr>
+                <w:rFonts w:ascii="宋体" w:hAnsi="宋体" w:eastAsia="宋体"/>
+                <w:b w:val="0"/>
+                <w:sz w:val="18"/>
+              </w:rPr>
+              <w:t>91.67%±14.43%</w:t>
+            </w:r>
+          </w:p>
+        </w:tc>
+      </w:tr>
+      <w:tr>
+        <w:tc>
+          <w:tcPr>
+            <w:tcW w:type="dxa" w:w="1984"/>
+            <w:vAlign w:val="center"/>
+          </w:tcPr>
+          <w:p>
+            <w:pPr>
+              <w:spacing w:before="30" w:after="30" w:line="252" w:lineRule="auto"/>
+              <w:jc w:val="center"/>
+            </w:pPr>
+            <w:r>
+              <w:rPr>
+                <w:rFonts w:ascii="宋体" w:hAnsi="宋体" w:eastAsia="宋体"/>
+                <w:b w:val="0"/>
+                <w:sz w:val="18"/>
+              </w:rPr>
+              <w:t>移除普通磁铁矿代理</w:t>
+            </w:r>
+          </w:p>
+        </w:tc>
+        <w:tc>
+          <w:tcPr>
+            <w:tcW w:type="dxa" w:w="1814"/>
+            <w:vAlign w:val="center"/>
+          </w:tcPr>
+          <w:p>
+            <w:pPr>
+              <w:spacing w:before="30" w:after="30" w:line="252" w:lineRule="auto"/>
+              <w:jc w:val="center"/>
+            </w:pPr>
+            <w:r>
+              <w:rPr>
+                <w:rFonts w:ascii="宋体" w:hAnsi="宋体" w:eastAsia="宋体"/>
+                <w:b w:val="0"/>
+                <w:sz w:val="18"/>
+              </w:rPr>
+              <w:t>70.45%±0.61%</w:t>
+            </w:r>
+          </w:p>
+        </w:tc>
+        <w:tc>
+          <w:tcPr>
+            <w:tcW w:type="dxa" w:w="1587"/>
+            <w:vAlign w:val="center"/>
+          </w:tcPr>
+          <w:p>
+            <w:pPr>
+              <w:spacing w:before="30" w:after="30" w:line="252" w:lineRule="auto"/>
+              <w:jc w:val="center"/>
+            </w:pPr>
+            <w:r>
+              <w:rPr>
+                <w:rFonts w:ascii="宋体" w:hAnsi="宋体" w:eastAsia="宋体"/>
+                <w:b w:val="0"/>
+                <w:sz w:val="18"/>
+              </w:rPr>
+              <w:t>45.06%±6.50%</w:t>
+            </w:r>
+          </w:p>
+        </w:tc>
+        <w:tc>
+          <w:tcPr>
+            <w:tcW w:type="dxa" w:w="1984"/>
+            <w:vAlign w:val="center"/>
+          </w:tcPr>
+          <w:p>
+            <w:pPr>
+              <w:spacing w:before="30" w:after="30" w:line="252" w:lineRule="auto"/>
+              <w:jc w:val="center"/>
+            </w:pPr>
+            <w:r>
+              <w:rPr>
+                <w:rFonts w:ascii="宋体" w:hAnsi="宋体" w:eastAsia="宋体"/>
+                <w:b w:val="0"/>
+                <w:sz w:val="18"/>
+              </w:rPr>
+              <w:t>44.67%±5.03%</w:t>
+            </w:r>
+          </w:p>
+        </w:tc>
+        <w:tc>
+          <w:tcPr>
+            <w:tcW w:type="dxa" w:w="1984"/>
+            <w:vAlign w:val="center"/>
+          </w:tcPr>
+          <w:p>
+            <w:pPr>
+              <w:spacing w:before="30" w:after="30" w:line="252" w:lineRule="auto"/>
+              <w:jc w:val="center"/>
+            </w:pPr>
+            <w:r>
+              <w:rPr>
+                <w:rFonts w:ascii="宋体" w:hAnsi="宋体" w:eastAsia="宋体"/>
+                <w:b w:val="0"/>
+                <w:sz w:val="18"/>
+              </w:rPr>
+              <w:t>50.00%±25.00%</w:t>
+            </w:r>
+          </w:p>
+        </w:tc>
+      </w:tr>
+    </w:tbl>
+    <w:p>
+      <w:pPr>
+        <w:spacing w:after="60"/>
+      </w:pPr>
+    </w:p>
+    <w:p>
+      <w:pPr>
+        <w:spacing w:line="360" w:lineRule="auto" w:after="80"/>
+      </w:pPr>
+      <w:r>
+        <w:rPr>
+          <w:rFonts w:ascii="宋体" w:hAnsi="宋体" w:eastAsia="宋体"/>
+          <w:sz w:val="21"/>
+        </w:rPr>
+        <w:t>移除代理样本后，共同子集总体准确率上升，但目标召回由72.22%降至45.06%，钛铁矿召回由70.67%降至44.67%。这说明类别组成变化会使总体准确率产生误导，同时普通磁铁矿可增强目标类视觉表征；然而其结果不能替代真实钛磁铁矿验证。钛磁铁矿测试仅4张，其召回率只能作描述性展示。</w:t>
+      </w:r>
+    </w:p>
+    <w:p>
+      <w:pPr>
+        <w:pStyle w:val="21"/>
+        <w:spacing w:line="360" w:lineRule="auto"/>
+      </w:pPr>
+      <w:r>
+        <w:rPr>
+          <w:rFonts w:ascii="宋体" w:hAnsi="宋体" w:eastAsia="宋体"/>
+          <w:sz w:val="21"/>
+        </w:rPr>
+        <w:t>5.16 实验结果的综合判断</w:t>
+      </w:r>
+    </w:p>
+    <w:p>
+      <w:pPr>
+        <w:spacing w:line="360" w:lineRule="auto"/>
         <w:ind w:firstLine="420"/>
         <w:jc w:val="both"/>
       </w:pPr>
       <w:r>
-        <w:t>当前实验已经形成清晰的证据链：基础模型结果稳定可复现；</w:t>
-      </w:r>
-      <w:r>
-        <w:t xml:space="preserve">Focal Loss </w:t>
-      </w:r>
-      <w:r>
-        <w:t>不能统一解决结构性混淆；角色感知方法降低困难干扰误入目标但增加目标漏选；分层方法提高目标召回但增加部分干扰误入；选择性阈值能够降低保留风险但尚未校准。由此可以得出的结论是</w:t>
-      </w:r>
-      <w:r>
-        <w:t>“</w:t>
-      </w:r>
-      <w:r>
-        <w:t>不同机制改变风险取舍</w:t>
-      </w:r>
-      <w:r>
-        <w:t>”</w:t>
-      </w:r>
-      <w:r>
-        <w:t>，而不是</w:t>
-      </w:r>
-      <w:r>
-        <w:t>“</w:t>
-      </w:r>
-      <w:r>
-        <w:t>提出模型稳定优于所有基线</w:t>
-      </w:r>
-      <w:r>
-        <w:t>”</w:t>
-      </w:r>
-      <w:r>
-        <w:t>。</w:t>
+        <w:rPr>
+          <w:rFonts w:ascii="宋体" w:hAnsi="宋体" w:eastAsia="宋体"/>
+          <w:sz w:val="21"/>
+        </w:rPr>
+        <w:t>当前证据链由五部分组成：多种子基线确认基本性能；固定映射证明并实证角色风险收缩；一致性消融显示双头 KL、TV 和预测分歧下降；温度校准与独立认证把描述性置信度曲线升级为预设风险约束；摄影者留出和代理消融检验来源偏差与数据构成。结果支持分层模型在严格来源留出中的改进趋势，但尚不能声称跨网站、真实矿石或工业现场有效。</w:t>
       </w:r>
     </w:p>
     <w:p>
@@ -20245,38 +23072,29 @@
       <w:pPr>
         <w:pStyle w:val="af7"/>
         <w:keepNext/>
-        <w:spacing w:after="100"/>
+        <w:spacing w:after="100" w:line="360" w:lineRule="auto"/>
         <w:jc w:val="center"/>
       </w:pPr>
       <w:r>
-        <w:t>表</w:t>
-      </w:r>
-      <w:r>
-        <w:t xml:space="preserve"> 18 </w:t>
-      </w:r>
-      <w:r>
-        <w:t>本阶段方法贡献及其解释边界</w:t>
+        <w:rPr>
+          <w:rFonts w:ascii="宋体" w:hAnsi="宋体" w:eastAsia="宋体"/>
+          <w:sz w:val="21"/>
+        </w:rPr>
+        <w:t>表 24 本阶段方法贡献及其解释边界</w:t>
       </w:r>
     </w:p>
     <w:p>
       <w:pPr>
+        <w:spacing w:line="360" w:lineRule="auto"/>
         <w:ind w:firstLine="420"/>
         <w:jc w:val="both"/>
       </w:pPr>
       <w:r>
-        <w:t>相较原初稿，本修订稿不再把受控候选集合</w:t>
-      </w:r>
-      <w:r>
-        <w:t xml:space="preserve"> 100%/0% </w:t>
-      </w:r>
-      <w:r>
-        <w:t>结果作为核心创新证据，也不把未经校准的最大</w:t>
-      </w:r>
-      <w:r>
-        <w:t xml:space="preserve"> Softmax </w:t>
-      </w:r>
-      <w:r>
-        <w:t>阈值作为独立算法创新。真正需要进一步加强的是：真实候选标签、来源外测试、置信度校准和专家定义的风险约束。</w:t>
+        <w:rPr>
+          <w:rFonts w:ascii="宋体" w:hAnsi="宋体" w:eastAsia="宋体"/>
+          <w:sz w:val="21"/>
+        </w:rPr>
+        <w:t>本次修订把理论贡献限定为可验证的三层结构：其一，固定种类—角色映射诱导逐样本风险支配和经验风险收缩；其二，KL 一致性通过 Pinsker 不等式控制双头分布差异，并由消融验证其分布效果；其三，温度校准结合多阈值修正的 Clopper–Pearson 上界，实现验证集上的选择性风险认证。来源留出和代理消融进一步限定这些结论的适用边界。</w:t>
       </w:r>
     </w:p>
     <w:p>
@@ -20409,10 +23227,11 @@
           <w:cantSplit/>
           <w:tblHeader/>
           <w:jc w:val="center"/>
+          <w:tblHeader w:val="true"/>
         </w:trPr>
         <w:tc>
           <w:tcPr>
-            <w:tcW w:w="2268" w:type="dxa"/>
+            <w:tcW w:w="2267" w:type="dxa"/>
             <w:shd w:val="clear" w:color="auto" w:fill="D9EAF7"/>
             <w:tcMar>
               <w:top w:w="80" w:type="dxa"/>
@@ -20421,17 +23240,18 @@
               <w:right w:w="90" w:type="dxa"/>
             </w:tcMar>
             <w:vAlign w:val="center"/>
-          </w:tcPr>
-          <w:p>
-            <w:pPr>
-              <w:spacing w:after="0" w:line="264" w:lineRule="auto"/>
+            <w:shd w:fill="D9EAF7"/>
+          </w:tcPr>
+          <w:p>
+            <w:pPr>
+              <w:spacing w:after="30" w:line="252" w:lineRule="auto" w:before="30"/>
               <w:jc w:val="center"/>
             </w:pPr>
             <w:r>
               <w:rPr>
-                <w:rFonts w:eastAsia="黑体"/>
+                <w:rFonts w:eastAsia="黑体" w:ascii="黑体" w:hAnsi="黑体"/>
                 <w:b/>
-                <w:sz w:val="15"/>
+                <w:sz w:val="18"/>
               </w:rPr>
               <w:t>问题</w:t>
             </w:r>
@@ -20439,7 +23259,7 @@
         </w:tc>
         <w:tc>
           <w:tcPr>
-            <w:tcW w:w="3515" w:type="dxa"/>
+            <w:tcW w:w="3401" w:type="dxa"/>
             <w:shd w:val="clear" w:color="auto" w:fill="D9EAF7"/>
             <w:tcMar>
               <w:top w:w="80" w:type="dxa"/>
@@ -20448,17 +23268,18 @@
               <w:right w:w="90" w:type="dxa"/>
             </w:tcMar>
             <w:vAlign w:val="center"/>
-          </w:tcPr>
-          <w:p>
-            <w:pPr>
-              <w:spacing w:after="0" w:line="264" w:lineRule="auto"/>
+            <w:shd w:fill="D9EAF7"/>
+          </w:tcPr>
+          <w:p>
+            <w:pPr>
+              <w:spacing w:after="30" w:line="252" w:lineRule="auto" w:before="30"/>
               <w:jc w:val="center"/>
             </w:pPr>
             <w:r>
               <w:rPr>
-                <w:rFonts w:eastAsia="黑体"/>
+                <w:rFonts w:eastAsia="黑体" w:ascii="黑体" w:hAnsi="黑体"/>
                 <w:b/>
-                <w:sz w:val="15"/>
+                <w:sz w:val="18"/>
               </w:rPr>
               <w:t>对结果解释的影响</w:t>
             </w:r>
@@ -20466,7 +23287,7 @@
         </w:tc>
         <w:tc>
           <w:tcPr>
-            <w:tcW w:w="3402" w:type="dxa"/>
+            <w:tcW w:w="3401" w:type="dxa"/>
             <w:shd w:val="clear" w:color="auto" w:fill="D9EAF7"/>
             <w:tcMar>
               <w:top w:w="80" w:type="dxa"/>
@@ -20475,17 +23296,18 @@
               <w:right w:w="90" w:type="dxa"/>
             </w:tcMar>
             <w:vAlign w:val="center"/>
-          </w:tcPr>
-          <w:p>
-            <w:pPr>
-              <w:spacing w:after="0" w:line="264" w:lineRule="auto"/>
+            <w:shd w:fill="D9EAF7"/>
+          </w:tcPr>
+          <w:p>
+            <w:pPr>
+              <w:spacing w:after="30" w:line="252" w:lineRule="auto" w:before="30"/>
               <w:jc w:val="center"/>
             </w:pPr>
             <w:r>
               <w:rPr>
-                <w:rFonts w:eastAsia="黑体"/>
+                <w:rFonts w:eastAsia="黑体" w:ascii="黑体" w:hAnsi="黑体"/>
                 <w:b/>
-                <w:sz w:val="15"/>
+                <w:sz w:val="18"/>
               </w:rPr>
               <w:t>处理原则</w:t>
             </w:r>
@@ -20499,7 +23321,7 @@
         </w:trPr>
         <w:tc>
           <w:tcPr>
-            <w:tcW w:w="2268" w:type="dxa"/>
+            <w:tcW w:w="2267" w:type="dxa"/>
             <w:tcMar>
               <w:top w:w="80" w:type="dxa"/>
               <w:left w:w="90" w:type="dxa"/>
@@ -20510,11 +23332,14 @@
           </w:tcPr>
           <w:p>
             <w:pPr>
-              <w:spacing w:after="0" w:line="264" w:lineRule="auto"/>
-            </w:pPr>
-            <w:r>
-              <w:rPr>
-                <w:sz w:val="15"/>
+              <w:spacing w:after="30" w:line="252" w:lineRule="auto" w:before="30"/>
+              <w:jc w:val="center"/>
+            </w:pPr>
+            <w:r>
+              <w:rPr>
+                <w:rFonts w:ascii="宋体" w:hAnsi="宋体" w:eastAsia="宋体"/>
+                <w:b w:val="0"/>
+                <w:sz w:val="18"/>
               </w:rPr>
               <w:t>公开标本图像与工业现场差异</w:t>
             </w:r>
@@ -20522,7 +23347,7 @@
         </w:tc>
         <w:tc>
           <w:tcPr>
-            <w:tcW w:w="3515" w:type="dxa"/>
+            <w:tcW w:w="3401" w:type="dxa"/>
             <w:tcMar>
               <w:top w:w="80" w:type="dxa"/>
               <w:left w:w="90" w:type="dxa"/>
@@ -20533,11 +23358,14 @@
           </w:tcPr>
           <w:p>
             <w:pPr>
-              <w:spacing w:after="0" w:line="264" w:lineRule="auto"/>
-            </w:pPr>
-            <w:r>
-              <w:rPr>
-                <w:sz w:val="15"/>
+              <w:spacing w:after="30" w:line="252" w:lineRule="auto" w:before="30"/>
+              <w:jc w:val="center"/>
+            </w:pPr>
+            <w:r>
+              <w:rPr>
+                <w:rFonts w:ascii="宋体" w:hAnsi="宋体" w:eastAsia="宋体"/>
+                <w:b w:val="0"/>
+                <w:sz w:val="18"/>
               </w:rPr>
               <w:t>不能将当前准确率等同于皮带分选性能或生产指标</w:t>
             </w:r>
@@ -20545,7 +23373,7 @@
         </w:tc>
         <w:tc>
           <w:tcPr>
-            <w:tcW w:w="3402" w:type="dxa"/>
+            <w:tcW w:w="3401" w:type="dxa"/>
             <w:tcMar>
               <w:top w:w="80" w:type="dxa"/>
               <w:left w:w="90" w:type="dxa"/>
@@ -20556,11 +23384,14 @@
           </w:tcPr>
           <w:p>
             <w:pPr>
-              <w:spacing w:after="0" w:line="264" w:lineRule="auto"/>
-            </w:pPr>
-            <w:r>
-              <w:rPr>
-                <w:sz w:val="15"/>
+              <w:spacing w:after="30" w:line="252" w:lineRule="auto" w:before="30"/>
+              <w:jc w:val="center"/>
+            </w:pPr>
+            <w:r>
+              <w:rPr>
+                <w:rFonts w:ascii="宋体" w:hAnsi="宋体" w:eastAsia="宋体"/>
+                <w:b w:val="0"/>
+                <w:sz w:val="18"/>
               </w:rPr>
               <w:t>定位为公开标本图像源域验证</w:t>
             </w:r>
@@ -20574,7 +23405,7 @@
         </w:trPr>
         <w:tc>
           <w:tcPr>
-            <w:tcW w:w="2268" w:type="dxa"/>
+            <w:tcW w:w="2267" w:type="dxa"/>
             <w:tcMar>
               <w:top w:w="80" w:type="dxa"/>
               <w:left w:w="90" w:type="dxa"/>
@@ -20585,29 +23416,38 @@
           </w:tcPr>
           <w:p>
             <w:pPr>
-              <w:spacing w:after="0" w:line="264" w:lineRule="auto"/>
-            </w:pPr>
-            <w:r>
-              <w:rPr>
-                <w:sz w:val="15"/>
+              <w:spacing w:after="30" w:line="252" w:lineRule="auto" w:before="30"/>
+              <w:jc w:val="center"/>
+            </w:pPr>
+            <w:r>
+              <w:rPr>
+                <w:rFonts w:ascii="宋体" w:hAnsi="宋体" w:eastAsia="宋体"/>
+                <w:b w:val="0"/>
+                <w:sz w:val="18"/>
               </w:rPr>
               <w:t xml:space="preserve">titanomagnetite </w:t>
             </w:r>
             <w:r>
               <w:rPr>
-                <w:sz w:val="15"/>
+                <w:rFonts w:ascii="宋体" w:hAnsi="宋体" w:eastAsia="宋体"/>
+                <w:b w:val="0"/>
+                <w:sz w:val="18"/>
               </w:rPr>
               <w:t>仅</w:t>
             </w:r>
             <w:r>
               <w:rPr>
-                <w:sz w:val="15"/>
+                <w:rFonts w:ascii="宋体" w:hAnsi="宋体" w:eastAsia="宋体"/>
+                <w:b w:val="0"/>
+                <w:sz w:val="18"/>
               </w:rPr>
               <w:t xml:space="preserve"> 23 </w:t>
             </w:r>
             <w:r>
               <w:rPr>
-                <w:sz w:val="15"/>
+                <w:rFonts w:ascii="宋体" w:hAnsi="宋体" w:eastAsia="宋体"/>
+                <w:b w:val="0"/>
+                <w:sz w:val="18"/>
               </w:rPr>
               <w:t>张</w:t>
             </w:r>
@@ -20615,7 +23455,7 @@
         </w:tc>
         <w:tc>
           <w:tcPr>
-            <w:tcW w:w="3515" w:type="dxa"/>
+            <w:tcW w:w="3401" w:type="dxa"/>
             <w:tcMar>
               <w:top w:w="80" w:type="dxa"/>
               <w:left w:w="90" w:type="dxa"/>
@@ -20626,11 +23466,14 @@
           </w:tcPr>
           <w:p>
             <w:pPr>
-              <w:spacing w:after="0" w:line="264" w:lineRule="auto"/>
-            </w:pPr>
-            <w:r>
-              <w:rPr>
-                <w:sz w:val="15"/>
+              <w:spacing w:after="30" w:line="252" w:lineRule="auto" w:before="30"/>
+              <w:jc w:val="center"/>
+            </w:pPr>
+            <w:r>
+              <w:rPr>
+                <w:rFonts w:ascii="宋体" w:hAnsi="宋体" w:eastAsia="宋体"/>
+                <w:b w:val="0"/>
+                <w:sz w:val="18"/>
               </w:rPr>
               <w:t>不足以支持钛磁铁矿独立细分类结论</w:t>
             </w:r>
@@ -20638,7 +23481,7 @@
         </w:tc>
         <w:tc>
           <w:tcPr>
-            <w:tcW w:w="3402" w:type="dxa"/>
+            <w:tcW w:w="3401" w:type="dxa"/>
             <w:tcMar>
               <w:top w:w="80" w:type="dxa"/>
               <w:left w:w="90" w:type="dxa"/>
@@ -20649,11 +23492,14 @@
           </w:tcPr>
           <w:p>
             <w:pPr>
-              <w:spacing w:after="0" w:line="264" w:lineRule="auto"/>
-            </w:pPr>
-            <w:r>
-              <w:rPr>
-                <w:sz w:val="15"/>
+              <w:spacing w:after="30" w:line="252" w:lineRule="auto" w:before="30"/>
+              <w:jc w:val="center"/>
+            </w:pPr>
+            <w:r>
+              <w:rPr>
+                <w:rFonts w:ascii="宋体" w:hAnsi="宋体" w:eastAsia="宋体"/>
+                <w:b w:val="0"/>
+                <w:sz w:val="18"/>
               </w:rPr>
               <w:t>作为合并目标类补充，并优先扩充</w:t>
             </w:r>
@@ -20667,7 +23513,7 @@
         </w:trPr>
         <w:tc>
           <w:tcPr>
-            <w:tcW w:w="2268" w:type="dxa"/>
+            <w:tcW w:w="2267" w:type="dxa"/>
             <w:tcMar>
               <w:top w:w="80" w:type="dxa"/>
               <w:left w:w="90" w:type="dxa"/>
@@ -20678,23 +23524,30 @@
           </w:tcPr>
           <w:p>
             <w:pPr>
-              <w:spacing w:after="0" w:line="264" w:lineRule="auto"/>
-            </w:pPr>
-            <w:r>
-              <w:rPr>
-                <w:sz w:val="15"/>
+              <w:spacing w:after="30" w:line="252" w:lineRule="auto" w:before="30"/>
+              <w:jc w:val="center"/>
+            </w:pPr>
+            <w:r>
+              <w:rPr>
+                <w:rFonts w:ascii="宋体" w:hAnsi="宋体" w:eastAsia="宋体"/>
+                <w:b w:val="0"/>
+                <w:sz w:val="18"/>
               </w:rPr>
               <w:t>普通</w:t>
             </w:r>
             <w:r>
               <w:rPr>
-                <w:sz w:val="15"/>
+                <w:rFonts w:ascii="宋体" w:hAnsi="宋体" w:eastAsia="宋体"/>
+                <w:b w:val="0"/>
+                <w:sz w:val="18"/>
               </w:rPr>
               <w:t xml:space="preserve"> magnetite </w:t>
             </w:r>
             <w:r>
               <w:rPr>
-                <w:sz w:val="15"/>
+                <w:rFonts w:ascii="宋体" w:hAnsi="宋体" w:eastAsia="宋体"/>
+                <w:b w:val="0"/>
+                <w:sz w:val="18"/>
               </w:rPr>
               <w:t>作为代理</w:t>
             </w:r>
@@ -20702,7 +23555,7 @@
         </w:tc>
         <w:tc>
           <w:tcPr>
-            <w:tcW w:w="3515" w:type="dxa"/>
+            <w:tcW w:w="3401" w:type="dxa"/>
             <w:tcMar>
               <w:top w:w="80" w:type="dxa"/>
               <w:left w:w="90" w:type="dxa"/>
@@ -20713,19 +23566,22 @@
           </w:tcPr>
           <w:p>
             <w:pPr>
-              <w:spacing w:after="0" w:line="264" w:lineRule="auto"/>
-            </w:pPr>
-            <w:r>
-              <w:rPr>
-                <w:sz w:val="15"/>
-              </w:rPr>
-              <w:t>可能高估对真实钛磁铁矿的代表性</w:t>
-            </w:r>
-          </w:p>
-        </w:tc>
-        <w:tc>
-          <w:tcPr>
-            <w:tcW w:w="3402" w:type="dxa"/>
+              <w:spacing w:before="30" w:after="30" w:line="252" w:lineRule="auto"/>
+              <w:jc w:val="center"/>
+            </w:pPr>
+            <w:r>
+              <w:rPr>
+                <w:rFonts w:ascii="宋体" w:hAnsi="宋体" w:eastAsia="宋体"/>
+                <w:b w:val="0"/>
+                <w:sz w:val="18"/>
+              </w:rPr>
+              <w:t>代理样本提高目标召回，但不能代表真实钛磁铁矿能力</w:t>
+            </w:r>
+          </w:p>
+        </w:tc>
+        <w:tc>
+          <w:tcPr>
+            <w:tcW w:w="3401" w:type="dxa"/>
             <w:tcMar>
               <w:top w:w="80" w:type="dxa"/>
               <w:left w:w="90" w:type="dxa"/>
@@ -20736,25 +23592,16 @@
           </w:tcPr>
           <w:p>
             <w:pPr>
-              <w:spacing w:after="0" w:line="264" w:lineRule="auto"/>
-            </w:pPr>
-            <w:r>
-              <w:rPr>
-                <w:sz w:val="15"/>
-              </w:rPr>
-              <w:t>增加代理标记并开展使用</w:t>
-            </w:r>
-            <w:r>
-              <w:rPr>
-                <w:sz w:val="15"/>
-              </w:rPr>
-              <w:t>/</w:t>
-            </w:r>
-            <w:r>
-              <w:rPr>
-                <w:sz w:val="15"/>
-              </w:rPr>
-              <w:t>不使用代理消融</w:t>
+              <w:spacing w:before="30" w:after="30" w:line="252" w:lineRule="auto"/>
+              <w:jc w:val="center"/>
+            </w:pPr>
+            <w:r>
+              <w:rPr>
+                <w:rFonts w:ascii="宋体" w:hAnsi="宋体" w:eastAsia="宋体"/>
+                <w:b w:val="0"/>
+                <w:sz w:val="18"/>
+              </w:rPr>
+              <w:t>已完成使用/不使用代理消融，并单列钛磁铁矿小样本限制</w:t>
             </w:r>
           </w:p>
         </w:tc>
@@ -20766,7 +23613,7 @@
         </w:trPr>
         <w:tc>
           <w:tcPr>
-            <w:tcW w:w="2268" w:type="dxa"/>
+            <w:tcW w:w="2267" w:type="dxa"/>
             <w:tcMar>
               <w:top w:w="80" w:type="dxa"/>
               <w:left w:w="90" w:type="dxa"/>
@@ -20777,11 +23624,14 @@
           </w:tcPr>
           <w:p>
             <w:pPr>
-              <w:spacing w:after="0" w:line="264" w:lineRule="auto"/>
-            </w:pPr>
-            <w:r>
-              <w:rPr>
-                <w:sz w:val="15"/>
+              <w:spacing w:after="30" w:line="252" w:lineRule="auto" w:before="30"/>
+              <w:jc w:val="center"/>
+            </w:pPr>
+            <w:r>
+              <w:rPr>
+                <w:rFonts w:ascii="宋体" w:hAnsi="宋体" w:eastAsia="宋体"/>
+                <w:b w:val="0"/>
+                <w:sz w:val="18"/>
               </w:rPr>
               <w:t>单标签与伴生矿物共存</w:t>
             </w:r>
@@ -20789,7 +23639,7 @@
         </w:tc>
         <w:tc>
           <w:tcPr>
-            <w:tcW w:w="3515" w:type="dxa"/>
+            <w:tcW w:w="3401" w:type="dxa"/>
             <w:tcMar>
               <w:top w:w="80" w:type="dxa"/>
               <w:left w:w="90" w:type="dxa"/>
@@ -20800,11 +23650,14 @@
           </w:tcPr>
           <w:p>
             <w:pPr>
-              <w:spacing w:after="0" w:line="264" w:lineRule="auto"/>
-            </w:pPr>
-            <w:r>
-              <w:rPr>
-                <w:sz w:val="15"/>
+              <w:spacing w:after="30" w:line="252" w:lineRule="auto" w:before="30"/>
+              <w:jc w:val="center"/>
+            </w:pPr>
+            <w:r>
+              <w:rPr>
+                <w:rFonts w:ascii="宋体" w:hAnsi="宋体" w:eastAsia="宋体"/>
+                <w:b w:val="0"/>
+                <w:sz w:val="18"/>
               </w:rPr>
               <w:t>页面主题矿物不一定是图像唯一可见对象</w:t>
             </w:r>
@@ -20812,7 +23665,7 @@
         </w:tc>
         <w:tc>
           <w:tcPr>
-            <w:tcW w:w="3402" w:type="dxa"/>
+            <w:tcW w:w="3401" w:type="dxa"/>
             <w:tcMar>
               <w:top w:w="80" w:type="dxa"/>
               <w:left w:w="90" w:type="dxa"/>
@@ -20823,11 +23676,14 @@
           </w:tcPr>
           <w:p>
             <w:pPr>
-              <w:spacing w:after="0" w:line="264" w:lineRule="auto"/>
-            </w:pPr>
-            <w:r>
-              <w:rPr>
-                <w:sz w:val="15"/>
+              <w:spacing w:after="30" w:line="252" w:lineRule="auto" w:before="30"/>
+              <w:jc w:val="center"/>
+            </w:pPr>
+            <w:r>
+              <w:rPr>
+                <w:rFonts w:ascii="宋体" w:hAnsi="宋体" w:eastAsia="宋体"/>
+                <w:b w:val="0"/>
+                <w:sz w:val="18"/>
               </w:rPr>
               <w:t>建立真实候选标签或多标签复核子集</w:t>
             </w:r>
@@ -20841,7 +23697,7 @@
         </w:trPr>
         <w:tc>
           <w:tcPr>
-            <w:tcW w:w="2268" w:type="dxa"/>
+            <w:tcW w:w="2267" w:type="dxa"/>
             <w:tcMar>
               <w:top w:w="80" w:type="dxa"/>
               <w:left w:w="90" w:type="dxa"/>
@@ -20852,19 +23708,22 @@
           </w:tcPr>
           <w:p>
             <w:pPr>
-              <w:spacing w:after="0" w:line="264" w:lineRule="auto"/>
-            </w:pPr>
-            <w:r>
-              <w:rPr>
-                <w:sz w:val="15"/>
-              </w:rPr>
-              <w:t>来源外泛化尚未验证</w:t>
-            </w:r>
-          </w:p>
-        </w:tc>
-        <w:tc>
-          <w:tcPr>
-            <w:tcW w:w="3515" w:type="dxa"/>
+              <w:spacing w:before="30" w:after="30" w:line="252" w:lineRule="auto"/>
+              <w:jc w:val="center"/>
+            </w:pPr>
+            <w:r>
+              <w:rPr>
+                <w:rFonts w:ascii="宋体" w:hAnsi="宋体" w:eastAsia="宋体"/>
+                <w:b w:val="0"/>
+                <w:sz w:val="18"/>
+              </w:rPr>
+              <w:t>来源外泛化仅完成摄影者留出</w:t>
+            </w:r>
+          </w:p>
+        </w:tc>
+        <w:tc>
+          <w:tcPr>
+            <w:tcW w:w="3401" w:type="dxa"/>
             <w:tcMar>
               <w:top w:w="80" w:type="dxa"/>
               <w:left w:w="90" w:type="dxa"/>
@@ -20875,19 +23734,22 @@
           </w:tcPr>
           <w:p>
             <w:pPr>
-              <w:spacing w:after="0" w:line="264" w:lineRule="auto"/>
-            </w:pPr>
-            <w:r>
-              <w:rPr>
-                <w:sz w:val="15"/>
-              </w:rPr>
-              <w:t>摄影者、产地和背景风格可能引入领域偏移</w:t>
-            </w:r>
-          </w:p>
-        </w:tc>
-        <w:tc>
-          <w:tcPr>
-            <w:tcW w:w="3402" w:type="dxa"/>
+              <w:spacing w:before="30" w:after="30" w:line="252" w:lineRule="auto"/>
+              <w:jc w:val="center"/>
+            </w:pPr>
+            <w:r>
+              <w:rPr>
+                <w:rFonts w:ascii="宋体" w:hAnsi="宋体" w:eastAsia="宋体"/>
+                <w:b w:val="0"/>
+                <w:sz w:val="18"/>
+              </w:rPr>
+              <w:t>尚未覆盖矿区、收藏机构或跨网站整体留出</w:t>
+            </w:r>
+          </w:p>
+        </w:tc>
+        <w:tc>
+          <w:tcPr>
+            <w:tcW w:w="3401" w:type="dxa"/>
             <w:tcMar>
               <w:top w:w="80" w:type="dxa"/>
               <w:left w:w="90" w:type="dxa"/>
@@ -20898,13 +23760,16 @@
           </w:tcPr>
           <w:p>
             <w:pPr>
-              <w:spacing w:after="0" w:line="264" w:lineRule="auto"/>
-            </w:pPr>
-            <w:r>
-              <w:rPr>
-                <w:sz w:val="15"/>
-              </w:rPr>
-              <w:t>按来源、摄影者或矿区整体留出测试</w:t>
+              <w:spacing w:before="30" w:after="30" w:line="252" w:lineRule="auto"/>
+              <w:jc w:val="center"/>
+            </w:pPr>
+            <w:r>
+              <w:rPr>
+                <w:rFonts w:ascii="宋体" w:hAnsi="宋体" w:eastAsia="宋体"/>
+                <w:b w:val="0"/>
+                <w:sz w:val="18"/>
+              </w:rPr>
+              <w:t>当前报告摄影者无交叉结果；继续构建更严格外部域测试</w:t>
             </w:r>
           </w:p>
         </w:tc>
@@ -20916,7 +23781,7 @@
         </w:trPr>
         <w:tc>
           <w:tcPr>
-            <w:tcW w:w="2268" w:type="dxa"/>
+            <w:tcW w:w="2267" w:type="dxa"/>
             <w:tcMar>
               <w:top w:w="80" w:type="dxa"/>
               <w:left w:w="90" w:type="dxa"/>
@@ -20927,11 +23792,14 @@
           </w:tcPr>
           <w:p>
             <w:pPr>
-              <w:spacing w:after="0" w:line="264" w:lineRule="auto"/>
-            </w:pPr>
-            <w:r>
-              <w:rPr>
-                <w:sz w:val="15"/>
+              <w:spacing w:after="30" w:line="252" w:lineRule="auto" w:before="30"/>
+              <w:jc w:val="center"/>
+            </w:pPr>
+            <w:r>
+              <w:rPr>
+                <w:rFonts w:ascii="宋体" w:hAnsi="宋体" w:eastAsia="宋体"/>
+                <w:b w:val="0"/>
+                <w:sz w:val="18"/>
               </w:rPr>
               <w:t>分层模型总体收益有限</w:t>
             </w:r>
@@ -20939,7 +23807,7 @@
         </w:tc>
         <w:tc>
           <w:tcPr>
-            <w:tcW w:w="3515" w:type="dxa"/>
+            <w:tcW w:w="3401" w:type="dxa"/>
             <w:tcMar>
               <w:top w:w="80" w:type="dxa"/>
               <w:left w:w="90" w:type="dxa"/>
@@ -20950,11 +23818,14 @@
           </w:tcPr>
           <w:p>
             <w:pPr>
-              <w:spacing w:after="0" w:line="264" w:lineRule="auto"/>
-            </w:pPr>
-            <w:r>
-              <w:rPr>
-                <w:sz w:val="15"/>
+              <w:spacing w:after="30" w:line="252" w:lineRule="auto" w:before="30"/>
+              <w:jc w:val="center"/>
+            </w:pPr>
+            <w:r>
+              <w:rPr>
+                <w:rFonts w:ascii="宋体" w:hAnsi="宋体" w:eastAsia="宋体"/>
+                <w:b w:val="0"/>
+                <w:sz w:val="18"/>
               </w:rPr>
               <w:t>均值差接近种子间波动</w:t>
             </w:r>
@@ -20962,7 +23833,7 @@
         </w:tc>
         <w:tc>
           <w:tcPr>
-            <w:tcW w:w="3402" w:type="dxa"/>
+            <w:tcW w:w="3401" w:type="dxa"/>
             <w:tcMar>
               <w:top w:w="80" w:type="dxa"/>
               <w:left w:w="90" w:type="dxa"/>
@@ -20973,11 +23844,14 @@
           </w:tcPr>
           <w:p>
             <w:pPr>
-              <w:spacing w:after="0" w:line="264" w:lineRule="auto"/>
-            </w:pPr>
-            <w:r>
-              <w:rPr>
-                <w:sz w:val="15"/>
+              <w:spacing w:after="30" w:line="252" w:lineRule="auto" w:before="30"/>
+              <w:jc w:val="center"/>
+            </w:pPr>
+            <w:r>
+              <w:rPr>
+                <w:rFonts w:ascii="宋体" w:hAnsi="宋体" w:eastAsia="宋体"/>
+                <w:b w:val="0"/>
+                <w:sz w:val="18"/>
               </w:rPr>
               <w:t>报告风险取舍，不宣称稳定领先</w:t>
             </w:r>
@@ -20991,7 +23865,7 @@
         </w:trPr>
         <w:tc>
           <w:tcPr>
-            <w:tcW w:w="2268" w:type="dxa"/>
+            <w:tcW w:w="2267" w:type="dxa"/>
             <w:tcMar>
               <w:top w:w="80" w:type="dxa"/>
               <w:left w:w="90" w:type="dxa"/>
@@ -21002,19 +23876,22 @@
           </w:tcPr>
           <w:p>
             <w:pPr>
-              <w:spacing w:after="0" w:line="264" w:lineRule="auto"/>
-            </w:pPr>
-            <w:r>
-              <w:rPr>
-                <w:sz w:val="15"/>
-              </w:rPr>
-              <w:t>置信度尚未校准</w:t>
-            </w:r>
-          </w:p>
-        </w:tc>
-        <w:tc>
-          <w:tcPr>
-            <w:tcW w:w="3515" w:type="dxa"/>
+              <w:spacing w:before="30" w:after="30" w:line="252" w:lineRule="auto"/>
+              <w:jc w:val="center"/>
+            </w:pPr>
+            <w:r>
+              <w:rPr>
+                <w:rFonts w:ascii="宋体" w:hAnsi="宋体" w:eastAsia="宋体"/>
+                <w:b w:val="0"/>
+                <w:sz w:val="18"/>
+              </w:rPr>
+              <w:t>校准与风险认证仍受样本规模限制</w:t>
+            </w:r>
+          </w:p>
+        </w:tc>
+        <w:tc>
+          <w:tcPr>
+            <w:tcW w:w="3401" w:type="dxa"/>
             <w:tcMar>
               <w:top w:w="80" w:type="dxa"/>
               <w:left w:w="90" w:type="dxa"/>
@@ -21025,19 +23902,22 @@
           </w:tcPr>
           <w:p>
             <w:pPr>
-              <w:spacing w:after="0" w:line="264" w:lineRule="auto"/>
-            </w:pPr>
-            <w:r>
-              <w:rPr>
-                <w:sz w:val="15"/>
-              </w:rPr>
-              <w:t>阈值不能解释为推荐运行点</w:t>
-            </w:r>
-          </w:p>
-        </w:tc>
-        <w:tc>
-          <w:tcPr>
-            <w:tcW w:w="3402" w:type="dxa"/>
+              <w:spacing w:before="30" w:after="30" w:line="252" w:lineRule="auto"/>
+              <w:jc w:val="center"/>
+            </w:pPr>
+            <w:r>
+              <w:rPr>
+                <w:rFonts w:ascii="宋体" w:hAnsi="宋体" w:eastAsia="宋体"/>
+                <w:b w:val="0"/>
+                <w:sz w:val="18"/>
+              </w:rPr>
+              <w:t>δ=0.10仅一个种子取得证书，严格风险控制不稳定</w:t>
+            </w:r>
+          </w:p>
+        </w:tc>
+        <w:tc>
+          <w:tcPr>
+            <w:tcW w:w="3401" w:type="dxa"/>
             <w:tcMar>
               <w:top w:w="80" w:type="dxa"/>
               <w:left w:w="90" w:type="dxa"/>
@@ -21048,43 +23928,16 @@
           </w:tcPr>
           <w:p>
             <w:pPr>
-              <w:spacing w:after="0" w:line="264" w:lineRule="auto"/>
-            </w:pPr>
-            <w:r>
-              <w:rPr>
-                <w:sz w:val="15"/>
-              </w:rPr>
-              <w:t>验证集温度缩放并报告</w:t>
-            </w:r>
-            <w:r>
-              <w:rPr>
-                <w:sz w:val="15"/>
-              </w:rPr>
-              <w:t xml:space="preserve"> ECE</w:t>
-            </w:r>
-            <w:r>
-              <w:rPr>
-                <w:sz w:val="15"/>
-              </w:rPr>
-              <w:t>、</w:t>
-            </w:r>
-            <w:r>
-              <w:rPr>
-                <w:sz w:val="15"/>
-              </w:rPr>
-              <w:t>Brier</w:t>
-            </w:r>
-            <w:r>
-              <w:rPr>
-                <w:sz w:val="15"/>
-              </w:rPr>
-              <w:t>、</w:t>
-            </w:r>
-            <w:r>
-              <w:rPr>
-                <w:sz w:val="15"/>
-              </w:rPr>
-              <w:t>AURC</w:t>
+              <w:spacing w:before="30" w:after="30" w:line="252" w:lineRule="auto"/>
+              <w:jc w:val="center"/>
+            </w:pPr>
+            <w:r>
+              <w:rPr>
+                <w:rFonts w:ascii="宋体" w:hAnsi="宋体" w:eastAsia="宋体"/>
+                <w:b w:val="0"/>
+                <w:sz w:val="18"/>
+              </w:rPr>
+              <w:t>扩展认证样本并比较向量缩放、Dirichlet 校准和共形风险控制</w:t>
             </w:r>
           </w:p>
         </w:tc>
@@ -21094,17 +23947,15 @@
       <w:pPr>
         <w:pStyle w:val="af7"/>
         <w:keepNext/>
-        <w:spacing w:after="100"/>
+        <w:spacing w:after="100" w:line="360" w:lineRule="auto"/>
         <w:jc w:val="center"/>
       </w:pPr>
       <w:r>
-        <w:t>表</w:t>
-      </w:r>
-      <w:r>
-        <w:t xml:space="preserve"> 19 </w:t>
-      </w:r>
-      <w:r>
-        <w:t>当前局限性及处理原则</w:t>
+        <w:rPr>
+          <w:rFonts w:ascii="宋体" w:hAnsi="宋体" w:eastAsia="宋体"/>
+          <w:sz w:val="21"/>
+        </w:rPr>
+        <w:t>表 25 当前局限性及处理原则</w:t>
       </w:r>
     </w:p>
     <w:p>
@@ -21171,62 +24022,30 @@
     </w:p>
     <w:p>
       <w:pPr>
+        <w:spacing w:line="360" w:lineRule="auto"/>
         <w:ind w:firstLine="420"/>
         <w:jc w:val="both"/>
       </w:pPr>
       <w:r>
-        <w:t>第四，回填摄影者、矿区、收藏机构和背景信息，建立来源留出测试集；普通随机固定测试集继续保留用于与既有结果连续比较。</w:t>
+        <w:rPr>
+          <w:rFonts w:ascii="宋体" w:hAnsi="宋体" w:eastAsia="宋体"/>
+          <w:sz w:val="21"/>
+        </w:rPr>
+        <w:t>第四，已利用摄影者字段建立严格来源留出测试：5,639张可用样本按摄影者与重复图像组整体划分，训练、验证和测试的摄影者及 split_group_id 均无重叠。后续仍需扩展到矿区、收藏机构和跨网站整体留出。</w:t>
       </w:r>
     </w:p>
     <w:p>
       <w:pPr>
+        <w:spacing w:line="360" w:lineRule="auto"/>
         <w:ind w:firstLine="420"/>
         <w:jc w:val="both"/>
       </w:pPr>
       <w:r>
-        <w:t>第五，对最大</w:t>
-      </w:r>
-      <w:r>
-        <w:t xml:space="preserve"> Softmax </w:t>
-      </w:r>
-      <w:r>
-        <w:t>概率进行验证集温度缩放，报告</w:t>
-      </w:r>
-      <w:r>
-        <w:t xml:space="preserve"> NLL</w:t>
-      </w:r>
-      <w:r>
-        <w:t>、</w:t>
-      </w:r>
-      <w:r>
-        <w:t>ECE</w:t>
-      </w:r>
-      <w:r>
-        <w:t>、</w:t>
-      </w:r>
-      <w:r>
-        <w:t>Brier</w:t>
-      </w:r>
-      <w:r>
-        <w:t>、</w:t>
-      </w:r>
-      <w:r>
-        <w:t>Risk-Coverage</w:t>
-      </w:r>
-      <w:r>
-        <w:t>、</w:t>
-      </w:r>
-      <w:r>
-        <w:t xml:space="preserve">AURC </w:t>
-      </w:r>
-      <w:r>
-        <w:t>和</w:t>
-      </w:r>
-      <w:r>
-        <w:t xml:space="preserve"> E-AURC</w:t>
-      </w:r>
-      <w:r>
-        <w:t>，并在验证集按预定约束选择阈值。</w:t>
+        <w:rPr>
+          <w:rFonts w:ascii="宋体" w:hAnsi="宋体" w:eastAsia="宋体"/>
+          <w:sz w:val="21"/>
+        </w:rPr>
+        <w:t>第五，已完成验证集温度缩放、NLL/ECE/Brier/AURC评估和独立认证子集上的风险阈值选择。后续需要扩大校准样本规模，比较向量缩放、Dirichlet 校准和共形风险控制，并预注册更细的风险约束。</w:t>
       </w:r>
     </w:p>
     <w:p>
@@ -21491,64 +24310,66 @@
     </w:p>
     <w:p>
       <w:pPr>
+        <w:spacing w:line="360" w:lineRule="auto"/>
         <w:jc w:val="both"/>
       </w:pPr>
       <w:r>
-        <w:t xml:space="preserve">6. </w:t>
-      </w:r>
-      <w:r>
-        <w:t>分层一致性模型提高目标召回和目标代理</w:t>
-      </w:r>
-      <w:r>
-        <w:t xml:space="preserve"> F1</w:t>
-      </w:r>
-      <w:r>
-        <w:t>，但增加部分困难干扰误入目标。当前代码实际采用</w:t>
-      </w:r>
-      <w:r>
-        <w:t xml:space="preserve"> D_KL(A p_s || p_r)</w:t>
-      </w:r>
-      <w:r>
-        <w:t>，本修订稿已统一公式、结构图和文字说明。</w:t>
+        <w:rPr>
+          <w:rFonts w:ascii="宋体" w:hAnsi="宋体" w:eastAsia="宋体"/>
+          <w:sz w:val="21"/>
+        </w:rPr>
+        <w:t>6. 分层一致性模型不仅输出四类角色，还同时学习17类种类、目标/非目标和困难负样本关系。固定映射使种类错误中的43.41%仍保持角色正确，对应18.74±1.29个百分点的经验角色风险收缩。</w:t>
       </w:r>
     </w:p>
     <w:p>
       <w:pPr>
+        <w:spacing w:line="360" w:lineRule="auto"/>
         <w:jc w:val="both"/>
       </w:pPr>
       <w:r>
-        <w:t xml:space="preserve">7. </w:t>
-      </w:r>
-      <w:r>
-        <w:t>固定映射候选集合结果仅是命题与程序实现的构造性一致性检查，不构成图像识别或真实弱标签证据。</w:t>
+        <w:rPr>
+          <w:rFonts w:ascii="宋体" w:hAnsi="宋体" w:eastAsia="宋体"/>
+          <w:sz w:val="21"/>
+        </w:rPr>
+        <w:t>7. DKL(p̃r||pr) 一致性项将平均 KL 从0.0565降至0.0426、双头分歧率从7.42%降至6.36%；该贡献体现为层级分布一致性增强，不保证总体分类精度必然提高。</w:t>
       </w:r>
     </w:p>
     <w:p>
       <w:pPr>
+        <w:spacing w:line="360" w:lineRule="auto"/>
         <w:jc w:val="both"/>
       </w:pPr>
       <w:r>
-        <w:t xml:space="preserve">8. </w:t>
-      </w:r>
-      <w:r>
-        <w:t>选择性识别显示提高阈值会降低覆盖率和保留风险；由于置信度未校准且阈值未由验证集预先选择，该结果仅为固定测试划分的描述性分析。</w:t>
+        <w:rPr>
+          <w:rFonts w:ascii="宋体" w:hAnsi="宋体" w:eastAsia="宋体"/>
+          <w:sz w:val="21"/>
+        </w:rPr>
+        <w:t>8. 验证集温度缩放将测试 ECE 从0.1131降至0.0342、NLL 从0.8399降至0.6633；在δ=0.15和δ=0.20时三个种子均获得独立认证子集上的风险证书，实现了比测试集后验选阈更严格的选择性决策验证。</w:t>
       </w:r>
     </w:p>
     <w:p>
       <w:pPr>
+        <w:spacing w:line="360" w:lineRule="auto"/>
         <w:jc w:val="both"/>
       </w:pPr>
       <w:r>
-        <w:t xml:space="preserve">9. </w:t>
-      </w:r>
-      <w:r>
-        <w:t>当前工作已经形成较完整的结题实验与复现材料，但尚不能证明模型在工业现场、来源外数据、真实品位</w:t>
-      </w:r>
-      <w:r>
-        <w:t>/</w:t>
-      </w:r>
-      <w:r>
-        <w:t>回收率或成本最优决策上有效。</w:t>
+        <w:rPr>
+          <w:rFonts w:ascii="宋体" w:hAnsi="宋体" w:eastAsia="宋体"/>
+          <w:sz w:val="21"/>
+        </w:rPr>
+        <w:t>9. 摄影者来源留出实验中，分层模型 Macro F1 为69.70%±0.90%，较基线提高2.70个百分点；代理消融表明普通磁铁矿有助于目标类表征，但最终23张钛磁铁矿及测试中的4张样本不足以支撑真实性或工业能力结论。</w:t>
+      </w:r>
+    </w:p>
+    <w:p>
+      <w:pPr>
+        <w:spacing w:line="360" w:lineRule="auto" w:after="80"/>
+      </w:pPr>
+      <w:r>
+        <w:rPr>
+          <w:rFonts w:ascii="宋体" w:hAnsi="宋体" w:eastAsia="宋体"/>
+          <w:sz w:val="21"/>
+        </w:rPr>
+        <w:t>10. 本研究的理论结果建立在固定种类—角色映射、同分布校准样本和公开矿物标本图像上；当前结论不涉及钒钛品位预测、工业回收率、真实XRF送检成本或现场生产线性能。阶段条件化选矿决策图保留为获得流程阶段与成本数据后的后续研究方向。</w:t>
       </w:r>
     </w:p>
     <w:p>
@@ -22063,6 +24884,18 @@
           <w:sz w:val="19"/>
         </w:rPr>
         <w:t>[18] Geifman Y, El-Yaniv R. Selective Classification for Deep Neural Networks[C]//Advances in Neural Information Processing Systems. 2017, 30.</w:t>
+      </w:r>
+    </w:p>
+    <w:p>
+      <w:pPr>
+        <w:spacing w:line="360" w:lineRule="auto" w:after="80"/>
+      </w:pPr>
+      <w:r>
+        <w:rPr>
+          <w:rFonts w:ascii="宋体" w:hAnsi="宋体" w:eastAsia="宋体"/>
+          <w:sz w:val="21"/>
+        </w:rPr>
+        <w:t>[19] Guo C, Pleiss G, Sun Y, Weinberger K Q. On Calibration of Modern Neural Networks[C]//Proceedings of ICML. 2017: 1321-1330.</w:t>
       </w:r>
     </w:p>
     <w:p>
@@ -22596,35 +25429,16 @@
     </w:p>
     <w:p>
       <w:pPr>
+        <w:spacing w:line="360" w:lineRule="auto"/>
         <w:ind w:firstLine="420"/>
         <w:jc w:val="both"/>
       </w:pPr>
       <w:r>
-        <w:t>项目保留数据清单、采集与筛选脚本、数据质量审计记录、训练脚本、实验指标、混淆矩阵、逐图预测和图表源数据。固定映射程序化检查汇总位于</w:t>
-      </w:r>
-      <w:r>
-        <w:t xml:space="preserve"> outputs/theory_validation/role_identifiability/role_identifiability_summary.json</w:t>
-      </w:r>
-      <w:r>
-        <w:t>；选择性识别汇总位于</w:t>
-      </w:r>
-      <w:r>
-        <w:t xml:space="preserve"> outputs/theory_validation/selective_recognition/selective_recognition_summary.json</w:t>
-      </w:r>
-      <w:r>
-        <w:t>；图</w:t>
-      </w:r>
-      <w:r>
-        <w:t xml:space="preserve"> 11 </w:t>
-      </w:r>
-      <w:r>
-        <w:t>位于</w:t>
-      </w:r>
-      <w:r>
-        <w:t xml:space="preserve"> outputs/paper_figures_v1/fig9_selective_recognition.png</w:t>
-      </w:r>
-      <w:r>
-        <w:t>。</w:t>
+        <w:rPr>
+          <w:rFonts w:ascii="宋体" w:hAnsi="宋体" w:eastAsia="宋体"/>
+          <w:sz w:val="21"/>
+        </w:rPr>
+        <w:t>项目保留数据清单、采集与筛选脚本、数据质量审计记录、训练脚本、实验指标、混淆矩阵、逐图预测和图表源数据。层级风险汇总位于 outputs/theory_validation/hierarchy_consistency/；校准风险认证汇总位于 outputs/theory_validation/calibrated_selective_recognition/；来源留出与代理消融汇总位于 outputs/paper_experiments_v2/training_summaries/；新增论文图位于 outputs/paper_figures_v2/。</w:t>
       </w:r>
     </w:p>
     <w:p>

</xml_diff>

<commit_message>
exp: add paired cluster inference and report evidence
</commit_message>
<xml_diff>
--- a/结题/基于深度学习的钒钛矿相关矿物图像识别方法研究_技术报告（正式版）.docx
+++ b/结题/基于深度学习的钒钛矿相关矿物图像识别方法研究_技术报告（正式版）.docx
@@ -22645,14 +22645,1086 @@
     <w:p>
       <w:pPr>
         <w:pStyle w:val="21"/>
-        <w:spacing w:line="360" w:lineRule="auto"/>
+      </w:pPr>
+      <w:r>
+        <w:t>5.16 成对簇 Bootstrap 与配对统计推断</w:t>
+      </w:r>
+    </w:p>
+    <w:p>
+      <w:pPr>
+        <w:spacing w:line="360" w:lineRule="auto" w:after="80"/>
       </w:pPr>
       <w:r>
         <w:rPr>
           <w:rFonts w:ascii="宋体" w:hAnsi="宋体" w:eastAsia="宋体"/>
           <w:sz w:val="21"/>
         </w:rPr>
-        <w:t>5.16 实验结果的综合判断</w:t>
+        <w:t>为避免仅凭三随机种子均值判断模型优劣，本研究在固定测试集上按 image_id 对齐普通 EfficientNet-B0 与分层模型的逐图预测。每次重复首先对三个训练随机种子有放回抽样，再在每个真实角色内部以 split_group_id 为不可拆分簇进行有放回抽样；同一簇内的原图、重复图或近重复图始终共同进入样本。设 B 和 H 分别表示基线与分层模型，m 为评价指标，则第 b 次模型效应及其百分位区间定义为：</w:t>
+      </w:r>
+    </w:p>
+    <w:p>
+      <w:pPr>
+        <w:keepNext/>
+        <w:jc w:val="center"/>
+      </w:pPr>
+      <w:r>
+        <w:drawing>
+          <wp:inline xmlns:a="http://schemas.openxmlformats.org/drawingml/2006/main" xmlns:pic="http://schemas.openxmlformats.org/drawingml/2006/picture">
+            <wp:extent cx="5760000" cy="402813"/>
+            <wp:docPr id="26" name="Picture 26"/>
+            <wp:cNvGraphicFramePr>
+              <a:graphicFrameLocks noChangeAspect="1"/>
+            </wp:cNvGraphicFramePr>
+            <a:graphic>
+              <a:graphicData uri="http://schemas.openxmlformats.org/drawingml/2006/picture">
+                <pic:pic>
+                  <pic:nvPicPr>
+                    <pic:cNvPr id="0" name="paired_cluster_bootstrap.png"/>
+                    <pic:cNvPicPr/>
+                  </pic:nvPicPr>
+                  <pic:blipFill>
+                    <a:blip r:embed="rId37"/>
+                    <a:stretch>
+                      <a:fillRect/>
+                    </a:stretch>
+                  </pic:blipFill>
+                  <pic:spPr>
+                    <a:xfrm>
+                      <a:off x="0" y="0"/>
+                      <a:ext cx="5760000" cy="402813"/>
+                    </a:xfrm>
+                    <a:prstGeom prst="rect"/>
+                  </pic:spPr>
+                </pic:pic>
+              </a:graphicData>
+            </a:graphic>
+          </wp:inline>
+        </w:drawing>
+      </w:r>
+    </w:p>
+    <w:p>
+      <w:pPr>
+        <w:pStyle w:val="af7"/>
+        <w:jc w:val="center"/>
+      </w:pPr>
+      <w:r>
+        <w:rPr>
+          <w:rFonts w:ascii="宋体" w:hAnsi="宋体" w:eastAsia="宋体"/>
+          <w:sz w:val="19"/>
+        </w:rPr>
+        <w:t>式（11） 两阶段成对簇 Bootstrap 的模型效应估计</w:t>
+      </w:r>
+    </w:p>
+    <w:p>
+      <w:pPr>
+        <w:spacing w:line="360" w:lineRule="auto" w:after="80"/>
+      </w:pPr>
+      <w:r>
+        <w:rPr>
+          <w:rFonts w:ascii="宋体" w:hAnsi="宋体" w:eastAsia="宋体"/>
+          <w:sz w:val="21"/>
+        </w:rPr>
+        <w:t>正式实验采用10,000次重复，区间为2.5%和97.5%分位数。Accuracy、Macro F1 和目标召回以正差值为改善；目标漏选率及两类干扰误入目标的比例以负差值为改善。该方法同时反映当前三个训练种子和测试图像簇的抽样不确定性，但不外推到未观测的矿区、网站或工业现场。</w:t>
+      </w:r>
+    </w:p>
+    <w:p>
+      <w:pPr>
+        <w:pStyle w:val="af7"/>
+        <w:jc w:val="center"/>
+      </w:pPr>
+      <w:r>
+        <w:rPr>
+          <w:rFonts w:ascii="宋体" w:hAnsi="宋体" w:eastAsia="宋体"/>
+          <w:sz w:val="19"/>
+        </w:rPr>
+        <w:t>表 24 固定测试集上的成对统计推断</w:t>
+      </w:r>
+    </w:p>
+    <w:tbl>
+      <w:tblPr>
+        <w:tblStyle w:val="aff1"/>
+        <w:tblW w:type="auto" w:w="0"/>
+        <w:jc w:val="center"/>
+        <w:tblLayout w:type="fixed"/>
+        <w:tblLook w:firstColumn="1" w:firstRow="1" w:lastColumn="0" w:lastRow="0" w:noHBand="0" w:noVBand="1" w:val="04A0"/>
+      </w:tblPr>
+      <w:tblGrid>
+        <w:gridCol w:w="1531"/>
+        <w:gridCol w:w="1531"/>
+        <w:gridCol w:w="1531"/>
+        <w:gridCol w:w="1531"/>
+        <w:gridCol w:w="1531"/>
+        <w:gridCol w:w="1531"/>
+      </w:tblGrid>
+      <w:tr>
+        <w:trPr>
+          <w:tblHeader w:val="true"/>
+        </w:trPr>
+        <w:tc>
+          <w:tcPr>
+            <w:tcW w:type="dxa" w:w="1927"/>
+            <w:vAlign w:val="center"/>
+            <w:shd w:fill="D9EAF7"/>
+          </w:tcPr>
+          <w:p>
+            <w:pPr>
+              <w:spacing w:before="30" w:after="30" w:line="252" w:lineRule="auto"/>
+              <w:jc w:val="center"/>
+            </w:pPr>
+            <w:r>
+              <w:rPr>
+                <w:rFonts w:ascii="黑体" w:hAnsi="黑体" w:eastAsia="黑体"/>
+                <w:b/>
+                <w:sz w:val="18"/>
+              </w:rPr>
+              <w:t>指标</w:t>
+            </w:r>
+          </w:p>
+        </w:tc>
+        <w:tc>
+          <w:tcPr>
+            <w:tcW w:type="dxa" w:w="1360"/>
+            <w:vAlign w:val="center"/>
+            <w:shd w:fill="D9EAF7"/>
+          </w:tcPr>
+          <w:p>
+            <w:pPr>
+              <w:spacing w:before="30" w:after="30" w:line="252" w:lineRule="auto"/>
+              <w:jc w:val="center"/>
+            </w:pPr>
+            <w:r>
+              <w:rPr>
+                <w:rFonts w:ascii="黑体" w:hAnsi="黑体" w:eastAsia="黑体"/>
+                <w:b/>
+                <w:sz w:val="18"/>
+              </w:rPr>
+              <w:t>基线均值</w:t>
+            </w:r>
+          </w:p>
+        </w:tc>
+        <w:tc>
+          <w:tcPr>
+            <w:tcW w:type="dxa" w:w="1587"/>
+            <w:vAlign w:val="center"/>
+            <w:shd w:fill="D9EAF7"/>
+          </w:tcPr>
+          <w:p>
+            <w:pPr>
+              <w:spacing w:before="30" w:after="30" w:line="252" w:lineRule="auto"/>
+              <w:jc w:val="center"/>
+            </w:pPr>
+            <w:r>
+              <w:rPr>
+                <w:rFonts w:ascii="黑体" w:hAnsi="黑体" w:eastAsia="黑体"/>
+                <w:b/>
+                <w:sz w:val="18"/>
+              </w:rPr>
+              <w:t>分层模型均值</w:t>
+            </w:r>
+          </w:p>
+        </w:tc>
+        <w:tc>
+          <w:tcPr>
+            <w:tcW w:type="dxa" w:w="1530"/>
+            <w:vAlign w:val="center"/>
+            <w:shd w:fill="D9EAF7"/>
+          </w:tcPr>
+          <w:p>
+            <w:pPr>
+              <w:spacing w:before="30" w:after="30" w:line="252" w:lineRule="auto"/>
+              <w:jc w:val="center"/>
+            </w:pPr>
+            <w:r>
+              <w:rPr>
+                <w:rFonts w:ascii="黑体" w:hAnsi="黑体" w:eastAsia="黑体"/>
+                <w:b/>
+                <w:sz w:val="18"/>
+              </w:rPr>
+              <w:t>差值/百分点</w:t>
+            </w:r>
+          </w:p>
+        </w:tc>
+        <w:tc>
+          <w:tcPr>
+            <w:tcW w:type="dxa" w:w="2040"/>
+            <w:vAlign w:val="center"/>
+            <w:shd w:fill="D9EAF7"/>
+          </w:tcPr>
+          <w:p>
+            <w:pPr>
+              <w:spacing w:before="30" w:after="30" w:line="252" w:lineRule="auto"/>
+              <w:jc w:val="center"/>
+            </w:pPr>
+            <w:r>
+              <w:rPr>
+                <w:rFonts w:ascii="黑体" w:hAnsi="黑体" w:eastAsia="黑体"/>
+                <w:b/>
+                <w:sz w:val="18"/>
+              </w:rPr>
+              <w:t>95%簇区间/百分点</w:t>
+            </w:r>
+          </w:p>
+        </w:tc>
+        <w:tc>
+          <w:tcPr>
+            <w:tcW w:type="dxa" w:w="1417"/>
+            <w:vAlign w:val="center"/>
+            <w:shd w:fill="D9EAF7"/>
+          </w:tcPr>
+          <w:p>
+            <w:pPr>
+              <w:spacing w:before="30" w:after="30" w:line="252" w:lineRule="auto"/>
+              <w:jc w:val="center"/>
+            </w:pPr>
+            <w:r>
+              <w:rPr>
+                <w:rFonts w:ascii="黑体" w:hAnsi="黑体" w:eastAsia="黑体"/>
+                <w:b/>
+                <w:sz w:val="18"/>
+              </w:rPr>
+              <w:t>判断</w:t>
+            </w:r>
+          </w:p>
+        </w:tc>
+      </w:tr>
+      <w:tr>
+        <w:tc>
+          <w:tcPr>
+            <w:tcW w:type="dxa" w:w="1927"/>
+            <w:vAlign w:val="center"/>
+          </w:tcPr>
+          <w:p>
+            <w:pPr>
+              <w:spacing w:before="30" w:after="30" w:line="252" w:lineRule="auto"/>
+              <w:jc w:val="center"/>
+            </w:pPr>
+            <w:r>
+              <w:rPr>
+                <w:rFonts w:ascii="宋体" w:hAnsi="宋体" w:eastAsia="宋体"/>
+                <w:b w:val="0"/>
+                <w:sz w:val="18"/>
+              </w:rPr>
+              <w:t>Accuracy</w:t>
+            </w:r>
+          </w:p>
+        </w:tc>
+        <w:tc>
+          <w:tcPr>
+            <w:tcW w:type="dxa" w:w="1360"/>
+            <w:vAlign w:val="center"/>
+          </w:tcPr>
+          <w:p>
+            <w:pPr>
+              <w:spacing w:before="30" w:after="30" w:line="252" w:lineRule="auto"/>
+              <w:jc w:val="center"/>
+            </w:pPr>
+            <w:r>
+              <w:rPr>
+                <w:rFonts w:ascii="宋体" w:hAnsi="宋体" w:eastAsia="宋体"/>
+                <w:b w:val="0"/>
+                <w:sz w:val="18"/>
+              </w:rPr>
+              <w:t>74.79%</w:t>
+            </w:r>
+          </w:p>
+        </w:tc>
+        <w:tc>
+          <w:tcPr>
+            <w:tcW w:type="dxa" w:w="1587"/>
+            <w:vAlign w:val="center"/>
+          </w:tcPr>
+          <w:p>
+            <w:pPr>
+              <w:spacing w:before="30" w:after="30" w:line="252" w:lineRule="auto"/>
+              <w:jc w:val="center"/>
+            </w:pPr>
+            <w:r>
+              <w:rPr>
+                <w:rFonts w:ascii="宋体" w:hAnsi="宋体" w:eastAsia="宋体"/>
+                <w:b w:val="0"/>
+                <w:sz w:val="18"/>
+              </w:rPr>
+              <w:t>75.42%</w:t>
+            </w:r>
+          </w:p>
+        </w:tc>
+        <w:tc>
+          <w:tcPr>
+            <w:tcW w:type="dxa" w:w="1530"/>
+            <w:vAlign w:val="center"/>
+          </w:tcPr>
+          <w:p>
+            <w:pPr>
+              <w:spacing w:before="30" w:after="30" w:line="252" w:lineRule="auto"/>
+              <w:jc w:val="center"/>
+            </w:pPr>
+            <w:r>
+              <w:rPr>
+                <w:rFonts w:ascii="宋体" w:hAnsi="宋体" w:eastAsia="宋体"/>
+                <w:b w:val="0"/>
+                <w:sz w:val="18"/>
+              </w:rPr>
+              <w:t>+0.62</w:t>
+            </w:r>
+          </w:p>
+        </w:tc>
+        <w:tc>
+          <w:tcPr>
+            <w:tcW w:type="dxa" w:w="2040"/>
+            <w:vAlign w:val="center"/>
+          </w:tcPr>
+          <w:p>
+            <w:pPr>
+              <w:spacing w:before="30" w:after="30" w:line="252" w:lineRule="auto"/>
+              <w:jc w:val="center"/>
+            </w:pPr>
+            <w:r>
+              <w:rPr>
+                <w:rFonts w:ascii="宋体" w:hAnsi="宋体" w:eastAsia="宋体"/>
+                <w:b w:val="0"/>
+                <w:sz w:val="18"/>
+              </w:rPr>
+              <w:t>[-2.39, 3.22]</w:t>
+            </w:r>
+          </w:p>
+        </w:tc>
+        <w:tc>
+          <w:tcPr>
+            <w:tcW w:type="dxa" w:w="1417"/>
+            <w:vAlign w:val="center"/>
+          </w:tcPr>
+          <w:p>
+            <w:pPr>
+              <w:spacing w:before="30" w:after="30" w:line="252" w:lineRule="auto"/>
+              <w:jc w:val="center"/>
+            </w:pPr>
+            <w:r>
+              <w:rPr>
+                <w:rFonts w:ascii="宋体" w:hAnsi="宋体" w:eastAsia="宋体"/>
+                <w:b w:val="0"/>
+                <w:sz w:val="18"/>
+              </w:rPr>
+              <w:t>区间跨0</w:t>
+            </w:r>
+          </w:p>
+        </w:tc>
+      </w:tr>
+      <w:tr>
+        <w:tc>
+          <w:tcPr>
+            <w:tcW w:type="dxa" w:w="1927"/>
+            <w:vAlign w:val="center"/>
+          </w:tcPr>
+          <w:p>
+            <w:pPr>
+              <w:spacing w:before="30" w:after="30" w:line="252" w:lineRule="auto"/>
+              <w:jc w:val="center"/>
+            </w:pPr>
+            <w:r>
+              <w:rPr>
+                <w:rFonts w:ascii="宋体" w:hAnsi="宋体" w:eastAsia="宋体"/>
+                <w:b w:val="0"/>
+                <w:sz w:val="18"/>
+              </w:rPr>
+              <w:t>Macro F1</w:t>
+            </w:r>
+          </w:p>
+        </w:tc>
+        <w:tc>
+          <w:tcPr>
+            <w:tcW w:type="dxa" w:w="1360"/>
+            <w:vAlign w:val="center"/>
+          </w:tcPr>
+          <w:p>
+            <w:pPr>
+              <w:spacing w:before="30" w:after="30" w:line="252" w:lineRule="auto"/>
+              <w:jc w:val="center"/>
+            </w:pPr>
+            <w:r>
+              <w:rPr>
+                <w:rFonts w:ascii="宋体" w:hAnsi="宋体" w:eastAsia="宋体"/>
+                <w:b w:val="0"/>
+                <w:sz w:val="18"/>
+              </w:rPr>
+              <w:t>73.02%</w:t>
+            </w:r>
+          </w:p>
+        </w:tc>
+        <w:tc>
+          <w:tcPr>
+            <w:tcW w:type="dxa" w:w="1587"/>
+            <w:vAlign w:val="center"/>
+          </w:tcPr>
+          <w:p>
+            <w:pPr>
+              <w:spacing w:before="30" w:after="30" w:line="252" w:lineRule="auto"/>
+              <w:jc w:val="center"/>
+            </w:pPr>
+            <w:r>
+              <w:rPr>
+                <w:rFonts w:ascii="宋体" w:hAnsi="宋体" w:eastAsia="宋体"/>
+                <w:b w:val="0"/>
+                <w:sz w:val="18"/>
+              </w:rPr>
+              <w:t>73.41%</w:t>
+            </w:r>
+          </w:p>
+        </w:tc>
+        <w:tc>
+          <w:tcPr>
+            <w:tcW w:type="dxa" w:w="1530"/>
+            <w:vAlign w:val="center"/>
+          </w:tcPr>
+          <w:p>
+            <w:pPr>
+              <w:spacing w:before="30" w:after="30" w:line="252" w:lineRule="auto"/>
+              <w:jc w:val="center"/>
+            </w:pPr>
+            <w:r>
+              <w:rPr>
+                <w:rFonts w:ascii="宋体" w:hAnsi="宋体" w:eastAsia="宋体"/>
+                <w:b w:val="0"/>
+                <w:sz w:val="18"/>
+              </w:rPr>
+              <w:t>+0.39</w:t>
+            </w:r>
+          </w:p>
+        </w:tc>
+        <w:tc>
+          <w:tcPr>
+            <w:tcW w:type="dxa" w:w="2040"/>
+            <w:vAlign w:val="center"/>
+          </w:tcPr>
+          <w:p>
+            <w:pPr>
+              <w:spacing w:before="30" w:after="30" w:line="252" w:lineRule="auto"/>
+              <w:jc w:val="center"/>
+            </w:pPr>
+            <w:r>
+              <w:rPr>
+                <w:rFonts w:ascii="宋体" w:hAnsi="宋体" w:eastAsia="宋体"/>
+                <w:b w:val="0"/>
+                <w:sz w:val="18"/>
+              </w:rPr>
+              <w:t>[-2.46, 3.04]</w:t>
+            </w:r>
+          </w:p>
+        </w:tc>
+        <w:tc>
+          <w:tcPr>
+            <w:tcW w:type="dxa" w:w="1417"/>
+            <w:vAlign w:val="center"/>
+          </w:tcPr>
+          <w:p>
+            <w:pPr>
+              <w:spacing w:before="30" w:after="30" w:line="252" w:lineRule="auto"/>
+              <w:jc w:val="center"/>
+            </w:pPr>
+            <w:r>
+              <w:rPr>
+                <w:rFonts w:ascii="宋体" w:hAnsi="宋体" w:eastAsia="宋体"/>
+                <w:b w:val="0"/>
+                <w:sz w:val="18"/>
+              </w:rPr>
+              <w:t>区间跨0</w:t>
+            </w:r>
+          </w:p>
+        </w:tc>
+      </w:tr>
+      <w:tr>
+        <w:tc>
+          <w:tcPr>
+            <w:tcW w:type="dxa" w:w="1927"/>
+            <w:vAlign w:val="center"/>
+          </w:tcPr>
+          <w:p>
+            <w:pPr>
+              <w:spacing w:before="30" w:after="30" w:line="252" w:lineRule="auto"/>
+              <w:jc w:val="center"/>
+            </w:pPr>
+            <w:r>
+              <w:rPr>
+                <w:rFonts w:ascii="宋体" w:hAnsi="宋体" w:eastAsia="宋体"/>
+                <w:b w:val="0"/>
+                <w:sz w:val="18"/>
+              </w:rPr>
+              <w:t>目标召回</w:t>
+            </w:r>
+          </w:p>
+        </w:tc>
+        <w:tc>
+          <w:tcPr>
+            <w:tcW w:type="dxa" w:w="1360"/>
+            <w:vAlign w:val="center"/>
+          </w:tcPr>
+          <w:p>
+            <w:pPr>
+              <w:spacing w:before="30" w:after="30" w:line="252" w:lineRule="auto"/>
+              <w:jc w:val="center"/>
+            </w:pPr>
+            <w:r>
+              <w:rPr>
+                <w:rFonts w:ascii="宋体" w:hAnsi="宋体" w:eastAsia="宋体"/>
+                <w:b w:val="0"/>
+                <w:sz w:val="18"/>
+              </w:rPr>
+              <w:t>68.39%</w:t>
+            </w:r>
+          </w:p>
+        </w:tc>
+        <w:tc>
+          <w:tcPr>
+            <w:tcW w:type="dxa" w:w="1587"/>
+            <w:vAlign w:val="center"/>
+          </w:tcPr>
+          <w:p>
+            <w:pPr>
+              <w:spacing w:before="30" w:after="30" w:line="252" w:lineRule="auto"/>
+              <w:jc w:val="center"/>
+            </w:pPr>
+            <w:r>
+              <w:rPr>
+                <w:rFonts w:ascii="宋体" w:hAnsi="宋体" w:eastAsia="宋体"/>
+                <w:b w:val="0"/>
+                <w:sz w:val="18"/>
+              </w:rPr>
+              <w:t>77.56%</w:t>
+            </w:r>
+          </w:p>
+        </w:tc>
+        <w:tc>
+          <w:tcPr>
+            <w:tcW w:type="dxa" w:w="1530"/>
+            <w:vAlign w:val="center"/>
+          </w:tcPr>
+          <w:p>
+            <w:pPr>
+              <w:spacing w:before="30" w:after="30" w:line="252" w:lineRule="auto"/>
+              <w:jc w:val="center"/>
+            </w:pPr>
+            <w:r>
+              <w:rPr>
+                <w:rFonts w:ascii="宋体" w:hAnsi="宋体" w:eastAsia="宋体"/>
+                <w:b w:val="0"/>
+                <w:sz w:val="18"/>
+              </w:rPr>
+              <w:t>+9.16</w:t>
+            </w:r>
+          </w:p>
+        </w:tc>
+        <w:tc>
+          <w:tcPr>
+            <w:tcW w:type="dxa" w:w="2040"/>
+            <w:vAlign w:val="center"/>
+          </w:tcPr>
+          <w:p>
+            <w:pPr>
+              <w:spacing w:before="30" w:after="30" w:line="252" w:lineRule="auto"/>
+              <w:jc w:val="center"/>
+            </w:pPr>
+            <w:r>
+              <w:rPr>
+                <w:rFonts w:ascii="宋体" w:hAnsi="宋体" w:eastAsia="宋体"/>
+                <w:b w:val="0"/>
+                <w:sz w:val="18"/>
+              </w:rPr>
+              <w:t>[5.18, 13.28]</w:t>
+            </w:r>
+          </w:p>
+        </w:tc>
+        <w:tc>
+          <w:tcPr>
+            <w:tcW w:type="dxa" w:w="1417"/>
+            <w:vAlign w:val="center"/>
+          </w:tcPr>
+          <w:p>
+            <w:pPr>
+              <w:spacing w:before="30" w:after="30" w:line="252" w:lineRule="auto"/>
+              <w:jc w:val="center"/>
+            </w:pPr>
+            <w:r>
+              <w:rPr>
+                <w:rFonts w:ascii="宋体" w:hAnsi="宋体" w:eastAsia="宋体"/>
+                <w:b w:val="0"/>
+                <w:sz w:val="18"/>
+              </w:rPr>
+              <w:t>稳定改善</w:t>
+            </w:r>
+          </w:p>
+        </w:tc>
+      </w:tr>
+      <w:tr>
+        <w:tc>
+          <w:tcPr>
+            <w:tcW w:type="dxa" w:w="1927"/>
+            <w:vAlign w:val="center"/>
+          </w:tcPr>
+          <w:p>
+            <w:pPr>
+              <w:spacing w:before="30" w:after="30" w:line="252" w:lineRule="auto"/>
+              <w:jc w:val="center"/>
+            </w:pPr>
+            <w:r>
+              <w:rPr>
+                <w:rFonts w:ascii="宋体" w:hAnsi="宋体" w:eastAsia="宋体"/>
+                <w:b w:val="0"/>
+                <w:sz w:val="18"/>
+              </w:rPr>
+              <w:t>目标漏选率</w:t>
+            </w:r>
+          </w:p>
+        </w:tc>
+        <w:tc>
+          <w:tcPr>
+            <w:tcW w:type="dxa" w:w="1360"/>
+            <w:vAlign w:val="center"/>
+          </w:tcPr>
+          <w:p>
+            <w:pPr>
+              <w:spacing w:before="30" w:after="30" w:line="252" w:lineRule="auto"/>
+              <w:jc w:val="center"/>
+            </w:pPr>
+            <w:r>
+              <w:rPr>
+                <w:rFonts w:ascii="宋体" w:hAnsi="宋体" w:eastAsia="宋体"/>
+                <w:b w:val="0"/>
+                <w:sz w:val="18"/>
+              </w:rPr>
+              <w:t>31.61%</w:t>
+            </w:r>
+          </w:p>
+        </w:tc>
+        <w:tc>
+          <w:tcPr>
+            <w:tcW w:type="dxa" w:w="1587"/>
+            <w:vAlign w:val="center"/>
+          </w:tcPr>
+          <w:p>
+            <w:pPr>
+              <w:spacing w:before="30" w:after="30" w:line="252" w:lineRule="auto"/>
+              <w:jc w:val="center"/>
+            </w:pPr>
+            <w:r>
+              <w:rPr>
+                <w:rFonts w:ascii="宋体" w:hAnsi="宋体" w:eastAsia="宋体"/>
+                <w:b w:val="0"/>
+                <w:sz w:val="18"/>
+              </w:rPr>
+              <w:t>22.44%</w:t>
+            </w:r>
+          </w:p>
+        </w:tc>
+        <w:tc>
+          <w:tcPr>
+            <w:tcW w:type="dxa" w:w="1530"/>
+            <w:vAlign w:val="center"/>
+          </w:tcPr>
+          <w:p>
+            <w:pPr>
+              <w:spacing w:before="30" w:after="30" w:line="252" w:lineRule="auto"/>
+              <w:jc w:val="center"/>
+            </w:pPr>
+            <w:r>
+              <w:rPr>
+                <w:rFonts w:ascii="宋体" w:hAnsi="宋体" w:eastAsia="宋体"/>
+                <w:b w:val="0"/>
+                <w:sz w:val="18"/>
+              </w:rPr>
+              <w:t>-9.16</w:t>
+            </w:r>
+          </w:p>
+        </w:tc>
+        <w:tc>
+          <w:tcPr>
+            <w:tcW w:type="dxa" w:w="2040"/>
+            <w:vAlign w:val="center"/>
+          </w:tcPr>
+          <w:p>
+            <w:pPr>
+              <w:spacing w:before="30" w:after="30" w:line="252" w:lineRule="auto"/>
+              <w:jc w:val="center"/>
+            </w:pPr>
+            <w:r>
+              <w:rPr>
+                <w:rFonts w:ascii="宋体" w:hAnsi="宋体" w:eastAsia="宋体"/>
+                <w:b w:val="0"/>
+                <w:sz w:val="18"/>
+              </w:rPr>
+              <w:t>[-13.28, -5.18]</w:t>
+            </w:r>
+          </w:p>
+        </w:tc>
+        <w:tc>
+          <w:tcPr>
+            <w:tcW w:type="dxa" w:w="1417"/>
+            <w:vAlign w:val="center"/>
+          </w:tcPr>
+          <w:p>
+            <w:pPr>
+              <w:spacing w:before="30" w:after="30" w:line="252" w:lineRule="auto"/>
+              <w:jc w:val="center"/>
+            </w:pPr>
+            <w:r>
+              <w:rPr>
+                <w:rFonts w:ascii="宋体" w:hAnsi="宋体" w:eastAsia="宋体"/>
+                <w:b w:val="0"/>
+                <w:sz w:val="18"/>
+              </w:rPr>
+              <w:t>稳定下降</w:t>
+            </w:r>
+          </w:p>
+        </w:tc>
+      </w:tr>
+      <w:tr>
+        <w:tc>
+          <w:tcPr>
+            <w:tcW w:type="dxa" w:w="1927"/>
+            <w:vAlign w:val="center"/>
+          </w:tcPr>
+          <w:p>
+            <w:pPr>
+              <w:spacing w:before="30" w:after="30" w:line="252" w:lineRule="auto"/>
+              <w:jc w:val="center"/>
+            </w:pPr>
+            <w:r>
+              <w:rPr>
+                <w:rFonts w:ascii="宋体" w:hAnsi="宋体" w:eastAsia="宋体"/>
+                <w:b w:val="0"/>
+                <w:sz w:val="18"/>
+              </w:rPr>
+              <w:t>含钛干扰误入目标</w:t>
+            </w:r>
+          </w:p>
+        </w:tc>
+        <w:tc>
+          <w:tcPr>
+            <w:tcW w:type="dxa" w:w="1360"/>
+            <w:vAlign w:val="center"/>
+          </w:tcPr>
+          <w:p>
+            <w:pPr>
+              <w:spacing w:before="30" w:after="30" w:line="252" w:lineRule="auto"/>
+              <w:jc w:val="center"/>
+            </w:pPr>
+            <w:r>
+              <w:rPr>
+                <w:rFonts w:ascii="宋体" w:hAnsi="宋体" w:eastAsia="宋体"/>
+                <w:b w:val="0"/>
+                <w:sz w:val="18"/>
+              </w:rPr>
+              <w:t>7.74%</w:t>
+            </w:r>
+          </w:p>
+        </w:tc>
+        <w:tc>
+          <w:tcPr>
+            <w:tcW w:type="dxa" w:w="1587"/>
+            <w:vAlign w:val="center"/>
+          </w:tcPr>
+          <w:p>
+            <w:pPr>
+              <w:spacing w:before="30" w:after="30" w:line="252" w:lineRule="auto"/>
+              <w:jc w:val="center"/>
+            </w:pPr>
+            <w:r>
+              <w:rPr>
+                <w:rFonts w:ascii="宋体" w:hAnsi="宋体" w:eastAsia="宋体"/>
+                <w:b w:val="0"/>
+                <w:sz w:val="18"/>
+              </w:rPr>
+              <w:t>10.93%</w:t>
+            </w:r>
+          </w:p>
+        </w:tc>
+        <w:tc>
+          <w:tcPr>
+            <w:tcW w:type="dxa" w:w="1530"/>
+            <w:vAlign w:val="center"/>
+          </w:tcPr>
+          <w:p>
+            <w:pPr>
+              <w:spacing w:before="30" w:after="30" w:line="252" w:lineRule="auto"/>
+              <w:jc w:val="center"/>
+            </w:pPr>
+            <w:r>
+              <w:rPr>
+                <w:rFonts w:ascii="宋体" w:hAnsi="宋体" w:eastAsia="宋体"/>
+                <w:b w:val="0"/>
+                <w:sz w:val="18"/>
+              </w:rPr>
+              <w:t>+3.19</w:t>
+            </w:r>
+          </w:p>
+        </w:tc>
+        <w:tc>
+          <w:tcPr>
+            <w:tcW w:type="dxa" w:w="2040"/>
+            <w:vAlign w:val="center"/>
+          </w:tcPr>
+          <w:p>
+            <w:pPr>
+              <w:spacing w:before="30" w:after="30" w:line="252" w:lineRule="auto"/>
+              <w:jc w:val="center"/>
+            </w:pPr>
+            <w:r>
+              <w:rPr>
+                <w:rFonts w:ascii="宋体" w:hAnsi="宋体" w:eastAsia="宋体"/>
+                <w:b w:val="0"/>
+                <w:sz w:val="18"/>
+              </w:rPr>
+              <w:t>[0.07, 6.79]</w:t>
+            </w:r>
+          </w:p>
+        </w:tc>
+        <w:tc>
+          <w:tcPr>
+            <w:tcW w:type="dxa" w:w="1417"/>
+            <w:vAlign w:val="center"/>
+          </w:tcPr>
+          <w:p>
+            <w:pPr>
+              <w:spacing w:before="30" w:after="30" w:line="252" w:lineRule="auto"/>
+              <w:jc w:val="center"/>
+            </w:pPr>
+            <w:r>
+              <w:rPr>
+                <w:rFonts w:ascii="宋体" w:hAnsi="宋体" w:eastAsia="宋体"/>
+                <w:b w:val="0"/>
+                <w:sz w:val="18"/>
+              </w:rPr>
+              <w:t>不利上升</w:t>
+            </w:r>
+          </w:p>
+        </w:tc>
+      </w:tr>
+      <w:tr>
+        <w:tc>
+          <w:tcPr>
+            <w:tcW w:type="dxa" w:w="1927"/>
+            <w:vAlign w:val="center"/>
+          </w:tcPr>
+          <w:p>
+            <w:pPr>
+              <w:spacing w:before="30" w:after="30" w:line="252" w:lineRule="auto"/>
+              <w:jc w:val="center"/>
+            </w:pPr>
+            <w:r>
+              <w:rPr>
+                <w:rFonts w:ascii="宋体" w:hAnsi="宋体" w:eastAsia="宋体"/>
+                <w:b w:val="0"/>
+                <w:sz w:val="18"/>
+              </w:rPr>
+              <w:t>金属光泽干扰误入目标</w:t>
+            </w:r>
+          </w:p>
+        </w:tc>
+        <w:tc>
+          <w:tcPr>
+            <w:tcW w:type="dxa" w:w="1360"/>
+            <w:vAlign w:val="center"/>
+          </w:tcPr>
+          <w:p>
+            <w:pPr>
+              <w:spacing w:before="30" w:after="30" w:line="252" w:lineRule="auto"/>
+              <w:jc w:val="center"/>
+            </w:pPr>
+            <w:r>
+              <w:rPr>
+                <w:rFonts w:ascii="宋体" w:hAnsi="宋体" w:eastAsia="宋体"/>
+                <w:b w:val="0"/>
+                <w:sz w:val="18"/>
+              </w:rPr>
+              <w:t>9.66%</w:t>
+            </w:r>
+          </w:p>
+        </w:tc>
+        <w:tc>
+          <w:tcPr>
+            <w:tcW w:type="dxa" w:w="1587"/>
+            <w:vAlign w:val="center"/>
+          </w:tcPr>
+          <w:p>
+            <w:pPr>
+              <w:spacing w:before="30" w:after="30" w:line="252" w:lineRule="auto"/>
+              <w:jc w:val="center"/>
+            </w:pPr>
+            <w:r>
+              <w:rPr>
+                <w:rFonts w:ascii="宋体" w:hAnsi="宋体" w:eastAsia="宋体"/>
+                <w:b w:val="0"/>
+                <w:sz w:val="18"/>
+              </w:rPr>
+              <w:t>14.39%</w:t>
+            </w:r>
+          </w:p>
+        </w:tc>
+        <w:tc>
+          <w:tcPr>
+            <w:tcW w:type="dxa" w:w="1530"/>
+            <w:vAlign w:val="center"/>
+          </w:tcPr>
+          <w:p>
+            <w:pPr>
+              <w:spacing w:before="30" w:after="30" w:line="252" w:lineRule="auto"/>
+              <w:jc w:val="center"/>
+            </w:pPr>
+            <w:r>
+              <w:rPr>
+                <w:rFonts w:ascii="宋体" w:hAnsi="宋体" w:eastAsia="宋体"/>
+                <w:b w:val="0"/>
+                <w:sz w:val="18"/>
+              </w:rPr>
+              <w:t>+4.73</w:t>
+            </w:r>
+          </w:p>
+        </w:tc>
+        <w:tc>
+          <w:tcPr>
+            <w:tcW w:type="dxa" w:w="2040"/>
+            <w:vAlign w:val="center"/>
+          </w:tcPr>
+          <w:p>
+            <w:pPr>
+              <w:spacing w:before="30" w:after="30" w:line="252" w:lineRule="auto"/>
+              <w:jc w:val="center"/>
+            </w:pPr>
+            <w:r>
+              <w:rPr>
+                <w:rFonts w:ascii="宋体" w:hAnsi="宋体" w:eastAsia="宋体"/>
+                <w:b w:val="0"/>
+                <w:sz w:val="18"/>
+              </w:rPr>
+              <w:t>[1.33, 8.14]</w:t>
+            </w:r>
+          </w:p>
+        </w:tc>
+        <w:tc>
+          <w:tcPr>
+            <w:tcW w:type="dxa" w:w="1417"/>
+            <w:vAlign w:val="center"/>
+          </w:tcPr>
+          <w:p>
+            <w:pPr>
+              <w:spacing w:before="30" w:after="30" w:line="252" w:lineRule="auto"/>
+              <w:jc w:val="center"/>
+            </w:pPr>
+            <w:r>
+              <w:rPr>
+                <w:rFonts w:ascii="宋体" w:hAnsi="宋体" w:eastAsia="宋体"/>
+                <w:b w:val="0"/>
+                <w:sz w:val="18"/>
+              </w:rPr>
+              <w:t>不利上升</w:t>
+            </w:r>
+          </w:p>
+        </w:tc>
+      </w:tr>
+    </w:tbl>
+    <w:p>
+      <w:pPr>
+        <w:spacing w:after="60"/>
+      </w:pPr>
+    </w:p>
+    <w:p>
+      <w:pPr>
+        <w:keepNext/>
+        <w:jc w:val="center"/>
+      </w:pPr>
+      <w:r>
+        <w:drawing>
+          <wp:inline xmlns:a="http://schemas.openxmlformats.org/drawingml/2006/main" xmlns:pic="http://schemas.openxmlformats.org/drawingml/2006/picture">
+            <wp:extent cx="5688000" cy="3129200"/>
+            <wp:docPr id="27" name="Picture 27"/>
+            <wp:cNvGraphicFramePr>
+              <a:graphicFrameLocks noChangeAspect="1"/>
+            </wp:cNvGraphicFramePr>
+            <a:graphic>
+              <a:graphicData uri="http://schemas.openxmlformats.org/drawingml/2006/picture">
+                <pic:pic>
+                  <pic:nvPicPr>
+                    <pic:cNvPr id="0" name="fig_paired_cluster_effects.png"/>
+                    <pic:cNvPicPr/>
+                  </pic:nvPicPr>
+                  <pic:blipFill>
+                    <a:blip r:embed="rId38"/>
+                    <a:stretch>
+                      <a:fillRect/>
+                    </a:stretch>
+                  </pic:blipFill>
+                  <pic:spPr>
+                    <a:xfrm>
+                      <a:off x="0" y="0"/>
+                      <a:ext cx="5688000" cy="3129200"/>
+                    </a:xfrm>
+                    <a:prstGeom prst="rect"/>
+                  </pic:spPr>
+                </pic:pic>
+              </a:graphicData>
+            </a:graphic>
+          </wp:inline>
+        </w:drawing>
+      </w:r>
+    </w:p>
+    <w:p>
+      <w:pPr>
+        <w:pStyle w:val="af7"/>
+        <w:jc w:val="center"/>
+      </w:pPr>
+      <w:r>
+        <w:rPr>
+          <w:rFonts w:ascii="宋体" w:hAnsi="宋体" w:eastAsia="宋体"/>
+          <w:sz w:val="19"/>
+        </w:rPr>
+        <w:t>图 16 分层模型相对基线的成对效应及95%簇 Bootstrap 区间</w:t>
+      </w:r>
+    </w:p>
+    <w:p>
+      <w:pPr>
+        <w:spacing w:line="360" w:lineRule="auto" w:after="80"/>
+      </w:pPr>
+      <w:r>
+        <w:rPr>
+          <w:rFonts w:ascii="宋体" w:hAnsi="宋体" w:eastAsia="宋体"/>
+          <w:sz w:val="21"/>
+        </w:rPr>
+        <w:t>结果显示，分层模型的目标召回提高9.16个百分点，95%簇 Bootstrap 区间为[5.18, 13.28]个百分点；目标漏选率相应下降9.16个百分点。与此同时，含钛干扰和金属光泽干扰误入目标类的比例分别上升3.19和4.73个百分点，且对应区间均未跨0。Accuracy仅提高0.62个百分点、Macro F1仅提高0.39个百分点，两者区间均跨0。因此，分层模型的主要效果是改变目标召回—难负样本误收之间的风险分配，而非证明总体性能全面提高。</w:t>
+      </w:r>
+    </w:p>
+    <w:p>
+      <w:pPr>
+        <w:spacing w:line="360" w:lineRule="auto" w:after="80"/>
+      </w:pPr>
+      <w:r>
+        <w:rPr>
+          <w:rFonts w:ascii="宋体" w:hAnsi="宋体" w:eastAsia="宋体"/>
+          <w:sz w:val="21"/>
+        </w:rPr>
+        <w:t>作为逐图正确/错误变化的补充检验，每个随机种子分别进行双侧精确 McNemar 检验，并对三个 p 值作 Holm 校正。三个种子的校正后 p 值依次为0.094、0.110和0.110，三组经 Holm 校正的 p 值均大于0.05；同时第一个种子中基线独有正确135张、分层模型独有正确101张，而另两个种子的方向相反。这表明总体正确率变化存在明显种子异质性，不能将单个未校正结果解释为稳定优势。</w:t>
+      </w:r>
+    </w:p>
+    <w:p>
+      <w:pPr>
+        <w:spacing w:line="360" w:lineRule="auto" w:after="80"/>
+      </w:pPr>
+      <w:r>
+        <w:rPr>
+          <w:rFonts w:ascii="宋体" w:hAnsi="宋体" w:eastAsia="宋体"/>
+          <w:sz w:val="21"/>
+        </w:rPr>
+        <w:t>该统计结果进一步支持本报告的风险敏感理论主线：层级辅助任务可以显著降低目标漏选，但不会自动控制含钛和金属光泽难负样本的误收。后续推理必须结合5.13节的概率校准、风险证书或类别相关阈值，在目标保留与干扰进入之间进行显式权衡。</w:t>
+      </w:r>
+    </w:p>
+    <w:p>
+      <w:pPr>
+        <w:pStyle w:val="21"/>
+        <w:spacing w:line="360" w:lineRule="auto"/>
+      </w:pPr>
+      <w:r>
+        <w:rPr>
+          <w:rFonts w:ascii="宋体" w:hAnsi="宋体" w:eastAsia="宋体"/>
+          <w:sz w:val="21"/>
+        </w:rPr>
+        <w:t>5.17 实验结果的综合判断</w:t>
       </w:r>
     </w:p>
     <w:p>
@@ -23080,7 +24152,7 @@
           <w:rFonts w:ascii="宋体" w:hAnsi="宋体" w:eastAsia="宋体"/>
           <w:sz w:val="21"/>
         </w:rPr>
-        <w:t>表 24 本阶段方法贡献及其解释边界</w:t>
+        <w:t>表 25 本阶段方法贡献及其解释边界</w:t>
       </w:r>
     </w:p>
     <w:p>
@@ -23955,7 +25027,7 @@
           <w:rFonts w:ascii="宋体" w:hAnsi="宋体" w:eastAsia="宋体"/>
           <w:sz w:val="21"/>
         </w:rPr>
-        <w:t>表 25 当前局限性及处理原则</w:t>
+        <w:t>表 26 当前局限性及处理原则</w:t>
       </w:r>
     </w:p>
     <w:p>
@@ -24362,14 +25434,26 @@
     </w:p>
     <w:p>
       <w:pPr>
-        <w:spacing w:line="360" w:lineRule="auto" w:after="80"/>
+        <w:spacing w:line="360" w:lineRule="auto"/>
       </w:pPr>
       <w:r>
         <w:rPr>
           <w:rFonts w:ascii="宋体" w:hAnsi="宋体" w:eastAsia="宋体"/>
           <w:sz w:val="21"/>
         </w:rPr>
-        <w:t>10. 本研究的理论结果建立在固定种类—角色映射、同分布校准样本和公开矿物标本图像上；当前结论不涉及钒钛品位预测、工业回收率、真实XRF送检成本或现场生产线性能。阶段条件化选矿决策图保留为获得流程阶段与成本数据后的后续研究方向。</w:t>
+        <w:t>10. 成对簇 Bootstrap 表明，分层模型稳定提高目标召回并降低目标漏选，但同时增加两类困难负样本误入目标的比例；总体 Accuracy 和 Macro F1 的区间跨0，McNemar 校正结果也未形成跨种子的总体优势证据。因此，方法贡献应解释为可量化的风险重分配与后续选择性决策基础。</w:t>
+      </w:r>
+    </w:p>
+    <w:p>
+      <w:pPr>
+        <w:spacing w:line="360" w:lineRule="auto" w:after="80"/>
+      </w:pPr>
+      <w:r>
+        <w:rPr>
+          <w:rFonts w:ascii="宋体" w:hAnsi="宋体" w:eastAsia="宋体"/>
+          <w:sz w:val="21"/>
+        </w:rPr>
+        <w:t>11. 本研究的理论结果建立在固定种类—角色映射、同分布校准样本和公开矿物标本图像上；当前结论不涉及钒钛品位预测、工业回收率、真实XRF送检成本或现场生产线性能。阶段条件化选矿决策图保留为获得流程阶段与成本数据后的后续研究方向。</w:t>
       </w:r>
     </w:p>
     <w:p>
@@ -24896,6 +25980,18 @@
           <w:sz w:val="21"/>
         </w:rPr>
         <w:t>[19] Guo C, Pleiss G, Sun Y, Weinberger K Q. On Calibration of Modern Neural Networks[C]//Proceedings of ICML. 2017: 1321-1330.</w:t>
+      </w:r>
+    </w:p>
+    <w:p>
+      <w:pPr>
+        <w:spacing w:line="360" w:lineRule="auto" w:after="80"/>
+      </w:pPr>
+      <w:r>
+        <w:rPr>
+          <w:rFonts w:ascii="宋体" w:hAnsi="宋体" w:eastAsia="宋体"/>
+          <w:sz w:val="21"/>
+        </w:rPr>
+        <w:t>[20] Efron B, Tibshirani R J. An Introduction to the Bootstrap[M]. New York: Chapman &amp; Hall, 1993.</w:t>
       </w:r>
     </w:p>
     <w:p>
@@ -25438,7 +26534,7 @@
           <w:rFonts w:ascii="宋体" w:hAnsi="宋体" w:eastAsia="宋体"/>
           <w:sz w:val="21"/>
         </w:rPr>
-        <w:t>项目保留数据清单、采集与筛选脚本、数据质量审计记录、训练脚本、实验指标、混淆矩阵、逐图预测和图表源数据。层级风险汇总位于 outputs/theory_validation/hierarchy_consistency/；校准风险认证汇总位于 outputs/theory_validation/calibrated_selective_recognition/；来源留出与代理消融汇总位于 outputs/paper_experiments_v2/training_summaries/；新增论文图位于 outputs/paper_figures_v2/。</w:t>
+        <w:t>项目保留数据清单、采集与筛选脚本、数据质量审计记录、训练脚本、实验指标、混淆矩阵、逐图预测和图表源数据。层级风险汇总位于 outputs/theory_validation/hierarchy_consistency/；校准风险认证汇总位于 outputs/theory_validation/calibrated_selective_recognition/；来源留出与代理消融汇总位于 outputs/paper_experiments_v2/training_summaries/；成对簇 Bootstrap、McNemar 结果和重采样分布位于 outputs/paper_experiments_v3/statistical_inference/；对应论文图位于 outputs/paper_figures_v3/。</w:t>
       </w:r>
     </w:p>
     <w:p>

</xml_diff>

<commit_message>
feat: add HRGV theory experiments and formal report
</commit_message>
<xml_diff>
--- a/结题/基于深度学习的钒钛矿相关矿物图像识别方法研究_技术报告（正式版）.docx
+++ b/结题/基于深度学习的钒钛矿相关矿物图像识别方法研究_技术报告（正式版）.docx
@@ -433,6 +433,18 @@
           <w:sz w:val="21"/>
         </w:rPr>
         <w:t>摄影者整体留出的严格实验包含5,639张具有来源字段的图像。分层模型在该测试上的 Macro F1 为69.70%±0.90%，较 EfficientNet-B0 提高2.70个百分点，并改善目标类和金属光泽干扰召回。普通磁铁矿代理消融表明，移除1,316张代理样本后目标召回由72.22%降至45.06%；钛磁铁矿最终保留23张、固定测试仅4张，因此其结果仅作描述性证据。当前工作定位为公开标本图像条件下的钒钛矿相关组分矿物视觉代理研究，不构成工业品位、回收率或现场分选验证。</w:t>
+      </w:r>
+    </w:p>
+    <w:p>
+      <w:pPr>
+        <w:spacing w:line="360" w:lineRule="auto" w:after="80"/>
+      </w:pPr>
+      <w:r>
+        <w:rPr>
+          <w:rFonts w:ascii="宋体" w:hAnsi="宋体" w:eastAsia="宋体"/>
+          <w:sz w:val="21"/>
+        </w:rPr>
+        <w:t>在进一步的网络改进中，HRGV-Net 的三随机种子 Accuracy 为76.48%±0.23%、Macro F1 为74.59%±0.34%。角色感知对比约束的 Accuracy 与 Macro F1 成对簇区间均未跨0；门控、双验证器和残差校正则表现为可解释但多数尚未达到显著性的风险取舍。</w:t>
       </w:r>
     </w:p>
     <w:p>
@@ -12929,14 +12941,46 @@
     </w:tbl>
     <w:p>
       <w:pPr>
+        <w:spacing w:line="360" w:lineRule="auto" w:after="80"/>
+      </w:pPr>
+      <w:r>
+        <w:rPr>
+          <w:rFonts w:ascii="宋体" w:hAnsi="宋体" w:eastAsia="宋体"/>
+          <w:sz w:val="21"/>
+        </w:rPr>
+        <w:t>图5在 EfficientNet-B0 基线主干上明确给出四个任务头、固定种类—角色映射、DKL(p̃r||pr) 一致性约束以及推理期温度校准和风险认证。网络训练与选择性决策分开：训练阶段学习视觉表征和层级关系，推理阶段使用独立验证数据确定温度与风险阈值。</w:t>
+      </w:r>
+    </w:p>
+    <w:p>
+      <w:pPr>
+        <w:pStyle w:val="21"/>
+      </w:pPr>
+      <w:r>
+        <w:t>4.6 层级风险门控验证网络（HRGV-Net）</w:t>
+      </w:r>
+    </w:p>
+    <w:p>
+      <w:pPr>
+        <w:spacing w:line="360" w:lineRule="auto" w:after="80"/>
+      </w:pPr>
+      <w:r>
+        <w:rPr>
+          <w:rFonts w:ascii="宋体" w:hAnsi="宋体" w:eastAsia="宋体"/>
+          <w:sz w:val="21"/>
+        </w:rPr>
+        <w:t>既有分层模型能够利用17类矿物种类监督提升目标召回，但固定测试集的成对分析表明，两类困难负样本误入目标的比例也随之上升。为直接处理这一失效模式，本研究提出层级风险门控验证网络（HRGV-Net）。网络以 EfficientNet-B0 为共享主干，设置直接角色专家和矿物种类专家；后者经固定映射矩阵 A 聚合为角色后验。可靠性门控根据共享特征、两个专家的熵及 Jensen-Shannon 分歧进行逐图融合，随后由“目标—含钛干扰”和“目标—金属光泽干扰”两个验证器对目标后验进行中性区残差校正。 本方法仍是公开矿物标本图像上的视觉代理任务，不等同于工业分选回收率验证。</w:t>
+      </w:r>
+    </w:p>
+    <w:p>
+      <w:pPr>
         <w:keepNext/>
         <w:jc w:val="center"/>
       </w:pPr>
       <w:r>
         <w:drawing>
           <wp:inline xmlns:a="http://schemas.openxmlformats.org/drawingml/2006/main" xmlns:pic="http://schemas.openxmlformats.org/drawingml/2006/picture">
-            <wp:extent cx="5760000" cy="3360000"/>
-            <wp:docPr id="25" name="Picture 25"/>
+            <wp:extent cx="5832000" cy="3424735"/>
+            <wp:docPr id="28" name="Picture 28"/>
             <wp:cNvGraphicFramePr>
               <a:graphicFrameLocks noChangeAspect="1"/>
             </wp:cNvGraphicFramePr>
@@ -12944,11 +12988,11 @@
               <a:graphicData uri="http://schemas.openxmlformats.org/drawingml/2006/picture">
                 <pic:pic>
                   <pic:nvPicPr>
-                    <pic:cNvPr id="0" name="fig_theory_aware_architecture_v2.png"/>
+                    <pic:cNvPr id="0" name="fig_hrgv_architecture.png"/>
                     <pic:cNvPicPr/>
                   </pic:nvPicPr>
                   <pic:blipFill>
-                    <a:blip r:embed="rId36"/>
+                    <a:blip r:embed="rId39"/>
                     <a:stretch>
                       <a:fillRect/>
                     </a:stretch>
@@ -12956,7 +13000,7 @@
                   <pic:spPr>
                     <a:xfrm>
                       <a:off x="0" y="0"/>
-                      <a:ext cx="5760000" cy="3360000"/>
+                      <a:ext cx="5832000" cy="3424735"/>
                     </a:xfrm>
                     <a:prstGeom prst="rect"/>
                   </pic:spPr>
@@ -12977,7 +13021,7 @@
           <w:rFonts w:ascii="宋体" w:hAnsi="宋体" w:eastAsia="宋体"/>
           <w:sz w:val="19"/>
         </w:rPr>
-        <w:t>图 5 理论感知的分层网络、校准与风险认证结构（修订）</w:t>
+        <w:t>图 5 HRGV-Net 的层级证据融合与困难负样本风险验证结构</w:t>
       </w:r>
     </w:p>
     <w:p>
@@ -12989,18 +13033,476 @@
           <w:rFonts w:ascii="宋体" w:hAnsi="宋体" w:eastAsia="宋体"/>
           <w:sz w:val="21"/>
         </w:rPr>
-        <w:t>图5在 EfficientNet-B0 基线主干上明确给出四个任务头、固定种类—角色映射、DKL(p̃r||pr) 一致性约束以及推理期温度校准和风险认证。网络训练与选择性决策分开：训练阶段学习视觉表征和层级关系，推理阶段使用独立验证数据确定温度与风险阈值。</w:t>
+        <w:t>设共享特征为 h，直接角色后验、17类种类后验及其角色映射分别为 pd、ps 和 pm，学习门控为 g，则层级证据融合为：</w:t>
+      </w:r>
+    </w:p>
+    <w:p>
+      <w:pPr>
+        <w:keepNext/>
+        <w:jc w:val="center"/>
+      </w:pPr>
+      <w:r>
+        <w:drawing>
+          <wp:inline xmlns:a="http://schemas.openxmlformats.org/drawingml/2006/main" xmlns:pic="http://schemas.openxmlformats.org/drawingml/2006/picture">
+            <wp:extent cx="5760000" cy="305814"/>
+            <wp:docPr id="29" name="Picture 29"/>
+            <wp:cNvGraphicFramePr>
+              <a:graphicFrameLocks noChangeAspect="1"/>
+            </wp:cNvGraphicFramePr>
+            <a:graphic>
+              <a:graphicData uri="http://schemas.openxmlformats.org/drawingml/2006/picture">
+                <pic:pic>
+                  <pic:nvPicPr>
+                    <pic:cNvPr id="0" name="hrgv_fusion.png"/>
+                    <pic:cNvPicPr/>
+                  </pic:nvPicPr>
+                  <pic:blipFill>
+                    <a:blip r:embed="rId40"/>
+                    <a:stretch>
+                      <a:fillRect/>
+                    </a:stretch>
+                  </pic:blipFill>
+                  <pic:spPr>
+                    <a:xfrm>
+                      <a:off x="0" y="0"/>
+                      <a:ext cx="5760000" cy="305814"/>
+                    </a:xfrm>
+                    <a:prstGeom prst="rect"/>
+                  </pic:spPr>
+                </pic:pic>
+              </a:graphicData>
+            </a:graphic>
+          </wp:inline>
+        </w:drawing>
+      </w:r>
+    </w:p>
+    <w:p>
+      <w:pPr>
+        <w:pStyle w:val="af7"/>
+        <w:jc w:val="center"/>
+      </w:pPr>
+      <w:r>
+        <w:rPr>
+          <w:rFonts w:ascii="宋体" w:hAnsi="宋体" w:eastAsia="宋体"/>
+          <w:sz w:val="19"/>
+        </w:rPr>
+        <w:t>式（12） HRGV-Net 的双专家可靠性融合</w:t>
+      </w:r>
+    </w:p>
+    <w:p>
+      <w:pPr>
+        <w:spacing w:line="360" w:lineRule="auto" w:after="80"/>
+      </w:pPr>
+      <w:r>
+        <w:rPr>
+          <w:rFonts w:ascii="宋体" w:hAnsi="宋体" w:eastAsia="宋体"/>
+          <w:sz w:val="21"/>
+        </w:rPr>
+        <w:t>对验证器 h∈{Ti,Met}，当验证分数不低于阈值 τh 时不修改融合后验；只有反对证据进入中性区以下时，才按强度 βh 单调降低目标相对赔率：</w:t>
+      </w:r>
+    </w:p>
+    <w:p>
+      <w:pPr>
+        <w:keepNext/>
+        <w:jc w:val="center"/>
+      </w:pPr>
+      <w:r>
+        <w:drawing>
+          <wp:inline xmlns:a="http://schemas.openxmlformats.org/drawingml/2006/main" xmlns:pic="http://schemas.openxmlformats.org/drawingml/2006/picture">
+            <wp:extent cx="5760000" cy="327066"/>
+            <wp:docPr id="30" name="Picture 30"/>
+            <wp:cNvGraphicFramePr>
+              <a:graphicFrameLocks noChangeAspect="1"/>
+            </wp:cNvGraphicFramePr>
+            <a:graphic>
+              <a:graphicData uri="http://schemas.openxmlformats.org/drawingml/2006/picture">
+                <pic:pic>
+                  <pic:nvPicPr>
+                    <pic:cNvPr id="0" name="hrgv_correction.png"/>
+                    <pic:cNvPicPr/>
+                  </pic:nvPicPr>
+                  <pic:blipFill>
+                    <a:blip r:embed="rId41"/>
+                    <a:stretch>
+                      <a:fillRect/>
+                    </a:stretch>
+                  </pic:blipFill>
+                  <pic:spPr>
+                    <a:xfrm>
+                      <a:off x="0" y="0"/>
+                      <a:ext cx="5760000" cy="327066"/>
+                    </a:xfrm>
+                    <a:prstGeom prst="rect"/>
+                  </pic:spPr>
+                </pic:pic>
+              </a:graphicData>
+            </a:graphic>
+          </wp:inline>
+        </w:drawing>
+      </w:r>
+    </w:p>
+    <w:p>
+      <w:pPr>
+        <w:pStyle w:val="af7"/>
+        <w:jc w:val="center"/>
+      </w:pPr>
+      <w:r>
+        <w:rPr>
+          <w:rFonts w:ascii="宋体" w:hAnsi="宋体" w:eastAsia="宋体"/>
+          <w:sz w:val="19"/>
+        </w:rPr>
+        <w:t>式（13） 中性区残差后验校正</w:t>
+      </w:r>
+    </w:p>
+    <w:p>
+      <w:pPr>
+        <w:spacing w:line="360" w:lineRule="auto" w:after="80"/>
+      </w:pPr>
+      <w:r>
+        <w:rPr>
+          <w:rFonts w:ascii="宋体" w:hAnsi="宋体" w:eastAsia="宋体"/>
+          <w:sz w:val="21"/>
+        </w:rPr>
+        <w:t>主任务、双专家、层级一致性、双验证器和角色感知对比约束的完整目标函数为：</w:t>
+      </w:r>
+    </w:p>
+    <w:p>
+      <w:pPr>
+        <w:keepNext/>
+        <w:jc w:val="center"/>
+      </w:pPr>
+      <w:r>
+        <w:drawing>
+          <wp:inline xmlns:a="http://schemas.openxmlformats.org/drawingml/2006/main" xmlns:pic="http://schemas.openxmlformats.org/drawingml/2006/picture">
+            <wp:extent cx="5760000" cy="358099"/>
+            <wp:docPr id="31" name="Picture 31"/>
+            <wp:cNvGraphicFramePr>
+              <a:graphicFrameLocks noChangeAspect="1"/>
+            </wp:cNvGraphicFramePr>
+            <a:graphic>
+              <a:graphicData uri="http://schemas.openxmlformats.org/drawingml/2006/picture">
+                <pic:pic>
+                  <pic:nvPicPr>
+                    <pic:cNvPr id="0" name="hrgv_objective.png"/>
+                    <pic:cNvPicPr/>
+                  </pic:nvPicPr>
+                  <pic:blipFill>
+                    <a:blip r:embed="rId42"/>
+                    <a:stretch>
+                      <a:fillRect/>
+                    </a:stretch>
+                  </pic:blipFill>
+                  <pic:spPr>
+                    <a:xfrm>
+                      <a:off x="0" y="0"/>
+                      <a:ext cx="5760000" cy="358099"/>
+                    </a:xfrm>
+                    <a:prstGeom prst="rect"/>
+                  </pic:spPr>
+                </pic:pic>
+              </a:graphicData>
+            </a:graphic>
+          </wp:inline>
+        </w:drawing>
+      </w:r>
+    </w:p>
+    <w:p>
+      <w:pPr>
+        <w:pStyle w:val="af7"/>
+        <w:jc w:val="center"/>
+      </w:pPr>
+      <w:r>
+        <w:rPr>
+          <w:rFonts w:ascii="宋体" w:hAnsi="宋体" w:eastAsia="宋体"/>
+          <w:sz w:val="19"/>
+        </w:rPr>
+        <w:t>式（14） HRGV-Net 的完整训练目标</w:t>
+      </w:r>
+    </w:p>
+    <w:p>
+      <w:pPr>
+        <w:spacing w:line="360" w:lineRule="auto" w:after="80"/>
+      </w:pPr>
+      <w:r>
+        <w:rPr>
+          <w:rFonts w:ascii="黑体" w:hAnsi="黑体" w:eastAsia="黑体"/>
+          <w:b/>
+          <w:sz w:val="21"/>
+        </w:rPr>
+        <w:t>命题1（凸融合对数损失上界）</w:t>
+      </w:r>
+      <w:r>
+        <w:rPr>
+          <w:rFonts w:ascii="宋体" w:hAnsi="宋体" w:eastAsia="宋体"/>
+          <w:sz w:val="21"/>
+        </w:rPr>
+      </w:r>
+    </w:p>
+    <w:p>
+      <w:pPr>
+        <w:spacing w:line="360" w:lineRule="auto" w:after="80"/>
+      </w:pPr>
+      <w:r>
+        <w:rPr>
+          <w:rFonts w:ascii="宋体" w:hAnsi="宋体" w:eastAsia="宋体"/>
+          <w:sz w:val="21"/>
+        </w:rPr>
+        <w:t>对任意真实角色 y 和 g∈[0,1]，融合后验的负对数损失不大于两个专家负对数损失的同权凸组合。证明直接来自 −log 在正数域上的凸性与 Jensen 不等式。该性质说明概率空间融合具有确定的上界，但不意味着学习门控必然显著优于等权融合。</w:t>
+      </w:r>
+    </w:p>
+    <w:p>
+      <w:pPr>
+        <w:spacing w:line="360" w:lineRule="auto" w:after="80"/>
+      </w:pPr>
+      <w:r>
+        <w:rPr>
+          <w:rFonts w:ascii="黑体" w:hAnsi="黑体" w:eastAsia="黑体"/>
+          <w:b/>
+          <w:sz w:val="21"/>
+        </w:rPr>
+        <w:t>命题2（中性区残差校正的恒等性与单调性）</w:t>
+      </w:r>
+      <w:r>
+        <w:rPr>
+          <w:rFonts w:ascii="宋体" w:hAnsi="宋体" w:eastAsia="宋体"/>
+          <w:sz w:val="21"/>
+        </w:rPr>
+      </w:r>
+    </w:p>
+    <w:p>
+      <w:pPr>
+        <w:spacing w:line="360" w:lineRule="auto" w:after="80"/>
+      </w:pPr>
+      <w:r>
+        <w:rPr>
+          <w:rFonts w:ascii="宋体" w:hAnsi="宋体" w:eastAsia="宋体"/>
+          <w:sz w:val="21"/>
+        </w:rPr>
+        <w:t>若两个验证器均给出支持或中性证据，则残差项为0且最终后验 q 与融合后验 pf 完全相同；当任一反对残差增加时，目标对任意非目标类的对数赔率以斜率 −βh 单调下降，非目标类之间的相对赔率保持不变。该性质由式（13）的后验比值直接得到。</w:t>
+      </w:r>
+    </w:p>
+    <w:p>
+      <w:pPr>
+        <w:spacing w:line="360" w:lineRule="auto" w:after="80"/>
+      </w:pPr>
+      <w:r>
+        <w:rPr>
+          <w:rFonts w:ascii="黑体" w:hAnsi="黑体" w:eastAsia="黑体"/>
+          <w:b/>
+          <w:sz w:val="21"/>
+        </w:rPr>
+        <w:t>命题3（验证式目标接纳的误收上界）</w:t>
+      </w:r>
+      <w:r>
+        <w:rPr>
+          <w:rFonts w:ascii="宋体" w:hAnsi="宋体" w:eastAsia="宋体"/>
+          <w:sz w:val="21"/>
+        </w:rPr>
+      </w:r>
+    </w:p>
+    <w:p>
+      <w:pPr>
+        <w:spacing w:line="360" w:lineRule="auto" w:after="80"/>
+      </w:pPr>
+      <w:r>
+        <w:rPr>
+          <w:rFonts w:ascii="宋体" w:hAnsi="宋体" w:eastAsia="宋体"/>
+          <w:sz w:val="21"/>
+        </w:rPr>
+        <w:t>若部署时要求基础分类器判为目标且相关困难负样本验证器同时通过，则最终误收事件是两事件的交集，其概率不超过任一组成事件的概率；只有在给定真实类别与来源后条件独立时才能进一步写成概率乘积。该结论适用于严格阈值接纳层，不能被扩大解释为软校正必然降低所有误收。</w:t>
+      </w:r>
+    </w:p>
+    <w:p>
+      <w:pPr>
+        <w:spacing w:line="360" w:lineRule="auto" w:after="80"/>
+      </w:pPr>
+      <w:r>
+        <w:rPr>
+          <w:rFonts w:ascii="黑体" w:hAnsi="黑体" w:eastAsia="黑体"/>
+          <w:b/>
+          <w:sz w:val="21"/>
+        </w:rPr>
+        <w:t>命题4（带拒识的贝叶斯最优选择性决策）</w:t>
+      </w:r>
+      <w:r>
+        <w:rPr>
+          <w:rFonts w:ascii="宋体" w:hAnsi="宋体" w:eastAsia="宋体"/>
+          <w:sz w:val="21"/>
+        </w:rPr>
+      </w:r>
+    </w:p>
+    <w:p>
+      <w:pPr>
+        <w:spacing w:line="360" w:lineRule="auto" w:after="80"/>
+      </w:pPr>
+      <w:r>
+        <w:rPr>
+          <w:rFonts w:ascii="宋体" w:hAnsi="宋体" w:eastAsia="宋体"/>
+          <w:sz w:val="21"/>
+        </w:rPr>
+        <w:t>给定校准后验 q、错误代价矩阵 C 和拒识代价 crej，应逐图比较所有直接动作的最小条件风险与 crej；当前者更大时拒识，否则执行最小风险动作。这是标准贝叶斯逐点风险最小化结果。本研究只验证了公开标本图像上的选择性识别，不宣称真实 XRF 送检成本已得到验证。</w:t>
+      </w:r>
+    </w:p>
+    <w:p>
+      <w:pPr>
+        <w:spacing w:line="360" w:lineRule="auto" w:after="80"/>
+      </w:pPr>
+      <w:r>
+        <w:rPr>
+          <w:rFonts w:ascii="黑体" w:hAnsi="黑体" w:eastAsia="黑体"/>
+          <w:b/>
+          <w:sz w:val="21"/>
+        </w:rPr>
+        <w:t>命题5（验证器梯度隔离）</w:t>
+      </w:r>
+      <w:r>
+        <w:rPr>
+          <w:rFonts w:ascii="宋体" w:hAnsi="宋体" w:eastAsia="宋体"/>
+          <w:sz w:val="21"/>
+        </w:rPr>
+      </w:r>
+    </w:p>
+    <w:p>
+      <w:pPr>
+        <w:spacing w:line="360" w:lineRule="auto" w:after="80"/>
+      </w:pPr>
+      <w:r>
+        <w:rPr>
+          <w:rFonts w:ascii="宋体" w:hAnsi="宋体" w:eastAsia="宋体"/>
+          <w:sz w:val="21"/>
+        </w:rPr>
+        <w:t>若验证器输入采用 stopgrad(h)，则验证器损失通过该路径对共享主干参数 θ 的梯度严格为0，而验证器自身参数仍正常更新。命题本身是计算图上的确定性性质；是否有利于分类性能必须通过消融实验判断。</w:t>
+      </w:r>
+    </w:p>
+    <w:p>
+      <w:pPr>
+        <w:keepNext/>
+        <w:jc w:val="center"/>
+      </w:pPr>
+      <w:r>
+        <w:drawing>
+          <wp:inline xmlns:a="http://schemas.openxmlformats.org/drawingml/2006/main" xmlns:pic="http://schemas.openxmlformats.org/drawingml/2006/picture">
+            <wp:extent cx="5760000" cy="412647"/>
+            <wp:docPr id="32" name="Picture 32"/>
+            <wp:cNvGraphicFramePr>
+              <a:graphicFrameLocks noChangeAspect="1"/>
+            </wp:cNvGraphicFramePr>
+            <a:graphic>
+              <a:graphicData uri="http://schemas.openxmlformats.org/drawingml/2006/picture">
+                <pic:pic>
+                  <pic:nvPicPr>
+                    <pic:cNvPr id="0" name="hrgv_properties.png"/>
+                    <pic:cNvPicPr/>
+                  </pic:nvPicPr>
+                  <pic:blipFill>
+                    <a:blip r:embed="rId43"/>
+                    <a:stretch>
+                      <a:fillRect/>
+                    </a:stretch>
+                  </pic:blipFill>
+                  <pic:spPr>
+                    <a:xfrm>
+                      <a:off x="0" y="0"/>
+                      <a:ext cx="5760000" cy="412647"/>
+                    </a:xfrm>
+                    <a:prstGeom prst="rect"/>
+                  </pic:spPr>
+                </pic:pic>
+              </a:graphicData>
+            </a:graphic>
+          </wp:inline>
+        </w:drawing>
+      </w:r>
+    </w:p>
+    <w:p>
+      <w:pPr>
+        <w:pStyle w:val="af7"/>
+        <w:jc w:val="center"/>
+      </w:pPr>
+      <w:r>
+        <w:rPr>
+          <w:rFonts w:ascii="宋体" w:hAnsi="宋体" w:eastAsia="宋体"/>
+          <w:sz w:val="19"/>
+        </w:rPr>
+        <w:t>式（15） 凸融合上界与残差校正单调性</w:t>
+      </w:r>
+    </w:p>
+    <w:p>
+      <w:pPr>
+        <w:keepNext/>
+        <w:jc w:val="center"/>
+      </w:pPr>
+      <w:r>
+        <w:drawing>
+          <wp:inline xmlns:a="http://schemas.openxmlformats.org/drawingml/2006/main" xmlns:pic="http://schemas.openxmlformats.org/drawingml/2006/picture">
+            <wp:extent cx="5760000" cy="368372"/>
+            <wp:docPr id="33" name="Picture 33"/>
+            <wp:cNvGraphicFramePr>
+              <a:graphicFrameLocks noChangeAspect="1"/>
+            </wp:cNvGraphicFramePr>
+            <a:graphic>
+              <a:graphicData uri="http://schemas.openxmlformats.org/drawingml/2006/picture">
+                <pic:pic>
+                  <pic:nvPicPr>
+                    <pic:cNvPr id="0" name="hrgv_selection.png"/>
+                    <pic:cNvPicPr/>
+                  </pic:nvPicPr>
+                  <pic:blipFill>
+                    <a:blip r:embed="rId44"/>
+                    <a:stretch>
+                      <a:fillRect/>
+                    </a:stretch>
+                  </pic:blipFill>
+                  <pic:spPr>
+                    <a:xfrm>
+                      <a:off x="0" y="0"/>
+                      <a:ext cx="5760000" cy="368372"/>
+                    </a:xfrm>
+                    <a:prstGeom prst="rect"/>
+                  </pic:spPr>
+                </pic:pic>
+              </a:graphicData>
+            </a:graphic>
+          </wp:inline>
+        </w:drawing>
+      </w:r>
+    </w:p>
+    <w:p>
+      <w:pPr>
+        <w:pStyle w:val="af7"/>
+        <w:jc w:val="center"/>
+      </w:pPr>
+      <w:r>
+        <w:rPr>
+          <w:rFonts w:ascii="宋体" w:hAnsi="宋体" w:eastAsia="宋体"/>
+          <w:sz w:val="19"/>
+        </w:rPr>
+        <w:t>式（16） 选择性风险规则与梯度隔离性质</w:t>
+      </w:r>
+    </w:p>
+    <w:p>
+      <w:pPr>
+        <w:spacing w:line="360" w:lineRule="auto" w:after="80"/>
+      </w:pPr>
+      <w:r>
+        <w:rPr>
+          <w:rFonts w:ascii="宋体" w:hAnsi="宋体" w:eastAsia="宋体"/>
+          <w:sz w:val="21"/>
+        </w:rPr>
+        <w:t>上述五条中，命题1、2和5是网络结构产生的确定性数学性质；命题3依赖严格阈值接纳规则及可选的条件独立假设；命题4是标准选择性决策性质。报告把这些性质与对应消融分开陈述，避免把数学恒等式、经验趋势和统计显著性混为一谈。</w:t>
       </w:r>
     </w:p>
     <w:p>
       <w:pPr>
         <w:pStyle w:val="21"/>
+        <w:spacing w:line="360" w:lineRule="auto"/>
       </w:pPr>
       <w:r>
-        <w:t xml:space="preserve">4.6 </w:t>
-      </w:r>
-      <w:r>
-        <w:t>固定映射下的角色可识别性命题</w:t>
+        <w:rPr>
+          <w:rFonts w:ascii="宋体" w:hAnsi="宋体" w:eastAsia="宋体"/>
+          <w:sz w:val="21"/>
+        </w:rPr>
+        <w:t>4.7 固定映射下的角色可识别性命题</w:t>
       </w:r>
     </w:p>
     <w:p>
@@ -13072,12 +13574,14 @@
     <w:p>
       <w:pPr>
         <w:pStyle w:val="21"/>
+        <w:spacing w:line="360" w:lineRule="auto"/>
       </w:pPr>
       <w:r>
-        <w:t xml:space="preserve">4.7 </w:t>
-      </w:r>
-      <w:r>
-        <w:t>选择性识别规则</w:t>
+        <w:rPr>
+          <w:rFonts w:ascii="宋体" w:hAnsi="宋体" w:eastAsia="宋体"/>
+          <w:sz w:val="21"/>
+        </w:rPr>
+        <w:t>4.8 选择性识别规则</w:t>
       </w:r>
     </w:p>
     <w:p>
@@ -23717,14 +24221,1021 @@
     <w:p>
       <w:pPr>
         <w:pStyle w:val="21"/>
-        <w:spacing w:line="360" w:lineRule="auto"/>
+      </w:pPr>
+      <w:r>
+        <w:t>5.17 HRGV-Net 三随机种子实验与组件验证</w:t>
+      </w:r>
+    </w:p>
+    <w:p>
+      <w:pPr>
+        <w:spacing w:line="360" w:lineRule="auto" w:after="80"/>
       </w:pPr>
       <w:r>
         <w:rPr>
           <w:rFonts w:ascii="宋体" w:hAnsi="宋体" w:eastAsia="宋体"/>
           <w:sz w:val="21"/>
         </w:rPr>
-        <w:t>5.17 实验结果的综合判断</w:t>
+        <w:t>HRGV-Net 与所有组件消融沿用同一数据划分、相同三随机种子和统一评价口径。主模型采用耦合梯度、学习门控、中性区残差双验证器和角色感知对比约束。结果如下：</w:t>
+      </w:r>
+    </w:p>
+    <w:p>
+      <w:pPr>
+        <w:pStyle w:val="af7"/>
+        <w:jc w:val="center"/>
+      </w:pPr>
+      <w:r>
+        <w:rPr>
+          <w:rFonts w:ascii="宋体" w:hAnsi="宋体" w:eastAsia="宋体"/>
+          <w:sz w:val="19"/>
+        </w:rPr>
+        <w:t>表 25 HRGV-Net 三随机种子组件消融</w:t>
+      </w:r>
+    </w:p>
+    <w:tbl>
+      <w:tblPr>
+        <w:tblStyle w:val="aff1"/>
+        <w:tblW w:type="auto" w:w="0"/>
+        <w:jc w:val="center"/>
+        <w:tblLayout w:type="fixed"/>
+        <w:tblLook w:firstColumn="1" w:firstRow="1" w:lastColumn="0" w:lastRow="0" w:noHBand="0" w:noVBand="1" w:val="04A0"/>
+      </w:tblPr>
+      <w:tblGrid>
+        <w:gridCol w:w="1531"/>
+        <w:gridCol w:w="1531"/>
+        <w:gridCol w:w="1531"/>
+        <w:gridCol w:w="1531"/>
+        <w:gridCol w:w="1531"/>
+        <w:gridCol w:w="1531"/>
+      </w:tblGrid>
+      <w:tr>
+        <w:trPr>
+          <w:tblHeader w:val="true"/>
+        </w:trPr>
+        <w:tc>
+          <w:tcPr>
+            <w:tcW w:type="dxa" w:w="1927"/>
+            <w:vAlign w:val="center"/>
+            <w:shd w:fill="D9EAF7"/>
+          </w:tcPr>
+          <w:p>
+            <w:pPr>
+              <w:spacing w:before="30" w:after="30" w:line="252" w:lineRule="auto"/>
+              <w:jc w:val="center"/>
+            </w:pPr>
+            <w:r>
+              <w:rPr>
+                <w:rFonts w:ascii="黑体" w:hAnsi="黑体" w:eastAsia="黑体"/>
+                <w:b/>
+                <w:sz w:val="18"/>
+              </w:rPr>
+              <w:t>设置</w:t>
+            </w:r>
+          </w:p>
+        </w:tc>
+        <w:tc>
+          <w:tcPr>
+            <w:tcW w:type="dxa" w:w="1247"/>
+            <w:vAlign w:val="center"/>
+            <w:shd w:fill="D9EAF7"/>
+          </w:tcPr>
+          <w:p>
+            <w:pPr>
+              <w:spacing w:before="30" w:after="30" w:line="252" w:lineRule="auto"/>
+              <w:jc w:val="center"/>
+            </w:pPr>
+            <w:r>
+              <w:rPr>
+                <w:rFonts w:ascii="黑体" w:hAnsi="黑体" w:eastAsia="黑体"/>
+                <w:b/>
+                <w:sz w:val="18"/>
+              </w:rPr>
+              <w:t>Accuracy</w:t>
+            </w:r>
+          </w:p>
+        </w:tc>
+        <w:tc>
+          <w:tcPr>
+            <w:tcW w:type="dxa" w:w="1247"/>
+            <w:vAlign w:val="center"/>
+            <w:shd w:fill="D9EAF7"/>
+          </w:tcPr>
+          <w:p>
+            <w:pPr>
+              <w:spacing w:before="30" w:after="30" w:line="252" w:lineRule="auto"/>
+              <w:jc w:val="center"/>
+            </w:pPr>
+            <w:r>
+              <w:rPr>
+                <w:rFonts w:ascii="黑体" w:hAnsi="黑体" w:eastAsia="黑体"/>
+                <w:b/>
+                <w:sz w:val="18"/>
+              </w:rPr>
+              <w:t>Macro F1</w:t>
+            </w:r>
+          </w:p>
+        </w:tc>
+        <w:tc>
+          <w:tcPr>
+            <w:tcW w:type="dxa" w:w="1247"/>
+            <w:vAlign w:val="center"/>
+            <w:shd w:fill="D9EAF7"/>
+          </w:tcPr>
+          <w:p>
+            <w:pPr>
+              <w:spacing w:before="30" w:after="30" w:line="252" w:lineRule="auto"/>
+              <w:jc w:val="center"/>
+            </w:pPr>
+            <w:r>
+              <w:rPr>
+                <w:rFonts w:ascii="黑体" w:hAnsi="黑体" w:eastAsia="黑体"/>
+                <w:b/>
+                <w:sz w:val="18"/>
+              </w:rPr>
+              <w:t>目标召回</w:t>
+            </w:r>
+          </w:p>
+        </w:tc>
+        <w:tc>
+          <w:tcPr>
+            <w:tcW w:type="dxa" w:w="1417"/>
+            <w:vAlign w:val="center"/>
+            <w:shd w:fill="D9EAF7"/>
+          </w:tcPr>
+          <w:p>
+            <w:pPr>
+              <w:spacing w:before="30" w:after="30" w:line="252" w:lineRule="auto"/>
+              <w:jc w:val="center"/>
+            </w:pPr>
+            <w:r>
+              <w:rPr>
+                <w:rFonts w:ascii="黑体" w:hAnsi="黑体" w:eastAsia="黑体"/>
+                <w:b/>
+                <w:sz w:val="18"/>
+              </w:rPr>
+              <w:t>含钛误入目标</w:t>
+            </w:r>
+          </w:p>
+        </w:tc>
+        <w:tc>
+          <w:tcPr>
+            <w:tcW w:type="dxa" w:w="1530"/>
+            <w:vAlign w:val="center"/>
+            <w:shd w:fill="D9EAF7"/>
+          </w:tcPr>
+          <w:p>
+            <w:pPr>
+              <w:spacing w:before="30" w:after="30" w:line="252" w:lineRule="auto"/>
+              <w:jc w:val="center"/>
+            </w:pPr>
+            <w:r>
+              <w:rPr>
+                <w:rFonts w:ascii="黑体" w:hAnsi="黑体" w:eastAsia="黑体"/>
+                <w:b/>
+                <w:sz w:val="18"/>
+              </w:rPr>
+              <w:t>金属光泽误入目标</w:t>
+            </w:r>
+          </w:p>
+        </w:tc>
+      </w:tr>
+      <w:tr>
+        <w:tc>
+          <w:tcPr>
+            <w:tcW w:type="dxa" w:w="1927"/>
+            <w:vAlign w:val="center"/>
+          </w:tcPr>
+          <w:p>
+            <w:pPr>
+              <w:spacing w:before="30" w:after="30" w:line="252" w:lineRule="auto"/>
+              <w:jc w:val="center"/>
+            </w:pPr>
+            <w:r>
+              <w:rPr>
+                <w:rFonts w:ascii="宋体" w:hAnsi="宋体" w:eastAsia="宋体"/>
+                <w:b w:val="0"/>
+                <w:sz w:val="18"/>
+              </w:rPr>
+              <w:t>耦合残差 HRGV（主模型）</w:t>
+            </w:r>
+          </w:p>
+        </w:tc>
+        <w:tc>
+          <w:tcPr>
+            <w:tcW w:type="dxa" w:w="1247"/>
+            <w:vAlign w:val="center"/>
+          </w:tcPr>
+          <w:p>
+            <w:pPr>
+              <w:spacing w:before="30" w:after="30" w:line="252" w:lineRule="auto"/>
+              <w:jc w:val="center"/>
+            </w:pPr>
+            <w:r>
+              <w:rPr>
+                <w:rFonts w:ascii="宋体" w:hAnsi="宋体" w:eastAsia="宋体"/>
+                <w:b w:val="0"/>
+                <w:sz w:val="18"/>
+              </w:rPr>
+              <w:t>76.48% ± 0.23%</w:t>
+            </w:r>
+          </w:p>
+        </w:tc>
+        <w:tc>
+          <w:tcPr>
+            <w:tcW w:type="dxa" w:w="1247"/>
+            <w:vAlign w:val="center"/>
+          </w:tcPr>
+          <w:p>
+            <w:pPr>
+              <w:spacing w:before="30" w:after="30" w:line="252" w:lineRule="auto"/>
+              <w:jc w:val="center"/>
+            </w:pPr>
+            <w:r>
+              <w:rPr>
+                <w:rFonts w:ascii="宋体" w:hAnsi="宋体" w:eastAsia="宋体"/>
+                <w:b w:val="0"/>
+                <w:sz w:val="18"/>
+              </w:rPr>
+              <w:t>74.59% ± 0.34%</w:t>
+            </w:r>
+          </w:p>
+        </w:tc>
+        <w:tc>
+          <w:tcPr>
+            <w:tcW w:type="dxa" w:w="1247"/>
+            <w:vAlign w:val="center"/>
+          </w:tcPr>
+          <w:p>
+            <w:pPr>
+              <w:spacing w:before="30" w:after="30" w:line="252" w:lineRule="auto"/>
+              <w:jc w:val="center"/>
+            </w:pPr>
+            <w:r>
+              <w:rPr>
+                <w:rFonts w:ascii="宋体" w:hAnsi="宋体" w:eastAsia="宋体"/>
+                <w:b w:val="0"/>
+                <w:sz w:val="18"/>
+              </w:rPr>
+              <w:t>72.38% ± 3.22%</w:t>
+            </w:r>
+          </w:p>
+        </w:tc>
+        <w:tc>
+          <w:tcPr>
+            <w:tcW w:type="dxa" w:w="1417"/>
+            <w:vAlign w:val="center"/>
+          </w:tcPr>
+          <w:p>
+            <w:pPr>
+              <w:spacing w:before="30" w:after="30" w:line="252" w:lineRule="auto"/>
+              <w:jc w:val="center"/>
+            </w:pPr>
+            <w:r>
+              <w:rPr>
+                <w:rFonts w:ascii="宋体" w:hAnsi="宋体" w:eastAsia="宋体"/>
+                <w:b w:val="0"/>
+                <w:sz w:val="18"/>
+              </w:rPr>
+              <w:t>9.16% ± 1.13%</w:t>
+            </w:r>
+          </w:p>
+        </w:tc>
+        <w:tc>
+          <w:tcPr>
+            <w:tcW w:type="dxa" w:w="1530"/>
+            <w:vAlign w:val="center"/>
+          </w:tcPr>
+          <w:p>
+            <w:pPr>
+              <w:spacing w:before="30" w:after="30" w:line="252" w:lineRule="auto"/>
+              <w:jc w:val="center"/>
+            </w:pPr>
+            <w:r>
+              <w:rPr>
+                <w:rFonts w:ascii="宋体" w:hAnsi="宋体" w:eastAsia="宋体"/>
+                <w:b w:val="0"/>
+                <w:sz w:val="18"/>
+              </w:rPr>
+              <w:t>11.55% ± 1.18%</w:t>
+            </w:r>
+          </w:p>
+        </w:tc>
+      </w:tr>
+      <w:tr>
+        <w:tc>
+          <w:tcPr>
+            <w:tcW w:type="dxa" w:w="1927"/>
+            <w:vAlign w:val="center"/>
+          </w:tcPr>
+          <w:p>
+            <w:pPr>
+              <w:spacing w:before="30" w:after="30" w:line="252" w:lineRule="auto"/>
+              <w:jc w:val="center"/>
+            </w:pPr>
+            <w:r>
+              <w:rPr>
+                <w:rFonts w:ascii="宋体" w:hAnsi="宋体" w:eastAsia="宋体"/>
+                <w:b w:val="0"/>
+                <w:sz w:val="18"/>
+              </w:rPr>
+              <w:t>等权融合</w:t>
+            </w:r>
+          </w:p>
+        </w:tc>
+        <w:tc>
+          <w:tcPr>
+            <w:tcW w:type="dxa" w:w="1247"/>
+            <w:vAlign w:val="center"/>
+          </w:tcPr>
+          <w:p>
+            <w:pPr>
+              <w:spacing w:before="30" w:after="30" w:line="252" w:lineRule="auto"/>
+              <w:jc w:val="center"/>
+            </w:pPr>
+            <w:r>
+              <w:rPr>
+                <w:rFonts w:ascii="宋体" w:hAnsi="宋体" w:eastAsia="宋体"/>
+                <w:b w:val="0"/>
+                <w:sz w:val="18"/>
+              </w:rPr>
+              <w:t>75.91% ± 0.29%</w:t>
+            </w:r>
+          </w:p>
+        </w:tc>
+        <w:tc>
+          <w:tcPr>
+            <w:tcW w:type="dxa" w:w="1247"/>
+            <w:vAlign w:val="center"/>
+          </w:tcPr>
+          <w:p>
+            <w:pPr>
+              <w:spacing w:before="30" w:after="30" w:line="252" w:lineRule="auto"/>
+              <w:jc w:val="center"/>
+            </w:pPr>
+            <w:r>
+              <w:rPr>
+                <w:rFonts w:ascii="宋体" w:hAnsi="宋体" w:eastAsia="宋体"/>
+                <w:b w:val="0"/>
+                <w:sz w:val="18"/>
+              </w:rPr>
+              <w:t>74.01% ± 0.33%</w:t>
+            </w:r>
+          </w:p>
+        </w:tc>
+        <w:tc>
+          <w:tcPr>
+            <w:tcW w:type="dxa" w:w="1247"/>
+            <w:vAlign w:val="center"/>
+          </w:tcPr>
+          <w:p>
+            <w:pPr>
+              <w:spacing w:before="30" w:after="30" w:line="252" w:lineRule="auto"/>
+              <w:jc w:val="center"/>
+            </w:pPr>
+            <w:r>
+              <w:rPr>
+                <w:rFonts w:ascii="宋体" w:hAnsi="宋体" w:eastAsia="宋体"/>
+                <w:b w:val="0"/>
+                <w:sz w:val="18"/>
+              </w:rPr>
+              <w:t>73.04% ± 2.99%</w:t>
+            </w:r>
+          </w:p>
+        </w:tc>
+        <w:tc>
+          <w:tcPr>
+            <w:tcW w:type="dxa" w:w="1417"/>
+            <w:vAlign w:val="center"/>
+          </w:tcPr>
+          <w:p>
+            <w:pPr>
+              <w:spacing w:before="30" w:after="30" w:line="252" w:lineRule="auto"/>
+              <w:jc w:val="center"/>
+            </w:pPr>
+            <w:r>
+              <w:rPr>
+                <w:rFonts w:ascii="宋体" w:hAnsi="宋体" w:eastAsia="宋体"/>
+                <w:b w:val="0"/>
+                <w:sz w:val="18"/>
+              </w:rPr>
+              <w:t>9.78% ± 1.47%</w:t>
+            </w:r>
+          </w:p>
+        </w:tc>
+        <w:tc>
+          <w:tcPr>
+            <w:tcW w:type="dxa" w:w="1530"/>
+            <w:vAlign w:val="center"/>
+          </w:tcPr>
+          <w:p>
+            <w:pPr>
+              <w:spacing w:before="30" w:after="30" w:line="252" w:lineRule="auto"/>
+              <w:jc w:val="center"/>
+            </w:pPr>
+            <w:r>
+              <w:rPr>
+                <w:rFonts w:ascii="宋体" w:hAnsi="宋体" w:eastAsia="宋体"/>
+                <w:b w:val="0"/>
+                <w:sz w:val="18"/>
+              </w:rPr>
+              <w:t>12.31% ± 2.37%</w:t>
+            </w:r>
+          </w:p>
+        </w:tc>
+      </w:tr>
+      <w:tr>
+        <w:tc>
+          <w:tcPr>
+            <w:tcW w:type="dxa" w:w="1927"/>
+            <w:vAlign w:val="center"/>
+          </w:tcPr>
+          <w:p>
+            <w:pPr>
+              <w:spacing w:before="30" w:after="30" w:line="252" w:lineRule="auto"/>
+              <w:jc w:val="center"/>
+            </w:pPr>
+            <w:r>
+              <w:rPr>
+                <w:rFonts w:ascii="宋体" w:hAnsi="宋体" w:eastAsia="宋体"/>
+                <w:b w:val="0"/>
+                <w:sz w:val="18"/>
+              </w:rPr>
+              <w:t>无角色感知对比约束</w:t>
+            </w:r>
+          </w:p>
+        </w:tc>
+        <w:tc>
+          <w:tcPr>
+            <w:tcW w:type="dxa" w:w="1247"/>
+            <w:vAlign w:val="center"/>
+          </w:tcPr>
+          <w:p>
+            <w:pPr>
+              <w:spacing w:before="30" w:after="30" w:line="252" w:lineRule="auto"/>
+              <w:jc w:val="center"/>
+            </w:pPr>
+            <w:r>
+              <w:rPr>
+                <w:rFonts w:ascii="宋体" w:hAnsi="宋体" w:eastAsia="宋体"/>
+                <w:b w:val="0"/>
+                <w:sz w:val="18"/>
+              </w:rPr>
+              <w:t>75.39% ± 0.86%</w:t>
+            </w:r>
+          </w:p>
+        </w:tc>
+        <w:tc>
+          <w:tcPr>
+            <w:tcW w:type="dxa" w:w="1247"/>
+            <w:vAlign w:val="center"/>
+          </w:tcPr>
+          <w:p>
+            <w:pPr>
+              <w:spacing w:before="30" w:after="30" w:line="252" w:lineRule="auto"/>
+              <w:jc w:val="center"/>
+            </w:pPr>
+            <w:r>
+              <w:rPr>
+                <w:rFonts w:ascii="宋体" w:hAnsi="宋体" w:eastAsia="宋体"/>
+                <w:b w:val="0"/>
+                <w:sz w:val="18"/>
+              </w:rPr>
+              <w:t>73.51% ± 0.56%</w:t>
+            </w:r>
+          </w:p>
+        </w:tc>
+        <w:tc>
+          <w:tcPr>
+            <w:tcW w:type="dxa" w:w="1247"/>
+            <w:vAlign w:val="center"/>
+          </w:tcPr>
+          <w:p>
+            <w:pPr>
+              <w:spacing w:before="30" w:after="30" w:line="252" w:lineRule="auto"/>
+              <w:jc w:val="center"/>
+            </w:pPr>
+            <w:r>
+              <w:rPr>
+                <w:rFonts w:ascii="宋体" w:hAnsi="宋体" w:eastAsia="宋体"/>
+                <w:b w:val="0"/>
+                <w:sz w:val="18"/>
+              </w:rPr>
+              <w:t>71.05% ± 2.65%</w:t>
+            </w:r>
+          </w:p>
+        </w:tc>
+        <w:tc>
+          <w:tcPr>
+            <w:tcW w:type="dxa" w:w="1417"/>
+            <w:vAlign w:val="center"/>
+          </w:tcPr>
+          <w:p>
+            <w:pPr>
+              <w:spacing w:before="30" w:after="30" w:line="252" w:lineRule="auto"/>
+              <w:jc w:val="center"/>
+            </w:pPr>
+            <w:r>
+              <w:rPr>
+                <w:rFonts w:ascii="宋体" w:hAnsi="宋体" w:eastAsia="宋体"/>
+                <w:b w:val="0"/>
+                <w:sz w:val="18"/>
+              </w:rPr>
+              <w:t>9.78% ± 2.74%</w:t>
+            </w:r>
+          </w:p>
+        </w:tc>
+        <w:tc>
+          <w:tcPr>
+            <w:tcW w:type="dxa" w:w="1530"/>
+            <w:vAlign w:val="center"/>
+          </w:tcPr>
+          <w:p>
+            <w:pPr>
+              <w:spacing w:before="30" w:after="30" w:line="252" w:lineRule="auto"/>
+              <w:jc w:val="center"/>
+            </w:pPr>
+            <w:r>
+              <w:rPr>
+                <w:rFonts w:ascii="宋体" w:hAnsi="宋体" w:eastAsia="宋体"/>
+                <w:b w:val="0"/>
+                <w:sz w:val="18"/>
+              </w:rPr>
+              <w:t>10.98% ± 2.15%</w:t>
+            </w:r>
+          </w:p>
+        </w:tc>
+      </w:tr>
+      <w:tr>
+        <w:tc>
+          <w:tcPr>
+            <w:tcW w:type="dxa" w:w="1927"/>
+            <w:vAlign w:val="center"/>
+          </w:tcPr>
+          <w:p>
+            <w:pPr>
+              <w:spacing w:before="30" w:after="30" w:line="252" w:lineRule="auto"/>
+              <w:jc w:val="center"/>
+            </w:pPr>
+            <w:r>
+              <w:rPr>
+                <w:rFonts w:ascii="宋体" w:hAnsi="宋体" w:eastAsia="宋体"/>
+                <w:b w:val="0"/>
+                <w:sz w:val="18"/>
+              </w:rPr>
+              <w:t>验证器梯度隔离</w:t>
+            </w:r>
+          </w:p>
+        </w:tc>
+        <w:tc>
+          <w:tcPr>
+            <w:tcW w:type="dxa" w:w="1247"/>
+            <w:vAlign w:val="center"/>
+          </w:tcPr>
+          <w:p>
+            <w:pPr>
+              <w:spacing w:before="30" w:after="30" w:line="252" w:lineRule="auto"/>
+              <w:jc w:val="center"/>
+            </w:pPr>
+            <w:r>
+              <w:rPr>
+                <w:rFonts w:ascii="宋体" w:hAnsi="宋体" w:eastAsia="宋体"/>
+                <w:b w:val="0"/>
+                <w:sz w:val="18"/>
+              </w:rPr>
+              <w:t>74.71% ± 1.56%</w:t>
+            </w:r>
+          </w:p>
+        </w:tc>
+        <w:tc>
+          <w:tcPr>
+            <w:tcW w:type="dxa" w:w="1247"/>
+            <w:vAlign w:val="center"/>
+          </w:tcPr>
+          <w:p>
+            <w:pPr>
+              <w:spacing w:before="30" w:after="30" w:line="252" w:lineRule="auto"/>
+              <w:jc w:val="center"/>
+            </w:pPr>
+            <w:r>
+              <w:rPr>
+                <w:rFonts w:ascii="宋体" w:hAnsi="宋体" w:eastAsia="宋体"/>
+                <w:b w:val="0"/>
+                <w:sz w:val="18"/>
+              </w:rPr>
+              <w:t>72.99% ± 2.15%</w:t>
+            </w:r>
+          </w:p>
+        </w:tc>
+        <w:tc>
+          <w:tcPr>
+            <w:tcW w:type="dxa" w:w="1247"/>
+            <w:vAlign w:val="center"/>
+          </w:tcPr>
+          <w:p>
+            <w:pPr>
+              <w:spacing w:before="30" w:after="30" w:line="252" w:lineRule="auto"/>
+              <w:jc w:val="center"/>
+            </w:pPr>
+            <w:r>
+              <w:rPr>
+                <w:rFonts w:ascii="宋体" w:hAnsi="宋体" w:eastAsia="宋体"/>
+                <w:b w:val="0"/>
+                <w:sz w:val="18"/>
+              </w:rPr>
+              <w:t>75.03% ± 4.30%</w:t>
+            </w:r>
+          </w:p>
+        </w:tc>
+        <w:tc>
+          <w:tcPr>
+            <w:tcW w:type="dxa" w:w="1417"/>
+            <w:vAlign w:val="center"/>
+          </w:tcPr>
+          <w:p>
+            <w:pPr>
+              <w:spacing w:before="30" w:after="30" w:line="252" w:lineRule="auto"/>
+              <w:jc w:val="center"/>
+            </w:pPr>
+            <w:r>
+              <w:rPr>
+                <w:rFonts w:ascii="宋体" w:hAnsi="宋体" w:eastAsia="宋体"/>
+                <w:b w:val="0"/>
+                <w:sz w:val="18"/>
+              </w:rPr>
+              <w:t>10.05% ± 0.62%</w:t>
+            </w:r>
+          </w:p>
+        </w:tc>
+        <w:tc>
+          <w:tcPr>
+            <w:tcW w:type="dxa" w:w="1530"/>
+            <w:vAlign w:val="center"/>
+          </w:tcPr>
+          <w:p>
+            <w:pPr>
+              <w:spacing w:before="30" w:after="30" w:line="252" w:lineRule="auto"/>
+              <w:jc w:val="center"/>
+            </w:pPr>
+            <w:r>
+              <w:rPr>
+                <w:rFonts w:ascii="宋体" w:hAnsi="宋体" w:eastAsia="宋体"/>
+                <w:b w:val="0"/>
+                <w:sz w:val="18"/>
+              </w:rPr>
+              <w:t>13.64% ± 2.05%</w:t>
+            </w:r>
+          </w:p>
+        </w:tc>
+      </w:tr>
+      <w:tr>
+        <w:tc>
+          <w:tcPr>
+            <w:tcW w:type="dxa" w:w="1927"/>
+            <w:vAlign w:val="center"/>
+          </w:tcPr>
+          <w:p>
+            <w:pPr>
+              <w:spacing w:before="30" w:after="30" w:line="252" w:lineRule="auto"/>
+              <w:jc w:val="center"/>
+            </w:pPr>
+            <w:r>
+              <w:rPr>
+                <w:rFonts w:ascii="宋体" w:hAnsi="宋体" w:eastAsia="宋体"/>
+                <w:b w:val="0"/>
+                <w:sz w:val="18"/>
+              </w:rPr>
+              <w:t>仅门控、无验证器</w:t>
+            </w:r>
+          </w:p>
+        </w:tc>
+        <w:tc>
+          <w:tcPr>
+            <w:tcW w:type="dxa" w:w="1247"/>
+            <w:vAlign w:val="center"/>
+          </w:tcPr>
+          <w:p>
+            <w:pPr>
+              <w:spacing w:before="30" w:after="30" w:line="252" w:lineRule="auto"/>
+              <w:jc w:val="center"/>
+            </w:pPr>
+            <w:r>
+              <w:rPr>
+                <w:rFonts w:ascii="宋体" w:hAnsi="宋体" w:eastAsia="宋体"/>
+                <w:b w:val="0"/>
+                <w:sz w:val="18"/>
+              </w:rPr>
+              <w:t>76.74% ± 0.65%</w:t>
+            </w:r>
+          </w:p>
+        </w:tc>
+        <w:tc>
+          <w:tcPr>
+            <w:tcW w:type="dxa" w:w="1247"/>
+            <w:vAlign w:val="center"/>
+          </w:tcPr>
+          <w:p>
+            <w:pPr>
+              <w:spacing w:before="30" w:after="30" w:line="252" w:lineRule="auto"/>
+              <w:jc w:val="center"/>
+            </w:pPr>
+            <w:r>
+              <w:rPr>
+                <w:rFonts w:ascii="宋体" w:hAnsi="宋体" w:eastAsia="宋体"/>
+                <w:b w:val="0"/>
+                <w:sz w:val="18"/>
+              </w:rPr>
+              <w:t>74.91% ± 0.41%</w:t>
+            </w:r>
+          </w:p>
+        </w:tc>
+        <w:tc>
+          <w:tcPr>
+            <w:tcW w:type="dxa" w:w="1247"/>
+            <w:vAlign w:val="center"/>
+          </w:tcPr>
+          <w:p>
+            <w:pPr>
+              <w:spacing w:before="30" w:after="30" w:line="252" w:lineRule="auto"/>
+              <w:jc w:val="center"/>
+            </w:pPr>
+            <w:r>
+              <w:rPr>
+                <w:rFonts w:ascii="宋体" w:hAnsi="宋体" w:eastAsia="宋体"/>
+                <w:b w:val="0"/>
+                <w:sz w:val="18"/>
+              </w:rPr>
+              <w:t>74.37% ± 0.83%</w:t>
+            </w:r>
+          </w:p>
+        </w:tc>
+        <w:tc>
+          <w:tcPr>
+            <w:tcW w:type="dxa" w:w="1417"/>
+            <w:vAlign w:val="center"/>
+          </w:tcPr>
+          <w:p>
+            <w:pPr>
+              <w:spacing w:before="30" w:after="30" w:line="252" w:lineRule="auto"/>
+              <w:jc w:val="center"/>
+            </w:pPr>
+            <w:r>
+              <w:rPr>
+                <w:rFonts w:ascii="宋体" w:hAnsi="宋体" w:eastAsia="宋体"/>
+                <w:b w:val="0"/>
+                <w:sz w:val="18"/>
+              </w:rPr>
+              <w:t>9.78% ± 1.47%</w:t>
+            </w:r>
+          </w:p>
+        </w:tc>
+        <w:tc>
+          <w:tcPr>
+            <w:tcW w:type="dxa" w:w="1530"/>
+            <w:vAlign w:val="center"/>
+          </w:tcPr>
+          <w:p>
+            <w:pPr>
+              <w:spacing w:before="30" w:after="30" w:line="252" w:lineRule="auto"/>
+              <w:jc w:val="center"/>
+            </w:pPr>
+            <w:r>
+              <w:rPr>
+                <w:rFonts w:ascii="宋体" w:hAnsi="宋体" w:eastAsia="宋体"/>
+                <w:b w:val="0"/>
+                <w:sz w:val="18"/>
+              </w:rPr>
+              <w:t>11.74% ± 0.87%</w:t>
+            </w:r>
+          </w:p>
+        </w:tc>
+      </w:tr>
+      <w:tr>
+        <w:tc>
+          <w:tcPr>
+            <w:tcW w:type="dxa" w:w="1927"/>
+            <w:vAlign w:val="center"/>
+          </w:tcPr>
+          <w:p>
+            <w:pPr>
+              <w:spacing w:before="30" w:after="30" w:line="252" w:lineRule="auto"/>
+              <w:jc w:val="center"/>
+            </w:pPr>
+            <w:r>
+              <w:rPr>
+                <w:rFonts w:ascii="宋体" w:hAnsi="宋体" w:eastAsia="宋体"/>
+                <w:b w:val="0"/>
+                <w:sz w:val="18"/>
+              </w:rPr>
+              <w:t>旧乘法验证</w:t>
+            </w:r>
+          </w:p>
+        </w:tc>
+        <w:tc>
+          <w:tcPr>
+            <w:tcW w:type="dxa" w:w="1247"/>
+            <w:vAlign w:val="center"/>
+          </w:tcPr>
+          <w:p>
+            <w:pPr>
+              <w:spacing w:before="30" w:after="30" w:line="252" w:lineRule="auto"/>
+              <w:jc w:val="center"/>
+            </w:pPr>
+            <w:r>
+              <w:rPr>
+                <w:rFonts w:ascii="宋体" w:hAnsi="宋体" w:eastAsia="宋体"/>
+                <w:b w:val="0"/>
+                <w:sz w:val="18"/>
+              </w:rPr>
+              <w:t>75.91% ± 0.83%</w:t>
+            </w:r>
+          </w:p>
+        </w:tc>
+        <w:tc>
+          <w:tcPr>
+            <w:tcW w:type="dxa" w:w="1247"/>
+            <w:vAlign w:val="center"/>
+          </w:tcPr>
+          <w:p>
+            <w:pPr>
+              <w:spacing w:before="30" w:after="30" w:line="252" w:lineRule="auto"/>
+              <w:jc w:val="center"/>
+            </w:pPr>
+            <w:r>
+              <w:rPr>
+                <w:rFonts w:ascii="宋体" w:hAnsi="宋体" w:eastAsia="宋体"/>
+                <w:b w:val="0"/>
+                <w:sz w:val="18"/>
+              </w:rPr>
+              <w:t>74.25% ± 1.02%</w:t>
+            </w:r>
+          </w:p>
+        </w:tc>
+        <w:tc>
+          <w:tcPr>
+            <w:tcW w:type="dxa" w:w="1247"/>
+            <w:vAlign w:val="center"/>
+          </w:tcPr>
+          <w:p>
+            <w:pPr>
+              <w:spacing w:before="30" w:after="30" w:line="252" w:lineRule="auto"/>
+              <w:jc w:val="center"/>
+            </w:pPr>
+            <w:r>
+              <w:rPr>
+                <w:rFonts w:ascii="宋体" w:hAnsi="宋体" w:eastAsia="宋体"/>
+                <w:b w:val="0"/>
+                <w:sz w:val="18"/>
+              </w:rPr>
+              <w:t>71.05% ± 1.80%</w:t>
+            </w:r>
+          </w:p>
+        </w:tc>
+        <w:tc>
+          <w:tcPr>
+            <w:tcW w:type="dxa" w:w="1417"/>
+            <w:vAlign w:val="center"/>
+          </w:tcPr>
+          <w:p>
+            <w:pPr>
+              <w:spacing w:before="30" w:after="30" w:line="252" w:lineRule="auto"/>
+              <w:jc w:val="center"/>
+            </w:pPr>
+            <w:r>
+              <w:rPr>
+                <w:rFonts w:ascii="宋体" w:hAnsi="宋体" w:eastAsia="宋体"/>
+                <w:b w:val="0"/>
+                <w:sz w:val="18"/>
+              </w:rPr>
+              <w:t>9.91% ± 1.05%</w:t>
+            </w:r>
+          </w:p>
+        </w:tc>
+        <w:tc>
+          <w:tcPr>
+            <w:tcW w:type="dxa" w:w="1530"/>
+            <w:vAlign w:val="center"/>
+          </w:tcPr>
+          <w:p>
+            <w:pPr>
+              <w:spacing w:before="30" w:after="30" w:line="252" w:lineRule="auto"/>
+              <w:jc w:val="center"/>
+            </w:pPr>
+            <w:r>
+              <w:rPr>
+                <w:rFonts w:ascii="宋体" w:hAnsi="宋体" w:eastAsia="宋体"/>
+                <w:b w:val="0"/>
+                <w:sz w:val="18"/>
+              </w:rPr>
+              <w:t>12.12% ± 0.87%</w:t>
+            </w:r>
+          </w:p>
+        </w:tc>
+      </w:tr>
+    </w:tbl>
+    <w:p>
+      <w:pPr>
+        <w:spacing w:after="60"/>
+      </w:pPr>
+    </w:p>
+    <w:p>
+      <w:pPr>
+        <w:spacing w:line="360" w:lineRule="auto" w:after="80"/>
+      </w:pPr>
+      <w:r>
+        <w:rPr>
+          <w:rFonts w:ascii="宋体" w:hAnsi="宋体" w:eastAsia="宋体"/>
+          <w:sz w:val="21"/>
+        </w:rPr>
+        <w:t>角色感知对比约束给出了当前最明确的组件贡献：主模型相对无对比约束设置的 Accuracy 提高1.09个百分点，95%区间为[0.08, 2.15]个百分点；Macro F1 提高1.08个百分点，95%区间为[0.12, 2.06]个百分点，两个区间均未跨0。学习门控相对等权融合的 Macro F1 提高0.58个百分点，两类误入率分别下降0.61和0.76个百分点，但区间跨0，只能视为有利趋势。</w:t>
+      </w:r>
+    </w:p>
+    <w:p>
+      <w:pPr>
+        <w:spacing w:line="360" w:lineRule="auto" w:after="80"/>
+      </w:pPr>
+      <w:r>
+        <w:rPr>
+          <w:rFonts w:ascii="宋体" w:hAnsi="宋体" w:eastAsia="宋体"/>
+          <w:sz w:val="21"/>
+        </w:rPr>
+        <w:t>完整 HRGV 相对 gate-only 将含钛干扰和金属光泽干扰误入目标的均值分别降低约0.62和0.19个百分点，但目标召回降低约1.99个百分点。两个验证器的 ROC-AUC 约为0.91至0.92，说明其学到可分信息；它们当前属于显式风险控制模块，不是无代价的精度增强模块。旧乘法校正与梯度隔离消融进一步表明，残差设计更稳定，而完全隔离验证器梯度会以总体性能和方差为代价提高目标召回。</w:t>
+      </w:r>
+    </w:p>
+    <w:p>
+      <w:pPr>
+        <w:keepNext/>
+        <w:jc w:val="center"/>
+      </w:pPr>
+      <w:r>
+        <w:drawing>
+          <wp:inline xmlns:a="http://schemas.openxmlformats.org/drawingml/2006/main" xmlns:pic="http://schemas.openxmlformats.org/drawingml/2006/picture">
+            <wp:extent cx="5688000" cy="3129200"/>
+            <wp:docPr id="34" name="Picture 34"/>
+            <wp:cNvGraphicFramePr>
+              <a:graphicFrameLocks noChangeAspect="1"/>
+            </wp:cNvGraphicFramePr>
+            <a:graphic>
+              <a:graphicData uri="http://schemas.openxmlformats.org/drawingml/2006/picture">
+                <pic:pic>
+                  <pic:nvPicPr>
+                    <pic:cNvPr id="0" name="fig_hrgv_vs_hierarchical_effects.png"/>
+                    <pic:cNvPicPr/>
+                  </pic:nvPicPr>
+                  <pic:blipFill>
+                    <a:blip r:embed="rId45"/>
+                    <a:stretch>
+                      <a:fillRect/>
+                    </a:stretch>
+                  </pic:blipFill>
+                  <pic:spPr>
+                    <a:xfrm>
+                      <a:off x="0" y="0"/>
+                      <a:ext cx="5688000" cy="3129200"/>
+                    </a:xfrm>
+                    <a:prstGeom prst="rect"/>
+                  </pic:spPr>
+                </pic:pic>
+              </a:graphicData>
+            </a:graphic>
+          </wp:inline>
+        </w:drawing>
+      </w:r>
+    </w:p>
+    <w:p>
+      <w:pPr>
+        <w:pStyle w:val="af7"/>
+        <w:jc w:val="center"/>
+      </w:pPr>
+      <w:r>
+        <w:rPr>
+          <w:rFonts w:ascii="宋体" w:hAnsi="宋体" w:eastAsia="宋体"/>
+          <w:sz w:val="19"/>
+        </w:rPr>
+        <w:t>图 17 HRGV-Net 相对既有分层模型的成对效应及95%簇 Bootstrap 区间</w:t>
+      </w:r>
+    </w:p>
+    <w:p>
+      <w:pPr>
+        <w:spacing w:line="360" w:lineRule="auto" w:after="80"/>
+      </w:pPr>
+      <w:r>
+        <w:rPr>
+          <w:rFonts w:ascii="宋体" w:hAnsi="宋体" w:eastAsia="宋体"/>
+          <w:sz w:val="21"/>
+        </w:rPr>
+        <w:t>与既有分层 EfficientNet-B0 相比，HRGV 的 Accuracy 和 Macro F1 均值分别提高1.06和1.18个百分点，两类困难负样本误入目标分别下降1.77和2.84个百分点；但目标召回下降5.18个百分点，且主要95%区间跨0。因此 HRGV 的证据应解释为更均衡、可审计的召回—误入风险重分配，不能解释为总体性能全面显著提高。</w:t>
+      </w:r>
+    </w:p>
+    <w:p>
+      <w:pPr>
+        <w:pStyle w:val="21"/>
+        <w:spacing w:line="360" w:lineRule="auto"/>
+      </w:pPr>
+      <w:r>
+        <w:rPr>
+          <w:rFonts w:ascii="宋体" w:hAnsi="宋体" w:eastAsia="宋体"/>
+          <w:sz w:val="21"/>
+        </w:rPr>
+        <w:t>5.18 实验结果的综合判断</w:t>
       </w:r>
     </w:p>
     <w:p>
@@ -24152,7 +25663,7 @@
           <w:rFonts w:ascii="宋体" w:hAnsi="宋体" w:eastAsia="宋体"/>
           <w:sz w:val="21"/>
         </w:rPr>
-        <w:t>表 25 本阶段方法贡献及其解释边界</w:t>
+        <w:t>表 26 本阶段方法贡献及其解释边界</w:t>
       </w:r>
     </w:p>
     <w:p>
@@ -25027,7 +26538,7 @@
           <w:rFonts w:ascii="宋体" w:hAnsi="宋体" w:eastAsia="宋体"/>
           <w:sz w:val="21"/>
         </w:rPr>
-        <w:t>表 26 当前局限性及处理原则</w:t>
+        <w:t>表 27 当前局限性及处理原则</w:t>
       </w:r>
     </w:p>
     <w:p>
@@ -25148,29 +26659,16 @@
     </w:p>
     <w:p>
       <w:pPr>
+        <w:spacing w:line="360" w:lineRule="auto"/>
         <w:ind w:firstLine="420"/>
         <w:jc w:val="both"/>
       </w:pPr>
       <w:r>
-        <w:t>采集由专家或化验确认的真实钒钛矿颗粒图像，建立独立外部测试集；建立独立未知矿物图像集，比较最大</w:t>
-      </w:r>
-      <w:r>
-        <w:t xml:space="preserve"> Softmax</w:t>
-      </w:r>
-      <w:r>
-        <w:t>、预测熵、</w:t>
-      </w:r>
-      <w:r>
-        <w:t xml:space="preserve">Energy Score </w:t>
-      </w:r>
-      <w:r>
-        <w:t>等开放集方法；在取得真实流程阶段、品位</w:t>
-      </w:r>
-      <w:r>
-        <w:t>/</w:t>
-      </w:r>
-      <w:r>
-        <w:t>回收率、动作代价和检查成本后，再研究阶段条件化选矿决策与多模态确认。</w:t>
+        <w:rPr>
+          <w:rFonts w:ascii="宋体" w:hAnsi="宋体" w:eastAsia="宋体"/>
+          <w:sz w:val="21"/>
+        </w:rPr>
+        <w:t>采集由专家或化验确认的真实钒钛矿颗粒图像，建立独立外部测试集；建立独立未知矿物图像集，比较最大 Softmax、预测熵、Energy Score 等开放集方法；在取得真实流程阶段、品位/回收率、动作代价和检查成本后，再研究阶段条件化选矿决策与多模态确认。 阶段条件化选矿决策图仍保留为后续研究方向：只有获得真实流程阶段、矿物—动作映射、品位/回收率及送检成本后，才研究矿物种类与阶段共同决定处理动作的问题。</w:t>
       </w:r>
     </w:p>
     <w:tbl>
@@ -25446,14 +26944,26 @@
     </w:p>
     <w:p>
       <w:pPr>
-        <w:spacing w:line="360" w:lineRule="auto" w:after="80"/>
+        <w:spacing w:line="360" w:lineRule="auto"/>
       </w:pPr>
       <w:r>
         <w:rPr>
           <w:rFonts w:ascii="宋体" w:hAnsi="宋体" w:eastAsia="宋体"/>
           <w:sz w:val="21"/>
         </w:rPr>
-        <w:t>11. 本研究的理论结果建立在固定种类—角色映射、同分布校准样本和公开矿物标本图像上；当前结论不涉及钒钛品位预测、工业回收率、真实XRF送检成本或现场生产线性能。阶段条件化选矿决策图保留为获得流程阶段与成本数据后的后续研究方向。</w:t>
+        <w:t>11. HRGV-Net 将层级双专家、逐图可靠性门控、两类困难负样本验证和中性区残差校正统一于同一计算图。三随机种子实验表明角色感知对比约束对 Accuracy 和 Macro F1 的改善具有未跨0的成对簇区间；其余组件主要体现召回与误入之间的可审计取舍，不能解释为全面显著优势。</w:t>
+      </w:r>
+    </w:p>
+    <w:p>
+      <w:pPr>
+        <w:spacing w:line="360" w:lineRule="auto" w:after="80"/>
+      </w:pPr>
+      <w:r>
+        <w:rPr>
+          <w:rFonts w:ascii="宋体" w:hAnsi="宋体" w:eastAsia="宋体"/>
+          <w:sz w:val="21"/>
+        </w:rPr>
+        <w:t>12. 本研究的理论结果建立在固定种类—角色映射、同分布校准样本和公开矿物标本图像上；当前结论不涉及钒钛品位预测、工业回收率、真实XRF送检成本或现场生产线性能。阶段条件化选矿决策图保留为获得流程阶段与成本数据后的后续研究方向。</w:t>
       </w:r>
     </w:p>
     <w:p>
@@ -26534,7 +28044,7 @@
           <w:rFonts w:ascii="宋体" w:hAnsi="宋体" w:eastAsia="宋体"/>
           <w:sz w:val="21"/>
         </w:rPr>
-        <w:t>项目保留数据清单、采集与筛选脚本、数据质量审计记录、训练脚本、实验指标、混淆矩阵、逐图预测和图表源数据。层级风险汇总位于 outputs/theory_validation/hierarchy_consistency/；校准风险认证汇总位于 outputs/theory_validation/calibrated_selective_recognition/；来源留出与代理消融汇总位于 outputs/paper_experiments_v2/training_summaries/；成对簇 Bootstrap、McNemar 结果和重采样分布位于 outputs/paper_experiments_v3/statistical_inference/；对应论文图位于 outputs/paper_figures_v3/。</w:t>
+        <w:t>项目保留数据清单、采集与筛选脚本、数据质量审计记录、训练脚本、实验指标、混淆矩阵、逐图预测和图表源数据。层级风险汇总位于 outputs/theory_validation/hierarchy_consistency/；校准风险认证汇总位于 outputs/theory_validation/calibrated_selective_recognition/；来源留出与代理消融汇总位于 outputs/paper_experiments_v2/training_summaries/；成对簇 Bootstrap、McNemar 结果和重采样分布位于 outputs/paper_experiments_v3/statistical_inference/；对应论文图位于 outputs/paper_figures_v3/。 HRGV 三随机种子汇总、消融差值、验证器 AUC 与成对统计位于 outputs/business_metrics/hrgv_network/；HRGV 相对既有分层模型的成对统计位于 outputs/paper_experiments_v4/statistical_inference/hrgv_vs_hierarchical/；网络结构图和效应图位于 outputs/paper_figures_v2/。</w:t>
       </w:r>
     </w:p>
     <w:p>

</xml_diff>

<commit_message>
exp: add formal regret-supervised HRGV evidence
</commit_message>
<xml_diff>
--- a/结题/基于深度学习的钒钛矿相关矿物图像识别方法研究_技术报告（正式版）.docx
+++ b/结题/基于深度学习的钒钛矿相关矿物图像识别方法研究_技术报告（正式版）.docx
@@ -445,6 +445,18 @@
           <w:sz w:val="21"/>
         </w:rPr>
         <w:t>在进一步的网络改进中，HRGV-Net 的三随机种子 Accuracy 为76.48%±0.23%、Macro F1 为74.59%±0.34%。角色感知对比约束的 Accuracy 与 Macro F1 成对簇区间均未跨0；门控、双验证器和残差校正则表现为可解释但多数尚未达到显著性的风险取舍。</w:t>
+      </w:r>
+    </w:p>
+    <w:p>
+      <w:pPr>
+        <w:spacing w:line="360" w:lineRule="auto" w:after="80"/>
+      </w:pPr>
+      <w:r>
+        <w:rPr>
+          <w:rFonts w:ascii="宋体" w:hAnsi="宋体" w:eastAsia="宋体"/>
+          <w:sz w:val="21"/>
+        </w:rPr>
+        <w:t>进一步的 RSG-HRGV-Net 将“应融合哪些证据”从间接终端监督转为基于真实类别专家损失差的后悔监督。三随机种子正式比较中，RSG 的总体 Accuracy 为76.45%±0.98%、Macro F1 为74.76%±0.90%，与参考 HRGV 的差异区间均跨0；但平均路由后悔下降1.77个百分点，95%簇 Bootstrap 区间为[−2.86, −0.69]个百分点。该网络创新的实证支撑来自路由机制，而非对总体分类精度的过度宣传。</w:t>
       </w:r>
     </w:p>
     <w:p>
@@ -12968,60 +12980,7 @@
           <w:rFonts w:ascii="宋体" w:hAnsi="宋体" w:eastAsia="宋体"/>
           <w:sz w:val="21"/>
         </w:rPr>
-        <w:t>既有分层模型能够利用17类矿物种类监督提升目标召回，但固定测试集的成对分析表明，两类困难负样本误入目标的比例也随之上升。为直接处理这一失效模式，本研究提出层级风险门控验证网络（HRGV-Net）。网络以 EfficientNet-B0 为共享主干，设置直接角色专家和矿物种类专家；后者经固定映射矩阵 A 聚合为角色后验。可靠性门控根据共享特征、两个专家的熵及 Jensen-Shannon 分歧进行逐图融合，随后由“目标—含钛干扰”和“目标—金属光泽干扰”两个验证器对目标后验进行中性区残差校正。 本方法仍是公开矿物标本图像上的视觉代理任务，不等同于工业分选回收率验证。</w:t>
-      </w:r>
-    </w:p>
-    <w:p>
-      <w:pPr>
-        <w:keepNext/>
-        <w:jc w:val="center"/>
-      </w:pPr>
-      <w:r>
-        <w:drawing>
-          <wp:inline xmlns:a="http://schemas.openxmlformats.org/drawingml/2006/main" xmlns:pic="http://schemas.openxmlformats.org/drawingml/2006/picture">
-            <wp:extent cx="5832000" cy="3424735"/>
-            <wp:docPr id="28" name="Picture 28"/>
-            <wp:cNvGraphicFramePr>
-              <a:graphicFrameLocks noChangeAspect="1"/>
-            </wp:cNvGraphicFramePr>
-            <a:graphic>
-              <a:graphicData uri="http://schemas.openxmlformats.org/drawingml/2006/picture">
-                <pic:pic>
-                  <pic:nvPicPr>
-                    <pic:cNvPr id="0" name="fig_hrgv_architecture.png"/>
-                    <pic:cNvPicPr/>
-                  </pic:nvPicPr>
-                  <pic:blipFill>
-                    <a:blip r:embed="rId39"/>
-                    <a:stretch>
-                      <a:fillRect/>
-                    </a:stretch>
-                  </pic:blipFill>
-                  <pic:spPr>
-                    <a:xfrm>
-                      <a:off x="0" y="0"/>
-                      <a:ext cx="5832000" cy="3424735"/>
-                    </a:xfrm>
-                    <a:prstGeom prst="rect"/>
-                  </pic:spPr>
-                </pic:pic>
-              </a:graphicData>
-            </a:graphic>
-          </wp:inline>
-        </w:drawing>
-      </w:r>
-    </w:p>
-    <w:p>
-      <w:pPr>
-        <w:pStyle w:val="af7"/>
-        <w:jc w:val="center"/>
-      </w:pPr>
-      <w:r>
-        <w:rPr>
-          <w:rFonts w:ascii="宋体" w:hAnsi="宋体" w:eastAsia="宋体"/>
-          <w:sz w:val="19"/>
-        </w:rPr>
-        <w:t>图 5 HRGV-Net 的层级证据融合与困难负样本风险验证结构</w:t>
+        <w:t>既有分层模型能够利用17类矿物种类监督提升目标召回，但固定测试集的成对分析表明，两类困难负样本误入目标的比例也随之上升。为直接处理这一失效模式，本研究在 HRGV-Net 的层级双专家、双验证器与中性区残差校正基础上，引入后悔监督门控，形成 RSG-HRGV-Net。网络以 EfficientNet-B0 为共享主干，设置直接角色专家和矿物种类专家；后者经固定映射矩阵 A 聚合为角色后验。可靠性门控根据共享特征、两个专家的熵及 Jensen-Shannon 分歧进行逐图融合，训练期再使用真实类别下的专家相对损失给予门控方向性监督。随后由“目标—含钛干扰”和“目标—金属光泽干扰”两个验证器对目标后验进行中性区残差校正。本方法仍是公开矿物标本图像上的视觉代理任务，不等同于工业分选回收率验证。</w:t>
       </w:r>
     </w:p>
     <w:p>
@@ -13490,6 +13449,302 @@
           <w:sz w:val="21"/>
         </w:rPr>
         <w:t>上述五条中，命题1、2和5是网络结构产生的确定性数学性质；命题3依赖严格阈值接纳规则及可选的条件独立假设；命题4是标准选择性决策性质。报告把这些性质与对应消融分开陈述，避免把数学恒等式、经验趋势和统计显著性混为一谈。</w:t>
+      </w:r>
+    </w:p>
+    <w:p>
+      <w:pPr>
+        <w:keepNext/>
+        <w:jc w:val="center"/>
+      </w:pPr>
+      <w:r>
+        <w:drawing>
+          <wp:inline xmlns:a="http://schemas.openxmlformats.org/drawingml/2006/main" xmlns:pic="http://schemas.openxmlformats.org/drawingml/2006/picture">
+            <wp:extent cx="5796000" cy="3403595"/>
+            <wp:docPr id="35" name="Picture 35"/>
+            <wp:cNvGraphicFramePr>
+              <a:graphicFrameLocks noChangeAspect="1"/>
+            </wp:cNvGraphicFramePr>
+            <a:graphic>
+              <a:graphicData uri="http://schemas.openxmlformats.org/drawingml/2006/picture">
+                <pic:pic>
+                  <pic:nvPicPr>
+                    <pic:cNvPr id="0" name="fig_hrgv_architecture.png"/>
+                    <pic:cNvPicPr/>
+                  </pic:nvPicPr>
+                  <pic:blipFill>
+                    <a:blip r:embed="rId46"/>
+                    <a:stretch>
+                      <a:fillRect/>
+                    </a:stretch>
+                  </pic:blipFill>
+                  <pic:spPr>
+                    <a:xfrm>
+                      <a:off x="0" y="0"/>
+                      <a:ext cx="5796000" cy="3403595"/>
+                    </a:xfrm>
+                    <a:prstGeom prst="rect"/>
+                  </pic:spPr>
+                </pic:pic>
+              </a:graphicData>
+            </a:graphic>
+          </wp:inline>
+        </w:drawing>
+      </w:r>
+    </w:p>
+    <w:p>
+      <w:pPr>
+        <w:pStyle w:val="af7"/>
+        <w:jc w:val="center"/>
+      </w:pPr>
+      <w:r>
+        <w:rPr>
+          <w:rFonts w:ascii="宋体" w:hAnsi="宋体" w:eastAsia="宋体"/>
+          <w:sz w:val="19"/>
+        </w:rPr>
+        <w:t>图 5 RSG-HRGV-Net 的分层证据、后悔监督门控与困难负样本风险验证结构</w:t>
+      </w:r>
+    </w:p>
+    <w:p>
+      <w:pPr>
+        <w:pStyle w:val="31"/>
+      </w:pPr>
+      <w:r>
+        <w:t>4.6.1 后悔监督门控（RSG）</w:t>
+      </w:r>
+    </w:p>
+    <w:p>
+      <w:pPr>
+        <w:spacing w:line="360" w:lineRule="auto" w:after="80"/>
+      </w:pPr>
+      <w:r>
+        <w:rPr>
+          <w:rFonts w:ascii="宋体" w:hAnsi="宋体" w:eastAsia="宋体"/>
+          <w:sz w:val="21"/>
+        </w:rPr>
+        <w:t>常规融合损失只要求融合后验正确，却不会直接告诉门控“本图像更应信任哪一位专家”。RSG 以真实角色 y 下的直接角色专家与种类映射专家的负对数损失差为可观测的训练期证据，构造连续门控目标。令 g 表示直接角色专家的融合权重，则：</w:t>
+      </w:r>
+    </w:p>
+    <w:p>
+      <w:pPr>
+        <w:keepNext/>
+        <w:jc w:val="center"/>
+      </w:pPr>
+      <w:r>
+        <w:drawing>
+          <wp:inline xmlns:a="http://schemas.openxmlformats.org/drawingml/2006/main" xmlns:pic="http://schemas.openxmlformats.org/drawingml/2006/picture">
+            <wp:extent cx="5760000" cy="243775"/>
+            <wp:docPr id="36" name="Picture 36"/>
+            <wp:cNvGraphicFramePr>
+              <a:graphicFrameLocks noChangeAspect="1"/>
+            </wp:cNvGraphicFramePr>
+            <a:graphic>
+              <a:graphicData uri="http://schemas.openxmlformats.org/drawingml/2006/picture">
+                <pic:pic>
+                  <pic:nvPicPr>
+                    <pic:cNvPr id="0" name="rsg_regret.png"/>
+                    <pic:cNvPicPr/>
+                  </pic:nvPicPr>
+                  <pic:blipFill>
+                    <a:blip r:embed="rId47"/>
+                    <a:stretch>
+                      <a:fillRect/>
+                    </a:stretch>
+                  </pic:blipFill>
+                  <pic:spPr>
+                    <a:xfrm>
+                      <a:off x="0" y="0"/>
+                      <a:ext cx="5760000" cy="243775"/>
+                    </a:xfrm>
+                    <a:prstGeom prst="rect"/>
+                  </pic:spPr>
+                </pic:pic>
+              </a:graphicData>
+            </a:graphic>
+          </wp:inline>
+        </w:drawing>
+      </w:r>
+    </w:p>
+    <w:p>
+      <w:pPr>
+        <w:pStyle w:val="af7"/>
+        <w:jc w:val="center"/>
+      </w:pPr>
+      <w:r>
+        <w:rPr>
+          <w:rFonts w:ascii="宋体" w:hAnsi="宋体" w:eastAsia="宋体"/>
+          <w:sz w:val="19"/>
+        </w:rPr>
+        <w:t>式（17） RSG 的样本级后悔差、软门控目标与加权监督</w:t>
+      </w:r>
+    </w:p>
+    <w:p>
+      <w:pPr>
+        <w:spacing w:line="360" w:lineRule="auto" w:after="80"/>
+      </w:pPr>
+      <w:r>
+        <w:rPr>
+          <w:rFonts w:ascii="宋体" w:hAnsi="宋体" w:eastAsia="宋体"/>
+          <w:sz w:val="21"/>
+        </w:rPr>
+        <w:t>当直接角色专家更可靠时，Δ 为正且 g* 趋近 1；当种类映射专家更可靠时，g* 趋近 0。差距权重 w 使两位专家几乎等价的样本不会主导门控学习。正式配置取 λg=0.1、Tr=0.2、Tw=0.5；为防止专家通过人为改变后验迎合门控标签，g* 与 w 由停止梯度的专家后验构造。该隔离只作用于后悔监督分支，双验证器仍通过原有耦合路径参与共享表征训练。</w:t>
+      </w:r>
+    </w:p>
+    <w:p>
+      <w:pPr>
+        <w:spacing w:line="360" w:lineRule="auto" w:after="80"/>
+      </w:pPr>
+      <w:r>
+        <w:rPr>
+          <w:rFonts w:ascii="黑体" w:hAnsi="黑体" w:eastAsia="黑体"/>
+          <w:b/>
+          <w:sz w:val="21"/>
+        </w:rPr>
+        <w:t>命题6（门控误差的路由后悔上界）</w:t>
+      </w:r>
+      <w:r>
+        <w:rPr>
+          <w:rFonts w:ascii="宋体" w:hAnsi="宋体" w:eastAsia="宋体"/>
+          <w:sz w:val="21"/>
+        </w:rPr>
+      </w:r>
+    </w:p>
+    <w:p>
+      <w:pPr>
+        <w:spacing w:line="360" w:lineRule="auto" w:after="80"/>
+      </w:pPr>
+      <w:r>
+        <w:rPr>
+          <w:rFonts w:ascii="宋体" w:hAnsi="宋体" w:eastAsia="宋体"/>
+          <w:sz w:val="21"/>
+        </w:rPr>
+        <w:t>令 a=pd(y|x)、b=pm(y|x)，且 a,b≥ε&gt;0；令 go=I(a≥b) 为硬最优门控，pg=ga+(1−g)b。则融合相对选择真实类别概率更大专家的对数后悔由式（18）上界。证明使用 −log 在 [ε,1] 上的 Lipschitz 性质。它说明，门控误差仅在专家对真实类别的证据差距较大时造成较高后悔，因此差距加权具有明确的优化含义。</w:t>
+      </w:r>
+    </w:p>
+    <w:p>
+      <w:pPr>
+        <w:spacing w:line="360" w:lineRule="auto" w:after="80"/>
+      </w:pPr>
+      <w:r>
+        <w:rPr>
+          <w:rFonts w:ascii="黑体" w:hAnsi="黑体" w:eastAsia="黑体"/>
+          <w:b/>
+          <w:sz w:val="21"/>
+        </w:rPr>
+        <w:t>命题7（软目标对硬门控的指数逼近）</w:t>
+      </w:r>
+      <w:r>
+        <w:rPr>
+          <w:rFonts w:ascii="宋体" w:hAnsi="宋体" w:eastAsia="宋体"/>
+          <w:sz w:val="21"/>
+        </w:rPr>
+      </w:r>
+    </w:p>
+    <w:p>
+      <w:pPr>
+        <w:spacing w:line="360" w:lineRule="auto" w:after="80"/>
+      </w:pPr>
+      <w:r>
+        <w:rPr>
+          <w:rFonts w:ascii="宋体" w:hAnsi="宋体" w:eastAsia="宋体"/>
+          <w:sz w:val="21"/>
+        </w:rPr>
+        <w:t>对 Δ≠0，软目标 g* 与硬最优门控 go 的距离不超过 exp(−|Δ|/Tr)。因此，当两专家明显分出优劣时，连续目标逼近硬选择；当它们接近时，目标保持不确定性而非制造过强监督。该命题对应软目标、硬目标和无差距加权的受控预实验设计。</w:t>
+      </w:r>
+    </w:p>
+    <w:p>
+      <w:pPr>
+        <w:spacing w:line="360" w:lineRule="auto" w:after="80"/>
+      </w:pPr>
+      <w:r>
+        <w:rPr>
+          <w:rFonts w:ascii="黑体" w:hAnsi="黑体" w:eastAsia="黑体"/>
+          <w:b/>
+          <w:sz w:val="21"/>
+        </w:rPr>
+        <w:t>命题8（后悔监督的局部梯度隔离）</w:t>
+      </w:r>
+      <w:r>
+        <w:rPr>
+          <w:rFonts w:ascii="宋体" w:hAnsi="宋体" w:eastAsia="宋体"/>
+          <w:sz w:val="21"/>
+        </w:rPr>
+      </w:r>
+    </w:p>
+    <w:p>
+      <w:pPr>
+        <w:spacing w:line="360" w:lineRule="auto" w:after="80"/>
+      </w:pPr>
+      <w:r>
+        <w:rPr>
+          <w:rFonts w:ascii="宋体" w:hAnsi="宋体" w:eastAsia="宋体"/>
+          <w:sz w:val="21"/>
+        </w:rPr>
+        <w:t>若构造 g* 与 w 的专家后验使用停止梯度，则后悔监督关于专家参数的梯度严格为0，而关于门控参数的梯度可非零。该结论仅限定 Lreg 分支，不切断角色、种类、验证器和对比约束对共享主干的训练。它解释了为何“局部梯度隔离”不同于将整个验证器与主干隔离。</w:t>
+      </w:r>
+    </w:p>
+    <w:p>
+      <w:pPr>
+        <w:keepNext/>
+        <w:jc w:val="center"/>
+      </w:pPr>
+      <w:r>
+        <w:drawing>
+          <wp:inline xmlns:a="http://schemas.openxmlformats.org/drawingml/2006/main" xmlns:pic="http://schemas.openxmlformats.org/drawingml/2006/picture">
+            <wp:extent cx="5760000" cy="327914"/>
+            <wp:docPr id="37" name="Picture 37"/>
+            <wp:cNvGraphicFramePr>
+              <a:graphicFrameLocks noChangeAspect="1"/>
+            </wp:cNvGraphicFramePr>
+            <a:graphic>
+              <a:graphicData uri="http://schemas.openxmlformats.org/drawingml/2006/picture">
+                <pic:pic>
+                  <pic:nvPicPr>
+                    <pic:cNvPr id="0" name="rsg_bounds.png"/>
+                    <pic:cNvPicPr/>
+                  </pic:nvPicPr>
+                  <pic:blipFill>
+                    <a:blip r:embed="rId48"/>
+                    <a:stretch>
+                      <a:fillRect/>
+                    </a:stretch>
+                  </pic:blipFill>
+                  <pic:spPr>
+                    <a:xfrm>
+                      <a:off x="0" y="0"/>
+                      <a:ext cx="5760000" cy="327914"/>
+                    </a:xfrm>
+                    <a:prstGeom prst="rect"/>
+                  </pic:spPr>
+                </pic:pic>
+              </a:graphicData>
+            </a:graphic>
+          </wp:inline>
+        </w:drawing>
+      </w:r>
+    </w:p>
+    <w:p>
+      <w:pPr>
+        <w:pStyle w:val="af7"/>
+        <w:jc w:val="center"/>
+      </w:pPr>
+      <w:r>
+        <w:rPr>
+          <w:rFonts w:ascii="宋体" w:hAnsi="宋体" w:eastAsia="宋体"/>
+          <w:sz w:val="19"/>
+        </w:rPr>
+        <w:t>式（18） RSG 的路由后悔上界、软目标逼近与局部梯度隔离</w:t>
+      </w:r>
+    </w:p>
+    <w:p>
+      <w:pPr>
+        <w:spacing w:line="360" w:lineRule="auto" w:after="80"/>
+      </w:pPr>
+      <w:r>
+        <w:rPr>
+          <w:rFonts w:ascii="宋体" w:hAnsi="宋体" w:eastAsia="宋体"/>
+          <w:sz w:val="21"/>
+        </w:rPr>
+        <w:t>命题6至8分别给出门控应优化何种风险、连续目标为何合理以及梯度如何受控；它们不等价于“任何门控网络均会提高总体准确率”。因此，后续实验同时报告常规四分类指标和以真实类别专家后验定义的路由指标，并用成对簇 Bootstrap 区间区分机制证据与总体任务分数。</w:t>
       </w:r>
     </w:p>
     <w:p>
@@ -25228,14 +25483,604 @@
     <w:p>
       <w:pPr>
         <w:pStyle w:val="21"/>
-        <w:spacing w:line="360" w:lineRule="auto"/>
+      </w:pPr>
+      <w:r>
+        <w:t>5.18 RSG-HRGV-Net 后悔监督门控正式验证</w:t>
+      </w:r>
+    </w:p>
+    <w:p>
+      <w:pPr>
+        <w:spacing w:line="360" w:lineRule="auto" w:after="80"/>
       </w:pPr>
       <w:r>
         <w:rPr>
           <w:rFonts w:ascii="宋体" w:hAnsi="宋体" w:eastAsia="宋体"/>
           <w:sz w:val="21"/>
         </w:rPr>
-        <w:t>5.18 实验结果的综合判断</w:t>
+        <w:t>RSG-HRGV 与参考 HRGV 使用完全相同的数据清单、固定划分、耦合残差验证器推理图和三个随机种子，仅在门控训练中加入冻结的软后悔目标与差距加权。软目标、硬目标、无差距加权和允许后悔监督反传至专家的单种子受控预实验用于冻结配置；下表和统计推断只使用参考 HRGV 与完整 RSG-HRGV 的三随机种子正式对照。</w:t>
+      </w:r>
+    </w:p>
+    <w:p>
+      <w:pPr>
+        <w:pStyle w:val="af7"/>
+        <w:jc w:val="center"/>
+      </w:pPr>
+      <w:r>
+        <w:rPr>
+          <w:rFonts w:ascii="宋体" w:hAnsi="宋体" w:eastAsia="宋体"/>
+          <w:sz w:val="19"/>
+        </w:rPr>
+        <w:t>表 26 RSG-HRGV-Net 与 HRGV 的三随机种子正式比较</w:t>
+      </w:r>
+    </w:p>
+    <w:tbl>
+      <w:tblPr>
+        <w:tblStyle w:val="aff1"/>
+        <w:tblW w:type="auto" w:w="0"/>
+        <w:jc w:val="center"/>
+        <w:tblLayout w:type="fixed"/>
+        <w:tblLook w:firstColumn="1" w:firstRow="1" w:lastColumn="0" w:lastRow="0" w:noHBand="0" w:noVBand="1" w:val="04A0"/>
+      </w:tblPr>
+      <w:tblGrid>
+        <w:gridCol w:w="1148"/>
+        <w:gridCol w:w="1148"/>
+        <w:gridCol w:w="1148"/>
+        <w:gridCol w:w="1148"/>
+        <w:gridCol w:w="1148"/>
+        <w:gridCol w:w="1148"/>
+        <w:gridCol w:w="1148"/>
+        <w:gridCol w:w="1148"/>
+      </w:tblGrid>
+      <w:tr>
+        <w:trPr>
+          <w:tblHeader w:val="true"/>
+        </w:trPr>
+        <w:tc>
+          <w:tcPr>
+            <w:tcW w:type="dxa" w:w="1388"/>
+            <w:vAlign w:val="center"/>
+            <w:shd w:fill="D9EAF7"/>
+          </w:tcPr>
+          <w:p>
+            <w:pPr>
+              <w:spacing w:before="30" w:after="30" w:line="252" w:lineRule="auto"/>
+              <w:jc w:val="center"/>
+            </w:pPr>
+            <w:r>
+              <w:rPr>
+                <w:rFonts w:ascii="黑体" w:hAnsi="黑体" w:eastAsia="黑体"/>
+                <w:b/>
+                <w:sz w:val="18"/>
+              </w:rPr>
+              <w:t>设置</w:t>
+            </w:r>
+          </w:p>
+        </w:tc>
+        <w:tc>
+          <w:tcPr>
+            <w:tcW w:type="dxa" w:w="850"/>
+            <w:vAlign w:val="center"/>
+            <w:shd w:fill="D9EAF7"/>
+          </w:tcPr>
+          <w:p>
+            <w:pPr>
+              <w:spacing w:before="30" w:after="30" w:line="252" w:lineRule="auto"/>
+              <w:jc w:val="center"/>
+            </w:pPr>
+            <w:r>
+              <w:rPr>
+                <w:rFonts w:ascii="黑体" w:hAnsi="黑体" w:eastAsia="黑体"/>
+                <w:b/>
+                <w:sz w:val="18"/>
+              </w:rPr>
+              <w:t>Accuracy</w:t>
+            </w:r>
+          </w:p>
+        </w:tc>
+        <w:tc>
+          <w:tcPr>
+            <w:tcW w:type="dxa" w:w="850"/>
+            <w:vAlign w:val="center"/>
+            <w:shd w:fill="D9EAF7"/>
+          </w:tcPr>
+          <w:p>
+            <w:pPr>
+              <w:spacing w:before="30" w:after="30" w:line="252" w:lineRule="auto"/>
+              <w:jc w:val="center"/>
+            </w:pPr>
+            <w:r>
+              <w:rPr>
+                <w:rFonts w:ascii="黑体" w:hAnsi="黑体" w:eastAsia="黑体"/>
+                <w:b/>
+                <w:sz w:val="18"/>
+              </w:rPr>
+              <w:t>Macro F1</w:t>
+            </w:r>
+          </w:p>
+        </w:tc>
+        <w:tc>
+          <w:tcPr>
+            <w:tcW w:type="dxa" w:w="878"/>
+            <w:vAlign w:val="center"/>
+            <w:shd w:fill="D9EAF7"/>
+          </w:tcPr>
+          <w:p>
+            <w:pPr>
+              <w:spacing w:before="30" w:after="30" w:line="252" w:lineRule="auto"/>
+              <w:jc w:val="center"/>
+            </w:pPr>
+            <w:r>
+              <w:rPr>
+                <w:rFonts w:ascii="黑体" w:hAnsi="黑体" w:eastAsia="黑体"/>
+                <w:b/>
+                <w:sz w:val="18"/>
+              </w:rPr>
+              <w:t>目标召回</w:t>
+            </w:r>
+          </w:p>
+        </w:tc>
+        <w:tc>
+          <w:tcPr>
+            <w:tcW w:type="dxa" w:w="878"/>
+            <w:vAlign w:val="center"/>
+            <w:shd w:fill="D9EAF7"/>
+          </w:tcPr>
+          <w:p>
+            <w:pPr>
+              <w:spacing w:before="30" w:after="30" w:line="252" w:lineRule="auto"/>
+              <w:jc w:val="center"/>
+            </w:pPr>
+            <w:r>
+              <w:rPr>
+                <w:rFonts w:ascii="黑体" w:hAnsi="黑体" w:eastAsia="黑体"/>
+                <w:b/>
+                <w:sz w:val="18"/>
+              </w:rPr>
+              <w:t>含钛误入</w:t>
+            </w:r>
+          </w:p>
+        </w:tc>
+        <w:tc>
+          <w:tcPr>
+            <w:tcW w:type="dxa" w:w="878"/>
+            <w:vAlign w:val="center"/>
+            <w:shd w:fill="D9EAF7"/>
+          </w:tcPr>
+          <w:p>
+            <w:pPr>
+              <w:spacing w:before="30" w:after="30" w:line="252" w:lineRule="auto"/>
+              <w:jc w:val="center"/>
+            </w:pPr>
+            <w:r>
+              <w:rPr>
+                <w:rFonts w:ascii="黑体" w:hAnsi="黑体" w:eastAsia="黑体"/>
+                <w:b/>
+                <w:sz w:val="18"/>
+              </w:rPr>
+              <w:t>金属误入</w:t>
+            </w:r>
+          </w:p>
+        </w:tc>
+        <w:tc>
+          <w:tcPr>
+            <w:tcW w:type="dxa" w:w="1162"/>
+            <w:vAlign w:val="center"/>
+            <w:shd w:fill="D9EAF7"/>
+          </w:tcPr>
+          <w:p>
+            <w:pPr>
+              <w:spacing w:before="30" w:after="30" w:line="252" w:lineRule="auto"/>
+              <w:jc w:val="center"/>
+            </w:pPr>
+            <w:r>
+              <w:rPr>
+                <w:rFonts w:ascii="黑体" w:hAnsi="黑体" w:eastAsia="黑体"/>
+                <w:b/>
+                <w:sz w:val="18"/>
+              </w:rPr>
+              <w:t>一对一错路由</w:t>
+            </w:r>
+          </w:p>
+        </w:tc>
+        <w:tc>
+          <w:tcPr>
+            <w:tcW w:type="dxa" w:w="935"/>
+            <w:vAlign w:val="center"/>
+            <w:shd w:fill="D9EAF7"/>
+          </w:tcPr>
+          <w:p>
+            <w:pPr>
+              <w:spacing w:before="30" w:after="30" w:line="252" w:lineRule="auto"/>
+              <w:jc w:val="center"/>
+            </w:pPr>
+            <w:r>
+              <w:rPr>
+                <w:rFonts w:ascii="黑体" w:hAnsi="黑体" w:eastAsia="黑体"/>
+                <w:b/>
+                <w:sz w:val="18"/>
+              </w:rPr>
+              <w:t>平均路由后悔</w:t>
+            </w:r>
+          </w:p>
+        </w:tc>
+      </w:tr>
+      <w:tr>
+        <w:tc>
+          <w:tcPr>
+            <w:tcW w:type="dxa" w:w="1388"/>
+            <w:vAlign w:val="center"/>
+          </w:tcPr>
+          <w:p>
+            <w:pPr>
+              <w:spacing w:before="30" w:after="30" w:line="252" w:lineRule="auto"/>
+              <w:jc w:val="center"/>
+            </w:pPr>
+            <w:r>
+              <w:rPr>
+                <w:rFonts w:ascii="宋体" w:hAnsi="宋体" w:eastAsia="宋体"/>
+                <w:b w:val="0"/>
+                <w:sz w:val="18"/>
+              </w:rPr>
+              <w:t>耦合残差 HRGV（参考）</w:t>
+            </w:r>
+          </w:p>
+        </w:tc>
+        <w:tc>
+          <w:tcPr>
+            <w:tcW w:type="dxa" w:w="850"/>
+            <w:vAlign w:val="center"/>
+          </w:tcPr>
+          <w:p>
+            <w:pPr>
+              <w:spacing w:before="30" w:after="30" w:line="252" w:lineRule="auto"/>
+              <w:jc w:val="center"/>
+            </w:pPr>
+            <w:r>
+              <w:rPr>
+                <w:rFonts w:ascii="宋体" w:hAnsi="宋体" w:eastAsia="宋体"/>
+                <w:b w:val="0"/>
+                <w:sz w:val="18"/>
+              </w:rPr>
+              <w:t>76.48% ± 0.23%</w:t>
+            </w:r>
+          </w:p>
+        </w:tc>
+        <w:tc>
+          <w:tcPr>
+            <w:tcW w:type="dxa" w:w="850"/>
+            <w:vAlign w:val="center"/>
+          </w:tcPr>
+          <w:p>
+            <w:pPr>
+              <w:spacing w:before="30" w:after="30" w:line="252" w:lineRule="auto"/>
+              <w:jc w:val="center"/>
+            </w:pPr>
+            <w:r>
+              <w:rPr>
+                <w:rFonts w:ascii="宋体" w:hAnsi="宋体" w:eastAsia="宋体"/>
+                <w:b w:val="0"/>
+                <w:sz w:val="18"/>
+              </w:rPr>
+              <w:t>74.59% ± 0.34%</w:t>
+            </w:r>
+          </w:p>
+        </w:tc>
+        <w:tc>
+          <w:tcPr>
+            <w:tcW w:type="dxa" w:w="878"/>
+            <w:vAlign w:val="center"/>
+          </w:tcPr>
+          <w:p>
+            <w:pPr>
+              <w:spacing w:before="30" w:after="30" w:line="252" w:lineRule="auto"/>
+              <w:jc w:val="center"/>
+            </w:pPr>
+            <w:r>
+              <w:rPr>
+                <w:rFonts w:ascii="宋体" w:hAnsi="宋体" w:eastAsia="宋体"/>
+                <w:b w:val="0"/>
+                <w:sz w:val="18"/>
+              </w:rPr>
+              <w:t>72.38% ± 3.22%</w:t>
+            </w:r>
+          </w:p>
+        </w:tc>
+        <w:tc>
+          <w:tcPr>
+            <w:tcW w:type="dxa" w:w="878"/>
+            <w:vAlign w:val="center"/>
+          </w:tcPr>
+          <w:p>
+            <w:pPr>
+              <w:spacing w:before="30" w:after="30" w:line="252" w:lineRule="auto"/>
+              <w:jc w:val="center"/>
+            </w:pPr>
+            <w:r>
+              <w:rPr>
+                <w:rFonts w:ascii="宋体" w:hAnsi="宋体" w:eastAsia="宋体"/>
+                <w:b w:val="0"/>
+                <w:sz w:val="18"/>
+              </w:rPr>
+              <w:t>9.16% ± 1.13%</w:t>
+            </w:r>
+          </w:p>
+        </w:tc>
+        <w:tc>
+          <w:tcPr>
+            <w:tcW w:type="dxa" w:w="878"/>
+            <w:vAlign w:val="center"/>
+          </w:tcPr>
+          <w:p>
+            <w:pPr>
+              <w:spacing w:before="30" w:after="30" w:line="252" w:lineRule="auto"/>
+              <w:jc w:val="center"/>
+            </w:pPr>
+            <w:r>
+              <w:rPr>
+                <w:rFonts w:ascii="宋体" w:hAnsi="宋体" w:eastAsia="宋体"/>
+                <w:b w:val="0"/>
+                <w:sz w:val="18"/>
+              </w:rPr>
+              <w:t>11.55% ± 1.18%</w:t>
+            </w:r>
+          </w:p>
+        </w:tc>
+        <w:tc>
+          <w:tcPr>
+            <w:tcW w:type="dxa" w:w="1162"/>
+            <w:vAlign w:val="center"/>
+          </w:tcPr>
+          <w:p>
+            <w:pPr>
+              <w:spacing w:before="30" w:after="30" w:line="252" w:lineRule="auto"/>
+              <w:jc w:val="center"/>
+            </w:pPr>
+            <w:r>
+              <w:rPr>
+                <w:rFonts w:ascii="宋体" w:hAnsi="宋体" w:eastAsia="宋体"/>
+                <w:b w:val="0"/>
+                <w:sz w:val="18"/>
+              </w:rPr>
+              <w:t>45.99% ± 4.82%</w:t>
+            </w:r>
+          </w:p>
+        </w:tc>
+        <w:tc>
+          <w:tcPr>
+            <w:tcW w:type="dxa" w:w="935"/>
+            <w:vAlign w:val="center"/>
+          </w:tcPr>
+          <w:p>
+            <w:pPr>
+              <w:spacing w:before="30" w:after="30" w:line="252" w:lineRule="auto"/>
+              <w:jc w:val="center"/>
+            </w:pPr>
+            <w:r>
+              <w:rPr>
+                <w:rFonts w:ascii="宋体" w:hAnsi="宋体" w:eastAsia="宋体"/>
+                <w:b w:val="0"/>
+                <w:sz w:val="18"/>
+              </w:rPr>
+              <w:t>9.86% ± 0.96%</w:t>
+            </w:r>
+          </w:p>
+        </w:tc>
+      </w:tr>
+      <w:tr>
+        <w:tc>
+          <w:tcPr>
+            <w:tcW w:type="dxa" w:w="1388"/>
+            <w:vAlign w:val="center"/>
+          </w:tcPr>
+          <w:p>
+            <w:pPr>
+              <w:spacing w:before="30" w:after="30" w:line="252" w:lineRule="auto"/>
+              <w:jc w:val="center"/>
+            </w:pPr>
+            <w:r>
+              <w:rPr>
+                <w:rFonts w:ascii="宋体" w:hAnsi="宋体" w:eastAsia="宋体"/>
+                <w:b w:val="0"/>
+                <w:sz w:val="18"/>
+              </w:rPr>
+              <w:t>RSG-HRGV（完整）</w:t>
+            </w:r>
+          </w:p>
+        </w:tc>
+        <w:tc>
+          <w:tcPr>
+            <w:tcW w:type="dxa" w:w="850"/>
+            <w:vAlign w:val="center"/>
+          </w:tcPr>
+          <w:p>
+            <w:pPr>
+              <w:spacing w:before="30" w:after="30" w:line="252" w:lineRule="auto"/>
+              <w:jc w:val="center"/>
+            </w:pPr>
+            <w:r>
+              <w:rPr>
+                <w:rFonts w:ascii="宋体" w:hAnsi="宋体" w:eastAsia="宋体"/>
+                <w:b w:val="0"/>
+                <w:sz w:val="18"/>
+              </w:rPr>
+              <w:t>76.45% ± 0.98%</w:t>
+            </w:r>
+          </w:p>
+        </w:tc>
+        <w:tc>
+          <w:tcPr>
+            <w:tcW w:type="dxa" w:w="850"/>
+            <w:vAlign w:val="center"/>
+          </w:tcPr>
+          <w:p>
+            <w:pPr>
+              <w:spacing w:before="30" w:after="30" w:line="252" w:lineRule="auto"/>
+              <w:jc w:val="center"/>
+            </w:pPr>
+            <w:r>
+              <w:rPr>
+                <w:rFonts w:ascii="宋体" w:hAnsi="宋体" w:eastAsia="宋体"/>
+                <w:b w:val="0"/>
+                <w:sz w:val="18"/>
+              </w:rPr>
+              <w:t>74.76% ± 0.90%</w:t>
+            </w:r>
+          </w:p>
+        </w:tc>
+        <w:tc>
+          <w:tcPr>
+            <w:tcW w:type="dxa" w:w="878"/>
+            <w:vAlign w:val="center"/>
+          </w:tcPr>
+          <w:p>
+            <w:pPr>
+              <w:spacing w:before="30" w:after="30" w:line="252" w:lineRule="auto"/>
+              <w:jc w:val="center"/>
+            </w:pPr>
+            <w:r>
+              <w:rPr>
+                <w:rFonts w:ascii="宋体" w:hAnsi="宋体" w:eastAsia="宋体"/>
+                <w:b w:val="0"/>
+                <w:sz w:val="18"/>
+              </w:rPr>
+              <w:t>72.91% ± 1.38%</w:t>
+            </w:r>
+          </w:p>
+        </w:tc>
+        <w:tc>
+          <w:tcPr>
+            <w:tcW w:type="dxa" w:w="878"/>
+            <w:vAlign w:val="center"/>
+          </w:tcPr>
+          <w:p>
+            <w:pPr>
+              <w:spacing w:before="30" w:after="30" w:line="252" w:lineRule="auto"/>
+              <w:jc w:val="center"/>
+            </w:pPr>
+            <w:r>
+              <w:rPr>
+                <w:rFonts w:ascii="宋体" w:hAnsi="宋体" w:eastAsia="宋体"/>
+                <w:b w:val="0"/>
+                <w:sz w:val="18"/>
+              </w:rPr>
+              <w:t>8.42% ± 1.54%</w:t>
+            </w:r>
+          </w:p>
+        </w:tc>
+        <w:tc>
+          <w:tcPr>
+            <w:tcW w:type="dxa" w:w="878"/>
+            <w:vAlign w:val="center"/>
+          </w:tcPr>
+          <w:p>
+            <w:pPr>
+              <w:spacing w:before="30" w:after="30" w:line="252" w:lineRule="auto"/>
+              <w:jc w:val="center"/>
+            </w:pPr>
+            <w:r>
+              <w:rPr>
+                <w:rFonts w:ascii="宋体" w:hAnsi="宋体" w:eastAsia="宋体"/>
+                <w:b w:val="0"/>
+                <w:sz w:val="18"/>
+              </w:rPr>
+              <w:t>11.17% ± 0.87%</w:t>
+            </w:r>
+          </w:p>
+        </w:tc>
+        <w:tc>
+          <w:tcPr>
+            <w:tcW w:type="dxa" w:w="1162"/>
+            <w:vAlign w:val="center"/>
+          </w:tcPr>
+          <w:p>
+            <w:pPr>
+              <w:spacing w:before="30" w:after="30" w:line="252" w:lineRule="auto"/>
+              <w:jc w:val="center"/>
+            </w:pPr>
+            <w:r>
+              <w:rPr>
+                <w:rFonts w:ascii="宋体" w:hAnsi="宋体" w:eastAsia="宋体"/>
+                <w:b w:val="0"/>
+                <w:sz w:val="18"/>
+              </w:rPr>
+              <w:t>58.01% ± 1.76%</w:t>
+            </w:r>
+          </w:p>
+        </w:tc>
+        <w:tc>
+          <w:tcPr>
+            <w:tcW w:type="dxa" w:w="935"/>
+            <w:vAlign w:val="center"/>
+          </w:tcPr>
+          <w:p>
+            <w:pPr>
+              <w:spacing w:before="30" w:after="30" w:line="252" w:lineRule="auto"/>
+              <w:jc w:val="center"/>
+            </w:pPr>
+            <w:r>
+              <w:rPr>
+                <w:rFonts w:ascii="宋体" w:hAnsi="宋体" w:eastAsia="宋体"/>
+                <w:b w:val="0"/>
+                <w:sz w:val="18"/>
+              </w:rPr>
+              <w:t>8.09% ± 0.17%</w:t>
+            </w:r>
+          </w:p>
+        </w:tc>
+      </w:tr>
+    </w:tbl>
+    <w:p>
+      <w:pPr>
+        <w:spacing w:after="60"/>
+      </w:pPr>
+    </w:p>
+    <w:p>
+      <w:pPr>
+        <w:spacing w:line="360" w:lineRule="auto" w:after="80"/>
+      </w:pPr>
+      <w:r>
+        <w:rPr>
+          <w:rFonts w:ascii="宋体" w:hAnsi="宋体" w:eastAsia="宋体"/>
+          <w:sz w:val="21"/>
+        </w:rPr>
+        <w:t>完整 RSG-HRGV 的平均 Accuracy 为76.45% ± 0.98%，与参考 HRGV 的76.48% ± 0.23%基本相当；Macro F1 由74.59% ± 0.34%变为74.76% ± 0.90%。目标召回和两类误入目标比例在均值上均呈有利变化，但 Accuracy、Macro F1、目标召回以及两类误入指标的 2,000 次成对簇 Bootstrap 区间均跨0。因此，当前证据不能写成 RSG 对总体四分类性能具有显著优势。</w:t>
+      </w:r>
+    </w:p>
+    <w:p>
+      <w:pPr>
+        <w:spacing w:line="360" w:lineRule="auto" w:after="80"/>
+      </w:pPr>
+      <w:r>
+        <w:rPr>
+          <w:rFonts w:ascii="宋体" w:hAnsi="宋体" w:eastAsia="宋体"/>
+          <w:sz w:val="21"/>
+        </w:rPr>
+        <w:t>RSG 的机制结果更明确：在“恰有一位专家正确”的可路由样本上，门控选择正确专家的比例从45.99% ± 4.82%升至58.01% ± 1.76%，提高12.02个百分点；平均路由后悔从9.86% ± 0.96%降至8.09% ± 0.17%。后者的成对差异（RSG−HRGV）为-1.77个百分点，95%簇 Bootstrap 区间为[-2.86, -0.69]个百分点，未跨0，方向性重采样概率为1.0000。这支持 RSG 在本固定测试协议下确实降低了式（18）所定义的路由后悔。</w:t>
+      </w:r>
+    </w:p>
+    <w:p>
+      <w:pPr>
+        <w:spacing w:line="360" w:lineRule="auto" w:after="80"/>
+      </w:pPr>
+      <w:r>
+        <w:rPr>
+          <w:rFonts w:ascii="宋体" w:hAnsi="宋体" w:eastAsia="宋体"/>
+          <w:sz w:val="21"/>
+        </w:rPr>
+        <w:t>该结果形成了可审计的理论—实验闭环：命题6给出门控误差与路由后悔的上界，命题7给出软目标在专家差异明确时逼近硬选择的理由，命题8限定后悔监督不改写专家证据；正式实验则表明，所设计的局部监督稳定改善了该路由目标。由于分类终端指标的区间仍跨0，论文应将创新表述为“针对跨粒度专家证据选择的后悔监督机制及其可检验路由风险改善”，而不是宣称普适的分类精度突破。</w:t>
+      </w:r>
+    </w:p>
+    <w:p>
+      <w:pPr>
+        <w:pStyle w:val="21"/>
+        <w:spacing w:line="360" w:lineRule="auto"/>
+      </w:pPr>
+      <w:r>
+        <w:rPr>
+          <w:rFonts w:ascii="宋体" w:hAnsi="宋体" w:eastAsia="宋体"/>
+          <w:sz w:val="21"/>
+        </w:rPr>
+        <w:t>5.19 实验结果的综合判断</w:t>
       </w:r>
     </w:p>
     <w:p>
@@ -25663,7 +26508,7 @@
           <w:rFonts w:ascii="宋体" w:hAnsi="宋体" w:eastAsia="宋体"/>
           <w:sz w:val="21"/>
         </w:rPr>
-        <w:t>表 26 本阶段方法贡献及其解释边界</w:t>
+        <w:t>表 27 本阶段方法贡献及其解释边界</w:t>
       </w:r>
     </w:p>
     <w:p>
@@ -26538,7 +27383,7 @@
           <w:rFonts w:ascii="宋体" w:hAnsi="宋体" w:eastAsia="宋体"/>
           <w:sz w:val="21"/>
         </w:rPr>
-        <w:t>表 27 当前局限性及处理原则</w:t>
+        <w:t>表 28 当前局限性及处理原则</w:t>
       </w:r>
     </w:p>
     <w:p>
@@ -26956,14 +27801,26 @@
     </w:p>
     <w:p>
       <w:pPr>
-        <w:spacing w:line="360" w:lineRule="auto" w:after="80"/>
+        <w:spacing w:line="360" w:lineRule="auto"/>
       </w:pPr>
       <w:r>
         <w:rPr>
           <w:rFonts w:ascii="宋体" w:hAnsi="宋体" w:eastAsia="宋体"/>
           <w:sz w:val="21"/>
         </w:rPr>
-        <w:t>12. 本研究的理论结果建立在固定种类—角色映射、同分布校准样本和公开矿物标本图像上；当前结论不涉及钒钛品位预测、工业回收率、真实XRF送检成本或现场生产线性能。阶段条件化选矿决策图保留为获得流程阶段与成本数据后的后续研究方向。</w:t>
+        <w:t>12. RSG-HRGV-Net 在 HRGV 的双专家、验证器与残差校正基础上，引入由样本级专家相对损失构造的软后悔门控目标，并以差距权重和局部停止梯度控制学习范围。三随机种子正式对照表明，该设计将平均路由后悔降低1.77个百分点，95%簇 Bootstrap 区间为[−2.86, −0.69]个百分点；总体 Accuracy 和 Macro F1 的差异区间均跨0。因此，本研究将其定位为可证明、可测量的证据路由创新，不将其解释为分类精度的普适显著提升。</w:t>
+      </w:r>
+    </w:p>
+    <w:p>
+      <w:pPr>
+        <w:spacing w:line="360" w:lineRule="auto" w:after="80"/>
+      </w:pPr>
+      <w:r>
+        <w:rPr>
+          <w:rFonts w:ascii="宋体" w:hAnsi="宋体" w:eastAsia="宋体"/>
+          <w:sz w:val="21"/>
+        </w:rPr>
+        <w:t>13. 本研究的理论结果建立在固定种类—角色映射、同分布校准样本和公开矿物标本图像上；当前结论不涉及钒钛品位预测、工业回收率、真实XRF送检成本或现场生产线性能。阶段条件化选矿决策图保留为获得流程阶段与成本数据后的后续研究方向。</w:t>
       </w:r>
     </w:p>
     <w:p>
@@ -28044,7 +28901,7 @@
           <w:rFonts w:ascii="宋体" w:hAnsi="宋体" w:eastAsia="宋体"/>
           <w:sz w:val="21"/>
         </w:rPr>
-        <w:t>项目保留数据清单、采集与筛选脚本、数据质量审计记录、训练脚本、实验指标、混淆矩阵、逐图预测和图表源数据。层级风险汇总位于 outputs/theory_validation/hierarchy_consistency/；校准风险认证汇总位于 outputs/theory_validation/calibrated_selective_recognition/；来源留出与代理消融汇总位于 outputs/paper_experiments_v2/training_summaries/；成对簇 Bootstrap、McNemar 结果和重采样分布位于 outputs/paper_experiments_v3/statistical_inference/；对应论文图位于 outputs/paper_figures_v3/。 HRGV 三随机种子汇总、消融差值、验证器 AUC 与成对统计位于 outputs/business_metrics/hrgv_network/；HRGV 相对既有分层模型的成对统计位于 outputs/paper_experiments_v4/statistical_inference/hrgv_vs_hierarchical/；网络结构图和效应图位于 outputs/paper_figures_v2/。</w:t>
+        <w:t>项目保留数据清单、采集与筛选脚本、数据质量审计记录、训练脚本、实验指标、混淆矩阵、逐图预测和图表源数据。层级风险汇总位于 outputs/theory_validation/hierarchy_consistency/；校准风险认证汇总位于 outputs/theory_validation/calibrated_selective_recognition/；来源留出与代理消融汇总位于 outputs/paper_experiments_v2/training_summaries/；成对簇 Bootstrap、McNemar 结果和重采样分布位于 outputs/paper_experiments_v3/statistical_inference/；对应论文图位于 outputs/paper_figures_v3/。 HRGV 三随机种子汇总、消融差值、验证器 AUC 与成对统计位于 outputs/business_metrics/hrgv_network/；HRGV 相对既有分层模型的成对统计位于 outputs/paper_experiments_v4/statistical_inference/hrgv_vs_hierarchical/；网络结构图和效应图位于 outputs/paper_figures_v2/。 RSG-HRGV 的冻结配置、受控预实验、三随机种子逐图预测与成对统计位于 outputs/training/rsg_controlled/、outputs/business_metrics/rsg_hrgv/formal/ 和 docs/experiment_records/2026-08-22_rsg_hrgv.md。</w:t>
       </w:r>
     </w:p>
     <w:p>

</xml_diff>

<commit_message>
exp: validate RSG under photographer holdout
</commit_message>
<xml_diff>
--- a/结题/基于深度学习的钒钛矿相关矿物图像识别方法研究_技术报告（正式版）.docx
+++ b/结题/基于深度学习的钒钛矿相关矿物图像识别方法研究_技术报告（正式版）.docx
@@ -26073,14 +26073,669 @@
     <w:p>
       <w:pPr>
         <w:pStyle w:val="21"/>
-        <w:spacing w:line="360" w:lineRule="auto"/>
+      </w:pPr>
+      <w:r>
+        <w:t>5.19 RSG-HRGV-Net 的摄影者留出泛化验证</w:t>
+      </w:r>
+    </w:p>
+    <w:p>
+      <w:pPr>
+        <w:spacing w:line="360" w:lineRule="auto" w:after="80"/>
       </w:pPr>
       <w:r>
         <w:rPr>
           <w:rFonts w:ascii="宋体" w:hAnsi="宋体" w:eastAsia="宋体"/>
           <w:sz w:val="21"/>
         </w:rPr>
-        <w:t>5.19 实验结果的综合判断</w:t>
+        <w:t>固定随机划分已按重复图像和 Mindat 图片编号控制泄漏，但仍可能受摄影背景、布光与上传者风格影响。为检验后悔监督机制在此类来源变化下是否保持其预期方向，本节沿用摄影者留出清单：5,639张具有摄影者字段的图像按摄影者与重复图像组整体划分为训练/验证/测试集3,947/846/846张，三划分的摄影者与 split_group_id 均不交叉；缺失摄影者字段的2,890张图像不进入本实验。该实验是公开 Mindat 标本图片上的来源留出验证，不是独立工业现场或未知矿物（OOD）测试。</w:t>
+      </w:r>
+    </w:p>
+    <w:p>
+      <w:pPr>
+        <w:spacing w:line="360" w:lineRule="auto" w:after="80"/>
+      </w:pPr>
+      <w:r>
+        <w:rPr>
+          <w:rFonts w:ascii="宋体" w:hAnsi="宋体" w:eastAsia="宋体"/>
+          <w:sz w:val="21"/>
+        </w:rPr>
+        <w:t>为避免使用试跑结果进行重复计数，种子20260728只用于检查执行与冻结流程，不进入统计推断；正式确认比较使用独立种子20260727、20260729和20260730。两组模型使用同一清单、同一 EfficientNet-B0 初始化、优化器、早停规则与耦合残差验证器，唯一差异为完整 RSG-HRGV 加入式（17）的局部梯度隔离软后悔门控监督。</w:t>
+      </w:r>
+    </w:p>
+    <w:p>
+      <w:pPr>
+        <w:pStyle w:val="af7"/>
+        <w:jc w:val="center"/>
+      </w:pPr>
+      <w:r>
+        <w:rPr>
+          <w:rFonts w:ascii="宋体" w:hAnsi="宋体" w:eastAsia="宋体"/>
+          <w:sz w:val="19"/>
+        </w:rPr>
+        <w:t>表 27 摄影者留出下 RSG-HRGV-Net 与 HRGV 的独立三随机种子比较</w:t>
+      </w:r>
+    </w:p>
+    <w:tbl>
+      <w:tblPr>
+        <w:tblStyle w:val="aff1"/>
+        <w:tblW w:type="auto" w:w="0"/>
+        <w:jc w:val="center"/>
+        <w:tblLayout w:type="fixed"/>
+        <w:tblLook w:firstColumn="1" w:firstRow="1" w:lastColumn="0" w:lastRow="0" w:noHBand="0" w:noVBand="1" w:val="04A0"/>
+      </w:tblPr>
+      <w:tblGrid>
+        <w:gridCol w:w="1148"/>
+        <w:gridCol w:w="1148"/>
+        <w:gridCol w:w="1148"/>
+        <w:gridCol w:w="1148"/>
+        <w:gridCol w:w="1148"/>
+        <w:gridCol w:w="1148"/>
+        <w:gridCol w:w="1148"/>
+        <w:gridCol w:w="1148"/>
+      </w:tblGrid>
+      <w:tr>
+        <w:trPr>
+          <w:tblHeader w:val="true"/>
+        </w:trPr>
+        <w:tc>
+          <w:tcPr>
+            <w:tcW w:type="dxa" w:w="1388"/>
+            <w:vAlign w:val="center"/>
+            <w:shd w:fill="D9EAF7"/>
+          </w:tcPr>
+          <w:p>
+            <w:pPr>
+              <w:spacing w:before="30" w:after="30" w:line="252" w:lineRule="auto"/>
+              <w:jc w:val="center"/>
+            </w:pPr>
+            <w:r>
+              <w:rPr>
+                <w:rFonts w:ascii="黑体" w:hAnsi="黑体" w:eastAsia="黑体"/>
+                <w:b/>
+                <w:sz w:val="18"/>
+              </w:rPr>
+              <w:t>设置</w:t>
+            </w:r>
+          </w:p>
+        </w:tc>
+        <w:tc>
+          <w:tcPr>
+            <w:tcW w:type="dxa" w:w="822"/>
+            <w:vAlign w:val="center"/>
+            <w:shd w:fill="D9EAF7"/>
+          </w:tcPr>
+          <w:p>
+            <w:pPr>
+              <w:spacing w:before="30" w:after="30" w:line="252" w:lineRule="auto"/>
+              <w:jc w:val="center"/>
+            </w:pPr>
+            <w:r>
+              <w:rPr>
+                <w:rFonts w:ascii="黑体" w:hAnsi="黑体" w:eastAsia="黑体"/>
+                <w:b/>
+                <w:sz w:val="18"/>
+              </w:rPr>
+              <w:t>Accuracy</w:t>
+            </w:r>
+          </w:p>
+        </w:tc>
+        <w:tc>
+          <w:tcPr>
+            <w:tcW w:type="dxa" w:w="822"/>
+            <w:vAlign w:val="center"/>
+            <w:shd w:fill="D9EAF7"/>
+          </w:tcPr>
+          <w:p>
+            <w:pPr>
+              <w:spacing w:before="30" w:after="30" w:line="252" w:lineRule="auto"/>
+              <w:jc w:val="center"/>
+            </w:pPr>
+            <w:r>
+              <w:rPr>
+                <w:rFonts w:ascii="黑体" w:hAnsi="黑体" w:eastAsia="黑体"/>
+                <w:b/>
+                <w:sz w:val="18"/>
+              </w:rPr>
+              <w:t>Macro F1</w:t>
+            </w:r>
+          </w:p>
+        </w:tc>
+        <w:tc>
+          <w:tcPr>
+            <w:tcW w:type="dxa" w:w="878"/>
+            <w:vAlign w:val="center"/>
+            <w:shd w:fill="D9EAF7"/>
+          </w:tcPr>
+          <w:p>
+            <w:pPr>
+              <w:spacing w:before="30" w:after="30" w:line="252" w:lineRule="auto"/>
+              <w:jc w:val="center"/>
+            </w:pPr>
+            <w:r>
+              <w:rPr>
+                <w:rFonts w:ascii="黑体" w:hAnsi="黑体" w:eastAsia="黑体"/>
+                <w:b/>
+                <w:sz w:val="18"/>
+              </w:rPr>
+              <w:t>目标召回</w:t>
+            </w:r>
+          </w:p>
+        </w:tc>
+        <w:tc>
+          <w:tcPr>
+            <w:tcW w:type="dxa" w:w="878"/>
+            <w:vAlign w:val="center"/>
+            <w:shd w:fill="D9EAF7"/>
+          </w:tcPr>
+          <w:p>
+            <w:pPr>
+              <w:spacing w:before="30" w:after="30" w:line="252" w:lineRule="auto"/>
+              <w:jc w:val="center"/>
+            </w:pPr>
+            <w:r>
+              <w:rPr>
+                <w:rFonts w:ascii="黑体" w:hAnsi="黑体" w:eastAsia="黑体"/>
+                <w:b/>
+                <w:sz w:val="18"/>
+              </w:rPr>
+              <w:t>含钛误入</w:t>
+            </w:r>
+          </w:p>
+        </w:tc>
+        <w:tc>
+          <w:tcPr>
+            <w:tcW w:type="dxa" w:w="878"/>
+            <w:vAlign w:val="center"/>
+            <w:shd w:fill="D9EAF7"/>
+          </w:tcPr>
+          <w:p>
+            <w:pPr>
+              <w:spacing w:before="30" w:after="30" w:line="252" w:lineRule="auto"/>
+              <w:jc w:val="center"/>
+            </w:pPr>
+            <w:r>
+              <w:rPr>
+                <w:rFonts w:ascii="黑体" w:hAnsi="黑体" w:eastAsia="黑体"/>
+                <w:b/>
+                <w:sz w:val="18"/>
+              </w:rPr>
+              <w:t>金属误入</w:t>
+            </w:r>
+          </w:p>
+        </w:tc>
+        <w:tc>
+          <w:tcPr>
+            <w:tcW w:type="dxa" w:w="1162"/>
+            <w:vAlign w:val="center"/>
+            <w:shd w:fill="D9EAF7"/>
+          </w:tcPr>
+          <w:p>
+            <w:pPr>
+              <w:spacing w:before="30" w:after="30" w:line="252" w:lineRule="auto"/>
+              <w:jc w:val="center"/>
+            </w:pPr>
+            <w:r>
+              <w:rPr>
+                <w:rFonts w:ascii="黑体" w:hAnsi="黑体" w:eastAsia="黑体"/>
+                <w:b/>
+                <w:sz w:val="18"/>
+              </w:rPr>
+              <w:t>一对一错路由</w:t>
+            </w:r>
+          </w:p>
+        </w:tc>
+        <w:tc>
+          <w:tcPr>
+            <w:tcW w:type="dxa" w:w="935"/>
+            <w:vAlign w:val="center"/>
+            <w:shd w:fill="D9EAF7"/>
+          </w:tcPr>
+          <w:p>
+            <w:pPr>
+              <w:spacing w:before="30" w:after="30" w:line="252" w:lineRule="auto"/>
+              <w:jc w:val="center"/>
+            </w:pPr>
+            <w:r>
+              <w:rPr>
+                <w:rFonts w:ascii="黑体" w:hAnsi="黑体" w:eastAsia="黑体"/>
+                <w:b/>
+                <w:sz w:val="18"/>
+              </w:rPr>
+              <w:t>平均路由后悔</w:t>
+            </w:r>
+          </w:p>
+        </w:tc>
+      </w:tr>
+      <w:tr>
+        <w:tc>
+          <w:tcPr>
+            <w:tcW w:type="dxa" w:w="1388"/>
+            <w:vAlign w:val="center"/>
+          </w:tcPr>
+          <w:p>
+            <w:pPr>
+              <w:spacing w:before="30" w:after="30" w:line="252" w:lineRule="auto"/>
+              <w:jc w:val="center"/>
+            </w:pPr>
+            <w:r>
+              <w:rPr>
+                <w:rFonts w:ascii="宋体" w:hAnsi="宋体" w:eastAsia="宋体"/>
+                <w:b w:val="0"/>
+                <w:sz w:val="18"/>
+              </w:rPr>
+              <w:t>耦合残差 HRGV（参考）</w:t>
+            </w:r>
+          </w:p>
+        </w:tc>
+        <w:tc>
+          <w:tcPr>
+            <w:tcW w:type="dxa" w:w="822"/>
+            <w:vAlign w:val="center"/>
+          </w:tcPr>
+          <w:p>
+            <w:pPr>
+              <w:spacing w:before="30" w:after="30" w:line="252" w:lineRule="auto"/>
+              <w:jc w:val="center"/>
+            </w:pPr>
+            <w:r>
+              <w:rPr>
+                <w:rFonts w:ascii="宋体" w:hAnsi="宋体" w:eastAsia="宋体"/>
+                <w:b w:val="0"/>
+                <w:sz w:val="18"/>
+              </w:rPr>
+              <w:t>71.20% ± 0.69%</w:t>
+            </w:r>
+          </w:p>
+        </w:tc>
+        <w:tc>
+          <w:tcPr>
+            <w:tcW w:type="dxa" w:w="822"/>
+            <w:vAlign w:val="center"/>
+          </w:tcPr>
+          <w:p>
+            <w:pPr>
+              <w:spacing w:before="30" w:after="30" w:line="252" w:lineRule="auto"/>
+              <w:jc w:val="center"/>
+            </w:pPr>
+            <w:r>
+              <w:rPr>
+                <w:rFonts w:ascii="宋体" w:hAnsi="宋体" w:eastAsia="宋体"/>
+                <w:b w:val="0"/>
+                <w:sz w:val="18"/>
+              </w:rPr>
+              <w:t>68.99% ± 1.17%</w:t>
+            </w:r>
+          </w:p>
+        </w:tc>
+        <w:tc>
+          <w:tcPr>
+            <w:tcW w:type="dxa" w:w="878"/>
+            <w:vAlign w:val="center"/>
+          </w:tcPr>
+          <w:p>
+            <w:pPr>
+              <w:spacing w:before="30" w:after="30" w:line="252" w:lineRule="auto"/>
+              <w:jc w:val="center"/>
+            </w:pPr>
+            <w:r>
+              <w:rPr>
+                <w:rFonts w:ascii="宋体" w:hAnsi="宋体" w:eastAsia="宋体"/>
+                <w:b w:val="0"/>
+                <w:sz w:val="18"/>
+              </w:rPr>
+              <w:t>71.25% ± 6.31%</w:t>
+            </w:r>
+          </w:p>
+        </w:tc>
+        <w:tc>
+          <w:tcPr>
+            <w:tcW w:type="dxa" w:w="878"/>
+            <w:vAlign w:val="center"/>
+          </w:tcPr>
+          <w:p>
+            <w:pPr>
+              <w:spacing w:before="30" w:after="30" w:line="252" w:lineRule="auto"/>
+              <w:jc w:val="center"/>
+            </w:pPr>
+            <w:r>
+              <w:rPr>
+                <w:rFonts w:ascii="宋体" w:hAnsi="宋体" w:eastAsia="宋体"/>
+                <w:b w:val="0"/>
+                <w:sz w:val="18"/>
+              </w:rPr>
+              <w:t>12.69% ± 1.83%</w:t>
+            </w:r>
+          </w:p>
+        </w:tc>
+        <w:tc>
+          <w:tcPr>
+            <w:tcW w:type="dxa" w:w="878"/>
+            <w:vAlign w:val="center"/>
+          </w:tcPr>
+          <w:p>
+            <w:pPr>
+              <w:spacing w:before="30" w:after="30" w:line="252" w:lineRule="auto"/>
+              <w:jc w:val="center"/>
+            </w:pPr>
+            <w:r>
+              <w:rPr>
+                <w:rFonts w:ascii="宋体" w:hAnsi="宋体" w:eastAsia="宋体"/>
+                <w:b w:val="0"/>
+                <w:sz w:val="18"/>
+              </w:rPr>
+              <w:t>11.88% ± 3.96%</w:t>
+            </w:r>
+          </w:p>
+        </w:tc>
+        <w:tc>
+          <w:tcPr>
+            <w:tcW w:type="dxa" w:w="1162"/>
+            <w:vAlign w:val="center"/>
+          </w:tcPr>
+          <w:p>
+            <w:pPr>
+              <w:spacing w:before="30" w:after="30" w:line="252" w:lineRule="auto"/>
+              <w:jc w:val="center"/>
+            </w:pPr>
+            <w:r>
+              <w:rPr>
+                <w:rFonts w:ascii="宋体" w:hAnsi="宋体" w:eastAsia="宋体"/>
+                <w:b w:val="0"/>
+                <w:sz w:val="18"/>
+              </w:rPr>
+              <w:t>45.19% ± 8.34%</w:t>
+            </w:r>
+          </w:p>
+        </w:tc>
+        <w:tc>
+          <w:tcPr>
+            <w:tcW w:type="dxa" w:w="935"/>
+            <w:vAlign w:val="center"/>
+          </w:tcPr>
+          <w:p>
+            <w:pPr>
+              <w:spacing w:before="30" w:after="30" w:line="252" w:lineRule="auto"/>
+              <w:jc w:val="center"/>
+            </w:pPr>
+            <w:r>
+              <w:rPr>
+                <w:rFonts w:ascii="宋体" w:hAnsi="宋体" w:eastAsia="宋体"/>
+                <w:b w:val="0"/>
+                <w:sz w:val="18"/>
+              </w:rPr>
+              <w:t>11.77% ± 0.63%</w:t>
+            </w:r>
+          </w:p>
+        </w:tc>
+      </w:tr>
+      <w:tr>
+        <w:tc>
+          <w:tcPr>
+            <w:tcW w:type="dxa" w:w="1388"/>
+            <w:vAlign w:val="center"/>
+          </w:tcPr>
+          <w:p>
+            <w:pPr>
+              <w:spacing w:before="30" w:after="30" w:line="252" w:lineRule="auto"/>
+              <w:jc w:val="center"/>
+            </w:pPr>
+            <w:r>
+              <w:rPr>
+                <w:rFonts w:ascii="宋体" w:hAnsi="宋体" w:eastAsia="宋体"/>
+                <w:b w:val="0"/>
+                <w:sz w:val="18"/>
+              </w:rPr>
+              <w:t>RSG-HRGV（完整）</w:t>
+            </w:r>
+          </w:p>
+        </w:tc>
+        <w:tc>
+          <w:tcPr>
+            <w:tcW w:type="dxa" w:w="822"/>
+            <w:vAlign w:val="center"/>
+          </w:tcPr>
+          <w:p>
+            <w:pPr>
+              <w:spacing w:before="30" w:after="30" w:line="252" w:lineRule="auto"/>
+              <w:jc w:val="center"/>
+            </w:pPr>
+            <w:r>
+              <w:rPr>
+                <w:rFonts w:ascii="宋体" w:hAnsi="宋体" w:eastAsia="宋体"/>
+                <w:b w:val="0"/>
+                <w:sz w:val="18"/>
+              </w:rPr>
+              <w:t>71.47% ± 1.14%</w:t>
+            </w:r>
+          </w:p>
+        </w:tc>
+        <w:tc>
+          <w:tcPr>
+            <w:tcW w:type="dxa" w:w="822"/>
+            <w:vAlign w:val="center"/>
+          </w:tcPr>
+          <w:p>
+            <w:pPr>
+              <w:spacing w:before="30" w:after="30" w:line="252" w:lineRule="auto"/>
+              <w:jc w:val="center"/>
+            </w:pPr>
+            <w:r>
+              <w:rPr>
+                <w:rFonts w:ascii="宋体" w:hAnsi="宋体" w:eastAsia="宋体"/>
+                <w:b w:val="0"/>
+                <w:sz w:val="18"/>
+              </w:rPr>
+              <w:t>69.25% ± 0.99%</w:t>
+            </w:r>
+          </w:p>
+        </w:tc>
+        <w:tc>
+          <w:tcPr>
+            <w:tcW w:type="dxa" w:w="878"/>
+            <w:vAlign w:val="center"/>
+          </w:tcPr>
+          <w:p>
+            <w:pPr>
+              <w:spacing w:before="30" w:after="30" w:line="252" w:lineRule="auto"/>
+              <w:jc w:val="center"/>
+            </w:pPr>
+            <w:r>
+              <w:rPr>
+                <w:rFonts w:ascii="宋体" w:hAnsi="宋体" w:eastAsia="宋体"/>
+                <w:b w:val="0"/>
+                <w:sz w:val="18"/>
+              </w:rPr>
+              <w:t>72.04% ± 2.64%</w:t>
+            </w:r>
+          </w:p>
+        </w:tc>
+        <w:tc>
+          <w:tcPr>
+            <w:tcW w:type="dxa" w:w="878"/>
+            <w:vAlign w:val="center"/>
+          </w:tcPr>
+          <w:p>
+            <w:pPr>
+              <w:spacing w:before="30" w:after="30" w:line="252" w:lineRule="auto"/>
+              <w:jc w:val="center"/>
+            </w:pPr>
+            <w:r>
+              <w:rPr>
+                <w:rFonts w:ascii="宋体" w:hAnsi="宋体" w:eastAsia="宋体"/>
+                <w:b w:val="0"/>
+                <w:sz w:val="18"/>
+              </w:rPr>
+              <w:t>11.40% ± 2.10%</w:t>
+            </w:r>
+          </w:p>
+        </w:tc>
+        <w:tc>
+          <w:tcPr>
+            <w:tcW w:type="dxa" w:w="878"/>
+            <w:vAlign w:val="center"/>
+          </w:tcPr>
+          <w:p>
+            <w:pPr>
+              <w:spacing w:before="30" w:after="30" w:line="252" w:lineRule="auto"/>
+              <w:jc w:val="center"/>
+            </w:pPr>
+            <w:r>
+              <w:rPr>
+                <w:rFonts w:ascii="宋体" w:hAnsi="宋体" w:eastAsia="宋体"/>
+                <w:b w:val="0"/>
+                <w:sz w:val="18"/>
+              </w:rPr>
+              <w:t>14.19% ± 3.02%</w:t>
+            </w:r>
+          </w:p>
+        </w:tc>
+        <w:tc>
+          <w:tcPr>
+            <w:tcW w:type="dxa" w:w="1162"/>
+            <w:vAlign w:val="center"/>
+          </w:tcPr>
+          <w:p>
+            <w:pPr>
+              <w:spacing w:before="30" w:after="30" w:line="252" w:lineRule="auto"/>
+              <w:jc w:val="center"/>
+            </w:pPr>
+            <w:r>
+              <w:rPr>
+                <w:rFonts w:ascii="宋体" w:hAnsi="宋体" w:eastAsia="宋体"/>
+                <w:b w:val="0"/>
+                <w:sz w:val="18"/>
+              </w:rPr>
+              <w:t>53.69% ± 4.02%</w:t>
+            </w:r>
+          </w:p>
+        </w:tc>
+        <w:tc>
+          <w:tcPr>
+            <w:tcW w:type="dxa" w:w="935"/>
+            <w:vAlign w:val="center"/>
+          </w:tcPr>
+          <w:p>
+            <w:pPr>
+              <w:spacing w:before="30" w:after="30" w:line="252" w:lineRule="auto"/>
+              <w:jc w:val="center"/>
+            </w:pPr>
+            <w:r>
+              <w:rPr>
+                <w:rFonts w:ascii="宋体" w:hAnsi="宋体" w:eastAsia="宋体"/>
+                <w:b w:val="0"/>
+                <w:sz w:val="18"/>
+              </w:rPr>
+              <w:t>8.24% ± 0.80%</w:t>
+            </w:r>
+          </w:p>
+        </w:tc>
+      </w:tr>
+    </w:tbl>
+    <w:p>
+      <w:pPr>
+        <w:spacing w:after="60"/>
+      </w:pPr>
+    </w:p>
+    <w:p>
+      <w:pPr>
+        <w:keepNext/>
+        <w:jc w:val="center"/>
+      </w:pPr>
+      <w:r>
+        <w:drawing>
+          <wp:inline xmlns:a="http://schemas.openxmlformats.org/drawingml/2006/main" xmlns:pic="http://schemas.openxmlformats.org/drawingml/2006/picture">
+            <wp:extent cx="5760000" cy="2288784"/>
+            <wp:docPr id="38" name="Picture 38"/>
+            <wp:cNvGraphicFramePr>
+              <a:graphicFrameLocks noChangeAspect="1"/>
+            </wp:cNvGraphicFramePr>
+            <a:graphic>
+              <a:graphicData uri="http://schemas.openxmlformats.org/drawingml/2006/picture">
+                <pic:pic>
+                  <pic:nvPicPr>
+                    <pic:cNvPr id="0" name="fig_rsg_source_holdout.png"/>
+                    <pic:cNvPicPr/>
+                  </pic:nvPicPr>
+                  <pic:blipFill>
+                    <a:blip r:embed="rId49"/>
+                    <a:stretch>
+                      <a:fillRect/>
+                    </a:stretch>
+                  </pic:blipFill>
+                  <pic:spPr>
+                    <a:xfrm>
+                      <a:off x="0" y="0"/>
+                      <a:ext cx="5760000" cy="2288784"/>
+                    </a:xfrm>
+                    <a:prstGeom prst="rect"/>
+                  </pic:spPr>
+                </pic:pic>
+              </a:graphicData>
+            </a:graphic>
+          </wp:inline>
+        </w:drawing>
+      </w:r>
+    </w:p>
+    <w:p>
+      <w:pPr>
+        <w:pStyle w:val="af7"/>
+        <w:jc w:val="center"/>
+      </w:pPr>
+      <w:r>
+        <w:rPr>
+          <w:rFonts w:ascii="宋体" w:hAnsi="宋体" w:eastAsia="宋体"/>
+          <w:sz w:val="19"/>
+        </w:rPr>
+        <w:t>图 18 摄影者留出条件下 RSG-HRGV 的角色指标与路由机制比较</w:t>
+      </w:r>
+    </w:p>
+    <w:p>
+      <w:pPr>
+        <w:spacing w:line="360" w:lineRule="auto" w:after="80"/>
+      </w:pPr>
+      <w:r>
+        <w:rPr>
+          <w:rFonts w:ascii="宋体" w:hAnsi="宋体" w:eastAsia="宋体"/>
+          <w:sz w:val="21"/>
+        </w:rPr>
+        <w:t>来源留出下，RSG 的平均 Macro F1 由68.99% ± 1.17%变为69.25% ± 0.99%，目标召回由71.25% ± 6.31%变为72.04% ± 2.64%；两者的成对簇 Bootstrap 区间均跨0。含钛干扰误入目标的均值下降，但区间仍跨0；金属光泽干扰误入目标的均值上升，且区间亦跨0。因此，该实验不能声称 RSG 在来源变化下稳定提高总体角色分类或所有业务风险指标。</w:t>
+      </w:r>
+    </w:p>
+    <w:p>
+      <w:pPr>
+        <w:spacing w:line="360" w:lineRule="auto" w:after="80"/>
+      </w:pPr>
+      <w:r>
+        <w:rPr>
+          <w:rFonts w:ascii="宋体" w:hAnsi="宋体" w:eastAsia="宋体"/>
+          <w:sz w:val="21"/>
+        </w:rPr>
+        <w:t>相反，直接对应命题6的路由机制指标在三个独立种子中方向一致：平均路由后悔由11.77% ± 0.63%降至8.24% ± 0.80%，RSG−HRGV 的差异为-3.53个百分点，95%成对簇 Bootstrap 区间为[-4.75, -2.17]个百分点，未跨0，方向性重采样概率为1.0000。同时，在恰有一位专家正确的样本中，门控选择正确专家的比例由45.19% ± 8.34%提高至53.69% ± 4.02%。这为“后悔监督改善跨粒度证据路由”提供了比固定随机划分更严格、但仍限于公开标本来源的补充证据。</w:t>
+      </w:r>
+    </w:p>
+    <w:p>
+      <w:pPr>
+        <w:spacing w:line="360" w:lineRule="auto" w:after="80"/>
+      </w:pPr>
+      <w:r>
+        <w:rPr>
+          <w:rFonts w:ascii="宋体" w:hAnsi="宋体" w:eastAsia="宋体"/>
+          <w:sz w:val="21"/>
+        </w:rPr>
+        <w:t>上述判断依赖于路由后悔的预定义方向，而非事后挑选指标。作为边界，Macro F1、Target recall与两类误入率的区间均未给出稳定总体增益；论文应把该来源留出结果定位为机制泛化验证，不将其替代真实颗粒、矿石品位或工业回收率验证。</w:t>
+      </w:r>
+    </w:p>
+    <w:p>
+      <w:pPr>
+        <w:pStyle w:val="21"/>
+        <w:spacing w:line="360" w:lineRule="auto"/>
+      </w:pPr>
+      <w:r>
+        <w:rPr>
+          <w:rFonts w:ascii="宋体" w:hAnsi="宋体" w:eastAsia="宋体"/>
+          <w:sz w:val="21"/>
+        </w:rPr>
+        <w:t>5.20 实验结果的综合判断</w:t>
       </w:r>
     </w:p>
     <w:p>
@@ -26508,7 +27163,7 @@
           <w:rFonts w:ascii="宋体" w:hAnsi="宋体" w:eastAsia="宋体"/>
           <w:sz w:val="21"/>
         </w:rPr>
-        <w:t>表 27 本阶段方法贡献及其解释边界</w:t>
+        <w:t>表 28 本阶段方法贡献及其解释边界</w:t>
       </w:r>
     </w:p>
     <w:p>
@@ -27383,7 +28038,7 @@
           <w:rFonts w:ascii="宋体" w:hAnsi="宋体" w:eastAsia="宋体"/>
           <w:sz w:val="21"/>
         </w:rPr>
-        <w:t>表 28 当前局限性及处理原则</w:t>
+        <w:t>表 29 当前局限性及处理原则</w:t>
       </w:r>
     </w:p>
     <w:p>
@@ -27820,7 +28475,19 @@
           <w:rFonts w:ascii="宋体" w:hAnsi="宋体" w:eastAsia="宋体"/>
           <w:sz w:val="21"/>
         </w:rPr>
-        <w:t>13. 本研究的理论结果建立在固定种类—角色映射、同分布校准样本和公开矿物标本图像上；当前结论不涉及钒钛品位预测、工业回收率、真实XRF送检成本或现场生产线性能。阶段条件化选矿决策图保留为获得流程阶段与成本数据后的后续研究方向。</w:t>
+        <w:t>13. 摄影者留出实验在不交叉摄影者和重复图像组的条件下，使用独立三随机种子复现了 RSG 路由后悔降低的方向；但总体分类指标的区间仍跨0，且数据源仍为公开标本图片。因此，本研究将该结果作为跨来源机制证据，而不扩大为工业场景泛化结论。</w:t>
+      </w:r>
+    </w:p>
+    <w:p>
+      <w:pPr>
+        <w:spacing w:line="360" w:lineRule="auto" w:after="80"/>
+      </w:pPr>
+      <w:r>
+        <w:rPr>
+          <w:rFonts w:ascii="宋体" w:hAnsi="宋体" w:eastAsia="宋体"/>
+          <w:sz w:val="21"/>
+        </w:rPr>
+        <w:t>14. 本研究的理论结果建立在固定种类—角色映射、同分布校准样本和公开矿物标本图像上；当前结论不涉及钒钛品位预测、工业回收率、真实XRF送检成本或现场生产线性能。阶段条件化选矿决策图保留为获得流程阶段与成本数据后的后续研究方向。</w:t>
       </w:r>
     </w:p>
     <w:p>
@@ -28901,7 +29568,7 @@
           <w:rFonts w:ascii="宋体" w:hAnsi="宋体" w:eastAsia="宋体"/>
           <w:sz w:val="21"/>
         </w:rPr>
-        <w:t>项目保留数据清单、采集与筛选脚本、数据质量审计记录、训练脚本、实验指标、混淆矩阵、逐图预测和图表源数据。层级风险汇总位于 outputs/theory_validation/hierarchy_consistency/；校准风险认证汇总位于 outputs/theory_validation/calibrated_selective_recognition/；来源留出与代理消融汇总位于 outputs/paper_experiments_v2/training_summaries/；成对簇 Bootstrap、McNemar 结果和重采样分布位于 outputs/paper_experiments_v3/statistical_inference/；对应论文图位于 outputs/paper_figures_v3/。 HRGV 三随机种子汇总、消融差值、验证器 AUC 与成对统计位于 outputs/business_metrics/hrgv_network/；HRGV 相对既有分层模型的成对统计位于 outputs/paper_experiments_v4/statistical_inference/hrgv_vs_hierarchical/；网络结构图和效应图位于 outputs/paper_figures_v2/。 RSG-HRGV 的冻结配置、受控预实验、三随机种子逐图预测与成对统计位于 outputs/training/rsg_controlled/、outputs/business_metrics/rsg_hrgv/formal/ 和 docs/experiment_records/2026-08-22_rsg_hrgv.md。</w:t>
+        <w:t>项目保留数据清单、采集与筛选脚本、数据质量审计记录、训练脚本、实验指标、混淆矩阵、逐图预测和图表源数据。层级风险汇总位于 outputs/theory_validation/hierarchy_consistency/；校准风险认证汇总位于 outputs/theory_validation/calibrated_selective_recognition/；来源留出与代理消融汇总位于 outputs/paper_experiments_v2/training_summaries/；成对簇 Bootstrap、McNemar 结果和重采样分布位于 outputs/paper_experiments_v3/statistical_inference/；对应论文图位于 outputs/paper_figures_v3/。 HRGV 三随机种子汇总、消融差值、验证器 AUC 与成对统计位于 outputs/business_metrics/hrgv_network/；HRGV 相对既有分层模型的成对统计位于 outputs/paper_experiments_v4/statistical_inference/hrgv_vs_hierarchical/；网络结构图和效应图位于 outputs/paper_figures_v2/。 RSG-HRGV 的冻结配置、受控预实验、三随机种子逐图预测与成对统计位于 outputs/training/rsg_controlled/、outputs/business_metrics/rsg_hrgv/formal/ 和 docs/experiment_records/2026-08-22_rsg_hrgv.md。 摄影者留出确认集的清单、独立种子和汇总统计位于 outputs/training/rsg_source_holdout/、outputs/business_metrics/rsg_hrgv/source_holdout/ 和 docs/experiment_records/2026-08-24_rsg_source_holdout.md。</w:t>
       </w:r>
     </w:p>
     <w:p>

</xml_diff>

<commit_message>
docs: add formal RSG theory proofs and OOD audit
</commit_message>
<xml_diff>
--- a/结题/基于深度学习的钒钛矿相关矿物图像识别方法研究_技术报告（正式版）.docx
+++ b/结题/基于深度学习的钒钛矿相关矿物图像识别方法研究_技术报告（正式版）.docx
@@ -30213,6 +30213,338 @@
       </w:r>
       <w:r>
         <w:t>正式结题前需要补充的信息</w:t>
+      </w:r>
+    </w:p>
+    <w:p>
+      <w:pPr>
+        <w:pStyle w:val="1"/>
+      </w:pPr>
+      <w:r>
+        <w:t>附录 B RSG-HRGV 门控后悔理论证明</w:t>
+      </w:r>
+    </w:p>
+    <w:p>
+      <w:pPr>
+        <w:spacing w:line="360" w:lineRule="auto"/>
+      </w:pPr>
+      <w:r>
+        <w:rPr>
+          <w:rFonts w:ascii="宋体" w:hAnsi="宋体" w:eastAsia="宋体"/>
+          <w:sz w:val="21"/>
+        </w:rPr>
+        <w:t>本附录只证明当前 RSG-HRGV 计算图中后悔门控的三个局部结论。它们规定了优化对象与梯度范围，不推出网络在任意数据集上必然提高 Accuracy 或 Macro F1。令带真实角色标签 y 的图片 x 满足 a=pd(y|x)、b=pm(y|x)∈[ε,1]，ε&gt;0；令 g∈[0,1] 为直接角色专家的门控权重，pg=ga+(1−g)b，M=max(a,b)，go=I(a≥b)。</w:t>
+      </w:r>
+    </w:p>
+    <w:p>
+      <w:pPr>
+        <w:pStyle w:val="21"/>
+      </w:pPr>
+      <w:r>
+        <w:t>B.1 门控误差的路由后悔上界</w:t>
+      </w:r>
+    </w:p>
+    <w:p>
+      <w:pPr>
+        <w:spacing w:line="360" w:lineRule="auto"/>
+      </w:pPr>
+      <w:r>
+        <w:rPr>
+          <w:rFonts w:ascii="宋体" w:hAnsi="宋体" w:eastAsia="宋体"/>
+          <w:b/>
+          <w:sz w:val="21"/>
+        </w:rPr>
+        <w:t>定理 B.1（路由后悔上界）</w:t>
+      </w:r>
+      <w:r>
+        <w:rPr>
+          <w:rFonts w:ascii="宋体" w:hAnsi="宋体" w:eastAsia="宋体"/>
+          <w:sz w:val="21"/>
+        </w:rPr>
+      </w:r>
+    </w:p>
+    <w:p>
+      <w:pPr>
+        <w:spacing w:line="360" w:lineRule="auto"/>
+      </w:pPr>
+      <w:r>
+        <w:rPr>
+          <w:rFonts w:ascii="宋体" w:hAnsi="宋体" w:eastAsia="宋体"/>
+          <w:sz w:val="21"/>
+        </w:rPr>
+        <w:t>在上述假设下，RSG 门控相对选择真实类概率更大专家的对数后悔满足下式。</w:t>
+      </w:r>
+    </w:p>
+    <w:p>
+      <w:pPr>
+        <w:jc w:val="center"/>
+      </w:pPr>
+      <w:r>
+        <w:drawing>
+          <wp:inline xmlns:a="http://schemas.openxmlformats.org/drawingml/2006/main" xmlns:pic="http://schemas.openxmlformats.org/drawingml/2006/picture">
+            <wp:extent cx="5580000" cy="549212"/>
+            <wp:docPr id="39" name="Picture 39"/>
+            <wp:cNvGraphicFramePr>
+              <a:graphicFrameLocks noChangeAspect="1"/>
+            </wp:cNvGraphicFramePr>
+            <a:graphic>
+              <a:graphicData uri="http://schemas.openxmlformats.org/drawingml/2006/picture">
+                <pic:pic>
+                  <pic:nvPicPr>
+                    <pic:cNvPr id="0" name="rsg_proof_bound.png"/>
+                    <pic:cNvPicPr/>
+                  </pic:nvPicPr>
+                  <pic:blipFill>
+                    <a:blip r:embed="rId50"/>
+                    <a:stretch>
+                      <a:fillRect/>
+                    </a:stretch>
+                  </pic:blipFill>
+                  <pic:spPr>
+                    <a:xfrm>
+                      <a:off x="0" y="0"/>
+                      <a:ext cx="5580000" cy="549212"/>
+                    </a:xfrm>
+                    <a:prstGeom prst="rect"/>
+                  </pic:spPr>
+                </pic:pic>
+              </a:graphicData>
+            </a:graphic>
+          </wp:inline>
+        </w:drawing>
+      </w:r>
+    </w:p>
+    <w:p>
+      <w:pPr>
+        <w:spacing w:line="360" w:lineRule="auto"/>
+      </w:pPr>
+      <w:r>
+        <w:rPr>
+          <w:rFonts w:ascii="宋体" w:hAnsi="宋体" w:eastAsia="宋体"/>
+          <w:sz w:val="21"/>
+        </w:rPr>
+        <w:t>式（B-1） 门控误差的路由后悔上界</w:t>
+      </w:r>
+    </w:p>
+    <w:p>
+      <w:pPr>
+        <w:spacing w:line="360" w:lineRule="auto"/>
+      </w:pPr>
+      <w:r>
+        <w:rPr>
+          <w:rFonts w:ascii="宋体" w:hAnsi="宋体" w:eastAsia="宋体"/>
+          <w:sz w:val="21"/>
+        </w:rPr>
+        <w:t>证明：pg 是 a 与 b 的凸组合，故 pg≤M，左端非负。若 a≥b，则 M−pg=(1−g)(a−b)=|g−go||a−b|；若 a&lt;b，则 M−pg=g(b−a)=|g−go||a−b|。又因 −log t 在 [ε,1] 上的导数绝对值不超过1/ε，均值定理给出 −log pg+log M≤(M−pg)/ε，代入前述恒等式即得结论。证毕。</w:t>
+      </w:r>
+    </w:p>
+    <w:p>
+      <w:pPr>
+        <w:spacing w:line="360" w:lineRule="auto"/>
+      </w:pPr>
+      <w:r>
+        <w:rPr>
+          <w:rFonts w:ascii="宋体" w:hAnsi="宋体" w:eastAsia="宋体"/>
+          <w:sz w:val="21"/>
+        </w:rPr>
+        <w:t>该上界说明，当两专家对真实类证据接近时，选错专家引起的后悔也受限；当差距显著时，门控误差的代价增大。因此 RSG 采用 tanh(|Δ|/Tw) 作为有界差距权重，而非仅凭经验放大所有样本。</w:t>
+      </w:r>
+    </w:p>
+    <w:p>
+      <w:pPr>
+        <w:pStyle w:val="21"/>
+      </w:pPr>
+      <w:r>
+        <w:t>B.2 软门控目标的指数逼近</w:t>
+      </w:r>
+    </w:p>
+    <w:p>
+      <w:pPr>
+        <w:spacing w:line="360" w:lineRule="auto"/>
+      </w:pPr>
+      <w:r>
+        <w:rPr>
+          <w:rFonts w:ascii="宋体" w:hAnsi="宋体" w:eastAsia="宋体"/>
+          <w:sz w:val="21"/>
+        </w:rPr>
+        <w:t>令 Δ=log(a/b)，g*=σ(Δ/Tr)，Tr&gt;0。</w:t>
+      </w:r>
+    </w:p>
+    <w:p>
+      <w:pPr>
+        <w:jc w:val="center"/>
+      </w:pPr>
+      <w:r>
+        <w:drawing>
+          <wp:inline xmlns:a="http://schemas.openxmlformats.org/drawingml/2006/main" xmlns:pic="http://schemas.openxmlformats.org/drawingml/2006/picture">
+            <wp:extent cx="5580000" cy="610903"/>
+            <wp:docPr id="40" name="Picture 40"/>
+            <wp:cNvGraphicFramePr>
+              <a:graphicFrameLocks noChangeAspect="1"/>
+            </wp:cNvGraphicFramePr>
+            <a:graphic>
+              <a:graphicData uri="http://schemas.openxmlformats.org/drawingml/2006/picture">
+                <pic:pic>
+                  <pic:nvPicPr>
+                    <pic:cNvPr id="0" name="rsg_proof_soft.png"/>
+                    <pic:cNvPicPr/>
+                  </pic:nvPicPr>
+                  <pic:blipFill>
+                    <a:blip r:embed="rId51"/>
+                    <a:stretch>
+                      <a:fillRect/>
+                    </a:stretch>
+                  </pic:blipFill>
+                  <pic:spPr>
+                    <a:xfrm>
+                      <a:off x="0" y="0"/>
+                      <a:ext cx="5580000" cy="610903"/>
+                    </a:xfrm>
+                    <a:prstGeom prst="rect"/>
+                  </pic:spPr>
+                </pic:pic>
+              </a:graphicData>
+            </a:graphic>
+          </wp:inline>
+        </w:drawing>
+      </w:r>
+    </w:p>
+    <w:p>
+      <w:pPr>
+        <w:spacing w:line="360" w:lineRule="auto"/>
+      </w:pPr>
+      <w:r>
+        <w:rPr>
+          <w:rFonts w:ascii="宋体" w:hAnsi="宋体" w:eastAsia="宋体"/>
+          <w:sz w:val="21"/>
+        </w:rPr>
+        <w:t>式（B-2） 软目标对硬最优门控的指数逼近</w:t>
+      </w:r>
+    </w:p>
+    <w:p>
+      <w:pPr>
+        <w:spacing w:line="360" w:lineRule="auto"/>
+      </w:pPr>
+      <w:r>
+        <w:rPr>
+          <w:rFonts w:ascii="宋体" w:hAnsi="宋体" w:eastAsia="宋体"/>
+          <w:sz w:val="21"/>
+        </w:rPr>
+        <w:t>证明：Δ&gt;0 时，go=1，且1−σ(Δ/Tr)=1/(1+exp(Δ/Tr))≤exp(−Δ/Tr)。Δ&lt;0 时，go=0，且σ(Δ/Tr)=1/(1+exp(|Δ|/Tr))≤exp(−|Δ|/Tr)。证毕。该结论说明专家优劣明确时软目标接近硬选择，而专家接近时保留连续不确定性。</w:t>
+      </w:r>
+    </w:p>
+    <w:p>
+      <w:pPr>
+        <w:pStyle w:val="21"/>
+      </w:pPr>
+      <w:r>
+        <w:t>B.3 后悔监督分支的局部梯度隔离</w:t>
+      </w:r>
+    </w:p>
+    <w:p>
+      <w:pPr>
+        <w:spacing w:line="360" w:lineRule="auto"/>
+      </w:pPr>
+      <w:r>
+        <w:rPr>
+          <w:rFonts w:ascii="宋体" w:hAnsi="宋体" w:eastAsia="宋体"/>
+          <w:sz w:val="21"/>
+        </w:rPr>
+        <w:t>当前实现中，门控输入 z=[h,Hbar(pd),Hbar(pm),DJS(pd||pm)]、软目标 g* 与权重 w 都在后悔分支使用 stopgrad；门控为 g=σ(fφ(stopgrad(z)))，后悔损失为 Lreg=w BCE(g,g*)。</w:t>
+      </w:r>
+    </w:p>
+    <w:p>
+      <w:pPr>
+        <w:jc w:val="center"/>
+      </w:pPr>
+      <w:r>
+        <w:drawing>
+          <wp:inline xmlns:a="http://schemas.openxmlformats.org/drawingml/2006/main" xmlns:pic="http://schemas.openxmlformats.org/drawingml/2006/picture">
+            <wp:extent cx="5580000" cy="701886"/>
+            <wp:docPr id="41" name="Picture 41"/>
+            <wp:cNvGraphicFramePr>
+              <a:graphicFrameLocks noChangeAspect="1"/>
+            </wp:cNvGraphicFramePr>
+            <a:graphic>
+              <a:graphicData uri="http://schemas.openxmlformats.org/drawingml/2006/picture">
+                <pic:pic>
+                  <pic:nvPicPr>
+                    <pic:cNvPr id="0" name="rsg_proof_gradient.png"/>
+                    <pic:cNvPicPr/>
+                  </pic:nvPicPr>
+                  <pic:blipFill>
+                    <a:blip r:embed="rId52"/>
+                    <a:stretch>
+                      <a:fillRect/>
+                    </a:stretch>
+                  </pic:blipFill>
+                  <pic:spPr>
+                    <a:xfrm>
+                      <a:off x="0" y="0"/>
+                      <a:ext cx="5580000" cy="701886"/>
+                    </a:xfrm>
+                    <a:prstGeom prst="rect"/>
+                  </pic:spPr>
+                </pic:pic>
+              </a:graphicData>
+            </a:graphic>
+          </wp:inline>
+        </w:drawing>
+      </w:r>
+    </w:p>
+    <w:p>
+      <w:pPr>
+        <w:spacing w:line="360" w:lineRule="auto"/>
+      </w:pPr>
+      <w:r>
+        <w:rPr>
+          <w:rFonts w:ascii="宋体" w:hAnsi="宋体" w:eastAsia="宋体"/>
+          <w:sz w:val="21"/>
+        </w:rPr>
+        <w:t>式（B-3） RSG 后悔分支的局部梯度隔离</w:t>
+      </w:r>
+    </w:p>
+    <w:p>
+      <w:pPr>
+        <w:spacing w:line="360" w:lineRule="auto"/>
+      </w:pPr>
+      <w:r>
+        <w:rPr>
+          <w:rFonts w:ascii="宋体" w:hAnsi="宋体" w:eastAsia="宋体"/>
+          <w:sz w:val="21"/>
+        </w:rPr>
+        <w:t>证明：对产生 h、pd 与 pm 的任意共享主干或专家参数 θe，stopgrad 使 ∂z/∂θe、∂g*/∂θe 与∂w/∂θe 在 Lreg 分支均为0。链式法则遂使 ∂Lreg/∂θe=0。只要 0&lt;g&lt;1、w&gt;0 且g≠g*，二元交叉熵关于g的导数非零，故门控参数 φ 仍可更新。证毕。</w:t>
+      </w:r>
+    </w:p>
+    <w:p>
+      <w:pPr>
+        <w:spacing w:line="360" w:lineRule="auto"/>
+      </w:pPr>
+      <w:r>
+        <w:rPr>
+          <w:rFonts w:ascii="宋体" w:hAnsi="宋体" w:eastAsia="宋体"/>
+          <w:sz w:val="21"/>
+        </w:rPr>
+        <w:t>重要边界：式（B-3）只针对 Lreg 分支。角色、种类、一致性、验证器和对比损失仍依原计算图更新共享主干；因此局部梯度隔离不是“停止训练主干”。</w:t>
+      </w:r>
+    </w:p>
+    <w:p>
+      <w:pPr>
+        <w:pStyle w:val="21"/>
+      </w:pPr>
+      <w:r>
+        <w:t>B.4 证伪性与实验对应</w:t>
+      </w:r>
+    </w:p>
+    <w:p>
+      <w:pPr>
+        <w:spacing w:line="360" w:lineRule="auto"/>
+      </w:pPr>
+      <w:r>
+        <w:rPr>
+          <w:rFonts w:ascii="宋体" w:hAnsi="宋体" w:eastAsia="宋体"/>
+          <w:sz w:val="21"/>
+        </w:rPr>
+        <w:t>定理 B.1 对应平均路由后悔，定理 B.2 对应软/硬目标与一对一错路由选择率，定理 B.3 对应取消局部隔离的受控消融。固定测试划分中，RSG−HRGV 的平均路由后悔为−1.77个百分点，95%簇 Bootstrap 区间[−2.86, −0.69]；摄影者留出独立确认中为−3.53个百分点，区间[−4.75, −2.17]。这些结果支持已定义的路由机制，但不将理论性质扩大为工业分选、品位预测或整体分类精度的普适保证。</w:t>
       </w:r>
     </w:p>
     <w:sectPr>

</xml_diff>

<commit_message>
exp: add formal RSG theory ablations
</commit_message>
<xml_diff>
--- a/结题/基于深度学习的钒钛矿相关矿物图像识别方法研究_技术报告（正式版）.docx
+++ b/结题/基于深度学习的钒钛矿相关矿物图像识别方法研究_技术报告（正式版）.docx
@@ -30545,6 +30545,662 @@
           <w:sz w:val="21"/>
         </w:rPr>
         <w:t>定理 B.1 对应平均路由后悔，定理 B.2 对应软/硬目标与一对一错路由选择率，定理 B.3 对应取消局部隔离的受控消融。固定测试划分中，RSG−HRGV 的平均路由后悔为−1.77个百分点，95%簇 Bootstrap 区间[−2.86, −0.69]；摄影者留出独立确认中为−3.53个百分点，区间[−4.75, −2.17]。这些结果支持已定义的路由机制，但不将理论性质扩大为工业分选、品位预测或整体分类精度的普适保证。</w:t>
+      </w:r>
+    </w:p>
+    <w:p>
+      <w:pPr>
+        <w:pStyle w:val="1"/>
+      </w:pPr>
+      <w:r>
+        <w:t>附录 C RSG-HRGV 三随机种子理论消融</w:t>
+      </w:r>
+    </w:p>
+    <w:p>
+      <w:pPr>
+        <w:spacing w:line="360" w:lineRule="auto"/>
+      </w:pPr>
+      <w:r>
+        <w:rPr>
+          <w:rFonts w:ascii="宋体" w:hAnsi="宋体" w:eastAsia="宋体"/>
+          <w:sz w:val="21"/>
+        </w:rPr>
+        <w:t>本附录使用与完整 RSG 相同的三随机种子、固定数据划分、EfficientNet-B0 主干、验证器耦合方式和训练预算，只替换一个后悔门控部件。各配置按图片 split_group_id 聚类、按随机种子重采样的两阶段 Bootstrap（2,000 次）与完整 RSG 进行逐图成对比较。该消融用于检验已定义的机制边界，不用于声称一般分类精度或工业分选性能。</w:t>
+      </w:r>
+    </w:p>
+    <w:p>
+      <w:pPr>
+        <w:pStyle w:val="21"/>
+      </w:pPr>
+      <w:r>
+        <w:t>C.1 受控配置与指标</w:t>
+      </w:r>
+    </w:p>
+    <w:tbl>
+      <w:tblPr>
+        <w:tblStyle w:val="aff1"/>
+        <w:tblW w:type="auto" w:w="0"/>
+        <w:tblLook w:firstColumn="1" w:firstRow="1" w:lastColumn="0" w:lastRow="0" w:noHBand="0" w:noVBand="1" w:val="04A0"/>
+      </w:tblPr>
+      <w:tblGrid>
+        <w:gridCol w:w="3062"/>
+        <w:gridCol w:w="3062"/>
+        <w:gridCol w:w="3062"/>
+      </w:tblGrid>
+      <w:tr>
+        <w:tc>
+          <w:tcPr>
+            <w:tcW w:type="dxa" w:w="3062"/>
+          </w:tcPr>
+          <w:p>
+            <w:r>
+              <w:rPr>
+                <w:rFonts w:ascii="宋体" w:hAnsi="宋体" w:eastAsia="宋体"/>
+                <w:b/>
+                <w:sz w:val="17"/>
+              </w:rPr>
+              <w:t>配置</w:t>
+            </w:r>
+          </w:p>
+        </w:tc>
+        <w:tc>
+          <w:tcPr>
+            <w:tcW w:type="dxa" w:w="3062"/>
+          </w:tcPr>
+          <w:p>
+            <w:r>
+              <w:rPr>
+                <w:rFonts w:ascii="宋体" w:hAnsi="宋体" w:eastAsia="宋体"/>
+                <w:b/>
+                <w:sz w:val="17"/>
+              </w:rPr>
+              <w:t>仅改变的部件</w:t>
+            </w:r>
+          </w:p>
+        </w:tc>
+        <w:tc>
+          <w:tcPr>
+            <w:tcW w:type="dxa" w:w="3062"/>
+          </w:tcPr>
+          <w:p>
+            <w:r>
+              <w:rPr>
+                <w:rFonts w:ascii="宋体" w:hAnsi="宋体" w:eastAsia="宋体"/>
+                <w:b/>
+                <w:sz w:val="17"/>
+              </w:rPr>
+              <w:t>理论对应</w:t>
+            </w:r>
+          </w:p>
+        </w:tc>
+      </w:tr>
+      <w:tr>
+        <w:tc>
+          <w:tcPr>
+            <w:tcW w:type="dxa" w:w="3062"/>
+          </w:tcPr>
+          <w:p>
+            <w:r>
+              <w:rPr>
+                <w:rFonts w:ascii="宋体" w:hAnsi="宋体" w:eastAsia="宋体"/>
+                <w:sz w:val="17"/>
+              </w:rPr>
+              <w:t>完整 RSG</w:t>
+            </w:r>
+          </w:p>
+        </w:tc>
+        <w:tc>
+          <w:tcPr>
+            <w:tcW w:type="dxa" w:w="3062"/>
+          </w:tcPr>
+          <w:p>
+            <w:r>
+              <w:rPr>
+                <w:rFonts w:ascii="宋体" w:hAnsi="宋体" w:eastAsia="宋体"/>
+                <w:sz w:val="17"/>
+              </w:rPr>
+              <w:t>软目标 + 差距权重 + 后悔分支 stopgrad</w:t>
+            </w:r>
+          </w:p>
+        </w:tc>
+        <w:tc>
+          <w:tcPr>
+            <w:tcW w:type="dxa" w:w="3062"/>
+          </w:tcPr>
+          <w:p>
+            <w:r>
+              <w:rPr>
+                <w:rFonts w:ascii="宋体" w:hAnsi="宋体" w:eastAsia="宋体"/>
+                <w:sz w:val="17"/>
+              </w:rPr>
+              <w:t>完整方法</w:t>
+            </w:r>
+          </w:p>
+        </w:tc>
+      </w:tr>
+      <w:tr>
+        <w:tc>
+          <w:tcPr>
+            <w:tcW w:type="dxa" w:w="3062"/>
+          </w:tcPr>
+          <w:p>
+            <w:r>
+              <w:rPr>
+                <w:rFonts w:ascii="宋体" w:hAnsi="宋体" w:eastAsia="宋体"/>
+                <w:sz w:val="17"/>
+              </w:rPr>
+              <w:t>硬目标</w:t>
+            </w:r>
+          </w:p>
+        </w:tc>
+        <w:tc>
+          <w:tcPr>
+            <w:tcW w:type="dxa" w:w="3062"/>
+          </w:tcPr>
+          <w:p>
+            <w:r>
+              <w:rPr>
+                <w:rFonts w:ascii="宋体" w:hAnsi="宋体" w:eastAsia="宋体"/>
+                <w:sz w:val="17"/>
+              </w:rPr>
+              <w:t>将 g*=sigmoid(Delta/Tr) 改为 I(Delta&gt;=0)</w:t>
+            </w:r>
+          </w:p>
+        </w:tc>
+        <w:tc>
+          <w:tcPr>
+            <w:tcW w:type="dxa" w:w="3062"/>
+          </w:tcPr>
+          <w:p>
+            <w:r>
+              <w:rPr>
+                <w:rFonts w:ascii="宋体" w:hAnsi="宋体" w:eastAsia="宋体"/>
+                <w:sz w:val="17"/>
+              </w:rPr>
+              <w:t>式(B-2)的连续软目标</w:t>
+            </w:r>
+          </w:p>
+        </w:tc>
+      </w:tr>
+      <w:tr>
+        <w:tc>
+          <w:tcPr>
+            <w:tcW w:type="dxa" w:w="3062"/>
+          </w:tcPr>
+          <w:p>
+            <w:r>
+              <w:rPr>
+                <w:rFonts w:ascii="宋体" w:hAnsi="宋体" w:eastAsia="宋体"/>
+                <w:sz w:val="17"/>
+              </w:rPr>
+              <w:t>取消置信度加权</w:t>
+            </w:r>
+          </w:p>
+        </w:tc>
+        <w:tc>
+          <w:tcPr>
+            <w:tcW w:type="dxa" w:w="3062"/>
+          </w:tcPr>
+          <w:p>
+            <w:r>
+              <w:rPr>
+                <w:rFonts w:ascii="宋体" w:hAnsi="宋体" w:eastAsia="宋体"/>
+                <w:sz w:val="17"/>
+              </w:rPr>
+              <w:t>将 w=tanh(|Delta|/Tw) 改为 w=1</w:t>
+            </w:r>
+          </w:p>
+        </w:tc>
+        <w:tc>
+          <w:tcPr>
+            <w:tcW w:type="dxa" w:w="3062"/>
+          </w:tcPr>
+          <w:p>
+            <w:r>
+              <w:rPr>
+                <w:rFonts w:ascii="宋体" w:hAnsi="宋体" w:eastAsia="宋体"/>
+                <w:sz w:val="17"/>
+              </w:rPr>
+              <w:t>式(B-1)的差距风险代理</w:t>
+            </w:r>
+          </w:p>
+        </w:tc>
+      </w:tr>
+      <w:tr>
+        <w:tc>
+          <w:tcPr>
+            <w:tcW w:type="dxa" w:w="3062"/>
+          </w:tcPr>
+          <w:p>
+            <w:r>
+              <w:rPr>
+                <w:rFonts w:ascii="宋体" w:hAnsi="宋体" w:eastAsia="宋体"/>
+                <w:sz w:val="17"/>
+              </w:rPr>
+              <w:t>取消局部梯度隔离</w:t>
+            </w:r>
+          </w:p>
+        </w:tc>
+        <w:tc>
+          <w:tcPr>
+            <w:tcW w:type="dxa" w:w="3062"/>
+          </w:tcPr>
+          <w:p>
+            <w:r>
+              <w:rPr>
+                <w:rFonts w:ascii="宋体" w:hAnsi="宋体" w:eastAsia="宋体"/>
+                <w:sz w:val="17"/>
+              </w:rPr>
+              <w:t>允许 Lreg 经门控输入回传至主干/专家</w:t>
+            </w:r>
+          </w:p>
+        </w:tc>
+        <w:tc>
+          <w:tcPr>
+            <w:tcW w:type="dxa" w:w="3062"/>
+          </w:tcPr>
+          <w:p>
+            <w:r>
+              <w:rPr>
+                <w:rFonts w:ascii="宋体" w:hAnsi="宋体" w:eastAsia="宋体"/>
+                <w:sz w:val="17"/>
+              </w:rPr>
+              <w:t>式(B-3)的局部梯度边界</w:t>
+            </w:r>
+          </w:p>
+        </w:tc>
+      </w:tr>
+    </w:tbl>
+    <w:p/>
+    <w:p>
+      <w:pPr>
+        <w:spacing w:line="360" w:lineRule="auto"/>
+      </w:pPr>
+      <w:r>
+        <w:rPr>
+          <w:rFonts w:ascii="宋体" w:hAnsi="宋体" w:eastAsia="宋体"/>
+          <w:sz w:val="21"/>
+        </w:rPr>
+        <w:t>主要机制指标为平均路由后悔（越低越好）和一对一错样本的门控选择正确率（越高越好）；同时报告 Accuracy、Macro F1、目标类召回率及两类误入率，以检查路由改善是否伴随不可接受的主任务风险。</w:t>
+      </w:r>
+    </w:p>
+    <w:p>
+      <w:pPr>
+        <w:pStyle w:val="21"/>
+      </w:pPr>
+      <w:r>
+        <w:t>C.2 三随机种子汇总</w:t>
+      </w:r>
+    </w:p>
+    <w:tbl>
+      <w:tblPr>
+        <w:tblStyle w:val="aff1"/>
+        <w:tblW w:type="auto" w:w="0"/>
+        <w:tblLook w:firstColumn="1" w:firstRow="1" w:lastColumn="0" w:lastRow="0" w:noHBand="0" w:noVBand="1" w:val="04A0"/>
+      </w:tblPr>
+      <w:tblGrid>
+        <w:gridCol w:w="2296"/>
+        <w:gridCol w:w="2296"/>
+        <w:gridCol w:w="2296"/>
+        <w:gridCol w:w="2296"/>
+      </w:tblGrid>
+      <w:tr>
+        <w:tc>
+          <w:tcPr>
+            <w:tcW w:type="dxa" w:w="2296"/>
+          </w:tcPr>
+          <w:p>
+            <w:r>
+              <w:rPr>
+                <w:rFonts w:ascii="宋体" w:hAnsi="宋体" w:eastAsia="宋体"/>
+                <w:b/>
+                <w:sz w:val="17"/>
+              </w:rPr>
+              <w:t>配置</w:t>
+            </w:r>
+          </w:p>
+        </w:tc>
+        <w:tc>
+          <w:tcPr>
+            <w:tcW w:type="dxa" w:w="2296"/>
+          </w:tcPr>
+          <w:p>
+            <w:r>
+              <w:rPr>
+                <w:rFonts w:ascii="宋体" w:hAnsi="宋体" w:eastAsia="宋体"/>
+                <w:b/>
+                <w:sz w:val="17"/>
+              </w:rPr>
+              <w:t>Macro F1</w:t>
+            </w:r>
+          </w:p>
+        </w:tc>
+        <w:tc>
+          <w:tcPr>
+            <w:tcW w:type="dxa" w:w="2296"/>
+          </w:tcPr>
+          <w:p>
+            <w:r>
+              <w:rPr>
+                <w:rFonts w:ascii="宋体" w:hAnsi="宋体" w:eastAsia="宋体"/>
+                <w:b/>
+                <w:sz w:val="17"/>
+              </w:rPr>
+              <w:t>门控选择正确率</w:t>
+            </w:r>
+          </w:p>
+        </w:tc>
+        <w:tc>
+          <w:tcPr>
+            <w:tcW w:type="dxa" w:w="2296"/>
+          </w:tcPr>
+          <w:p>
+            <w:r>
+              <w:rPr>
+                <w:rFonts w:ascii="宋体" w:hAnsi="宋体" w:eastAsia="宋体"/>
+                <w:b/>
+                <w:sz w:val="17"/>
+              </w:rPr>
+              <w:t>平均路由后悔</w:t>
+            </w:r>
+          </w:p>
+        </w:tc>
+      </w:tr>
+      <w:tr>
+        <w:tc>
+          <w:tcPr>
+            <w:tcW w:type="dxa" w:w="2296"/>
+          </w:tcPr>
+          <w:p>
+            <w:r>
+              <w:rPr>
+                <w:rFonts w:ascii="宋体" w:hAnsi="宋体" w:eastAsia="宋体"/>
+                <w:sz w:val="17"/>
+              </w:rPr>
+              <w:t>完整 RSG</w:t>
+            </w:r>
+          </w:p>
+        </w:tc>
+        <w:tc>
+          <w:tcPr>
+            <w:tcW w:type="dxa" w:w="2296"/>
+          </w:tcPr>
+          <w:p>
+            <w:r>
+              <w:rPr>
+                <w:rFonts w:ascii="宋体" w:hAnsi="宋体" w:eastAsia="宋体"/>
+                <w:sz w:val="17"/>
+              </w:rPr>
+              <w:t>74.76% +/- 0.90%</w:t>
+            </w:r>
+          </w:p>
+        </w:tc>
+        <w:tc>
+          <w:tcPr>
+            <w:tcW w:type="dxa" w:w="2296"/>
+          </w:tcPr>
+          <w:p>
+            <w:r>
+              <w:rPr>
+                <w:rFonts w:ascii="宋体" w:hAnsi="宋体" w:eastAsia="宋体"/>
+                <w:sz w:val="17"/>
+              </w:rPr>
+              <w:t>58.01% +/- 1.76%</w:t>
+            </w:r>
+          </w:p>
+        </w:tc>
+        <w:tc>
+          <w:tcPr>
+            <w:tcW w:type="dxa" w:w="2296"/>
+          </w:tcPr>
+          <w:p>
+            <w:r>
+              <w:rPr>
+                <w:rFonts w:ascii="宋体" w:hAnsi="宋体" w:eastAsia="宋体"/>
+                <w:sz w:val="17"/>
+              </w:rPr>
+              <w:t>8.09% +/- 0.17%</w:t>
+            </w:r>
+          </w:p>
+        </w:tc>
+      </w:tr>
+      <w:tr>
+        <w:tc>
+          <w:tcPr>
+            <w:tcW w:type="dxa" w:w="2296"/>
+          </w:tcPr>
+          <w:p>
+            <w:r>
+              <w:rPr>
+                <w:rFonts w:ascii="宋体" w:hAnsi="宋体" w:eastAsia="宋体"/>
+                <w:sz w:val="17"/>
+              </w:rPr>
+              <w:t>硬目标</w:t>
+            </w:r>
+          </w:p>
+        </w:tc>
+        <w:tc>
+          <w:tcPr>
+            <w:tcW w:type="dxa" w:w="2296"/>
+          </w:tcPr>
+          <w:p>
+            <w:r>
+              <w:rPr>
+                <w:rFonts w:ascii="宋体" w:hAnsi="宋体" w:eastAsia="宋体"/>
+                <w:sz w:val="17"/>
+              </w:rPr>
+              <w:t>74.56% +/- 0.40%</w:t>
+            </w:r>
+          </w:p>
+        </w:tc>
+        <w:tc>
+          <w:tcPr>
+            <w:tcW w:type="dxa" w:w="2296"/>
+          </w:tcPr>
+          <w:p>
+            <w:r>
+              <w:rPr>
+                <w:rFonts w:ascii="宋体" w:hAnsi="宋体" w:eastAsia="宋体"/>
+                <w:sz w:val="17"/>
+              </w:rPr>
+              <w:t>53.24% +/- 4.44%</w:t>
+            </w:r>
+          </w:p>
+        </w:tc>
+        <w:tc>
+          <w:tcPr>
+            <w:tcW w:type="dxa" w:w="2296"/>
+          </w:tcPr>
+          <w:p>
+            <w:r>
+              <w:rPr>
+                <w:rFonts w:ascii="宋体" w:hAnsi="宋体" w:eastAsia="宋体"/>
+                <w:sz w:val="17"/>
+              </w:rPr>
+              <w:t>10.02% +/- 0.65%</w:t>
+            </w:r>
+          </w:p>
+        </w:tc>
+      </w:tr>
+      <w:tr>
+        <w:tc>
+          <w:tcPr>
+            <w:tcW w:type="dxa" w:w="2296"/>
+          </w:tcPr>
+          <w:p>
+            <w:r>
+              <w:rPr>
+                <w:rFonts w:ascii="宋体" w:hAnsi="宋体" w:eastAsia="宋体"/>
+                <w:sz w:val="17"/>
+              </w:rPr>
+              <w:t>取消置信度加权</w:t>
+            </w:r>
+          </w:p>
+        </w:tc>
+        <w:tc>
+          <w:tcPr>
+            <w:tcW w:type="dxa" w:w="2296"/>
+          </w:tcPr>
+          <w:p>
+            <w:r>
+              <w:rPr>
+                <w:rFonts w:ascii="宋体" w:hAnsi="宋体" w:eastAsia="宋体"/>
+                <w:sz w:val="17"/>
+              </w:rPr>
+              <w:t>73.77% +/- 1.23%</w:t>
+            </w:r>
+          </w:p>
+        </w:tc>
+        <w:tc>
+          <w:tcPr>
+            <w:tcW w:type="dxa" w:w="2296"/>
+          </w:tcPr>
+          <w:p>
+            <w:r>
+              <w:rPr>
+                <w:rFonts w:ascii="宋体" w:hAnsi="宋体" w:eastAsia="宋体"/>
+                <w:sz w:val="17"/>
+              </w:rPr>
+              <w:t>58.21% +/- 4.78%</w:t>
+            </w:r>
+          </w:p>
+        </w:tc>
+        <w:tc>
+          <w:tcPr>
+            <w:tcW w:type="dxa" w:w="2296"/>
+          </w:tcPr>
+          <w:p>
+            <w:r>
+              <w:rPr>
+                <w:rFonts w:ascii="宋体" w:hAnsi="宋体" w:eastAsia="宋体"/>
+                <w:sz w:val="17"/>
+              </w:rPr>
+              <w:t>7.88% +/- 0.45%</w:t>
+            </w:r>
+          </w:p>
+        </w:tc>
+      </w:tr>
+      <w:tr>
+        <w:tc>
+          <w:tcPr>
+            <w:tcW w:type="dxa" w:w="2296"/>
+          </w:tcPr>
+          <w:p>
+            <w:r>
+              <w:rPr>
+                <w:rFonts w:ascii="宋体" w:hAnsi="宋体" w:eastAsia="宋体"/>
+                <w:sz w:val="17"/>
+              </w:rPr>
+              <w:t>取消局部梯度隔离</w:t>
+            </w:r>
+          </w:p>
+        </w:tc>
+        <w:tc>
+          <w:tcPr>
+            <w:tcW w:type="dxa" w:w="2296"/>
+          </w:tcPr>
+          <w:p>
+            <w:r>
+              <w:rPr>
+                <w:rFonts w:ascii="宋体" w:hAnsi="宋体" w:eastAsia="宋体"/>
+                <w:sz w:val="17"/>
+              </w:rPr>
+              <w:t>73.17% +/- 1.35%</w:t>
+            </w:r>
+          </w:p>
+        </w:tc>
+        <w:tc>
+          <w:tcPr>
+            <w:tcW w:type="dxa" w:w="2296"/>
+          </w:tcPr>
+          <w:p>
+            <w:r>
+              <w:rPr>
+                <w:rFonts w:ascii="宋体" w:hAnsi="宋体" w:eastAsia="宋体"/>
+                <w:sz w:val="17"/>
+              </w:rPr>
+              <w:t>51.64% +/- 8.83%</w:t>
+            </w:r>
+          </w:p>
+        </w:tc>
+        <w:tc>
+          <w:tcPr>
+            <w:tcW w:type="dxa" w:w="2296"/>
+          </w:tcPr>
+          <w:p>
+            <w:r>
+              <w:rPr>
+                <w:rFonts w:ascii="宋体" w:hAnsi="宋体" w:eastAsia="宋体"/>
+                <w:sz w:val="17"/>
+              </w:rPr>
+              <w:t>7.57% +/- 0.21%</w:t>
+            </w:r>
+          </w:p>
+        </w:tc>
+      </w:tr>
+    </w:tbl>
+    <w:p/>
+    <w:p>
+      <w:pPr>
+        <w:pStyle w:val="21"/>
+      </w:pPr>
+      <w:r>
+        <w:t>C.3 机制检验与可支持的结论</w:t>
+      </w:r>
+    </w:p>
+    <w:p>
+      <w:pPr>
+        <w:spacing w:line="360" w:lineRule="auto"/>
+      </w:pPr>
+      <w:r>
+        <w:rPr>
+          <w:rFonts w:ascii="宋体" w:hAnsi="宋体" w:eastAsia="宋体"/>
+          <w:sz w:val="21"/>
+        </w:rPr>
+        <w:t>（1）软目标：相对完整 RSG，硬目标的平均路由后悔增加1.94%，95% Bootstrap 区间为[1.30%, 2.60%]，有利于硬目标的重采样概率为0.000。该区间不跨零，说明在当前固定公开标本数据上，连续软目标优于将近似等价专家强制二值化；这与式(B-2)的动机一致。</w:t>
+      </w:r>
+    </w:p>
+    <w:p>
+      <w:pPr>
+        <w:spacing w:line="360" w:lineRule="auto"/>
+      </w:pPr>
+      <w:r>
+        <w:rPr>
+          <w:rFonts w:ascii="宋体" w:hAnsi="宋体" w:eastAsia="宋体"/>
+          <w:sz w:val="21"/>
+        </w:rPr>
+        <w:t>（2）置信度加权：取消加权相对完整 RSG 的平均路由后悔差异为-0.20%，区间为[-0.62%, 0.12%]，跨越零。因此，w=tanh(|Delta|/Tw) 可作为由式(B-1)风险上界导出的有界设计，但本次三随机种子实验尚不能证明它在该数据集上带来稳定的额外性能增益；报告保留该负结果，不把它表述为已验证的普适优势。</w:t>
+      </w:r>
+    </w:p>
+    <w:p>
+      <w:pPr>
+        <w:spacing w:line="360" w:lineRule="auto"/>
+      </w:pPr>
+      <w:r>
+        <w:rPr>
+          <w:rFonts w:ascii="宋体" w:hAnsi="宋体" w:eastAsia="宋体"/>
+          <w:sz w:val="21"/>
+        </w:rPr>
+        <w:t>（3）局部梯度隔离：取消隔离后平均路由后悔变化为-0.51%，区间为[-0.85%, -0.16%]；Macro F1 变化为-1.58%，区间为[-4.10%, 0.36%]。前者下降而后者呈下降趋势，表明让后悔监督直接改写专家证据可能以主任务稳定性为代价交换路由指标。式(B-3)是计算图的严格局部梯度结论；本实验只将其作为模块化优化边界的经验权衡，不声称隔离必然提高所有分类指标。</w:t>
+      </w:r>
+    </w:p>
+    <w:p>
+      <w:pPr>
+        <w:pStyle w:val="21"/>
+      </w:pPr>
+      <w:r>
+        <w:t>C.4 结论边界</w:t>
+      </w:r>
+    </w:p>
+    <w:p>
+      <w:pPr>
+        <w:spacing w:line="360" w:lineRule="auto"/>
+      </w:pPr>
+      <w:r>
+        <w:rPr>
+          <w:rFonts w:ascii="宋体" w:hAnsi="宋体" w:eastAsia="宋体"/>
+          <w:sz w:val="21"/>
+        </w:rPr>
+        <w:t>本组结果支持的最强结论是：在当前固定公开标本图像数据与冻结训练协议下，RSG 的软门控目标可稳定降低已定义的路由后悔；后悔分支的差距加权和梯度隔离分别体现为风险建模与优化边界，但其单独的性能贡献存在数据依赖性。该结论不等同于矿物品位预测、真实产线回收率提升或未知矿物拒识能力。</w:t>
       </w:r>
     </w:p>
     <w:sectPr>

</xml_diff>

<commit_message>
docs: add CGDC formal evidence to report
</commit_message>
<xml_diff>
--- a/结题/基于深度学习的钒钛矿相关矿物图像识别方法研究_技术报告（正式版）.docx
+++ b/结题/基于深度学习的钒钛矿相关矿物图像识别方法研究_技术报告（正式版）.docx
@@ -31201,6 +31201,1375 @@
           <w:sz w:val="21"/>
         </w:rPr>
         <w:t>本组结果支持的最强结论是：在当前固定公开标本图像数据与冻结训练协议下，RSG 的软门控目标可稳定降低已定义的路由后悔；后悔分支的差距加权和梯度隔离分别体现为风险建模与优化边界，但其单独的性能贡献存在数据依赖性。该结论不等同于矿物品位预测、真实产线回收率提升或未知矿物拒识能力。</w:t>
+      </w:r>
+    </w:p>
+    <w:p>
+      <w:pPr>
+        <w:pStyle w:val="1"/>
+      </w:pPr>
+      <w:r>
+        <w:t>附录 D CGDC-RSG-HRGV 网络理论与实验</w:t>
+      </w:r>
+    </w:p>
+    <w:p>
+      <w:pPr>
+        <w:pStyle w:val="21"/>
+      </w:pPr>
+      <w:r>
+        <w:t>D.1 网络结构与理论定位</w:t>
+      </w:r>
+    </w:p>
+    <w:p>
+      <w:pPr>
+        <w:spacing w:line="360" w:lineRule="auto"/>
+      </w:pPr>
+      <w:r>
+        <w:rPr>
+          <w:rFonts w:ascii="宋体" w:hAnsi="宋体" w:eastAsia="宋体"/>
+          <w:sz w:val="21"/>
+        </w:rPr>
+        <w:t>CGDC-RSG-HRGV-Net 以 EfficientNet-B0 为共享视觉主干，将共享特征 h 通过直接角色残差适配器和矿物种类残差适配器分解为 u_d=h+A_d(h) 与 u_s=h+A_s(h)。直接角色专家给出 p_d，种类专家经固定种类-角色映射聚合为 p_m；既有 RSG 门控给出融合后验 p_f=g p_d+(1-g)p_m。仅在两路证据不一致时，CGDC 校正器再执行受界后验修正。</w:t>
+      </w:r>
+    </w:p>
+    <w:p>
+      <w:pPr>
+        <w:jc w:val="center"/>
+      </w:pPr>
+      <w:r>
+        <w:drawing>
+          <wp:inline xmlns:a="http://schemas.openxmlformats.org/drawingml/2006/main" xmlns:pic="http://schemas.openxmlformats.org/drawingml/2006/picture">
+            <wp:extent cx="5508000" cy="370116"/>
+            <wp:docPr id="42" name="Picture 42"/>
+            <wp:cNvGraphicFramePr>
+              <a:graphicFrameLocks noChangeAspect="1"/>
+            </wp:cNvGraphicFramePr>
+            <a:graphic>
+              <a:graphicData uri="http://schemas.openxmlformats.org/drawingml/2006/picture">
+                <pic:pic>
+                  <pic:nvPicPr>
+                    <pic:cNvPr id="0" name="cgdc_decomposition.png"/>
+                    <pic:cNvPicPr/>
+                  </pic:nvPicPr>
+                  <pic:blipFill>
+                    <a:blip r:embed="rId53"/>
+                    <a:stretch>
+                      <a:fillRect/>
+                    </a:stretch>
+                  </pic:blipFill>
+                  <pic:spPr>
+                    <a:xfrm>
+                      <a:off x="0" y="0"/>
+                      <a:ext cx="5508000" cy="370116"/>
+                    </a:xfrm>
+                    <a:prstGeom prst="rect"/>
+                  </pic:spPr>
+                </pic:pic>
+              </a:graphicData>
+            </a:graphic>
+          </wp:inline>
+        </w:drawing>
+      </w:r>
+    </w:p>
+    <w:p>
+      <w:pPr>
+        <w:spacing w:line="360" w:lineRule="auto"/>
+      </w:pPr>
+      <w:r>
+        <w:rPr>
+          <w:rFonts w:ascii="宋体" w:hAnsi="宋体" w:eastAsia="宋体"/>
+          <w:sz w:val="21"/>
+        </w:rPr>
+        <w:t>式（D-1） 跨粒度残差证据分解与适配器去相关约束</w:t>
+      </w:r>
+    </w:p>
+    <w:p>
+      <w:pPr>
+        <w:spacing w:line="360" w:lineRule="auto"/>
+      </w:pPr>
+      <w:r>
+        <w:rPr>
+          <w:rFonts w:ascii="宋体" w:hAnsi="宋体" w:eastAsia="宋体"/>
+          <w:sz w:val="21"/>
+        </w:rPr>
+        <w:t>令 rho=1-exp[-D_JS(p_d||p_m)]，s=tanh(MLP[z_c])，其中 z_c 包含两路分解特征、逐元素乘积、绝对差、对数后验差、熵与 JS 分歧。最终校正后验为 p_c=softmax(log p_f+rho s)，总损失为 L_CGDC=L_HRGV+lambda_dec L_dec+lambda_cal L_cal，其中 L_dec=mean cos^2(A_d(h),A_s(h))，L_cal=-mean log p_c(y)。</w:t>
+      </w:r>
+    </w:p>
+    <w:p>
+      <w:pPr>
+        <w:jc w:val="center"/>
+      </w:pPr>
+      <w:r>
+        <w:drawing>
+          <wp:inline xmlns:a="http://schemas.openxmlformats.org/drawingml/2006/main" xmlns:pic="http://schemas.openxmlformats.org/drawingml/2006/picture">
+            <wp:extent cx="5508000" cy="351361"/>
+            <wp:docPr id="43" name="Picture 43"/>
+            <wp:cNvGraphicFramePr>
+              <a:graphicFrameLocks noChangeAspect="1"/>
+            </wp:cNvGraphicFramePr>
+            <a:graphic>
+              <a:graphicData uri="http://schemas.openxmlformats.org/drawingml/2006/picture">
+                <pic:pic>
+                  <pic:nvPicPr>
+                    <pic:cNvPr id="0" name="cgdc_calibration.png"/>
+                    <pic:cNvPicPr/>
+                  </pic:nvPicPr>
+                  <pic:blipFill>
+                    <a:blip r:embed="rId54"/>
+                    <a:stretch>
+                      <a:fillRect/>
+                    </a:stretch>
+                  </pic:blipFill>
+                  <pic:spPr>
+                    <a:xfrm>
+                      <a:off x="0" y="0"/>
+                      <a:ext cx="5508000" cy="351361"/>
+                    </a:xfrm>
+                    <a:prstGeom prst="rect"/>
+                  </pic:spPr>
+                </pic:pic>
+              </a:graphicData>
+            </a:graphic>
+          </wp:inline>
+        </w:drawing>
+      </w:r>
+    </w:p>
+    <w:p>
+      <w:pPr>
+        <w:spacing w:line="360" w:lineRule="auto"/>
+      </w:pPr>
+      <w:r>
+        <w:rPr>
+          <w:rFonts w:ascii="宋体" w:hAnsi="宋体" w:eastAsia="宋体"/>
+          <w:sz w:val="21"/>
+        </w:rPr>
+        <w:t>式（D-2） 分歧触发的受界后验校正</w:t>
+      </w:r>
+    </w:p>
+    <w:p>
+      <w:pPr>
+        <w:spacing w:line="360" w:lineRule="auto"/>
+      </w:pPr>
+      <w:r>
+        <w:rPr>
+          <w:rFonts w:ascii="宋体" w:hAnsi="宋体" w:eastAsia="宋体"/>
+          <w:sz w:val="21"/>
+        </w:rPr>
+        <w:t>命题 P1（协议一致性）：当 p_d=p_m 时 rho=0，故 p_c=p_f=p_d=p_m。命题 P2（概率有效性）：p_c 为 softmax 输出，非负且四类概率和为 1。命题 P3（有界对数几率修正）：因每个校正残差满足 |s_j|&lt;1，任意类别 j、k 有 |log[p_c(j)/p_c(k)]-log[p_f(j)/p_f(k)]|&lt;2rho。命题 P4（全局校正预算）：对任意两路四类后验，D_JS 不超过 ln2，故 rho=1-exp[-D_JS]≤0.5，结合 P3 可得任意对数几率修正严格小于 1。P1-P4 是当前公式与计算图的确定性性质；适配器分解和校正器是否改善分类或校准，必须由以下三随机种子实验检验。</w:t>
+      </w:r>
+    </w:p>
+    <w:p>
+      <w:pPr>
+        <w:jc w:val="center"/>
+      </w:pPr>
+      <w:r>
+        <w:drawing>
+          <wp:inline xmlns:a="http://schemas.openxmlformats.org/drawingml/2006/main" xmlns:pic="http://schemas.openxmlformats.org/drawingml/2006/picture">
+            <wp:extent cx="5508000" cy="477572"/>
+            <wp:docPr id="44" name="Picture 44"/>
+            <wp:cNvGraphicFramePr>
+              <a:graphicFrameLocks noChangeAspect="1"/>
+            </wp:cNvGraphicFramePr>
+            <a:graphic>
+              <a:graphicData uri="http://schemas.openxmlformats.org/drawingml/2006/picture">
+                <pic:pic>
+                  <pic:nvPicPr>
+                    <pic:cNvPr id="0" name="cgdc_bound.png"/>
+                    <pic:cNvPicPr/>
+                  </pic:nvPicPr>
+                  <pic:blipFill>
+                    <a:blip r:embed="rId55"/>
+                    <a:stretch>
+                      <a:fillRect/>
+                    </a:stretch>
+                  </pic:blipFill>
+                  <pic:spPr>
+                    <a:xfrm>
+                      <a:off x="0" y="0"/>
+                      <a:ext cx="5508000" cy="477572"/>
+                    </a:xfrm>
+                    <a:prstGeom prst="rect"/>
+                  </pic:spPr>
+                </pic:pic>
+              </a:graphicData>
+            </a:graphic>
+          </wp:inline>
+        </w:drawing>
+      </w:r>
+    </w:p>
+    <w:p>
+      <w:pPr>
+        <w:spacing w:line="360" w:lineRule="auto"/>
+      </w:pPr>
+      <w:r>
+        <w:rPr>
+          <w:rFonts w:ascii="宋体" w:hAnsi="宋体" w:eastAsia="宋体"/>
+          <w:sz w:val="21"/>
+        </w:rPr>
+        <w:t>式（D-3） 协议一致性、分歧相关修正与全局校正预算</w:t>
+      </w:r>
+    </w:p>
+    <w:p>
+      <w:pPr>
+        <w:jc w:val="center"/>
+      </w:pPr>
+      <w:r>
+        <w:drawing>
+          <wp:inline xmlns:a="http://schemas.openxmlformats.org/drawingml/2006/main" xmlns:pic="http://schemas.openxmlformats.org/drawingml/2006/picture">
+            <wp:extent cx="5544000" cy="3091900"/>
+            <wp:docPr id="45" name="Picture 45"/>
+            <wp:cNvGraphicFramePr>
+              <a:graphicFrameLocks noChangeAspect="1"/>
+            </wp:cNvGraphicFramePr>
+            <a:graphic>
+              <a:graphicData uri="http://schemas.openxmlformats.org/drawingml/2006/picture">
+                <pic:pic>
+                  <pic:nvPicPr>
+                    <pic:cNvPr id="0" name="cgdc_rsg_hrgv_architecture.png"/>
+                    <pic:cNvPicPr/>
+                  </pic:nvPicPr>
+                  <pic:blipFill>
+                    <a:blip r:embed="rId56"/>
+                    <a:stretch>
+                      <a:fillRect/>
+                    </a:stretch>
+                  </pic:blipFill>
+                  <pic:spPr>
+                    <a:xfrm>
+                      <a:off x="0" y="0"/>
+                      <a:ext cx="5544000" cy="3091900"/>
+                    </a:xfrm>
+                    <a:prstGeom prst="rect"/>
+                  </pic:spPr>
+                </pic:pic>
+              </a:graphicData>
+            </a:graphic>
+          </wp:inline>
+        </w:drawing>
+      </w:r>
+    </w:p>
+    <w:p>
+      <w:pPr>
+        <w:pStyle w:val="af7"/>
+        <w:jc w:val="center"/>
+      </w:pPr>
+      <w:r>
+        <w:rPr>
+          <w:rFonts w:ascii="宋体" w:hAnsi="宋体" w:eastAsia="宋体"/>
+          <w:sz w:val="19"/>
+        </w:rPr>
+        <w:t>图 19 CGDC-RSG-HRGV-Net 的跨粒度证据分解与分歧校正结构</w:t>
+      </w:r>
+    </w:p>
+    <w:p>
+      <w:pPr>
+        <w:pStyle w:val="21"/>
+      </w:pPr>
+      <w:r>
+        <w:t>D.2 三随机种子受控实验</w:t>
+      </w:r>
+    </w:p>
+    <w:tbl>
+      <w:tblPr>
+        <w:tblStyle w:val="aff1"/>
+        <w:tblW w:type="auto" w:w="0"/>
+        <w:tblLook w:firstColumn="1" w:firstRow="1" w:lastColumn="0" w:lastRow="0" w:noHBand="0" w:noVBand="1" w:val="04A0"/>
+      </w:tblPr>
+      <w:tblGrid>
+        <w:gridCol w:w="1531"/>
+        <w:gridCol w:w="1531"/>
+        <w:gridCol w:w="1531"/>
+        <w:gridCol w:w="1531"/>
+        <w:gridCol w:w="1531"/>
+        <w:gridCol w:w="1531"/>
+      </w:tblGrid>
+      <w:tr>
+        <w:tc>
+          <w:tcPr>
+            <w:tcW w:type="dxa" w:w="1531"/>
+          </w:tcPr>
+          <w:p>
+            <w:pPr>
+              <w:jc w:val="center"/>
+            </w:pPr>
+            <w:r>
+              <w:rPr>
+                <w:rFonts w:ascii="宋体" w:hAnsi="宋体" w:eastAsia="宋体"/>
+                <w:b/>
+                <w:sz w:val="17"/>
+              </w:rPr>
+              <w:t>配置</w:t>
+            </w:r>
+          </w:p>
+        </w:tc>
+        <w:tc>
+          <w:tcPr>
+            <w:tcW w:type="dxa" w:w="1531"/>
+          </w:tcPr>
+          <w:p>
+            <w:pPr>
+              <w:jc w:val="center"/>
+            </w:pPr>
+            <w:r>
+              <w:rPr>
+                <w:rFonts w:ascii="宋体" w:hAnsi="宋体" w:eastAsia="宋体"/>
+                <w:b/>
+                <w:sz w:val="17"/>
+              </w:rPr>
+              <w:t>Accuracy</w:t>
+            </w:r>
+          </w:p>
+        </w:tc>
+        <w:tc>
+          <w:tcPr>
+            <w:tcW w:type="dxa" w:w="1531"/>
+          </w:tcPr>
+          <w:p>
+            <w:pPr>
+              <w:jc w:val="center"/>
+            </w:pPr>
+            <w:r>
+              <w:rPr>
+                <w:rFonts w:ascii="宋体" w:hAnsi="宋体" w:eastAsia="宋体"/>
+                <w:b/>
+                <w:sz w:val="17"/>
+              </w:rPr>
+              <w:t>Macro F1</w:t>
+            </w:r>
+          </w:p>
+        </w:tc>
+        <w:tc>
+          <w:tcPr>
+            <w:tcW w:type="dxa" w:w="1531"/>
+          </w:tcPr>
+          <w:p>
+            <w:pPr>
+              <w:jc w:val="center"/>
+            </w:pPr>
+            <w:r>
+              <w:rPr>
+                <w:rFonts w:ascii="宋体" w:hAnsi="宋体" w:eastAsia="宋体"/>
+                <w:b/>
+                <w:sz w:val="17"/>
+              </w:rPr>
+              <w:t>目标类召回</w:t>
+            </w:r>
+          </w:p>
+        </w:tc>
+        <w:tc>
+          <w:tcPr>
+            <w:tcW w:type="dxa" w:w="1531"/>
+          </w:tcPr>
+          <w:p>
+            <w:pPr>
+              <w:jc w:val="center"/>
+            </w:pPr>
+            <w:r>
+              <w:rPr>
+                <w:rFonts w:ascii="宋体" w:hAnsi="宋体" w:eastAsia="宋体"/>
+                <w:b/>
+                <w:sz w:val="17"/>
+              </w:rPr>
+              <w:t>Brier</w:t>
+            </w:r>
+          </w:p>
+        </w:tc>
+        <w:tc>
+          <w:tcPr>
+            <w:tcW w:type="dxa" w:w="1531"/>
+          </w:tcPr>
+          <w:p>
+            <w:pPr>
+              <w:jc w:val="center"/>
+            </w:pPr>
+            <w:r>
+              <w:rPr>
+                <w:rFonts w:ascii="宋体" w:hAnsi="宋体" w:eastAsia="宋体"/>
+                <w:b/>
+                <w:sz w:val="17"/>
+              </w:rPr>
+              <w:t>ECE</w:t>
+            </w:r>
+          </w:p>
+        </w:tc>
+      </w:tr>
+      <w:tr>
+        <w:tc>
+          <w:tcPr>
+            <w:tcW w:type="dxa" w:w="1531"/>
+          </w:tcPr>
+          <w:p>
+            <w:pPr>
+              <w:jc w:val="center"/>
+            </w:pPr>
+            <w:r>
+              <w:rPr>
+                <w:rFonts w:ascii="宋体" w:hAnsi="宋体" w:eastAsia="宋体"/>
+                <w:b w:val="0"/>
+                <w:sz w:val="17"/>
+              </w:rPr>
+              <w:t>RSG 完整模型</w:t>
+            </w:r>
+          </w:p>
+        </w:tc>
+        <w:tc>
+          <w:tcPr>
+            <w:tcW w:type="dxa" w:w="1531"/>
+          </w:tcPr>
+          <w:p>
+            <w:pPr>
+              <w:jc w:val="center"/>
+            </w:pPr>
+            <w:r>
+              <w:rPr>
+                <w:rFonts w:ascii="宋体" w:hAnsi="宋体" w:eastAsia="宋体"/>
+                <w:b w:val="0"/>
+                <w:sz w:val="17"/>
+              </w:rPr>
+              <w:t>76.45%</w:t>
+            </w:r>
+          </w:p>
+        </w:tc>
+        <w:tc>
+          <w:tcPr>
+            <w:tcW w:type="dxa" w:w="1531"/>
+          </w:tcPr>
+          <w:p>
+            <w:pPr>
+              <w:jc w:val="center"/>
+            </w:pPr>
+            <w:r>
+              <w:rPr>
+                <w:rFonts w:ascii="宋体" w:hAnsi="宋体" w:eastAsia="宋体"/>
+                <w:b w:val="0"/>
+                <w:sz w:val="17"/>
+              </w:rPr>
+              <w:t>74.76%</w:t>
+            </w:r>
+          </w:p>
+        </w:tc>
+        <w:tc>
+          <w:tcPr>
+            <w:tcW w:type="dxa" w:w="1531"/>
+          </w:tcPr>
+          <w:p>
+            <w:pPr>
+              <w:jc w:val="center"/>
+            </w:pPr>
+            <w:r>
+              <w:rPr>
+                <w:rFonts w:ascii="宋体" w:hAnsi="宋体" w:eastAsia="宋体"/>
+                <w:b w:val="0"/>
+                <w:sz w:val="17"/>
+              </w:rPr>
+              <w:t>72.91%</w:t>
+            </w:r>
+          </w:p>
+        </w:tc>
+        <w:tc>
+          <w:tcPr>
+            <w:tcW w:type="dxa" w:w="1531"/>
+          </w:tcPr>
+          <w:p>
+            <w:pPr>
+              <w:jc w:val="center"/>
+            </w:pPr>
+            <w:r>
+              <w:rPr>
+                <w:rFonts w:ascii="宋体" w:hAnsi="宋体" w:eastAsia="宋体"/>
+                <w:b w:val="0"/>
+                <w:sz w:val="17"/>
+              </w:rPr>
+              <w:t>37.02%</w:t>
+            </w:r>
+          </w:p>
+        </w:tc>
+        <w:tc>
+          <w:tcPr>
+            <w:tcW w:type="dxa" w:w="1531"/>
+          </w:tcPr>
+          <w:p>
+            <w:pPr>
+              <w:jc w:val="center"/>
+            </w:pPr>
+            <w:r>
+              <w:rPr>
+                <w:rFonts w:ascii="宋体" w:hAnsi="宋体" w:eastAsia="宋体"/>
+                <w:b w:val="0"/>
+                <w:sz w:val="17"/>
+              </w:rPr>
+              <w:t>12.90%</w:t>
+            </w:r>
+          </w:p>
+        </w:tc>
+      </w:tr>
+      <w:tr>
+        <w:tc>
+          <w:tcPr>
+            <w:tcW w:type="dxa" w:w="1531"/>
+          </w:tcPr>
+          <w:p>
+            <w:pPr>
+              <w:jc w:val="center"/>
+            </w:pPr>
+            <w:r>
+              <w:rPr>
+                <w:rFonts w:ascii="宋体" w:hAnsi="宋体" w:eastAsia="宋体"/>
+                <w:b w:val="0"/>
+                <w:sz w:val="17"/>
+              </w:rPr>
+              <w:t>CGDC 完整模型</w:t>
+            </w:r>
+          </w:p>
+        </w:tc>
+        <w:tc>
+          <w:tcPr>
+            <w:tcW w:type="dxa" w:w="1531"/>
+          </w:tcPr>
+          <w:p>
+            <w:pPr>
+              <w:jc w:val="center"/>
+            </w:pPr>
+            <w:r>
+              <w:rPr>
+                <w:rFonts w:ascii="宋体" w:hAnsi="宋体" w:eastAsia="宋体"/>
+                <w:b w:val="0"/>
+                <w:sz w:val="17"/>
+              </w:rPr>
+              <w:t>75.26%</w:t>
+            </w:r>
+          </w:p>
+        </w:tc>
+        <w:tc>
+          <w:tcPr>
+            <w:tcW w:type="dxa" w:w="1531"/>
+          </w:tcPr>
+          <w:p>
+            <w:pPr>
+              <w:jc w:val="center"/>
+            </w:pPr>
+            <w:r>
+              <w:rPr>
+                <w:rFonts w:ascii="宋体" w:hAnsi="宋体" w:eastAsia="宋体"/>
+                <w:b w:val="0"/>
+                <w:sz w:val="17"/>
+              </w:rPr>
+              <w:t>73.25%</w:t>
+            </w:r>
+          </w:p>
+        </w:tc>
+        <w:tc>
+          <w:tcPr>
+            <w:tcW w:type="dxa" w:w="1531"/>
+          </w:tcPr>
+          <w:p>
+            <w:pPr>
+              <w:jc w:val="center"/>
+            </w:pPr>
+            <w:r>
+              <w:rPr>
+                <w:rFonts w:ascii="宋体" w:hAnsi="宋体" w:eastAsia="宋体"/>
+                <w:b w:val="0"/>
+                <w:sz w:val="17"/>
+              </w:rPr>
+              <w:t>72.91%</w:t>
+            </w:r>
+          </w:p>
+        </w:tc>
+        <w:tc>
+          <w:tcPr>
+            <w:tcW w:type="dxa" w:w="1531"/>
+          </w:tcPr>
+          <w:p>
+            <w:pPr>
+              <w:jc w:val="center"/>
+            </w:pPr>
+            <w:r>
+              <w:rPr>
+                <w:rFonts w:ascii="宋体" w:hAnsi="宋体" w:eastAsia="宋体"/>
+                <w:b w:val="0"/>
+                <w:sz w:val="17"/>
+              </w:rPr>
+              <w:t>37.84%</w:t>
+            </w:r>
+          </w:p>
+        </w:tc>
+        <w:tc>
+          <w:tcPr>
+            <w:tcW w:type="dxa" w:w="1531"/>
+          </w:tcPr>
+          <w:p>
+            <w:pPr>
+              <w:jc w:val="center"/>
+            </w:pPr>
+            <w:r>
+              <w:rPr>
+                <w:rFonts w:ascii="宋体" w:hAnsi="宋体" w:eastAsia="宋体"/>
+                <w:b w:val="0"/>
+                <w:sz w:val="17"/>
+              </w:rPr>
+              <w:t>12.87%</w:t>
+            </w:r>
+          </w:p>
+        </w:tc>
+      </w:tr>
+      <w:tr>
+        <w:tc>
+          <w:tcPr>
+            <w:tcW w:type="dxa" w:w="1531"/>
+          </w:tcPr>
+          <w:p>
+            <w:pPr>
+              <w:jc w:val="center"/>
+            </w:pPr>
+            <w:r>
+              <w:rPr>
+                <w:rFonts w:ascii="宋体" w:hAnsi="宋体" w:eastAsia="宋体"/>
+                <w:b w:val="0"/>
+                <w:sz w:val="17"/>
+              </w:rPr>
+              <w:t>共享特征消融</w:t>
+            </w:r>
+          </w:p>
+        </w:tc>
+        <w:tc>
+          <w:tcPr>
+            <w:tcW w:type="dxa" w:w="1531"/>
+          </w:tcPr>
+          <w:p>
+            <w:pPr>
+              <w:jc w:val="center"/>
+            </w:pPr>
+            <w:r>
+              <w:rPr>
+                <w:rFonts w:ascii="宋体" w:hAnsi="宋体" w:eastAsia="宋体"/>
+                <w:b w:val="0"/>
+                <w:sz w:val="17"/>
+              </w:rPr>
+              <w:t>75.03%</w:t>
+            </w:r>
+          </w:p>
+        </w:tc>
+        <w:tc>
+          <w:tcPr>
+            <w:tcW w:type="dxa" w:w="1531"/>
+          </w:tcPr>
+          <w:p>
+            <w:pPr>
+              <w:jc w:val="center"/>
+            </w:pPr>
+            <w:r>
+              <w:rPr>
+                <w:rFonts w:ascii="宋体" w:hAnsi="宋体" w:eastAsia="宋体"/>
+                <w:b w:val="0"/>
+                <w:sz w:val="17"/>
+              </w:rPr>
+              <w:t>73.01%</w:t>
+            </w:r>
+          </w:p>
+        </w:tc>
+        <w:tc>
+          <w:tcPr>
+            <w:tcW w:type="dxa" w:w="1531"/>
+          </w:tcPr>
+          <w:p>
+            <w:pPr>
+              <w:jc w:val="center"/>
+            </w:pPr>
+            <w:r>
+              <w:rPr>
+                <w:rFonts w:ascii="宋体" w:hAnsi="宋体" w:eastAsia="宋体"/>
+                <w:b w:val="0"/>
+                <w:sz w:val="17"/>
+              </w:rPr>
+              <w:t>70.52%</w:t>
+            </w:r>
+          </w:p>
+        </w:tc>
+        <w:tc>
+          <w:tcPr>
+            <w:tcW w:type="dxa" w:w="1531"/>
+          </w:tcPr>
+          <w:p>
+            <w:pPr>
+              <w:jc w:val="center"/>
+            </w:pPr>
+            <w:r>
+              <w:rPr>
+                <w:rFonts w:ascii="宋体" w:hAnsi="宋体" w:eastAsia="宋体"/>
+                <w:b w:val="0"/>
+                <w:sz w:val="17"/>
+              </w:rPr>
+              <w:t>38.48%</w:t>
+            </w:r>
+          </w:p>
+        </w:tc>
+        <w:tc>
+          <w:tcPr>
+            <w:tcW w:type="dxa" w:w="1531"/>
+          </w:tcPr>
+          <w:p>
+            <w:pPr>
+              <w:jc w:val="center"/>
+            </w:pPr>
+            <w:r>
+              <w:rPr>
+                <w:rFonts w:ascii="宋体" w:hAnsi="宋体" w:eastAsia="宋体"/>
+                <w:b w:val="0"/>
+                <w:sz w:val="17"/>
+              </w:rPr>
+              <w:t>12.75%</w:t>
+            </w:r>
+          </w:p>
+        </w:tc>
+      </w:tr>
+      <w:tr>
+        <w:tc>
+          <w:tcPr>
+            <w:tcW w:type="dxa" w:w="1531"/>
+          </w:tcPr>
+          <w:p>
+            <w:pPr>
+              <w:jc w:val="center"/>
+            </w:pPr>
+            <w:r>
+              <w:rPr>
+                <w:rFonts w:ascii="宋体" w:hAnsi="宋体" w:eastAsia="宋体"/>
+                <w:b w:val="0"/>
+                <w:sz w:val="17"/>
+              </w:rPr>
+              <w:t>无条件校正消融</w:t>
+            </w:r>
+          </w:p>
+        </w:tc>
+        <w:tc>
+          <w:tcPr>
+            <w:tcW w:type="dxa" w:w="1531"/>
+          </w:tcPr>
+          <w:p>
+            <w:pPr>
+              <w:jc w:val="center"/>
+            </w:pPr>
+            <w:r>
+              <w:rPr>
+                <w:rFonts w:ascii="宋体" w:hAnsi="宋体" w:eastAsia="宋体"/>
+                <w:b w:val="0"/>
+                <w:sz w:val="17"/>
+              </w:rPr>
+              <w:t>75.93%</w:t>
+            </w:r>
+          </w:p>
+        </w:tc>
+        <w:tc>
+          <w:tcPr>
+            <w:tcW w:type="dxa" w:w="1531"/>
+          </w:tcPr>
+          <w:p>
+            <w:pPr>
+              <w:jc w:val="center"/>
+            </w:pPr>
+            <w:r>
+              <w:rPr>
+                <w:rFonts w:ascii="宋体" w:hAnsi="宋体" w:eastAsia="宋体"/>
+                <w:b w:val="0"/>
+                <w:sz w:val="17"/>
+              </w:rPr>
+              <w:t>74.11%</w:t>
+            </w:r>
+          </w:p>
+        </w:tc>
+        <w:tc>
+          <w:tcPr>
+            <w:tcW w:type="dxa" w:w="1531"/>
+          </w:tcPr>
+          <w:p>
+            <w:pPr>
+              <w:jc w:val="center"/>
+            </w:pPr>
+            <w:r>
+              <w:rPr>
+                <w:rFonts w:ascii="宋体" w:hAnsi="宋体" w:eastAsia="宋体"/>
+                <w:b w:val="0"/>
+                <w:sz w:val="17"/>
+              </w:rPr>
+              <w:t>75.70%</w:t>
+            </w:r>
+          </w:p>
+        </w:tc>
+        <w:tc>
+          <w:tcPr>
+            <w:tcW w:type="dxa" w:w="1531"/>
+          </w:tcPr>
+          <w:p>
+            <w:pPr>
+              <w:jc w:val="center"/>
+            </w:pPr>
+            <w:r>
+              <w:rPr>
+                <w:rFonts w:ascii="宋体" w:hAnsi="宋体" w:eastAsia="宋体"/>
+                <w:b w:val="0"/>
+                <w:sz w:val="17"/>
+              </w:rPr>
+              <w:t>38.70%</w:t>
+            </w:r>
+          </w:p>
+        </w:tc>
+        <w:tc>
+          <w:tcPr>
+            <w:tcW w:type="dxa" w:w="1531"/>
+          </w:tcPr>
+          <w:p>
+            <w:pPr>
+              <w:jc w:val="center"/>
+            </w:pPr>
+            <w:r>
+              <w:rPr>
+                <w:rFonts w:ascii="宋体" w:hAnsi="宋体" w:eastAsia="宋体"/>
+                <w:b w:val="0"/>
+                <w:sz w:val="17"/>
+              </w:rPr>
+              <w:t>14.34%</w:t>
+            </w:r>
+          </w:p>
+        </w:tc>
+      </w:tr>
+      <w:tr>
+        <w:tc>
+          <w:tcPr>
+            <w:tcW w:type="dxa" w:w="1531"/>
+          </w:tcPr>
+          <w:p>
+            <w:pPr>
+              <w:jc w:val="center"/>
+            </w:pPr>
+            <w:r>
+              <w:rPr>
+                <w:rFonts w:ascii="宋体" w:hAnsi="宋体" w:eastAsia="宋体"/>
+                <w:b w:val="0"/>
+                <w:sz w:val="17"/>
+              </w:rPr>
+              <w:t>取消分解损失</w:t>
+            </w:r>
+          </w:p>
+        </w:tc>
+        <w:tc>
+          <w:tcPr>
+            <w:tcW w:type="dxa" w:w="1531"/>
+          </w:tcPr>
+          <w:p>
+            <w:pPr>
+              <w:jc w:val="center"/>
+            </w:pPr>
+            <w:r>
+              <w:rPr>
+                <w:rFonts w:ascii="宋体" w:hAnsi="宋体" w:eastAsia="宋体"/>
+                <w:b w:val="0"/>
+                <w:sz w:val="17"/>
+              </w:rPr>
+              <w:t>75.39%</w:t>
+            </w:r>
+          </w:p>
+        </w:tc>
+        <w:tc>
+          <w:tcPr>
+            <w:tcW w:type="dxa" w:w="1531"/>
+          </w:tcPr>
+          <w:p>
+            <w:pPr>
+              <w:jc w:val="center"/>
+            </w:pPr>
+            <w:r>
+              <w:rPr>
+                <w:rFonts w:ascii="宋体" w:hAnsi="宋体" w:eastAsia="宋体"/>
+                <w:b w:val="0"/>
+                <w:sz w:val="17"/>
+              </w:rPr>
+              <w:t>73.52%</w:t>
+            </w:r>
+          </w:p>
+        </w:tc>
+        <w:tc>
+          <w:tcPr>
+            <w:tcW w:type="dxa" w:w="1531"/>
+          </w:tcPr>
+          <w:p>
+            <w:pPr>
+              <w:jc w:val="center"/>
+            </w:pPr>
+            <w:r>
+              <w:rPr>
+                <w:rFonts w:ascii="宋体" w:hAnsi="宋体" w:eastAsia="宋体"/>
+                <w:b w:val="0"/>
+                <w:sz w:val="17"/>
+              </w:rPr>
+              <w:t>71.45%</w:t>
+            </w:r>
+          </w:p>
+        </w:tc>
+        <w:tc>
+          <w:tcPr>
+            <w:tcW w:type="dxa" w:w="1531"/>
+          </w:tcPr>
+          <w:p>
+            <w:pPr>
+              <w:jc w:val="center"/>
+            </w:pPr>
+            <w:r>
+              <w:rPr>
+                <w:rFonts w:ascii="宋体" w:hAnsi="宋体" w:eastAsia="宋体"/>
+                <w:b w:val="0"/>
+                <w:sz w:val="17"/>
+              </w:rPr>
+              <w:t>39.39%</w:t>
+            </w:r>
+          </w:p>
+        </w:tc>
+        <w:tc>
+          <w:tcPr>
+            <w:tcW w:type="dxa" w:w="1531"/>
+          </w:tcPr>
+          <w:p>
+            <w:pPr>
+              <w:jc w:val="center"/>
+            </w:pPr>
+            <w:r>
+              <w:rPr>
+                <w:rFonts w:ascii="宋体" w:hAnsi="宋体" w:eastAsia="宋体"/>
+                <w:b w:val="0"/>
+                <w:sz w:val="17"/>
+              </w:rPr>
+              <w:t>15.46%</w:t>
+            </w:r>
+          </w:p>
+        </w:tc>
+      </w:tr>
+    </w:tbl>
+    <w:p/>
+    <w:p>
+      <w:pPr>
+        <w:spacing w:line="360" w:lineRule="auto"/>
+      </w:pPr>
+      <w:r>
+        <w:rPr>
+          <w:rFonts w:ascii="宋体" w:hAnsi="宋体" w:eastAsia="宋体"/>
+          <w:sz w:val="21"/>
+        </w:rPr>
+        <w:t>表中为三随机种子均值；完整配置与四个控制变量消融共享固定数据划分、图像增强、主干、训练预算和测试协议。Brier 与 ECE 均为越低越好的后验质量指标，不能替代真实选矿回收率或品位指标。</w:t>
+      </w:r>
+    </w:p>
+    <w:p>
+      <w:pPr>
+        <w:pStyle w:val="21"/>
+      </w:pPr>
+      <w:r>
+        <w:t>D.3 成对 Bootstrap 证据与结论边界</w:t>
+      </w:r>
+    </w:p>
+    <w:tbl>
+      <w:tblPr>
+        <w:tblStyle w:val="aff1"/>
+        <w:tblW w:type="auto" w:w="0"/>
+        <w:tblLook w:firstColumn="1" w:firstRow="1" w:lastColumn="0" w:lastRow="0" w:noHBand="0" w:noVBand="1" w:val="04A0"/>
+      </w:tblPr>
+      <w:tblGrid>
+        <w:gridCol w:w="2296"/>
+        <w:gridCol w:w="2296"/>
+        <w:gridCol w:w="2296"/>
+        <w:gridCol w:w="2296"/>
+      </w:tblGrid>
+      <w:tr>
+        <w:tc>
+          <w:tcPr>
+            <w:tcW w:type="dxa" w:w="2296"/>
+          </w:tcPr>
+          <w:p>
+            <w:pPr>
+              <w:jc w:val="center"/>
+            </w:pPr>
+            <w:r>
+              <w:rPr>
+                <w:rFonts w:ascii="宋体" w:hAnsi="宋体" w:eastAsia="宋体"/>
+                <w:b/>
+                <w:sz w:val="17"/>
+              </w:rPr>
+              <w:t>相对 RSG</w:t>
+            </w:r>
+          </w:p>
+        </w:tc>
+        <w:tc>
+          <w:tcPr>
+            <w:tcW w:type="dxa" w:w="2296"/>
+          </w:tcPr>
+          <w:p>
+            <w:pPr>
+              <w:jc w:val="center"/>
+            </w:pPr>
+            <w:r>
+              <w:rPr>
+                <w:rFonts w:ascii="宋体" w:hAnsi="宋体" w:eastAsia="宋体"/>
+                <w:b/>
+                <w:sz w:val="17"/>
+              </w:rPr>
+              <w:t>Macro F1 差值 [95% CI]</w:t>
+            </w:r>
+          </w:p>
+        </w:tc>
+        <w:tc>
+          <w:tcPr>
+            <w:tcW w:type="dxa" w:w="2296"/>
+          </w:tcPr>
+          <w:p>
+            <w:pPr>
+              <w:jc w:val="center"/>
+            </w:pPr>
+            <w:r>
+              <w:rPr>
+                <w:rFonts w:ascii="宋体" w:hAnsi="宋体" w:eastAsia="宋体"/>
+                <w:b/>
+                <w:sz w:val="17"/>
+              </w:rPr>
+              <w:t>Brier 差值 [95% CI]</w:t>
+            </w:r>
+          </w:p>
+        </w:tc>
+        <w:tc>
+          <w:tcPr>
+            <w:tcW w:type="dxa" w:w="2296"/>
+          </w:tcPr>
+          <w:p>
+            <w:pPr>
+              <w:jc w:val="center"/>
+            </w:pPr>
+            <w:r>
+              <w:rPr>
+                <w:rFonts w:ascii="宋体" w:hAnsi="宋体" w:eastAsia="宋体"/>
+                <w:b/>
+                <w:sz w:val="17"/>
+              </w:rPr>
+              <w:t>ECE 差值 [95% CI]</w:t>
+            </w:r>
+          </w:p>
+        </w:tc>
+      </w:tr>
+      <w:tr>
+        <w:tc>
+          <w:tcPr>
+            <w:tcW w:type="dxa" w:w="2296"/>
+          </w:tcPr>
+          <w:p>
+            <w:pPr>
+              <w:jc w:val="center"/>
+            </w:pPr>
+            <w:r>
+              <w:rPr>
+                <w:rFonts w:ascii="宋体" w:hAnsi="宋体" w:eastAsia="宋体"/>
+                <w:b w:val="0"/>
+                <w:sz w:val="17"/>
+              </w:rPr>
+              <w:t>CGDC 完整模型</w:t>
+            </w:r>
+          </w:p>
+        </w:tc>
+        <w:tc>
+          <w:tcPr>
+            <w:tcW w:type="dxa" w:w="2296"/>
+          </w:tcPr>
+          <w:p>
+            <w:pPr>
+              <w:jc w:val="center"/>
+            </w:pPr>
+            <w:r>
+              <w:rPr>
+                <w:rFonts w:ascii="宋体" w:hAnsi="宋体" w:eastAsia="宋体"/>
+                <w:b w:val="0"/>
+                <w:sz w:val="17"/>
+              </w:rPr>
+              <w:t>-1.51% [-3.98%, 1.08%]</w:t>
+            </w:r>
+          </w:p>
+        </w:tc>
+        <w:tc>
+          <w:tcPr>
+            <w:tcW w:type="dxa" w:w="2296"/>
+          </w:tcPr>
+          <w:p>
+            <w:pPr>
+              <w:jc w:val="center"/>
+            </w:pPr>
+            <w:r>
+              <w:rPr>
+                <w:rFonts w:ascii="宋体" w:hAnsi="宋体" w:eastAsia="宋体"/>
+                <w:b w:val="0"/>
+                <w:sz w:val="17"/>
+              </w:rPr>
+              <w:t>0.82% [-1.29%, 2.96%]</w:t>
+            </w:r>
+          </w:p>
+        </w:tc>
+        <w:tc>
+          <w:tcPr>
+            <w:tcW w:type="dxa" w:w="2296"/>
+          </w:tcPr>
+          <w:p>
+            <w:pPr>
+              <w:jc w:val="center"/>
+            </w:pPr>
+            <w:r>
+              <w:rPr>
+                <w:rFonts w:ascii="宋体" w:hAnsi="宋体" w:eastAsia="宋体"/>
+                <w:b w:val="0"/>
+                <w:sz w:val="17"/>
+              </w:rPr>
+              <w:t>-0.03% [-1.61%, 1.23%]</w:t>
+            </w:r>
+          </w:p>
+        </w:tc>
+      </w:tr>
+      <w:tr>
+        <w:tc>
+          <w:tcPr>
+            <w:tcW w:type="dxa" w:w="2296"/>
+          </w:tcPr>
+          <w:p>
+            <w:pPr>
+              <w:jc w:val="center"/>
+            </w:pPr>
+            <w:r>
+              <w:rPr>
+                <w:rFonts w:ascii="宋体" w:hAnsi="宋体" w:eastAsia="宋体"/>
+                <w:b w:val="0"/>
+                <w:sz w:val="17"/>
+              </w:rPr>
+              <w:t>共享特征消融</w:t>
+            </w:r>
+          </w:p>
+        </w:tc>
+        <w:tc>
+          <w:tcPr>
+            <w:tcW w:type="dxa" w:w="2296"/>
+          </w:tcPr>
+          <w:p>
+            <w:pPr>
+              <w:jc w:val="center"/>
+            </w:pPr>
+            <w:r>
+              <w:rPr>
+                <w:rFonts w:ascii="宋体" w:hAnsi="宋体" w:eastAsia="宋体"/>
+                <w:b w:val="0"/>
+                <w:sz w:val="17"/>
+              </w:rPr>
+              <w:t>-1.75% [-3.20%, -0.25%]</w:t>
+            </w:r>
+          </w:p>
+        </w:tc>
+        <w:tc>
+          <w:tcPr>
+            <w:tcW w:type="dxa" w:w="2296"/>
+          </w:tcPr>
+          <w:p>
+            <w:pPr>
+              <w:jc w:val="center"/>
+            </w:pPr>
+            <w:r>
+              <w:rPr>
+                <w:rFonts w:ascii="宋体" w:hAnsi="宋体" w:eastAsia="宋体"/>
+                <w:b w:val="0"/>
+                <w:sz w:val="17"/>
+              </w:rPr>
+              <w:t>1.46% [-0.80%, 3.80%]</w:t>
+            </w:r>
+          </w:p>
+        </w:tc>
+        <w:tc>
+          <w:tcPr>
+            <w:tcW w:type="dxa" w:w="2296"/>
+          </w:tcPr>
+          <w:p>
+            <w:pPr>
+              <w:jc w:val="center"/>
+            </w:pPr>
+            <w:r>
+              <w:rPr>
+                <w:rFonts w:ascii="宋体" w:hAnsi="宋体" w:eastAsia="宋体"/>
+                <w:b w:val="0"/>
+                <w:sz w:val="17"/>
+              </w:rPr>
+              <w:t>-0.15% [-3.27%, 2.65%]</w:t>
+            </w:r>
+          </w:p>
+        </w:tc>
+      </w:tr>
+      <w:tr>
+        <w:tc>
+          <w:tcPr>
+            <w:tcW w:type="dxa" w:w="2296"/>
+          </w:tcPr>
+          <w:p>
+            <w:pPr>
+              <w:jc w:val="center"/>
+            </w:pPr>
+            <w:r>
+              <w:rPr>
+                <w:rFonts w:ascii="宋体" w:hAnsi="宋体" w:eastAsia="宋体"/>
+                <w:b w:val="0"/>
+                <w:sz w:val="17"/>
+              </w:rPr>
+              <w:t>无条件校正消融</w:t>
+            </w:r>
+          </w:p>
+        </w:tc>
+        <w:tc>
+          <w:tcPr>
+            <w:tcW w:type="dxa" w:w="2296"/>
+          </w:tcPr>
+          <w:p>
+            <w:pPr>
+              <w:jc w:val="center"/>
+            </w:pPr>
+            <w:r>
+              <w:rPr>
+                <w:rFonts w:ascii="宋体" w:hAnsi="宋体" w:eastAsia="宋体"/>
+                <w:b w:val="0"/>
+                <w:sz w:val="17"/>
+              </w:rPr>
+              <w:t>-0.64% [-3.42%, 1.94%]</w:t>
+            </w:r>
+          </w:p>
+        </w:tc>
+        <w:tc>
+          <w:tcPr>
+            <w:tcW w:type="dxa" w:w="2296"/>
+          </w:tcPr>
+          <w:p>
+            <w:pPr>
+              <w:jc w:val="center"/>
+            </w:pPr>
+            <w:r>
+              <w:rPr>
+                <w:rFonts w:ascii="宋体" w:hAnsi="宋体" w:eastAsia="宋体"/>
+                <w:b w:val="0"/>
+                <w:sz w:val="17"/>
+              </w:rPr>
+              <w:t>1.68% [-0.79%, 4.09%]</w:t>
+            </w:r>
+          </w:p>
+        </w:tc>
+        <w:tc>
+          <w:tcPr>
+            <w:tcW w:type="dxa" w:w="2296"/>
+          </w:tcPr>
+          <w:p>
+            <w:pPr>
+              <w:jc w:val="center"/>
+            </w:pPr>
+            <w:r>
+              <w:rPr>
+                <w:rFonts w:ascii="宋体" w:hAnsi="宋体" w:eastAsia="宋体"/>
+                <w:b w:val="0"/>
+                <w:sz w:val="17"/>
+              </w:rPr>
+              <w:t>1.44% [-0.06%, 2.90%]</w:t>
+            </w:r>
+          </w:p>
+        </w:tc>
+      </w:tr>
+      <w:tr>
+        <w:tc>
+          <w:tcPr>
+            <w:tcW w:type="dxa" w:w="2296"/>
+          </w:tcPr>
+          <w:p>
+            <w:pPr>
+              <w:jc w:val="center"/>
+            </w:pPr>
+            <w:r>
+              <w:rPr>
+                <w:rFonts w:ascii="宋体" w:hAnsi="宋体" w:eastAsia="宋体"/>
+                <w:b w:val="0"/>
+                <w:sz w:val="17"/>
+              </w:rPr>
+              <w:t>取消分解损失</w:t>
+            </w:r>
+          </w:p>
+        </w:tc>
+        <w:tc>
+          <w:tcPr>
+            <w:tcW w:type="dxa" w:w="2296"/>
+          </w:tcPr>
+          <w:p>
+            <w:pPr>
+              <w:jc w:val="center"/>
+            </w:pPr>
+            <w:r>
+              <w:rPr>
+                <w:rFonts w:ascii="宋体" w:hAnsi="宋体" w:eastAsia="宋体"/>
+                <w:b w:val="0"/>
+                <w:sz w:val="17"/>
+              </w:rPr>
+              <w:t>-1.24% [-2.55%, 0.10%]</w:t>
+            </w:r>
+          </w:p>
+        </w:tc>
+        <w:tc>
+          <w:tcPr>
+            <w:tcW w:type="dxa" w:w="2296"/>
+          </w:tcPr>
+          <w:p>
+            <w:pPr>
+              <w:jc w:val="center"/>
+            </w:pPr>
+            <w:r>
+              <w:rPr>
+                <w:rFonts w:ascii="宋体" w:hAnsi="宋体" w:eastAsia="宋体"/>
+                <w:b w:val="0"/>
+                <w:sz w:val="17"/>
+              </w:rPr>
+              <w:t>2.37% [0.24%, 4.36%]</w:t>
+            </w:r>
+          </w:p>
+        </w:tc>
+        <w:tc>
+          <w:tcPr>
+            <w:tcW w:type="dxa" w:w="2296"/>
+          </w:tcPr>
+          <w:p>
+            <w:pPr>
+              <w:jc w:val="center"/>
+            </w:pPr>
+            <w:r>
+              <w:rPr>
+                <w:rFonts w:ascii="宋体" w:hAnsi="宋体" w:eastAsia="宋体"/>
+                <w:b w:val="0"/>
+                <w:sz w:val="17"/>
+              </w:rPr>
+              <w:t>2.56% [1.21%, 3.75%]</w:t>
+            </w:r>
+          </w:p>
+        </w:tc>
+      </w:tr>
+    </w:tbl>
+    <w:p/>
+    <w:p>
+      <w:pPr>
+        <w:spacing w:line="360" w:lineRule="auto"/>
+      </w:pPr>
+      <w:r>
+        <w:rPr>
+          <w:rFonts w:ascii="宋体" w:hAnsi="宋体" w:eastAsia="宋体"/>
+          <w:sz w:val="21"/>
+        </w:rPr>
+        <w:t>每个区间以图片 split_group_id 聚类、随机种子与组两阶段重采样的 2,000 次 Bootstrap 得到。校正相关的经验结论仅以 Brier/ECE 差值及其区间为准；若区间跨零，报告应保留为未观察到稳定增益，而不能根据单个种子或单项指标宣称优势。</w:t>
+      </w:r>
+    </w:p>
+    <w:p>
+      <w:pPr>
+        <w:spacing w:line="360" w:lineRule="auto"/>
+      </w:pPr>
+      <w:r>
+        <w:rPr>
+          <w:rFonts w:ascii="宋体" w:hAnsi="宋体" w:eastAsia="宋体"/>
+          <w:sz w:val="21"/>
+        </w:rPr>
+        <w:t>结论边界：本附录验证的是公开矿物标本图像上的四角色闭集识别和后验校准行为，不等同于工业分选、精矿品位预测、回收率提升、钒钛元素含量检测或未知矿物拒识性能。阶段条件化选矿决策图仍作为下一篇工作与后续研究方向。</w:t>
       </w:r>
     </w:p>
     <w:sectPr>

</xml_diff>

<commit_message>
docs: add RPG formal appendix to report
</commit_message>
<xml_diff>
--- a/结题/基于深度学习的钒钛矿相关矿物图像识别方法研究_技术报告（正式版）.docx
+++ b/结题/基于深度学习的钒钛矿相关矿物图像识别方法研究_技术报告（正式版）.docx
@@ -32570,6 +32570,1375 @@
           <w:sz w:val="21"/>
         </w:rPr>
         <w:t>结论边界：本附录验证的是公开矿物标本图像上的四角色闭集识别和后验校准行为，不等同于工业分选、精矿品位预测、回收率提升、钒钛元素含量检测或未知矿物拒识性能。阶段条件化选矿决策图仍作为下一篇工作与后续研究方向。</w:t>
+      </w:r>
+    </w:p>
+    <w:p>
+      <w:pPr>
+        <w:pStyle w:val="1"/>
+      </w:pPr>
+      <w:r>
+        <w:t>附录 E RPG-HRGV 角色分区不确定性门控理论与实验</w:t>
+      </w:r>
+    </w:p>
+    <w:p>
+      <w:pPr>
+        <w:pStyle w:val="21"/>
+      </w:pPr>
+      <w:r>
+        <w:t>E.1 问题设定、网络结构与可检验命题</w:t>
+      </w:r>
+    </w:p>
+    <w:p>
+      <w:pPr>
+        <w:spacing w:line="360" w:lineRule="auto"/>
+      </w:pPr>
+      <w:r>
+        <w:rPr>
+          <w:rFonts w:ascii="宋体" w:hAnsi="宋体" w:eastAsia="宋体"/>
+          <w:sz w:val="21"/>
+        </w:rPr>
+        <w:t>RPG-HRGV-Net 保持原有 EfficientNet-B0 共享主干、直接角色专家和矿物种类专家。种类专家输出的 17 类矿物后验 p_s 通过固定的种类-角色映射矩阵 M 聚合为四角色后验 p_m=Mp_s；该映射仅编码本研究的公开图像四角色任务，不推断元素含量、品位或工业流程动作。</w:t>
+      </w:r>
+    </w:p>
+    <w:p>
+      <w:pPr>
+        <w:jc w:val="center"/>
+      </w:pPr>
+      <w:r>
+        <w:drawing>
+          <wp:inline xmlns:a="http://schemas.openxmlformats.org/drawingml/2006/main" xmlns:pic="http://schemas.openxmlformats.org/drawingml/2006/picture">
+            <wp:extent cx="5508000" cy="303849"/>
+            <wp:docPr id="46" name="Picture 46"/>
+            <wp:cNvGraphicFramePr>
+              <a:graphicFrameLocks noChangeAspect="1"/>
+            </wp:cNvGraphicFramePr>
+            <a:graphic>
+              <a:graphicData uri="http://schemas.openxmlformats.org/drawingml/2006/picture">
+                <pic:pic>
+                  <pic:nvPicPr>
+                    <pic:cNvPr id="0" name="rpg_entropy.png"/>
+                    <pic:cNvPicPr/>
+                  </pic:nvPicPr>
+                  <pic:blipFill>
+                    <a:blip r:embed="rId57"/>
+                    <a:stretch>
+                      <a:fillRect/>
+                    </a:stretch>
+                  </pic:blipFill>
+                  <pic:spPr>
+                    <a:xfrm>
+                      <a:off x="0" y="0"/>
+                      <a:ext cx="5508000" cy="303849"/>
+                    </a:xfrm>
+                    <a:prstGeom prst="rect"/>
+                  </pic:spPr>
+                </pic:pic>
+              </a:graphicData>
+            </a:graphic>
+          </wp:inline>
+        </w:drawing>
+      </w:r>
+    </w:p>
+    <w:p>
+      <w:pPr>
+        <w:spacing w:line="360" w:lineRule="auto"/>
+      </w:pPr>
+      <w:r>
+        <w:rPr>
+          <w:rFonts w:ascii="宋体" w:hAnsi="宋体" w:eastAsia="宋体"/>
+          <w:sz w:val="21"/>
+        </w:rPr>
+        <w:t>式（E-1） 固定角色分区下的熵链式分解</w:t>
+      </w:r>
+    </w:p>
+    <w:p>
+      <w:pPr>
+        <w:spacing w:line="360" w:lineRule="auto"/>
+      </w:pPr>
+      <w:r>
+        <w:rPr>
+          <w:rFonts w:ascii="宋体" w:hAnsi="宋体" w:eastAsia="宋体"/>
+          <w:sz w:val="21"/>
+        </w:rPr>
+        <w:t>设角色变量为 R、细粒度种类变量为 S，则 H(S)=H(R)+H(S|R)。其中 U_between=H(R) 为角色间不确定性，U_within=H(S|R) 为角色内不确定性，后者刻画同一角色内部矿物种类的歧义。RPG 门控以这两个互补量及直接专家熵作为证据，而不将单一总熵误作所有不确定性的来源。</w:t>
+      </w:r>
+    </w:p>
+    <w:p>
+      <w:pPr>
+        <w:jc w:val="center"/>
+      </w:pPr>
+      <w:r>
+        <w:drawing>
+          <wp:inline xmlns:a="http://schemas.openxmlformats.org/drawingml/2006/main" xmlns:pic="http://schemas.openxmlformats.org/drawingml/2006/picture">
+            <wp:extent cx="5508000" cy="327589"/>
+            <wp:docPr id="47" name="Picture 47"/>
+            <wp:cNvGraphicFramePr>
+              <a:graphicFrameLocks noChangeAspect="1"/>
+            </wp:cNvGraphicFramePr>
+            <a:graphic>
+              <a:graphicData uri="http://schemas.openxmlformats.org/drawingml/2006/picture">
+                <pic:pic>
+                  <pic:nvPicPr>
+                    <pic:cNvPr id="0" name="rpg_gate.png"/>
+                    <pic:cNvPicPr/>
+                  </pic:nvPicPr>
+                  <pic:blipFill>
+                    <a:blip r:embed="rId58"/>
+                    <a:stretch>
+                      <a:fillRect/>
+                    </a:stretch>
+                  </pic:blipFill>
+                  <pic:spPr>
+                    <a:xfrm>
+                      <a:off x="0" y="0"/>
+                      <a:ext cx="5508000" cy="327589"/>
+                    </a:xfrm>
+                    <a:prstGeom prst="rect"/>
+                  </pic:spPr>
+                </pic:pic>
+              </a:graphicData>
+            </a:graphic>
+          </wp:inline>
+        </w:drawing>
+      </w:r>
+    </w:p>
+    <w:p>
+      <w:pPr>
+        <w:spacing w:line="360" w:lineRule="auto"/>
+      </w:pPr>
+      <w:r>
+        <w:rPr>
+          <w:rFonts w:ascii="宋体" w:hAnsi="宋体" w:eastAsia="宋体"/>
+          <w:sz w:val="21"/>
+        </w:rPr>
+        <w:t>式（E-2） 角色分区不确定性门控</w:t>
+      </w:r>
+    </w:p>
+    <w:p>
+      <w:pPr>
+        <w:jc w:val="center"/>
+      </w:pPr>
+      <w:r>
+        <w:drawing>
+          <wp:inline xmlns:a="http://schemas.openxmlformats.org/drawingml/2006/main" xmlns:pic="http://schemas.openxmlformats.org/drawingml/2006/picture">
+            <wp:extent cx="5508000" cy="642075"/>
+            <wp:docPr id="48" name="Picture 48"/>
+            <wp:cNvGraphicFramePr>
+              <a:graphicFrameLocks noChangeAspect="1"/>
+            </wp:cNvGraphicFramePr>
+            <a:graphic>
+              <a:graphicData uri="http://schemas.openxmlformats.org/drawingml/2006/picture">
+                <pic:pic>
+                  <pic:nvPicPr>
+                    <pic:cNvPr id="0" name="rpg_fusion.png"/>
+                    <pic:cNvPicPr/>
+                  </pic:nvPicPr>
+                  <pic:blipFill>
+                    <a:blip r:embed="rId59"/>
+                    <a:stretch>
+                      <a:fillRect/>
+                    </a:stretch>
+                  </pic:blipFill>
+                  <pic:spPr>
+                    <a:xfrm>
+                      <a:off x="0" y="0"/>
+                      <a:ext cx="5508000" cy="642075"/>
+                    </a:xfrm>
+                    <a:prstGeom prst="rect"/>
+                  </pic:spPr>
+                </pic:pic>
+              </a:graphicData>
+            </a:graphic>
+          </wp:inline>
+        </w:drawing>
+      </w:r>
+    </w:p>
+    <w:p>
+      <w:pPr>
+        <w:spacing w:line="360" w:lineRule="auto"/>
+      </w:pPr>
+      <w:r>
+        <w:rPr>
+          <w:rFonts w:ascii="宋体" w:hAnsi="宋体" w:eastAsia="宋体"/>
+          <w:sz w:val="21"/>
+        </w:rPr>
+        <w:t>式（E-3） 门控凸融合后验</w:t>
+      </w:r>
+    </w:p>
+    <w:p>
+      <w:pPr>
+        <w:spacing w:line="360" w:lineRule="auto"/>
+      </w:pPr>
+      <w:r>
+        <w:rPr>
+          <w:rFonts w:ascii="宋体" w:hAnsi="宋体" w:eastAsia="宋体"/>
+          <w:sz w:val="21"/>
+        </w:rPr>
+        <w:t>命题 P-R1（精确分解）：在固定映射 M 下，式（E-1）为离散熵的链式法则，因此 U_between+U_within 与种类总熵严格一致。命题 P-R2（角色稳定性）：当种类候选仅在同一角色内变化时，角色后验 p_m 不变，U_between 不因该类内歧义而上升；因此角色决策所需的可辨识信息弱于精确矿物种类识别所需的信息。命题 P-R3（凸融合包络）：因 g 属于 [0,1]，每一角色概率 p_f(r) 位于 p_d(r) 与 p_m(r) 的闭区间内，RPG 门控不能产生超出两路专家证据范围的单角色概率。P-R1 与 P-R3 为计算图的确定性性质；P-R2 的实际收益以及分区熵是否优于消融变量，由下列三随机种子实验检验。</w:t>
+      </w:r>
+    </w:p>
+    <w:p>
+      <w:pPr>
+        <w:jc w:val="center"/>
+      </w:pPr>
+      <w:r>
+        <w:drawing>
+          <wp:inline xmlns:a="http://schemas.openxmlformats.org/drawingml/2006/main" xmlns:pic="http://schemas.openxmlformats.org/drawingml/2006/picture">
+            <wp:extent cx="5544000" cy="3087095"/>
+            <wp:docPr id="49" name="Picture 49"/>
+            <wp:cNvGraphicFramePr>
+              <a:graphicFrameLocks noChangeAspect="1"/>
+            </wp:cNvGraphicFramePr>
+            <a:graphic>
+              <a:graphicData uri="http://schemas.openxmlformats.org/drawingml/2006/picture">
+                <pic:pic>
+                  <pic:nvPicPr>
+                    <pic:cNvPr id="0" name="rpg_hrgv_architecture.png"/>
+                    <pic:cNvPicPr/>
+                  </pic:nvPicPr>
+                  <pic:blipFill>
+                    <a:blip r:embed="rId60"/>
+                    <a:stretch>
+                      <a:fillRect/>
+                    </a:stretch>
+                  </pic:blipFill>
+                  <pic:spPr>
+                    <a:xfrm>
+                      <a:off x="0" y="0"/>
+                      <a:ext cx="5544000" cy="3087095"/>
+                    </a:xfrm>
+                    <a:prstGeom prst="rect"/>
+                  </pic:spPr>
+                </pic:pic>
+              </a:graphicData>
+            </a:graphic>
+          </wp:inline>
+        </w:drawing>
+      </w:r>
+    </w:p>
+    <w:p>
+      <w:pPr>
+        <w:pStyle w:val="af7"/>
+        <w:jc w:val="center"/>
+      </w:pPr>
+      <w:r>
+        <w:rPr>
+          <w:rFonts w:ascii="宋体" w:hAnsi="宋体" w:eastAsia="宋体"/>
+          <w:sz w:val="19"/>
+        </w:rPr>
+        <w:t>图 20 RPG-HRGV-Net 的角色分区不确定性门控结构</w:t>
+      </w:r>
+    </w:p>
+    <w:p>
+      <w:pPr>
+        <w:pStyle w:val="21"/>
+      </w:pPr>
+      <w:r>
+        <w:t>E.2 三随机种子分区不确定性消融</w:t>
+      </w:r>
+    </w:p>
+    <w:tbl>
+      <w:tblPr>
+        <w:tblStyle w:val="aff1"/>
+        <w:tblW w:type="auto" w:w="0"/>
+        <w:tblLook w:firstColumn="1" w:firstRow="1" w:lastColumn="0" w:lastRow="0" w:noHBand="0" w:noVBand="1" w:val="04A0"/>
+      </w:tblPr>
+      <w:tblGrid>
+        <w:gridCol w:w="1531"/>
+        <w:gridCol w:w="1531"/>
+        <w:gridCol w:w="1531"/>
+        <w:gridCol w:w="1531"/>
+        <w:gridCol w:w="1531"/>
+        <w:gridCol w:w="1531"/>
+      </w:tblGrid>
+      <w:tr>
+        <w:tc>
+          <w:tcPr>
+            <w:tcW w:type="dxa" w:w="1531"/>
+          </w:tcPr>
+          <w:p>
+            <w:pPr>
+              <w:jc w:val="center"/>
+            </w:pPr>
+            <w:r>
+              <w:rPr>
+                <w:rFonts w:ascii="宋体" w:hAnsi="宋体" w:eastAsia="宋体"/>
+                <w:b/>
+                <w:sz w:val="17"/>
+              </w:rPr>
+              <w:t>配置</w:t>
+            </w:r>
+          </w:p>
+        </w:tc>
+        <w:tc>
+          <w:tcPr>
+            <w:tcW w:type="dxa" w:w="1531"/>
+          </w:tcPr>
+          <w:p>
+            <w:pPr>
+              <w:jc w:val="center"/>
+            </w:pPr>
+            <w:r>
+              <w:rPr>
+                <w:rFonts w:ascii="宋体" w:hAnsi="宋体" w:eastAsia="宋体"/>
+                <w:b/>
+                <w:sz w:val="17"/>
+              </w:rPr>
+              <w:t>Accuracy</w:t>
+            </w:r>
+          </w:p>
+        </w:tc>
+        <w:tc>
+          <w:tcPr>
+            <w:tcW w:type="dxa" w:w="1531"/>
+          </w:tcPr>
+          <w:p>
+            <w:pPr>
+              <w:jc w:val="center"/>
+            </w:pPr>
+            <w:r>
+              <w:rPr>
+                <w:rFonts w:ascii="宋体" w:hAnsi="宋体" w:eastAsia="宋体"/>
+                <w:b/>
+                <w:sz w:val="17"/>
+              </w:rPr>
+              <w:t>Macro F1</w:t>
+            </w:r>
+          </w:p>
+        </w:tc>
+        <w:tc>
+          <w:tcPr>
+            <w:tcW w:type="dxa" w:w="1531"/>
+          </w:tcPr>
+          <w:p>
+            <w:pPr>
+              <w:jc w:val="center"/>
+            </w:pPr>
+            <w:r>
+              <w:rPr>
+                <w:rFonts w:ascii="宋体" w:hAnsi="宋体" w:eastAsia="宋体"/>
+                <w:b/>
+                <w:sz w:val="17"/>
+              </w:rPr>
+              <w:t>目标类召回</w:t>
+            </w:r>
+          </w:p>
+        </w:tc>
+        <w:tc>
+          <w:tcPr>
+            <w:tcW w:type="dxa" w:w="1531"/>
+          </w:tcPr>
+          <w:p>
+            <w:pPr>
+              <w:jc w:val="center"/>
+            </w:pPr>
+            <w:r>
+              <w:rPr>
+                <w:rFonts w:ascii="宋体" w:hAnsi="宋体" w:eastAsia="宋体"/>
+                <w:b/>
+                <w:sz w:val="17"/>
+              </w:rPr>
+              <w:t>Brier</w:t>
+            </w:r>
+          </w:p>
+        </w:tc>
+        <w:tc>
+          <w:tcPr>
+            <w:tcW w:type="dxa" w:w="1531"/>
+          </w:tcPr>
+          <w:p>
+            <w:pPr>
+              <w:jc w:val="center"/>
+            </w:pPr>
+            <w:r>
+              <w:rPr>
+                <w:rFonts w:ascii="宋体" w:hAnsi="宋体" w:eastAsia="宋体"/>
+                <w:b/>
+                <w:sz w:val="17"/>
+              </w:rPr>
+              <w:t>ECE</w:t>
+            </w:r>
+          </w:p>
+        </w:tc>
+      </w:tr>
+      <w:tr>
+        <w:tc>
+          <w:tcPr>
+            <w:tcW w:type="dxa" w:w="1531"/>
+          </w:tcPr>
+          <w:p>
+            <w:pPr>
+              <w:jc w:val="center"/>
+            </w:pPr>
+            <w:r>
+              <w:rPr>
+                <w:rFonts w:ascii="宋体" w:hAnsi="宋体" w:eastAsia="宋体"/>
+                <w:b w:val="0"/>
+                <w:sz w:val="17"/>
+              </w:rPr>
+              <w:t>RSG 完整模型</w:t>
+            </w:r>
+          </w:p>
+        </w:tc>
+        <w:tc>
+          <w:tcPr>
+            <w:tcW w:type="dxa" w:w="1531"/>
+          </w:tcPr>
+          <w:p>
+            <w:pPr>
+              <w:jc w:val="center"/>
+            </w:pPr>
+            <w:r>
+              <w:rPr>
+                <w:rFonts w:ascii="宋体" w:hAnsi="宋体" w:eastAsia="宋体"/>
+                <w:b w:val="0"/>
+                <w:sz w:val="17"/>
+              </w:rPr>
+              <w:t>76.45%</w:t>
+            </w:r>
+          </w:p>
+        </w:tc>
+        <w:tc>
+          <w:tcPr>
+            <w:tcW w:type="dxa" w:w="1531"/>
+          </w:tcPr>
+          <w:p>
+            <w:pPr>
+              <w:jc w:val="center"/>
+            </w:pPr>
+            <w:r>
+              <w:rPr>
+                <w:rFonts w:ascii="宋体" w:hAnsi="宋体" w:eastAsia="宋体"/>
+                <w:b w:val="0"/>
+                <w:sz w:val="17"/>
+              </w:rPr>
+              <w:t>74.76%</w:t>
+            </w:r>
+          </w:p>
+        </w:tc>
+        <w:tc>
+          <w:tcPr>
+            <w:tcW w:type="dxa" w:w="1531"/>
+          </w:tcPr>
+          <w:p>
+            <w:pPr>
+              <w:jc w:val="center"/>
+            </w:pPr>
+            <w:r>
+              <w:rPr>
+                <w:rFonts w:ascii="宋体" w:hAnsi="宋体" w:eastAsia="宋体"/>
+                <w:b w:val="0"/>
+                <w:sz w:val="17"/>
+              </w:rPr>
+              <w:t>72.91%</w:t>
+            </w:r>
+          </w:p>
+        </w:tc>
+        <w:tc>
+          <w:tcPr>
+            <w:tcW w:type="dxa" w:w="1531"/>
+          </w:tcPr>
+          <w:p>
+            <w:pPr>
+              <w:jc w:val="center"/>
+            </w:pPr>
+            <w:r>
+              <w:rPr>
+                <w:rFonts w:ascii="宋体" w:hAnsi="宋体" w:eastAsia="宋体"/>
+                <w:b w:val="0"/>
+                <w:sz w:val="17"/>
+              </w:rPr>
+              <w:t>37.02%</w:t>
+            </w:r>
+          </w:p>
+        </w:tc>
+        <w:tc>
+          <w:tcPr>
+            <w:tcW w:type="dxa" w:w="1531"/>
+          </w:tcPr>
+          <w:p>
+            <w:pPr>
+              <w:jc w:val="center"/>
+            </w:pPr>
+            <w:r>
+              <w:rPr>
+                <w:rFonts w:ascii="宋体" w:hAnsi="宋体" w:eastAsia="宋体"/>
+                <w:b w:val="0"/>
+                <w:sz w:val="17"/>
+              </w:rPr>
+              <w:t>12.90%</w:t>
+            </w:r>
+          </w:p>
+        </w:tc>
+      </w:tr>
+      <w:tr>
+        <w:tc>
+          <w:tcPr>
+            <w:tcW w:type="dxa" w:w="1531"/>
+          </w:tcPr>
+          <w:p>
+            <w:pPr>
+              <w:jc w:val="center"/>
+            </w:pPr>
+            <w:r>
+              <w:rPr>
+                <w:rFonts w:ascii="宋体" w:hAnsi="宋体" w:eastAsia="宋体"/>
+                <w:b w:val="0"/>
+                <w:sz w:val="17"/>
+              </w:rPr>
+              <w:t>RPG 完整模型</w:t>
+            </w:r>
+          </w:p>
+        </w:tc>
+        <w:tc>
+          <w:tcPr>
+            <w:tcW w:type="dxa" w:w="1531"/>
+          </w:tcPr>
+          <w:p>
+            <w:pPr>
+              <w:jc w:val="center"/>
+            </w:pPr>
+            <w:r>
+              <w:rPr>
+                <w:rFonts w:ascii="宋体" w:hAnsi="宋体" w:eastAsia="宋体"/>
+                <w:b w:val="0"/>
+                <w:sz w:val="17"/>
+              </w:rPr>
+              <w:t>76.32%</w:t>
+            </w:r>
+          </w:p>
+        </w:tc>
+        <w:tc>
+          <w:tcPr>
+            <w:tcW w:type="dxa" w:w="1531"/>
+          </w:tcPr>
+          <w:p>
+            <w:pPr>
+              <w:jc w:val="center"/>
+            </w:pPr>
+            <w:r>
+              <w:rPr>
+                <w:rFonts w:ascii="宋体" w:hAnsi="宋体" w:eastAsia="宋体"/>
+                <w:b w:val="0"/>
+                <w:sz w:val="17"/>
+              </w:rPr>
+              <w:t>74.52%</w:t>
+            </w:r>
+          </w:p>
+        </w:tc>
+        <w:tc>
+          <w:tcPr>
+            <w:tcW w:type="dxa" w:w="1531"/>
+          </w:tcPr>
+          <w:p>
+            <w:pPr>
+              <w:jc w:val="center"/>
+            </w:pPr>
+            <w:r>
+              <w:rPr>
+                <w:rFonts w:ascii="宋体" w:hAnsi="宋体" w:eastAsia="宋体"/>
+                <w:b w:val="0"/>
+                <w:sz w:val="17"/>
+              </w:rPr>
+              <w:t>74.90%</w:t>
+            </w:r>
+          </w:p>
+        </w:tc>
+        <w:tc>
+          <w:tcPr>
+            <w:tcW w:type="dxa" w:w="1531"/>
+          </w:tcPr>
+          <w:p>
+            <w:pPr>
+              <w:jc w:val="center"/>
+            </w:pPr>
+            <w:r>
+              <w:rPr>
+                <w:rFonts w:ascii="宋体" w:hAnsi="宋体" w:eastAsia="宋体"/>
+                <w:b w:val="0"/>
+                <w:sz w:val="17"/>
+              </w:rPr>
+              <w:t>37.43%</w:t>
+            </w:r>
+          </w:p>
+        </w:tc>
+        <w:tc>
+          <w:tcPr>
+            <w:tcW w:type="dxa" w:w="1531"/>
+          </w:tcPr>
+          <w:p>
+            <w:pPr>
+              <w:jc w:val="center"/>
+            </w:pPr>
+            <w:r>
+              <w:rPr>
+                <w:rFonts w:ascii="宋体" w:hAnsi="宋体" w:eastAsia="宋体"/>
+                <w:b w:val="0"/>
+                <w:sz w:val="17"/>
+              </w:rPr>
+              <w:t>12.48%</w:t>
+            </w:r>
+          </w:p>
+        </w:tc>
+      </w:tr>
+      <w:tr>
+        <w:tc>
+          <w:tcPr>
+            <w:tcW w:type="dxa" w:w="1531"/>
+          </w:tcPr>
+          <w:p>
+            <w:pPr>
+              <w:jc w:val="center"/>
+            </w:pPr>
+            <w:r>
+              <w:rPr>
+                <w:rFonts w:ascii="宋体" w:hAnsi="宋体" w:eastAsia="宋体"/>
+                <w:b w:val="0"/>
+                <w:sz w:val="17"/>
+              </w:rPr>
+              <w:t>去除角色内不确定性</w:t>
+            </w:r>
+          </w:p>
+        </w:tc>
+        <w:tc>
+          <w:tcPr>
+            <w:tcW w:type="dxa" w:w="1531"/>
+          </w:tcPr>
+          <w:p>
+            <w:pPr>
+              <w:jc w:val="center"/>
+            </w:pPr>
+            <w:r>
+              <w:rPr>
+                <w:rFonts w:ascii="宋体" w:hAnsi="宋体" w:eastAsia="宋体"/>
+                <w:b w:val="0"/>
+                <w:sz w:val="17"/>
+              </w:rPr>
+              <w:t>76.32%</w:t>
+            </w:r>
+          </w:p>
+        </w:tc>
+        <w:tc>
+          <w:tcPr>
+            <w:tcW w:type="dxa" w:w="1531"/>
+          </w:tcPr>
+          <w:p>
+            <w:pPr>
+              <w:jc w:val="center"/>
+            </w:pPr>
+            <w:r>
+              <w:rPr>
+                <w:rFonts w:ascii="宋体" w:hAnsi="宋体" w:eastAsia="宋体"/>
+                <w:b w:val="0"/>
+                <w:sz w:val="17"/>
+              </w:rPr>
+              <w:t>74.67%</w:t>
+            </w:r>
+          </w:p>
+        </w:tc>
+        <w:tc>
+          <w:tcPr>
+            <w:tcW w:type="dxa" w:w="1531"/>
+          </w:tcPr>
+          <w:p>
+            <w:pPr>
+              <w:jc w:val="center"/>
+            </w:pPr>
+            <w:r>
+              <w:rPr>
+                <w:rFonts w:ascii="宋体" w:hAnsi="宋体" w:eastAsia="宋体"/>
+                <w:b w:val="0"/>
+                <w:sz w:val="17"/>
+              </w:rPr>
+              <w:t>74.63%</w:t>
+            </w:r>
+          </w:p>
+        </w:tc>
+        <w:tc>
+          <w:tcPr>
+            <w:tcW w:type="dxa" w:w="1531"/>
+          </w:tcPr>
+          <w:p>
+            <w:pPr>
+              <w:jc w:val="center"/>
+            </w:pPr>
+            <w:r>
+              <w:rPr>
+                <w:rFonts w:ascii="宋体" w:hAnsi="宋体" w:eastAsia="宋体"/>
+                <w:b w:val="0"/>
+                <w:sz w:val="17"/>
+              </w:rPr>
+              <w:t>37.74%</w:t>
+            </w:r>
+          </w:p>
+        </w:tc>
+        <w:tc>
+          <w:tcPr>
+            <w:tcW w:type="dxa" w:w="1531"/>
+          </w:tcPr>
+          <w:p>
+            <w:pPr>
+              <w:jc w:val="center"/>
+            </w:pPr>
+            <w:r>
+              <w:rPr>
+                <w:rFonts w:ascii="宋体" w:hAnsi="宋体" w:eastAsia="宋体"/>
+                <w:b w:val="0"/>
+                <w:sz w:val="17"/>
+              </w:rPr>
+              <w:t>12.75%</w:t>
+            </w:r>
+          </w:p>
+        </w:tc>
+      </w:tr>
+      <w:tr>
+        <w:tc>
+          <w:tcPr>
+            <w:tcW w:type="dxa" w:w="1531"/>
+          </w:tcPr>
+          <w:p>
+            <w:pPr>
+              <w:jc w:val="center"/>
+            </w:pPr>
+            <w:r>
+              <w:rPr>
+                <w:rFonts w:ascii="宋体" w:hAnsi="宋体" w:eastAsia="宋体"/>
+                <w:b w:val="0"/>
+                <w:sz w:val="17"/>
+              </w:rPr>
+              <w:t>去除角色间不确定性</w:t>
+            </w:r>
+          </w:p>
+        </w:tc>
+        <w:tc>
+          <w:tcPr>
+            <w:tcW w:type="dxa" w:w="1531"/>
+          </w:tcPr>
+          <w:p>
+            <w:pPr>
+              <w:jc w:val="center"/>
+            </w:pPr>
+            <w:r>
+              <w:rPr>
+                <w:rFonts w:ascii="宋体" w:hAnsi="宋体" w:eastAsia="宋体"/>
+                <w:b w:val="0"/>
+                <w:sz w:val="17"/>
+              </w:rPr>
+              <w:t>75.86%</w:t>
+            </w:r>
+          </w:p>
+        </w:tc>
+        <w:tc>
+          <w:tcPr>
+            <w:tcW w:type="dxa" w:w="1531"/>
+          </w:tcPr>
+          <w:p>
+            <w:pPr>
+              <w:jc w:val="center"/>
+            </w:pPr>
+            <w:r>
+              <w:rPr>
+                <w:rFonts w:ascii="宋体" w:hAnsi="宋体" w:eastAsia="宋体"/>
+                <w:b w:val="0"/>
+                <w:sz w:val="17"/>
+              </w:rPr>
+              <w:t>73.79%</w:t>
+            </w:r>
+          </w:p>
+        </w:tc>
+        <w:tc>
+          <w:tcPr>
+            <w:tcW w:type="dxa" w:w="1531"/>
+          </w:tcPr>
+          <w:p>
+            <w:pPr>
+              <w:jc w:val="center"/>
+            </w:pPr>
+            <w:r>
+              <w:rPr>
+                <w:rFonts w:ascii="宋体" w:hAnsi="宋体" w:eastAsia="宋体"/>
+                <w:b w:val="0"/>
+                <w:sz w:val="17"/>
+              </w:rPr>
+              <w:t>73.97%</w:t>
+            </w:r>
+          </w:p>
+        </w:tc>
+        <w:tc>
+          <w:tcPr>
+            <w:tcW w:type="dxa" w:w="1531"/>
+          </w:tcPr>
+          <w:p>
+            <w:pPr>
+              <w:jc w:val="center"/>
+            </w:pPr>
+            <w:r>
+              <w:rPr>
+                <w:rFonts w:ascii="宋体" w:hAnsi="宋体" w:eastAsia="宋体"/>
+                <w:b w:val="0"/>
+                <w:sz w:val="17"/>
+              </w:rPr>
+              <w:t>38.30%</w:t>
+            </w:r>
+          </w:p>
+        </w:tc>
+        <w:tc>
+          <w:tcPr>
+            <w:tcW w:type="dxa" w:w="1531"/>
+          </w:tcPr>
+          <w:p>
+            <w:pPr>
+              <w:jc w:val="center"/>
+            </w:pPr>
+            <w:r>
+              <w:rPr>
+                <w:rFonts w:ascii="宋体" w:hAnsi="宋体" w:eastAsia="宋体"/>
+                <w:b w:val="0"/>
+                <w:sz w:val="17"/>
+              </w:rPr>
+              <w:t>13.88%</w:t>
+            </w:r>
+          </w:p>
+        </w:tc>
+      </w:tr>
+      <w:tr>
+        <w:tc>
+          <w:tcPr>
+            <w:tcW w:type="dxa" w:w="1531"/>
+          </w:tcPr>
+          <w:p>
+            <w:pPr>
+              <w:jc w:val="center"/>
+            </w:pPr>
+            <w:r>
+              <w:rPr>
+                <w:rFonts w:ascii="宋体" w:hAnsi="宋体" w:eastAsia="宋体"/>
+                <w:b w:val="0"/>
+                <w:sz w:val="17"/>
+              </w:rPr>
+              <w:t>仅使用总熵</w:t>
+            </w:r>
+          </w:p>
+        </w:tc>
+        <w:tc>
+          <w:tcPr>
+            <w:tcW w:type="dxa" w:w="1531"/>
+          </w:tcPr>
+          <w:p>
+            <w:pPr>
+              <w:jc w:val="center"/>
+            </w:pPr>
+            <w:r>
+              <w:rPr>
+                <w:rFonts w:ascii="宋体" w:hAnsi="宋体" w:eastAsia="宋体"/>
+                <w:b w:val="0"/>
+                <w:sz w:val="17"/>
+              </w:rPr>
+              <w:t>75.93%</w:t>
+            </w:r>
+          </w:p>
+        </w:tc>
+        <w:tc>
+          <w:tcPr>
+            <w:tcW w:type="dxa" w:w="1531"/>
+          </w:tcPr>
+          <w:p>
+            <w:pPr>
+              <w:jc w:val="center"/>
+            </w:pPr>
+            <w:r>
+              <w:rPr>
+                <w:rFonts w:ascii="宋体" w:hAnsi="宋体" w:eastAsia="宋体"/>
+                <w:b w:val="0"/>
+                <w:sz w:val="17"/>
+              </w:rPr>
+              <w:t>74.25%</w:t>
+            </w:r>
+          </w:p>
+        </w:tc>
+        <w:tc>
+          <w:tcPr>
+            <w:tcW w:type="dxa" w:w="1531"/>
+          </w:tcPr>
+          <w:p>
+            <w:pPr>
+              <w:jc w:val="center"/>
+            </w:pPr>
+            <w:r>
+              <w:rPr>
+                <w:rFonts w:ascii="宋体" w:hAnsi="宋体" w:eastAsia="宋体"/>
+                <w:b w:val="0"/>
+                <w:sz w:val="17"/>
+              </w:rPr>
+              <w:t>74.50%</w:t>
+            </w:r>
+          </w:p>
+        </w:tc>
+        <w:tc>
+          <w:tcPr>
+            <w:tcW w:type="dxa" w:w="1531"/>
+          </w:tcPr>
+          <w:p>
+            <w:pPr>
+              <w:jc w:val="center"/>
+            </w:pPr>
+            <w:r>
+              <w:rPr>
+                <w:rFonts w:ascii="宋体" w:hAnsi="宋体" w:eastAsia="宋体"/>
+                <w:b w:val="0"/>
+                <w:sz w:val="17"/>
+              </w:rPr>
+              <w:t>37.63%</w:t>
+            </w:r>
+          </w:p>
+        </w:tc>
+        <w:tc>
+          <w:tcPr>
+            <w:tcW w:type="dxa" w:w="1531"/>
+          </w:tcPr>
+          <w:p>
+            <w:pPr>
+              <w:jc w:val="center"/>
+            </w:pPr>
+            <w:r>
+              <w:rPr>
+                <w:rFonts w:ascii="宋体" w:hAnsi="宋体" w:eastAsia="宋体"/>
+                <w:b w:val="0"/>
+                <w:sz w:val="17"/>
+              </w:rPr>
+              <w:t>12.89%</w:t>
+            </w:r>
+          </w:p>
+        </w:tc>
+      </w:tr>
+    </w:tbl>
+    <w:p/>
+    <w:p>
+      <w:pPr>
+        <w:spacing w:line="360" w:lineRule="auto"/>
+      </w:pPr>
+      <w:r>
+        <w:rPr>
+          <w:rFonts w:ascii="宋体" w:hAnsi="宋体" w:eastAsia="宋体"/>
+          <w:sz w:val="21"/>
+        </w:rPr>
+        <w:t>完整 RPG、两个分区熵移除消融和仅总熵消融在固定数据划分、主干、训练预算、图像增强和随机种子下进行对比。若 RPG 完整模型相对 RSG 的成对区间未显示稳定优势，本附录仅将其报告为理论驱动的受控探索，而不作性能优越性结论。</w:t>
+      </w:r>
+    </w:p>
+    <w:p>
+      <w:pPr>
+        <w:pStyle w:val="21"/>
+      </w:pPr>
+      <w:r>
+        <w:t>E.3 成对统计与结论边界</w:t>
+      </w:r>
+    </w:p>
+    <w:tbl>
+      <w:tblPr>
+        <w:tblStyle w:val="aff1"/>
+        <w:tblW w:type="auto" w:w="0"/>
+        <w:tblLook w:firstColumn="1" w:firstRow="1" w:lastColumn="0" w:lastRow="0" w:noHBand="0" w:noVBand="1" w:val="04A0"/>
+      </w:tblPr>
+      <w:tblGrid>
+        <w:gridCol w:w="2296"/>
+        <w:gridCol w:w="2296"/>
+        <w:gridCol w:w="2296"/>
+        <w:gridCol w:w="2296"/>
+      </w:tblGrid>
+      <w:tr>
+        <w:tc>
+          <w:tcPr>
+            <w:tcW w:type="dxa" w:w="2296"/>
+          </w:tcPr>
+          <w:p>
+            <w:pPr>
+              <w:jc w:val="center"/>
+            </w:pPr>
+            <w:r>
+              <w:rPr>
+                <w:rFonts w:ascii="宋体" w:hAnsi="宋体" w:eastAsia="宋体"/>
+                <w:b/>
+                <w:sz w:val="17"/>
+              </w:rPr>
+              <w:t>相对 RSG</w:t>
+            </w:r>
+          </w:p>
+        </w:tc>
+        <w:tc>
+          <w:tcPr>
+            <w:tcW w:type="dxa" w:w="2296"/>
+          </w:tcPr>
+          <w:p>
+            <w:pPr>
+              <w:jc w:val="center"/>
+            </w:pPr>
+            <w:r>
+              <w:rPr>
+                <w:rFonts w:ascii="宋体" w:hAnsi="宋体" w:eastAsia="宋体"/>
+                <w:b/>
+                <w:sz w:val="17"/>
+              </w:rPr>
+              <w:t>Macro F1 差值 [95% CI]</w:t>
+            </w:r>
+          </w:p>
+        </w:tc>
+        <w:tc>
+          <w:tcPr>
+            <w:tcW w:type="dxa" w:w="2296"/>
+          </w:tcPr>
+          <w:p>
+            <w:pPr>
+              <w:jc w:val="center"/>
+            </w:pPr>
+            <w:r>
+              <w:rPr>
+                <w:rFonts w:ascii="宋体" w:hAnsi="宋体" w:eastAsia="宋体"/>
+                <w:b/>
+                <w:sz w:val="17"/>
+              </w:rPr>
+              <w:t>门控遗憾差值 [95% CI]</w:t>
+            </w:r>
+          </w:p>
+        </w:tc>
+        <w:tc>
+          <w:tcPr>
+            <w:tcW w:type="dxa" w:w="2296"/>
+          </w:tcPr>
+          <w:p>
+            <w:pPr>
+              <w:jc w:val="center"/>
+            </w:pPr>
+            <w:r>
+              <w:rPr>
+                <w:rFonts w:ascii="宋体" w:hAnsi="宋体" w:eastAsia="宋体"/>
+                <w:b/>
+                <w:sz w:val="17"/>
+              </w:rPr>
+              <w:t>Brier 差值 [95% CI]</w:t>
+            </w:r>
+          </w:p>
+        </w:tc>
+      </w:tr>
+      <w:tr>
+        <w:tc>
+          <w:tcPr>
+            <w:tcW w:type="dxa" w:w="2296"/>
+          </w:tcPr>
+          <w:p>
+            <w:pPr>
+              <w:jc w:val="center"/>
+            </w:pPr>
+            <w:r>
+              <w:rPr>
+                <w:rFonts w:ascii="宋体" w:hAnsi="宋体" w:eastAsia="宋体"/>
+                <w:b w:val="0"/>
+                <w:sz w:val="17"/>
+              </w:rPr>
+              <w:t>RPG 完整模型</w:t>
+            </w:r>
+          </w:p>
+        </w:tc>
+        <w:tc>
+          <w:tcPr>
+            <w:tcW w:type="dxa" w:w="2296"/>
+          </w:tcPr>
+          <w:p>
+            <w:pPr>
+              <w:jc w:val="center"/>
+            </w:pPr>
+            <w:r>
+              <w:rPr>
+                <w:rFonts w:ascii="宋体" w:hAnsi="宋体" w:eastAsia="宋体"/>
+                <w:b w:val="0"/>
+                <w:sz w:val="17"/>
+              </w:rPr>
+              <w:t>-0.23% [-2.11%, 1.51%]</w:t>
+            </w:r>
+          </w:p>
+        </w:tc>
+        <w:tc>
+          <w:tcPr>
+            <w:tcW w:type="dxa" w:w="2296"/>
+          </w:tcPr>
+          <w:p>
+            <w:pPr>
+              <w:jc w:val="center"/>
+            </w:pPr>
+            <w:r>
+              <w:rPr>
+                <w:rFonts w:ascii="宋体" w:hAnsi="宋体" w:eastAsia="宋体"/>
+                <w:b w:val="0"/>
+                <w:sz w:val="17"/>
+              </w:rPr>
+              <w:t>0.29% [-1.01%, 1.33%]</w:t>
+            </w:r>
+          </w:p>
+        </w:tc>
+        <w:tc>
+          <w:tcPr>
+            <w:tcW w:type="dxa" w:w="2296"/>
+          </w:tcPr>
+          <w:p>
+            <w:pPr>
+              <w:jc w:val="center"/>
+            </w:pPr>
+            <w:r>
+              <w:rPr>
+                <w:rFonts w:ascii="宋体" w:hAnsi="宋体" w:eastAsia="宋体"/>
+                <w:b w:val="0"/>
+                <w:sz w:val="17"/>
+              </w:rPr>
+              <w:t>0.41% [-1.82%, 2.89%]</w:t>
+            </w:r>
+          </w:p>
+        </w:tc>
+      </w:tr>
+      <w:tr>
+        <w:tc>
+          <w:tcPr>
+            <w:tcW w:type="dxa" w:w="2296"/>
+          </w:tcPr>
+          <w:p>
+            <w:pPr>
+              <w:jc w:val="center"/>
+            </w:pPr>
+            <w:r>
+              <w:rPr>
+                <w:rFonts w:ascii="宋体" w:hAnsi="宋体" w:eastAsia="宋体"/>
+                <w:b w:val="0"/>
+                <w:sz w:val="17"/>
+              </w:rPr>
+              <w:t>去除角色内不确定性</w:t>
+            </w:r>
+          </w:p>
+        </w:tc>
+        <w:tc>
+          <w:tcPr>
+            <w:tcW w:type="dxa" w:w="2296"/>
+          </w:tcPr>
+          <w:p>
+            <w:pPr>
+              <w:jc w:val="center"/>
+            </w:pPr>
+            <w:r>
+              <w:rPr>
+                <w:rFonts w:ascii="宋体" w:hAnsi="宋体" w:eastAsia="宋体"/>
+                <w:b w:val="0"/>
+                <w:sz w:val="17"/>
+              </w:rPr>
+              <w:t>-0.08% [-1.66%, 1.50%]</w:t>
+            </w:r>
+          </w:p>
+        </w:tc>
+        <w:tc>
+          <w:tcPr>
+            <w:tcW w:type="dxa" w:w="2296"/>
+          </w:tcPr>
+          <w:p>
+            <w:pPr>
+              <w:jc w:val="center"/>
+            </w:pPr>
+            <w:r>
+              <w:rPr>
+                <w:rFonts w:ascii="宋体" w:hAnsi="宋体" w:eastAsia="宋体"/>
+                <w:b w:val="0"/>
+                <w:sz w:val="17"/>
+              </w:rPr>
+              <w:t>0.29% [-1.02%, 1.33%]</w:t>
+            </w:r>
+          </w:p>
+        </w:tc>
+        <w:tc>
+          <w:tcPr>
+            <w:tcW w:type="dxa" w:w="2296"/>
+          </w:tcPr>
+          <w:p>
+            <w:pPr>
+              <w:jc w:val="center"/>
+            </w:pPr>
+            <w:r>
+              <w:rPr>
+                <w:rFonts w:ascii="宋体" w:hAnsi="宋体" w:eastAsia="宋体"/>
+                <w:b w:val="0"/>
+                <w:sz w:val="17"/>
+              </w:rPr>
+              <w:t>0.72% [-1.58%, 2.99%]</w:t>
+            </w:r>
+          </w:p>
+        </w:tc>
+      </w:tr>
+      <w:tr>
+        <w:tc>
+          <w:tcPr>
+            <w:tcW w:type="dxa" w:w="2296"/>
+          </w:tcPr>
+          <w:p>
+            <w:pPr>
+              <w:jc w:val="center"/>
+            </w:pPr>
+            <w:r>
+              <w:rPr>
+                <w:rFonts w:ascii="宋体" w:hAnsi="宋体" w:eastAsia="宋体"/>
+                <w:b w:val="0"/>
+                <w:sz w:val="17"/>
+              </w:rPr>
+              <w:t>去除角色间不确定性</w:t>
+            </w:r>
+          </w:p>
+        </w:tc>
+        <w:tc>
+          <w:tcPr>
+            <w:tcW w:type="dxa" w:w="2296"/>
+          </w:tcPr>
+          <w:p>
+            <w:pPr>
+              <w:jc w:val="center"/>
+            </w:pPr>
+            <w:r>
+              <w:rPr>
+                <w:rFonts w:ascii="宋体" w:hAnsi="宋体" w:eastAsia="宋体"/>
+                <w:b w:val="0"/>
+                <w:sz w:val="17"/>
+              </w:rPr>
+              <w:t>-0.97% [-2.54%, 0.63%]</w:t>
+            </w:r>
+          </w:p>
+        </w:tc>
+        <w:tc>
+          <w:tcPr>
+            <w:tcW w:type="dxa" w:w="2296"/>
+          </w:tcPr>
+          <w:p>
+            <w:pPr>
+              <w:jc w:val="center"/>
+            </w:pPr>
+            <w:r>
+              <w:rPr>
+                <w:rFonts w:ascii="宋体" w:hAnsi="宋体" w:eastAsia="宋体"/>
+                <w:b w:val="0"/>
+                <w:sz w:val="17"/>
+              </w:rPr>
+              <w:t>0.29% [-0.37%, 0.98%]</w:t>
+            </w:r>
+          </w:p>
+        </w:tc>
+        <w:tc>
+          <w:tcPr>
+            <w:tcW w:type="dxa" w:w="2296"/>
+          </w:tcPr>
+          <w:p>
+            <w:pPr>
+              <w:jc w:val="center"/>
+            </w:pPr>
+            <w:r>
+              <w:rPr>
+                <w:rFonts w:ascii="宋体" w:hAnsi="宋体" w:eastAsia="宋体"/>
+                <w:b w:val="0"/>
+                <w:sz w:val="17"/>
+              </w:rPr>
+              <w:t>1.28% [-0.58%, 3.19%]</w:t>
+            </w:r>
+          </w:p>
+        </w:tc>
+      </w:tr>
+      <w:tr>
+        <w:tc>
+          <w:tcPr>
+            <w:tcW w:type="dxa" w:w="2296"/>
+          </w:tcPr>
+          <w:p>
+            <w:pPr>
+              <w:jc w:val="center"/>
+            </w:pPr>
+            <w:r>
+              <w:rPr>
+                <w:rFonts w:ascii="宋体" w:hAnsi="宋体" w:eastAsia="宋体"/>
+                <w:b w:val="0"/>
+                <w:sz w:val="17"/>
+              </w:rPr>
+              <w:t>仅使用总熵</w:t>
+            </w:r>
+          </w:p>
+        </w:tc>
+        <w:tc>
+          <w:tcPr>
+            <w:tcW w:type="dxa" w:w="2296"/>
+          </w:tcPr>
+          <w:p>
+            <w:pPr>
+              <w:jc w:val="center"/>
+            </w:pPr>
+            <w:r>
+              <w:rPr>
+                <w:rFonts w:ascii="宋体" w:hAnsi="宋体" w:eastAsia="宋体"/>
+                <w:b w:val="0"/>
+                <w:sz w:val="17"/>
+              </w:rPr>
+              <w:t>-0.51% [-2.31%, 1.29%]</w:t>
+            </w:r>
+          </w:p>
+        </w:tc>
+        <w:tc>
+          <w:tcPr>
+            <w:tcW w:type="dxa" w:w="2296"/>
+          </w:tcPr>
+          <w:p>
+            <w:pPr>
+              <w:jc w:val="center"/>
+            </w:pPr>
+            <w:r>
+              <w:rPr>
+                <w:rFonts w:ascii="宋体" w:hAnsi="宋体" w:eastAsia="宋体"/>
+                <w:b w:val="0"/>
+                <w:sz w:val="17"/>
+              </w:rPr>
+              <w:t>0.03% [-0.99%, 0.90%]</w:t>
+            </w:r>
+          </w:p>
+        </w:tc>
+        <w:tc>
+          <w:tcPr>
+            <w:tcW w:type="dxa" w:w="2296"/>
+          </w:tcPr>
+          <w:p>
+            <w:pPr>
+              <w:jc w:val="center"/>
+            </w:pPr>
+            <w:r>
+              <w:rPr>
+                <w:rFonts w:ascii="宋体" w:hAnsi="宋体" w:eastAsia="宋体"/>
+                <w:b w:val="0"/>
+                <w:sz w:val="17"/>
+              </w:rPr>
+              <w:t>0.61% [-1.66%, 2.81%]</w:t>
+            </w:r>
+          </w:p>
+        </w:tc>
+      </w:tr>
+    </w:tbl>
+    <w:p/>
+    <w:p>
+      <w:pPr>
+        <w:spacing w:line="360" w:lineRule="auto"/>
+      </w:pPr>
+      <w:r>
+        <w:rPr>
+          <w:rFonts w:ascii="宋体" w:hAnsi="宋体" w:eastAsia="宋体"/>
+          <w:sz w:val="21"/>
+        </w:rPr>
+        <w:t>差值均为配置减去 RSG；门控遗憾以融合后验相对于两路专家中概率更优者的负对数似然损失定义，越低越好。区间通过图片 split_group_id 聚类、随机种子与组两阶段重采样的 2,000 次 Bootstrap 得到。理论命题中的信息分解恒等式不依赖实验，实验只检验所构造的门控特征是否在本数据与本协议下带来稳定的经验收益。</w:t>
+      </w:r>
+    </w:p>
+    <w:p>
+      <w:pPr>
+        <w:spacing w:line="360" w:lineRule="auto"/>
+      </w:pPr>
+      <w:r>
+        <w:rPr>
+          <w:rFonts w:ascii="宋体" w:hAnsi="宋体" w:eastAsia="宋体"/>
+          <w:sz w:val="21"/>
+        </w:rPr>
+        <w:t>结论边界：RPG-HRGV 验证的是公开矿物标本图像上的四角色闭集识别、门控行为和后验质量，不等同于工业分选、精矿品位预测、回收率提升、钒钛元素含量检测、真实工况泛化或未知矿物拒识性能。阶段条件化选矿决策图及送检风险最小化作为后续研究方向，不在本附录中声称已完成验证。</w:t>
       </w:r>
     </w:p>
     <w:sectPr>

</xml_diff>